<commit_message>
Polish Word document with full answers for all variants
Regenerate Kontrolnaya_TRPO_otvety.docx as a print-ready submission
with complete theory answers and ASCII diagram sketches.

Co-authored-by: MaxChicago <MaxChicago@users.noreply.github.com>
</commit_message>
<xml_diff>
--- a/Kontrolnaya_TRPO_otvety.docx
+++ b/Kontrolnaya_TRPO_otvety.docx
@@ -4,478 +4,894 @@
   <w:body>
     <w:p>
       <w:pPr>
-        <w:pStyle w:val="Title"/>
+        <w:spacing w:after="120" w:before="0" w:line="276" w:lineRule="auto"/>
+        <w:jc w:val="center"/>
       </w:pPr>
       <w:r>
-        <w:t>Контрольная работа — ответы (все варианты)</w:t>
+        <w:rPr>
+          <w:rFonts w:ascii="Times New Roman" w:hAnsi="Times New Roman" w:eastAsia="Times New Roman"/>
+          <w:b/>
+          <w:i w:val="0"/>
+          <w:sz w:val="28"/>
+        </w:rPr>
+        <w:t>УО «Минский государственный механико-технологический колледж»</w:t>
       </w:r>
     </w:p>
     <w:p>
       <w:pPr>
-        <w:spacing w:after="120"/>
+        <w:spacing w:after="40" w:before="0" w:line="276" w:lineRule="auto"/>
+        <w:jc w:val="center"/>
       </w:pPr>
       <w:r>
         <w:rPr>
-          <w:rFonts w:ascii="Times New Roman" w:hAnsi="Times New Roman"/>
+          <w:rFonts w:ascii="Times New Roman" w:hAnsi="Times New Roman" w:eastAsia="Times New Roman"/>
           <w:b w:val="0"/>
-          <w:sz w:val="24"/>
+          <w:i w:val="0"/>
+          <w:sz w:val="28"/>
         </w:rPr>
-        <w:t>Учебный предмет: Технология разработки программного обеспечения</w:t>
+        <w:t>Специальность 5-04-0612-02</w:t>
       </w:r>
     </w:p>
     <w:p>
       <w:pPr>
-        <w:spacing w:after="120"/>
+        <w:spacing w:after="40" w:before="0" w:line="276" w:lineRule="auto"/>
+        <w:jc w:val="center"/>
       </w:pPr>
       <w:r>
         <w:rPr>
-          <w:rFonts w:ascii="Times New Roman" w:hAnsi="Times New Roman"/>
+          <w:rFonts w:ascii="Times New Roman" w:hAnsi="Times New Roman" w:eastAsia="Times New Roman"/>
           <w:b w:val="0"/>
-          <w:sz w:val="24"/>
+          <w:i w:val="0"/>
+          <w:sz w:val="28"/>
         </w:rPr>
-        <w:t>Специальность 5-04-0612-02 · Курс 4, группа №243</w:t>
+        <w:t>Разработка и сопровождение программного обеспечения информационных систем</w:t>
       </w:r>
     </w:p>
     <w:p>
       <w:pPr>
-        <w:pStyle w:val="Heading1"/>
+        <w:spacing w:after="240" w:before="0" w:line="276" w:lineRule="auto"/>
+        <w:jc w:val="center"/>
       </w:pPr>
       <w:r>
+        <w:rPr>
+          <w:rFonts w:ascii="Times New Roman" w:hAnsi="Times New Roman" w:eastAsia="Times New Roman"/>
+          <w:b w:val="0"/>
+          <w:i w:val="0"/>
+          <w:sz w:val="28"/>
+        </w:rPr>
+        <w:t>Квалификация: Техник-программист</w:t>
+      </w:r>
+    </w:p>
+    <w:p>
+      <w:pPr>
+        <w:spacing w:after="80" w:before="0" w:line="276" w:lineRule="auto"/>
+        <w:jc w:val="center"/>
+      </w:pPr>
+      <w:r>
+        <w:rPr>
+          <w:rFonts w:ascii="Times New Roman" w:hAnsi="Times New Roman" w:eastAsia="Times New Roman"/>
+          <w:b/>
+          <w:i w:val="0"/>
+          <w:sz w:val="32"/>
+        </w:rPr>
+        <w:t>Контрольная работа</w:t>
+      </w:r>
+    </w:p>
+    <w:p>
+      <w:pPr>
+        <w:spacing w:after="80" w:before="0" w:line="276" w:lineRule="auto"/>
+        <w:jc w:val="center"/>
+      </w:pPr>
+      <w:r>
+        <w:rPr>
+          <w:rFonts w:ascii="Times New Roman" w:hAnsi="Times New Roman" w:eastAsia="Times New Roman"/>
+          <w:b w:val="0"/>
+          <w:i w:val="0"/>
+          <w:sz w:val="28"/>
+        </w:rPr>
+        <w:t>при проведении самоконтроля</w:t>
+      </w:r>
+    </w:p>
+    <w:p>
+      <w:pPr>
+        <w:spacing w:after="80" w:before="0" w:line="276" w:lineRule="auto"/>
+        <w:jc w:val="center"/>
+      </w:pPr>
+      <w:r>
+        <w:rPr>
+          <w:rFonts w:ascii="Times New Roman" w:hAnsi="Times New Roman" w:eastAsia="Times New Roman"/>
+          <w:b w:val="0"/>
+          <w:i w:val="0"/>
+          <w:sz w:val="28"/>
+        </w:rPr>
+        <w:t>Учебный предмет «Технология разработки программного обеспечения»</w:t>
+      </w:r>
+    </w:p>
+    <w:p>
+      <w:pPr>
+        <w:spacing w:after="240" w:before="0" w:line="276" w:lineRule="auto"/>
+        <w:jc w:val="center"/>
+      </w:pPr>
+      <w:r>
+        <w:rPr>
+          <w:rFonts w:ascii="Times New Roman" w:hAnsi="Times New Roman" w:eastAsia="Times New Roman"/>
+          <w:b w:val="0"/>
+          <w:i w:val="0"/>
+          <w:sz w:val="28"/>
+        </w:rPr>
+        <w:t>Курс 4, группа №243</w:t>
+      </w:r>
+    </w:p>
+    <w:p>
+      <w:pPr>
+        <w:spacing w:after="480" w:before="0" w:line="276" w:lineRule="auto"/>
+        <w:jc w:val="center"/>
+      </w:pPr>
+      <w:r>
+        <w:rPr>
+          <w:rFonts w:ascii="Times New Roman" w:hAnsi="Times New Roman" w:eastAsia="Times New Roman"/>
+          <w:b/>
+          <w:i w:val="0"/>
+          <w:sz w:val="28"/>
+        </w:rPr>
+        <w:t>ОТВЕТЫ НА ВСЕ ВАРИАНТЫ (1–4)</w:t>
+      </w:r>
+    </w:p>
+    <w:p>
+      <w:pPr>
+        <w:spacing w:after="120" w:before="0" w:line="276" w:lineRule="auto"/>
+        <w:jc w:val="right"/>
+      </w:pPr>
+      <w:r>
+        <w:rPr>
+          <w:rFonts w:ascii="Times New Roman" w:hAnsi="Times New Roman" w:eastAsia="Times New Roman"/>
+          <w:b w:val="0"/>
+          <w:i w:val="0"/>
+          <w:sz w:val="28"/>
+        </w:rPr>
+        <w:t>Преподаватель: П.Д. Баркун</w:t>
+      </w:r>
+    </w:p>
+    <w:p>
+      <w:pPr>
+        <w:spacing w:after="240" w:before="0" w:line="276" w:lineRule="auto"/>
+        <w:jc w:val="center"/>
+      </w:pPr>
+      <w:r>
+        <w:rPr>
+          <w:rFonts w:ascii="Times New Roman" w:hAnsi="Times New Roman" w:eastAsia="Times New Roman"/>
+          <w:b w:val="0"/>
+          <w:i w:val="0"/>
+          <w:sz w:val="28"/>
+        </w:rPr>
+        <w:t>2026</w:t>
+      </w:r>
+    </w:p>
+    <w:p>
+      <w:r>
+        <w:br w:type="page"/>
+      </w:r>
+    </w:p>
+    <w:p>
+      <w:pPr>
+        <w:spacing w:after="240" w:before="360" w:line="276" w:lineRule="auto"/>
+        <w:jc w:val="center"/>
+      </w:pPr>
+      <w:r>
+        <w:rPr>
+          <w:rFonts w:ascii="Times New Roman" w:hAnsi="Times New Roman" w:eastAsia="Times New Roman"/>
+          <w:b/>
+          <w:i w:val="0"/>
+          <w:sz w:val="32"/>
+        </w:rPr>
         <w:t>ВАРИАНТ 1</w:t>
       </w:r>
     </w:p>
     <w:p>
       <w:pPr>
-        <w:pStyle w:val="Heading2"/>
+        <w:spacing w:after="160" w:before="240" w:line="276" w:lineRule="auto"/>
       </w:pPr>
       <w:r>
-        <w:t>Задание 1. Жизненный цикл ПО</w:t>
+        <w:rPr>
+          <w:rFonts w:ascii="Times New Roman" w:hAnsi="Times New Roman" w:eastAsia="Times New Roman"/>
+          <w:b/>
+          <w:i w:val="0"/>
+          <w:sz w:val="28"/>
+        </w:rPr>
+        <w:t>Задание 1. Жизненный цикл ПО (3–4 балла)</w:t>
       </w:r>
     </w:p>
     <w:p>
       <w:pPr>
-        <w:spacing w:after="120"/>
+        <w:spacing w:after="120" w:before="0" w:line="276" w:lineRule="auto"/>
+        <w:jc w:val="both"/>
       </w:pPr>
       <w:r>
         <w:rPr>
-          <w:rFonts w:ascii="Times New Roman" w:hAnsi="Times New Roman"/>
+          <w:rFonts w:ascii="Times New Roman" w:hAnsi="Times New Roman" w:eastAsia="Times New Roman"/>
           <w:b w:val="0"/>
-          <w:sz w:val="24"/>
+          <w:i w:val="0"/>
+          <w:sz w:val="28"/>
         </w:rPr>
-        <w:t>Жизненный цикл программного обеспечения (ЖЦ ПО) — период времени от момента принятия решения о необходимости создания программного продукта до момента его полного изъятия из эксплуатации. ЖЦ охватывает анализ, проектирование, реализацию, тестирование, внедрение, сопровождение и вывод из эксплуатации.</w:t>
+        <w:t>Жизненный цикл программного обеспечения (ЖЦ ПО) — это период времени от момента принятия решения о необходимости создания программного продукта до момента его полного изъятия из эксплуатации. ЖЦ охватывает все процессы: анализ, проектирование, реализацию, тестирование, внедрение, сопровождение и вывод из эксплуатации.</w:t>
       </w:r>
     </w:p>
     <w:p>
       <w:pPr>
-        <w:spacing w:after="120"/>
+        <w:spacing w:after="80" w:before="0" w:line="276" w:lineRule="auto"/>
       </w:pPr>
       <w:r>
         <w:rPr>
-          <w:rFonts w:ascii="Times New Roman" w:hAnsi="Times New Roman"/>
+          <w:rFonts w:ascii="Times New Roman" w:hAnsi="Times New Roman" w:eastAsia="Times New Roman"/>
           <w:b/>
-          <w:sz w:val="24"/>
+          <w:i w:val="0"/>
+          <w:sz w:val="28"/>
         </w:rPr>
-        <w:t>Основные этапы:</w:t>
+        <w:t>Основные этапы жизненного цикла ПО:</w:t>
       </w:r>
     </w:p>
     <w:p>
       <w:pPr>
         <w:pStyle w:val="ListBullet"/>
+        <w:spacing w:after="60"/>
       </w:pPr>
       <w:r>
         <w:rPr>
-          <w:rFonts w:ascii="Times New Roman" w:hAnsi="Times New Roman"/>
-          <w:sz w:val="24"/>
+          <w:rFonts w:ascii="Times New Roman" w:hAnsi="Times New Roman" w:eastAsia="Times New Roman"/>
+          <w:b w:val="0"/>
+          <w:i w:val="0"/>
+          <w:sz w:val="28"/>
         </w:rPr>
-        <w:t>Анализ требований — выявление и формализация потребностей заказчика; функциональные и нефункциональные требования.</w:t>
+        <w:t>Анализ требований — выявление и формализация потребностей заказчика и пользователей; формулировка функциональных и нефункциональных требований.</w:t>
       </w:r>
     </w:p>
     <w:p>
       <w:pPr>
         <w:pStyle w:val="ListBullet"/>
+        <w:spacing w:after="60"/>
       </w:pPr>
       <w:r>
         <w:rPr>
-          <w:rFonts w:ascii="Times New Roman" w:hAnsi="Times New Roman"/>
-          <w:sz w:val="24"/>
+          <w:rFonts w:ascii="Times New Roman" w:hAnsi="Times New Roman" w:eastAsia="Times New Roman"/>
+          <w:b w:val="0"/>
+          <w:i w:val="0"/>
+          <w:sz w:val="28"/>
         </w:rPr>
-        <w:t>Проектирование — архитектура, структуры данных, интерфейсы, алгоритмы, UML-модели.</w:t>
+        <w:t>Проектирование — разработка архитектуры системы, структуры данных, интерфейсов, алгоритмов; создание UML- и других моделей.</w:t>
       </w:r>
     </w:p>
     <w:p>
       <w:pPr>
         <w:pStyle w:val="ListBullet"/>
+        <w:spacing w:after="60"/>
       </w:pPr>
       <w:r>
         <w:rPr>
-          <w:rFonts w:ascii="Times New Roman" w:hAnsi="Times New Roman"/>
-          <w:sz w:val="24"/>
+          <w:rFonts w:ascii="Times New Roman" w:hAnsi="Times New Roman" w:eastAsia="Times New Roman"/>
+          <w:b w:val="0"/>
+          <w:i w:val="0"/>
+          <w:sz w:val="28"/>
         </w:rPr>
-        <w:t>Реализация (кодирование) — написание исходного кода и сборка модулей.</w:t>
+        <w:t>Реализация (кодирование) — написание исходного кода, создание модулей и компонентов согласно проекту.</w:t>
       </w:r>
     </w:p>
     <w:p>
       <w:pPr>
         <w:pStyle w:val="ListBullet"/>
+        <w:spacing w:after="60"/>
       </w:pPr>
       <w:r>
         <w:rPr>
-          <w:rFonts w:ascii="Times New Roman" w:hAnsi="Times New Roman"/>
-          <w:sz w:val="24"/>
+          <w:rFonts w:ascii="Times New Roman" w:hAnsi="Times New Roman" w:eastAsia="Times New Roman"/>
+          <w:b w:val="0"/>
+          <w:i w:val="0"/>
+          <w:sz w:val="28"/>
         </w:rPr>
-        <w:t>Тестирование — проверка соответствия требованиям, поиск и устранение дефектов.</w:t>
+        <w:t>Тестирование — проверка соответствия ПО требованиям, поиск и устранение дефектов (модульное, интеграционное, системное, приёмочное).</w:t>
       </w:r>
     </w:p>
     <w:p>
       <w:pPr>
         <w:pStyle w:val="ListBullet"/>
+        <w:spacing w:after="60"/>
       </w:pPr>
       <w:r>
         <w:rPr>
-          <w:rFonts w:ascii="Times New Roman" w:hAnsi="Times New Roman"/>
-          <w:sz w:val="24"/>
+          <w:rFonts w:ascii="Times New Roman" w:hAnsi="Times New Roman" w:eastAsia="Times New Roman"/>
+          <w:b w:val="0"/>
+          <w:i w:val="0"/>
+          <w:sz w:val="28"/>
         </w:rPr>
-        <w:t>Внедрение — установка у заказчика, обучение пользователей, ввод в эксплуатацию.</w:t>
+        <w:t>Внедрение — установка ПО у заказчика, обучение пользователей, ввод в промышленную эксплуатацию.</w:t>
       </w:r>
     </w:p>
     <w:p>
       <w:pPr>
         <w:pStyle w:val="ListBullet"/>
+        <w:spacing w:after="60"/>
       </w:pPr>
       <w:r>
         <w:rPr>
-          <w:rFonts w:ascii="Times New Roman" w:hAnsi="Times New Roman"/>
-          <w:sz w:val="24"/>
+          <w:rFonts w:ascii="Times New Roman" w:hAnsi="Times New Roman" w:eastAsia="Times New Roman"/>
+          <w:b w:val="0"/>
+          <w:i w:val="0"/>
+          <w:sz w:val="28"/>
         </w:rPr>
-        <w:t>Сопровождение — исправление ошибок, адаптация, развитие функциональности.</w:t>
+        <w:t>Сопровождение — исправление ошибок, адаптация к новым условиям, развитие функциональности.</w:t>
       </w:r>
     </w:p>
     <w:p>
       <w:pPr>
         <w:pStyle w:val="ListBullet"/>
+        <w:spacing w:after="60"/>
       </w:pPr>
       <w:r>
         <w:rPr>
-          <w:rFonts w:ascii="Times New Roman" w:hAnsi="Times New Roman"/>
-          <w:sz w:val="24"/>
+          <w:rFonts w:ascii="Times New Roman" w:hAnsi="Times New Roman" w:eastAsia="Times New Roman"/>
+          <w:b w:val="0"/>
+          <w:i w:val="0"/>
+          <w:sz w:val="28"/>
         </w:rPr>
-        <w:t>Вывод из эксплуатации — прекращение поддержки (при необходимости — миграция данных).</w:t>
+        <w:t>Вывод из эксплуатации — прекращение поддержки и использования системы (при необходимости — миграция данных).</w:t>
       </w:r>
     </w:p>
     <w:p>
       <w:pPr>
-        <w:spacing w:after="120"/>
+        <w:spacing w:after="80" w:before="0" w:line="276" w:lineRule="auto"/>
       </w:pPr>
       <w:r>
         <w:rPr>
-          <w:rFonts w:ascii="Times New Roman" w:hAnsi="Times New Roman"/>
+          <w:rFonts w:ascii="Times New Roman" w:hAnsi="Times New Roman" w:eastAsia="Times New Roman"/>
           <w:b/>
-          <w:sz w:val="24"/>
+          <w:i w:val="0"/>
+          <w:sz w:val="28"/>
         </w:rPr>
         <w:t>Последовательность этапов:</w:t>
       </w:r>
     </w:p>
     <w:p>
       <w:pPr>
-        <w:spacing w:after="120"/>
+        <w:spacing w:after="120" w:before="0" w:line="276" w:lineRule="auto"/>
+        <w:jc w:val="both"/>
       </w:pPr>
       <w:r>
         <w:rPr>
-          <w:rFonts w:ascii="Times New Roman" w:hAnsi="Times New Roman"/>
+          <w:rFonts w:ascii="Times New Roman" w:hAnsi="Times New Roman" w:eastAsia="Times New Roman"/>
           <w:b w:val="0"/>
-          <w:sz w:val="24"/>
+          <w:i w:val="0"/>
+          <w:sz w:val="28"/>
         </w:rPr>
         <w:t>Анализ требований → Проектирование → Реализация → Тестирование → Внедрение → Сопровождение → Вывод из эксплуатации.</w:t>
       </w:r>
     </w:p>
     <w:p>
       <w:pPr>
-        <w:pStyle w:val="Heading2"/>
+        <w:spacing w:after="120" w:before="0" w:line="276" w:lineRule="auto"/>
+        <w:jc w:val="both"/>
       </w:pPr>
       <w:r>
-        <w:t>Задание 2. Диаграмма вариантов использования</w:t>
+        <w:rPr>
+          <w:rFonts w:ascii="Times New Roman" w:hAnsi="Times New Roman" w:eastAsia="Times New Roman"/>
+          <w:b w:val="0"/>
+          <w:i w:val="0"/>
+          <w:sz w:val="28"/>
+        </w:rPr>
+        <w:t>В итеративных и Agile-моделях этапы могут повторяться циклами, но логическая последовательность внутри итерации сохраняется.</w:t>
       </w:r>
     </w:p>
     <w:p>
       <w:pPr>
-        <w:spacing w:after="120"/>
+        <w:spacing w:after="160" w:before="240" w:line="276" w:lineRule="auto"/>
       </w:pPr>
       <w:r>
         <w:rPr>
-          <w:rFonts w:ascii="Times New Roman" w:hAnsi="Times New Roman"/>
-          <w:b w:val="0"/>
-          <w:sz w:val="24"/>
+          <w:rFonts w:ascii="Times New Roman" w:hAnsi="Times New Roman" w:eastAsia="Times New Roman"/>
+          <w:b/>
+          <w:i w:val="0"/>
+          <w:sz w:val="28"/>
         </w:rPr>
-        <w:t>Назначение: показать, кто взаимодействует с системой и какие функции система предоставляет; описать границы системы с точки зрения пользователей без раскрытия внутренней реализации.</w:t>
+        <w:t>Задание 2. Диаграмма вариантов использования (5–6 баллов)</w:t>
       </w:r>
     </w:p>
     <w:p>
       <w:pPr>
-        <w:spacing w:after="120"/>
+        <w:spacing w:after="120" w:before="0" w:line="276" w:lineRule="auto"/>
+        <w:jc w:val="both"/>
       </w:pPr>
       <w:r>
         <w:rPr>
-          <w:rFonts w:ascii="Times New Roman" w:hAnsi="Times New Roman"/>
+          <w:rFonts w:ascii="Times New Roman" w:hAnsi="Times New Roman" w:eastAsia="Times New Roman"/>
           <w:b w:val="0"/>
-          <w:sz w:val="24"/>
+          <w:i w:val="0"/>
+          <w:sz w:val="28"/>
         </w:rPr>
-        <w:t>Актёр — внешняя сущность (человек или система), взаимодействующая с системой для достижения цели.</w:t>
+        <w:t>Назначение диаграммы вариантов использования (Use Case Diagram): показать, кто взаимодействует с системой и какие функции система предоставляет. Диаграмма описывает границы системы с точки зрения пользователей и внешних систем, не раскрывая внутреннюю реализацию.</w:t>
       </w:r>
     </w:p>
     <w:p>
       <w:pPr>
-        <w:spacing w:after="120"/>
+        <w:spacing w:after="120" w:line="276" w:lineRule="auto"/>
+        <w:jc w:val="both"/>
       </w:pPr>
       <w:r>
         <w:rPr>
-          <w:rFonts w:ascii="Times New Roman" w:hAnsi="Times New Roman"/>
+          <w:rFonts w:ascii="Times New Roman" w:hAnsi="Times New Roman" w:eastAsia="Times New Roman"/>
+          <w:b/>
+          <w:i w:val="0"/>
+          <w:sz w:val="28"/>
+        </w:rPr>
+        <w:t xml:space="preserve">Актёр (Actor) — </w:t>
+      </w:r>
+      <w:r>
+        <w:rPr>
+          <w:rFonts w:ascii="Times New Roman" w:hAnsi="Times New Roman" w:eastAsia="Times New Roman"/>
           <w:b w:val="0"/>
-          <w:sz w:val="24"/>
+          <w:i w:val="0"/>
+          <w:sz w:val="28"/>
         </w:rPr>
-        <w:t>Прецедент — последовательность действий системы, видимая актёру и дающая значимый результат («что» делает система, а не «как»).</w:t>
+        <w:t>внешняя по отношению к системе сущность (человек, организация или другая система), которая взаимодействует с системой для достижения цели. Актёр инициирует прецеденты или участвует в них. Обозначается фигурой «человечек» или стереотипом &lt;&lt;actor&gt;&gt;.</w:t>
       </w:r>
     </w:p>
     <w:p>
       <w:pPr>
-        <w:spacing w:after="120"/>
+        <w:spacing w:after="120" w:line="276" w:lineRule="auto"/>
+        <w:jc w:val="both"/>
       </w:pPr>
       <w:r>
         <w:rPr>
-          <w:rFonts w:ascii="Times New Roman" w:hAnsi="Times New Roman"/>
+          <w:rFonts w:ascii="Times New Roman" w:hAnsi="Times New Roman" w:eastAsia="Times New Roman"/>
+          <w:b/>
+          <w:i w:val="0"/>
+          <w:sz w:val="28"/>
+        </w:rPr>
+        <w:t xml:space="preserve">Прецедент (Use Case) — </w:t>
+      </w:r>
+      <w:r>
+        <w:rPr>
+          <w:rFonts w:ascii="Times New Roman" w:hAnsi="Times New Roman" w:eastAsia="Times New Roman"/>
           <w:b w:val="0"/>
-          <w:sz w:val="24"/>
+          <w:i w:val="0"/>
+          <w:sz w:val="28"/>
         </w:rPr>
-        <w:t>Отношение include — обязательное включение поведения одного прецедента в другой; общий фрагмент всегда выполняется. Стрелка: базовый → включаемый, &lt;&lt;include&gt;&gt;.</w:t>
+        <w:t>последовательность действий системы, видимая актёру и приводящая к значимому для него результату. Прецедент описывает «что» делает система, а не «как». Обозначается овалом с названием (обычно глагол + объект: «Оформить заказ»).</w:t>
       </w:r>
     </w:p>
     <w:p>
       <w:pPr>
-        <w:spacing w:after="120"/>
+        <w:spacing w:after="120" w:line="276" w:lineRule="auto"/>
+        <w:jc w:val="both"/>
       </w:pPr>
       <w:r>
         <w:rPr>
-          <w:rFonts w:ascii="Times New Roman" w:hAnsi="Times New Roman"/>
+          <w:rFonts w:ascii="Times New Roman" w:hAnsi="Times New Roman" w:eastAsia="Times New Roman"/>
+          <w:b/>
+          <w:i w:val="0"/>
+          <w:sz w:val="28"/>
+        </w:rPr>
+        <w:t xml:space="preserve">Отношение include (включение): </w:t>
+      </w:r>
+      <w:r>
+        <w:rPr>
+          <w:rFonts w:ascii="Times New Roman" w:hAnsi="Times New Roman" w:eastAsia="Times New Roman"/>
           <w:b w:val="0"/>
-          <w:sz w:val="24"/>
+          <w:i w:val="0"/>
+          <w:sz w:val="28"/>
         </w:rPr>
-        <w:t>Отношение extend — условное расширение базового прецедента; выполняется не всегда, а при условии. Стрелка: расширение → базовый, &lt;&lt;extend&gt;&gt;.</w:t>
+        <w:t>обязательное включение поведения одного прецедента в другой. Базовый прецедент всегда выполняет включаемый. Используется для выделения общего фрагмента, который повторяется в нескольких прецедентах. Стрелка: базовый → включаемый, стереотип &lt;&lt;include&gt;&gt;.</w:t>
       </w:r>
     </w:p>
     <w:p>
       <w:pPr>
-        <w:pStyle w:val="Heading2"/>
+        <w:spacing w:after="120" w:line="276" w:lineRule="auto"/>
+        <w:jc w:val="both"/>
       </w:pPr>
       <w:r>
-        <w:t>Задание 3. Функциональное и юзабилити-тестирование</w:t>
+        <w:rPr>
+          <w:rFonts w:ascii="Times New Roman" w:hAnsi="Times New Roman" w:eastAsia="Times New Roman"/>
+          <w:b/>
+          <w:i w:val="0"/>
+          <w:sz w:val="28"/>
+        </w:rPr>
+        <w:t xml:space="preserve">Отношение extend (расширение): </w:t>
+      </w:r>
+      <w:r>
+        <w:rPr>
+          <w:rFonts w:ascii="Times New Roman" w:hAnsi="Times New Roman" w:eastAsia="Times New Roman"/>
+          <w:b w:val="0"/>
+          <w:i w:val="0"/>
+          <w:sz w:val="28"/>
+        </w:rPr>
+        <w:t>условное расширение базового прецедента дополнительным поведением. Расширяющий прецедент выполняется не всегда, а при определённом условии (точка расширения). Стрелка: расширение → базовый, стереотип &lt;&lt;extend&gt;&gt;.</w:t>
       </w:r>
     </w:p>
     <w:p>
       <w:pPr>
-        <w:spacing w:after="120"/>
+        <w:spacing w:after="160" w:before="240" w:line="276" w:lineRule="auto"/>
       </w:pPr>
       <w:r>
         <w:rPr>
-          <w:rFonts w:ascii="Times New Roman" w:hAnsi="Times New Roman"/>
-          <w:b w:val="0"/>
-          <w:sz w:val="24"/>
+          <w:rFonts w:ascii="Times New Roman" w:hAnsi="Times New Roman" w:eastAsia="Times New Roman"/>
+          <w:b/>
+          <w:i w:val="0"/>
+          <w:sz w:val="28"/>
         </w:rPr>
-        <w:t>Функциональное тестирование — проверка соответствия поведения ПО функциональным требованиям: корректность функций, обработки данных и результатов. Оценивается «что делает» система.</w:t>
+        <w:t>Задание 3. Функциональное и юзабилити-тестирование (7–8 баллов)</w:t>
       </w:r>
     </w:p>
     <w:p>
       <w:pPr>
-        <w:spacing w:after="120"/>
+        <w:spacing w:after="120" w:line="276" w:lineRule="auto"/>
+        <w:jc w:val="both"/>
       </w:pPr>
       <w:r>
         <w:rPr>
-          <w:rFonts w:ascii="Times New Roman" w:hAnsi="Times New Roman"/>
+          <w:rFonts w:ascii="Times New Roman" w:hAnsi="Times New Roman" w:eastAsia="Times New Roman"/>
+          <w:b/>
+          <w:i w:val="0"/>
+          <w:sz w:val="28"/>
+        </w:rPr>
+        <w:t xml:space="preserve">Функциональное тестирование — </w:t>
+      </w:r>
+      <w:r>
+        <w:rPr>
+          <w:rFonts w:ascii="Times New Roman" w:hAnsi="Times New Roman" w:eastAsia="Times New Roman"/>
           <w:b w:val="0"/>
-          <w:sz w:val="24"/>
+          <w:i w:val="0"/>
+          <w:sz w:val="28"/>
         </w:rPr>
-        <w:t>Юзабилити-тестирование — проверка удобства интерфейса: насколько легко пользователь достигает целей, понятны ли элементы управления. Оцениваются понятность, эффективность, удовлетворённость.</w:t>
+        <w:t>вид тестирования, при котором проверяется, соответствует ли поведение ПО заявленным функциональным требованиям: правильно ли система выполняет функции, обрабатывает входные данные, формирует результаты и сообщения об ошибках. Оценивается «что делает» система, а не «как устроена» внутри.</w:t>
       </w:r>
     </w:p>
     <w:p>
       <w:pPr>
-        <w:pStyle w:val="Heading2"/>
+        <w:spacing w:after="120" w:line="276" w:lineRule="auto"/>
+        <w:jc w:val="both"/>
       </w:pPr>
       <w:r>
-        <w:t>Задание 4. Диаграмма последовательности</w:t>
+        <w:rPr>
+          <w:rFonts w:ascii="Times New Roman" w:hAnsi="Times New Roman" w:eastAsia="Times New Roman"/>
+          <w:b/>
+          <w:i w:val="0"/>
+          <w:sz w:val="28"/>
+        </w:rPr>
+        <w:t xml:space="preserve">Юзабилити-тестирование (usability testing) — </w:t>
+      </w:r>
+      <w:r>
+        <w:rPr>
+          <w:rFonts w:ascii="Times New Roman" w:hAnsi="Times New Roman" w:eastAsia="Times New Roman"/>
+          <w:b w:val="0"/>
+          <w:i w:val="0"/>
+          <w:sz w:val="28"/>
+        </w:rPr>
+        <w:t>вид тестирования удобства использования интерфейса: насколько легко и эффективно пользователь достигает целей, понятны ли элементы управления, насколько интуитивен сценарий работы. Оцениваются понятность, обучаемость, эффективность, удовлетворённость пользователя.</w:t>
       </w:r>
     </w:p>
     <w:p>
       <w:pPr>
-        <w:spacing w:after="120"/>
+        <w:spacing w:after="160" w:before="240" w:line="276" w:lineRule="auto"/>
       </w:pPr>
       <w:r>
         <w:rPr>
-          <w:rFonts w:ascii="Times New Roman" w:hAnsi="Times New Roman"/>
+          <w:rFonts w:ascii="Times New Roman" w:hAnsi="Times New Roman" w:eastAsia="Times New Roman"/>
+          <w:b/>
+          <w:i w:val="0"/>
+          <w:sz w:val="28"/>
+        </w:rPr>
+        <w:t>Задание 4. Диаграмма последовательности (9–10 баллов)</w:t>
+      </w:r>
+    </w:p>
+    <w:p>
+      <w:pPr>
+        <w:spacing w:after="120" w:before="0" w:line="276" w:lineRule="auto"/>
+        <w:jc w:val="both"/>
+      </w:pPr>
+      <w:r>
+        <w:rPr>
+          <w:rFonts w:ascii="Times New Roman" w:hAnsi="Times New Roman" w:eastAsia="Times New Roman"/>
           <w:b w:val="0"/>
-          <w:sz w:val="24"/>
+          <w:i w:val="0"/>
+          <w:sz w:val="28"/>
         </w:rPr>
         <w:t>Пример: оформление заказа в интернет-магазине.</w:t>
       </w:r>
     </w:p>
     <w:p>
       <w:pPr>
-        <w:spacing w:after="120"/>
+        <w:spacing w:after="120" w:before="0" w:line="276" w:lineRule="auto"/>
+        <w:jc w:val="both"/>
       </w:pPr>
       <w:r>
         <w:rPr>
-          <w:rFonts w:ascii="Times New Roman" w:hAnsi="Times New Roman"/>
+          <w:rFonts w:ascii="Times New Roman" w:hAnsi="Times New Roman" w:eastAsia="Times New Roman"/>
           <w:b w:val="0"/>
-          <w:sz w:val="24"/>
+          <w:i w:val="0"/>
+          <w:sz w:val="28"/>
         </w:rPr>
-        <w:t>Участники: Покупатель, :Интерфейс, :Корзина, :Склад, :Оплата.</w:t>
+        <w:t>Участники: актёр Покупатель; объекты :Интерфейс, :Корзина, :Склад, :Оплата.</w:t>
       </w:r>
     </w:p>
     <w:p>
       <w:pPr>
-        <w:pStyle w:val="ListBullet"/>
+        <w:spacing w:after="80" w:before="0" w:line="276" w:lineRule="auto"/>
       </w:pPr>
       <w:r>
         <w:rPr>
-          <w:rFonts w:ascii="Times New Roman" w:hAnsi="Times New Roman"/>
-          <w:sz w:val="24"/>
+          <w:rFonts w:ascii="Times New Roman" w:hAnsi="Times New Roman" w:eastAsia="Times New Roman"/>
+          <w:b/>
+          <w:i w:val="0"/>
+          <w:sz w:val="28"/>
         </w:rPr>
-        <w:t>Покупатель → Интерфейс: добавитьТовар(id)</w:t>
+        <w:t>Последовательность сообщений:</w:t>
       </w:r>
     </w:p>
     <w:p>
       <w:pPr>
-        <w:pStyle w:val="ListBullet"/>
+        <w:spacing w:after="80"/>
+        <w:ind w:left="283"/>
       </w:pPr>
       <w:r>
         <w:rPr>
-          <w:rFonts w:ascii="Times New Roman" w:hAnsi="Times New Roman"/>
-          <w:sz w:val="24"/>
+          <w:rFonts w:ascii="Courier New" w:hAnsi="Courier New" w:eastAsia="Courier New"/>
+          <w:b w:val="0"/>
+          <w:i w:val="0"/>
+          <w:sz w:val="22"/>
         </w:rPr>
-        <w:t>Интерфейс → Корзина: добавить(id)</w:t>
+        <w:t>Покупатель → Интерфейс : добавитьТовар(id)</w:t>
       </w:r>
     </w:p>
     <w:p>
       <w:pPr>
-        <w:pStyle w:val="ListBullet"/>
+        <w:spacing w:after="80"/>
+        <w:ind w:left="283"/>
       </w:pPr>
       <w:r>
         <w:rPr>
-          <w:rFonts w:ascii="Times New Roman" w:hAnsi="Times New Roman"/>
-          <w:sz w:val="24"/>
+          <w:rFonts w:ascii="Courier New" w:hAnsi="Courier New" w:eastAsia="Courier New"/>
+          <w:b w:val="0"/>
+          <w:i w:val="0"/>
+          <w:sz w:val="22"/>
         </w:rPr>
-        <w:t>Корзина → Склад: проверитьНаличие(id); Склад → Корзина: естьВНаличии</w:t>
+        <w:t>Интерфейс → Корзина : добавить(id)</w:t>
       </w:r>
     </w:p>
     <w:p>
       <w:pPr>
-        <w:pStyle w:val="ListBullet"/>
+        <w:spacing w:after="80"/>
+        <w:ind w:left="283"/>
       </w:pPr>
       <w:r>
         <w:rPr>
-          <w:rFonts w:ascii="Times New Roman" w:hAnsi="Times New Roman"/>
-          <w:sz w:val="24"/>
+          <w:rFonts w:ascii="Courier New" w:hAnsi="Courier New" w:eastAsia="Courier New"/>
+          <w:b w:val="0"/>
+          <w:i w:val="0"/>
+          <w:sz w:val="22"/>
         </w:rPr>
-        <w:t>Корзина → Интерфейс: товарДобавлен; Интерфейс → Покупатель: показатьКорзину()</w:t>
+        <w:t>Корзина → Склад : проверитьНаличие(id)</w:t>
       </w:r>
     </w:p>
     <w:p>
       <w:pPr>
-        <w:pStyle w:val="ListBullet"/>
+        <w:spacing w:after="80"/>
+        <w:ind w:left="283"/>
       </w:pPr>
       <w:r>
         <w:rPr>
-          <w:rFonts w:ascii="Times New Roman" w:hAnsi="Times New Roman"/>
-          <w:sz w:val="24"/>
+          <w:rFonts w:ascii="Courier New" w:hAnsi="Courier New" w:eastAsia="Courier New"/>
+          <w:b w:val="0"/>
+          <w:i w:val="0"/>
+          <w:sz w:val="22"/>
         </w:rPr>
-        <w:t>Покупатель → Интерфейс: оформитьЗаказ()</w:t>
+        <w:t>Склад --&gt; Корзина : естьВНаличии</w:t>
       </w:r>
     </w:p>
     <w:p>
       <w:pPr>
-        <w:pStyle w:val="ListBullet"/>
+        <w:spacing w:after="80"/>
+        <w:ind w:left="283"/>
       </w:pPr>
       <w:r>
         <w:rPr>
-          <w:rFonts w:ascii="Times New Roman" w:hAnsi="Times New Roman"/>
-          <w:sz w:val="24"/>
+          <w:rFonts w:ascii="Courier New" w:hAnsi="Courier New" w:eastAsia="Courier New"/>
+          <w:b w:val="0"/>
+          <w:i w:val="0"/>
+          <w:sz w:val="22"/>
         </w:rPr>
-        <w:t>Интерфейс → Корзина: получитьСостав(); Корзина → Интерфейс: списокТоваров</w:t>
+        <w:t>Корзина --&gt; Интерфейс : товарДобавлен</w:t>
       </w:r>
     </w:p>
     <w:p>
       <w:pPr>
-        <w:pStyle w:val="ListBullet"/>
+        <w:spacing w:after="80"/>
+        <w:ind w:left="283"/>
       </w:pPr>
       <w:r>
         <w:rPr>
-          <w:rFonts w:ascii="Times New Roman" w:hAnsi="Times New Roman"/>
-          <w:sz w:val="24"/>
+          <w:rFonts w:ascii="Courier New" w:hAnsi="Courier New" w:eastAsia="Courier New"/>
+          <w:b w:val="0"/>
+          <w:i w:val="0"/>
+          <w:sz w:val="22"/>
         </w:rPr>
-        <w:t>Интерфейс → Оплата: оплатить(сумма); Оплата → Интерфейс: успех</w:t>
+        <w:t>Интерфейс --&gt; Покупатель : показатьКорзину()</w:t>
       </w:r>
     </w:p>
     <w:p>
       <w:pPr>
-        <w:pStyle w:val="ListBullet"/>
+        <w:spacing w:after="80"/>
+        <w:ind w:left="283"/>
       </w:pPr>
       <w:r>
         <w:rPr>
-          <w:rFonts w:ascii="Times New Roman" w:hAnsi="Times New Roman"/>
-          <w:sz w:val="24"/>
+          <w:rFonts w:ascii="Courier New" w:hAnsi="Courier New" w:eastAsia="Courier New"/>
+          <w:b w:val="0"/>
+          <w:i w:val="0"/>
+          <w:sz w:val="22"/>
         </w:rPr>
-        <w:t>Интерфейс → Покупатель: заказОформлен</w:t>
       </w:r>
     </w:p>
     <w:p>
       <w:pPr>
-        <w:spacing w:after="120"/>
+        <w:spacing w:after="80"/>
+        <w:ind w:left="283"/>
       </w:pPr>
       <w:r>
         <w:rPr>
-          <w:rFonts w:ascii="Times New Roman" w:hAnsi="Times New Roman"/>
+          <w:rFonts w:ascii="Courier New" w:hAnsi="Courier New" w:eastAsia="Courier New"/>
           <w:b w:val="0"/>
-          <w:sz w:val="24"/>
+          <w:i w:val="0"/>
+          <w:sz w:val="22"/>
         </w:rPr>
-        <w:t>На чертеже: актёр и объекты с линиями жизни; сплошные стрелки — вызовы, пунктирные — возвраты; прямоугольники активации на линиях жизни.</w:t>
+        <w:t>Покупатель → Интерфейс : оформитьЗаказ()</w:t>
       </w:r>
     </w:p>
     <w:p>
       <w:pPr>
-        <w:pStyle w:val="Heading1"/>
+        <w:spacing w:after="80"/>
+        <w:ind w:left="283"/>
       </w:pPr>
       <w:r>
+        <w:rPr>
+          <w:rFonts w:ascii="Courier New" w:hAnsi="Courier New" w:eastAsia="Courier New"/>
+          <w:b w:val="0"/>
+          <w:i w:val="0"/>
+          <w:sz w:val="22"/>
+        </w:rPr>
+        <w:t>Интерфейс → Корзина : получитьСостав()</w:t>
+      </w:r>
+    </w:p>
+    <w:p>
+      <w:pPr>
+        <w:spacing w:after="80"/>
+        <w:ind w:left="283"/>
+      </w:pPr>
+      <w:r>
+        <w:rPr>
+          <w:rFonts w:ascii="Courier New" w:hAnsi="Courier New" w:eastAsia="Courier New"/>
+          <w:b w:val="0"/>
+          <w:i w:val="0"/>
+          <w:sz w:val="22"/>
+        </w:rPr>
+        <w:t>Корзина --&gt; Интерфейс : списокТоваров</w:t>
+      </w:r>
+    </w:p>
+    <w:p>
+      <w:pPr>
+        <w:spacing w:after="80"/>
+        <w:ind w:left="283"/>
+      </w:pPr>
+      <w:r>
+        <w:rPr>
+          <w:rFonts w:ascii="Courier New" w:hAnsi="Courier New" w:eastAsia="Courier New"/>
+          <w:b w:val="0"/>
+          <w:i w:val="0"/>
+          <w:sz w:val="22"/>
+        </w:rPr>
+        <w:t>Интерфейс → Оплата : оплатить(сумма)</w:t>
+      </w:r>
+    </w:p>
+    <w:p>
+      <w:pPr>
+        <w:spacing w:after="80"/>
+        <w:ind w:left="283"/>
+      </w:pPr>
+      <w:r>
+        <w:rPr>
+          <w:rFonts w:ascii="Courier New" w:hAnsi="Courier New" w:eastAsia="Courier New"/>
+          <w:b w:val="0"/>
+          <w:i w:val="0"/>
+          <w:sz w:val="22"/>
+        </w:rPr>
+        <w:t>Оплата --&gt; Интерфейс : успех</w:t>
+      </w:r>
+    </w:p>
+    <w:p>
+      <w:pPr>
+        <w:spacing w:after="80"/>
+        <w:ind w:left="283"/>
+      </w:pPr>
+      <w:r>
+        <w:rPr>
+          <w:rFonts w:ascii="Courier New" w:hAnsi="Courier New" w:eastAsia="Courier New"/>
+          <w:b w:val="0"/>
+          <w:i w:val="0"/>
+          <w:sz w:val="22"/>
+        </w:rPr>
+        <w:t>Интерфейс --&gt; Покупатель : заказОформлен</w:t>
+      </w:r>
+    </w:p>
+    <w:p>
+      <w:pPr>
+        <w:spacing w:after="120" w:before="0" w:line="276" w:lineRule="auto"/>
+        <w:jc w:val="both"/>
+      </w:pPr>
+      <w:r>
+        <w:rPr>
+          <w:rFonts w:ascii="Times New Roman" w:hAnsi="Times New Roman" w:eastAsia="Times New Roman"/>
+          <w:b w:val="0"/>
+          <w:i w:val="0"/>
+          <w:sz w:val="28"/>
+        </w:rPr>
+        <w:t>Как начертить: слева актёр, далее объекты с вертикальными линиями жизни; горизонтальные стрелки — сообщения (сплошные — вызов, пунктирные — возврат); на линиях жизни — прямоугольники активации.</w:t>
+      </w:r>
+    </w:p>
+    <w:p>
+      <w:r>
+        <w:br w:type="page"/>
+      </w:r>
+    </w:p>
+    <w:p>
+      <w:pPr>
+        <w:spacing w:after="240" w:before="360" w:line="276" w:lineRule="auto"/>
+        <w:jc w:val="center"/>
+      </w:pPr>
+      <w:r>
+        <w:rPr>
+          <w:rFonts w:ascii="Times New Roman" w:hAnsi="Times New Roman" w:eastAsia="Times New Roman"/>
+          <w:b/>
+          <w:i w:val="0"/>
+          <w:sz w:val="32"/>
+        </w:rPr>
         <w:t>ВАРИАНТ 2</w:t>
       </w:r>
     </w:p>
     <w:p>
       <w:pPr>
-        <w:pStyle w:val="Heading2"/>
+        <w:spacing w:after="160" w:before="240" w:line="276" w:lineRule="auto"/>
       </w:pPr>
       <w:r>
-        <w:t>Задание 1. Функциональное моделирование и IDEF0</w:t>
+        <w:rPr>
+          <w:rFonts w:ascii="Times New Roman" w:hAnsi="Times New Roman" w:eastAsia="Times New Roman"/>
+          <w:b/>
+          <w:i w:val="0"/>
+          <w:sz w:val="28"/>
+        </w:rPr>
+        <w:t>Задание 1. Функциональное моделирование и IDEF0 (3–4 балла)</w:t>
       </w:r>
     </w:p>
     <w:p>
       <w:pPr>
-        <w:spacing w:after="120"/>
+        <w:spacing w:after="120" w:before="0" w:line="276" w:lineRule="auto"/>
+        <w:jc w:val="both"/>
       </w:pPr>
       <w:r>
         <w:rPr>
-          <w:rFonts w:ascii="Times New Roman" w:hAnsi="Times New Roman"/>
+          <w:rFonts w:ascii="Times New Roman" w:hAnsi="Times New Roman" w:eastAsia="Times New Roman"/>
           <w:b w:val="0"/>
-          <w:sz w:val="24"/>
+          <w:i w:val="0"/>
+          <w:sz w:val="28"/>
         </w:rPr>
-        <w:t>Назначение функционального моделирования: описать систему как набор функций — что делает система, какие входы/выходы, чем управляется и какими ресурсами выполняется. Помогает анализировать процессы и требования.</w:t>
+        <w:t>Назначение функционального моделирования: описать систему как набор функций (работ), показать, что делает система, какие данные/материалы входят и выходят, чем управляется и какими ресурсами выполняется. Помогает анализировать бизнес-процессы и требования до детального проектирования ПО.</w:t>
       </w:r>
     </w:p>
     <w:p>
       <w:pPr>
-        <w:spacing w:after="120"/>
+        <w:spacing w:after="80" w:before="0" w:line="276" w:lineRule="auto"/>
       </w:pPr>
       <w:r>
         <w:rPr>
-          <w:rFonts w:ascii="Times New Roman" w:hAnsi="Times New Roman"/>
+          <w:rFonts w:ascii="Times New Roman" w:hAnsi="Times New Roman" w:eastAsia="Times New Roman"/>
           <w:b/>
-          <w:sz w:val="24"/>
+          <w:i w:val="0"/>
+          <w:sz w:val="28"/>
         </w:rPr>
         <w:t>Состав модели IDEF0:</w:t>
       </w:r>
@@ -483,424 +899,875 @@
     <w:p>
       <w:pPr>
         <w:pStyle w:val="ListBullet"/>
+        <w:spacing w:after="60"/>
       </w:pPr>
       <w:r>
         <w:rPr>
-          <w:rFonts w:ascii="Times New Roman" w:hAnsi="Times New Roman"/>
-          <w:sz w:val="24"/>
+          <w:rFonts w:ascii="Times New Roman" w:hAnsi="Times New Roman" w:eastAsia="Times New Roman"/>
+          <w:b w:val="0"/>
+          <w:i w:val="0"/>
+          <w:sz w:val="28"/>
         </w:rPr>
-        <w:t>Блоки (функции) — прямоугольники с названием «глагол + объект».</w:t>
+        <w:t>Блоки (Activity / Function) — прямоугольники, обозначающие функции. Название — глагол + объект.</w:t>
       </w:r>
     </w:p>
     <w:p>
       <w:pPr>
         <w:pStyle w:val="ListBullet"/>
+        <w:spacing w:after="60"/>
       </w:pPr>
       <w:r>
         <w:rPr>
-          <w:rFonts w:ascii="Times New Roman" w:hAnsi="Times New Roman"/>
-          <w:sz w:val="24"/>
+          <w:rFonts w:ascii="Times New Roman" w:hAnsi="Times New Roman" w:eastAsia="Times New Roman"/>
+          <w:b w:val="0"/>
+          <w:i w:val="0"/>
+          <w:sz w:val="28"/>
         </w:rPr>
-        <w:t>Стрелки входа (слева) — объекты, преобразуемые функцией.</w:t>
+        <w:t>Стрелки входа (Input) — слева: объекты, которые преобразуются функцией.</w:t>
       </w:r>
     </w:p>
     <w:p>
       <w:pPr>
         <w:pStyle w:val="ListBullet"/>
+        <w:spacing w:after="60"/>
       </w:pPr>
       <w:r>
         <w:rPr>
-          <w:rFonts w:ascii="Times New Roman" w:hAnsi="Times New Roman"/>
-          <w:sz w:val="24"/>
+          <w:rFonts w:ascii="Times New Roman" w:hAnsi="Times New Roman" w:eastAsia="Times New Roman"/>
+          <w:b w:val="0"/>
+          <w:i w:val="0"/>
+          <w:sz w:val="28"/>
         </w:rPr>
-        <w:t>Стрелки выхода (справа) — результаты.</w:t>
+        <w:t>Стрелки выхода (Output) — справа: результаты функции.</w:t>
       </w:r>
     </w:p>
     <w:p>
       <w:pPr>
         <w:pStyle w:val="ListBullet"/>
+        <w:spacing w:after="60"/>
       </w:pPr>
       <w:r>
         <w:rPr>
-          <w:rFonts w:ascii="Times New Roman" w:hAnsi="Times New Roman"/>
-          <w:sz w:val="24"/>
+          <w:rFonts w:ascii="Times New Roman" w:hAnsi="Times New Roman" w:eastAsia="Times New Roman"/>
+          <w:b w:val="0"/>
+          <w:i w:val="0"/>
+          <w:sz w:val="28"/>
         </w:rPr>
-        <w:t>Стрелки управления (сверху) — правила, стандарты, ограничения.</w:t>
+        <w:t>Стрелки управления (Control) — сверху: правила, стандарты, ограничения.</w:t>
       </w:r>
     </w:p>
     <w:p>
       <w:pPr>
         <w:pStyle w:val="ListBullet"/>
+        <w:spacing w:after="60"/>
       </w:pPr>
       <w:r>
         <w:rPr>
-          <w:rFonts w:ascii="Times New Roman" w:hAnsi="Times New Roman"/>
-          <w:sz w:val="24"/>
+          <w:rFonts w:ascii="Times New Roman" w:hAnsi="Times New Roman" w:eastAsia="Times New Roman"/>
+          <w:b w:val="0"/>
+          <w:i w:val="0"/>
+          <w:sz w:val="28"/>
         </w:rPr>
-        <w:t>Стрелки механизмов (снизу) — исполнители, оборудование, ПО.</w:t>
+        <w:t>Стрелки механизмов (Mechanism) — снизу: ресурсы, исполнители, оборудование, ПО.</w:t>
       </w:r>
     </w:p>
     <w:p>
       <w:pPr>
         <w:pStyle w:val="ListBullet"/>
+        <w:spacing w:after="60"/>
       </w:pPr>
       <w:r>
         <w:rPr>
-          <w:rFonts w:ascii="Times New Roman" w:hAnsi="Times New Roman"/>
-          <w:sz w:val="24"/>
+          <w:rFonts w:ascii="Times New Roman" w:hAnsi="Times New Roman" w:eastAsia="Times New Roman"/>
+          <w:b w:val="0"/>
+          <w:i w:val="0"/>
+          <w:sz w:val="28"/>
         </w:rPr>
-        <w:t>Иерархия декомпозиции (A0 → A1, A2…), глоссарий, цель и точка зрения.</w:t>
+        <w:t>Иерархия диаграмм — декомпозиция: A0 → A1, A2… → A11, A12…</w:t>
       </w:r>
     </w:p>
     <w:p>
       <w:pPr>
-        <w:spacing w:after="120"/>
+        <w:pStyle w:val="ListBullet"/>
+        <w:spacing w:after="60"/>
       </w:pPr>
       <w:r>
         <w:rPr>
-          <w:rFonts w:ascii="Times New Roman" w:hAnsi="Times New Roman"/>
+          <w:rFonts w:ascii="Times New Roman" w:hAnsi="Times New Roman" w:eastAsia="Times New Roman"/>
           <w:b w:val="0"/>
-          <w:sz w:val="24"/>
+          <w:i w:val="0"/>
+          <w:sz w:val="28"/>
         </w:rPr>
-        <w:t>Контекстная диаграмма — верхний уровень: один функциональный блок (вся система) и внешние стрелки. Определяет границы системы и взаимодействие с окружением.</w:t>
+        <w:t>Глоссарий, цель и точка зрения модели.</w:t>
       </w:r>
     </w:p>
     <w:p>
       <w:pPr>
-        <w:pStyle w:val="Heading2"/>
+        <w:spacing w:after="120" w:line="276" w:lineRule="auto"/>
+        <w:jc w:val="both"/>
       </w:pPr>
       <w:r>
-        <w:t>Задание 2. Инкапсуляция, наследование, полиморфизм</w:t>
+        <w:rPr>
+          <w:rFonts w:ascii="Times New Roman" w:hAnsi="Times New Roman" w:eastAsia="Times New Roman"/>
+          <w:b/>
+          <w:i w:val="0"/>
+          <w:sz w:val="28"/>
+        </w:rPr>
+        <w:t xml:space="preserve">Контекстная диаграмма (A-0): </w:t>
+      </w:r>
+      <w:r>
+        <w:rPr>
+          <w:rFonts w:ascii="Times New Roman" w:hAnsi="Times New Roman" w:eastAsia="Times New Roman"/>
+          <w:b w:val="0"/>
+          <w:i w:val="0"/>
+          <w:sz w:val="28"/>
+        </w:rPr>
+        <w:t>верхний уровень модели IDEF0 — один функциональный блок, представляющий систему целиком, и внешние стрелки (входы, выходы, управление, механизмы), связывающие систему с окружением. Определяет границы моделируемой системы. Дальнейшие диаграммы — декомпозиция этого блока.</w:t>
       </w:r>
     </w:p>
     <w:p>
       <w:pPr>
-        <w:spacing w:after="120"/>
+        <w:spacing w:after="160" w:before="240" w:line="276" w:lineRule="auto"/>
       </w:pPr>
       <w:r>
         <w:rPr>
-          <w:rFonts w:ascii="Times New Roman" w:hAnsi="Times New Roman"/>
-          <w:b w:val="0"/>
-          <w:sz w:val="24"/>
+          <w:rFonts w:ascii="Times New Roman" w:hAnsi="Times New Roman" w:eastAsia="Times New Roman"/>
+          <w:b/>
+          <w:i w:val="0"/>
+          <w:sz w:val="28"/>
         </w:rPr>
-        <w:t>Инкапсуляция — объединение данных и методов в объекте и сокрытие реализации; доступ через публичный интерфейс.</w:t>
+        <w:t>Задание 2. Инкапсуляция, наследование, полиморфизм (5–6 баллов)</w:t>
       </w:r>
     </w:p>
     <w:p>
       <w:pPr>
-        <w:spacing w:after="120"/>
+        <w:spacing w:after="120" w:line="276" w:lineRule="auto"/>
+        <w:jc w:val="both"/>
       </w:pPr>
       <w:r>
         <w:rPr>
-          <w:rFonts w:ascii="Times New Roman" w:hAnsi="Times New Roman"/>
+          <w:rFonts w:ascii="Times New Roman" w:hAnsi="Times New Roman" w:eastAsia="Times New Roman"/>
+          <w:b/>
+          <w:i w:val="0"/>
+          <w:sz w:val="28"/>
+        </w:rPr>
+        <w:t xml:space="preserve">Инкапсуляция — </w:t>
+      </w:r>
+      <w:r>
+        <w:rPr>
+          <w:rFonts w:ascii="Times New Roman" w:hAnsi="Times New Roman" w:eastAsia="Times New Roman"/>
           <w:b w:val="0"/>
-          <w:sz w:val="24"/>
+          <w:i w:val="0"/>
+          <w:sz w:val="28"/>
         </w:rPr>
-        <w:t>Наследование — потомок получает свойства и поведение предка и может их расширять/переопределять; повторное использование и иерархии «общее → частное».</w:t>
+        <w:t>объединение данных и методов, работающих с этими данными, в одном объекте (классе) и сокрытие внутренней реализации от внешнего кода. Доступ к состоянию объекта предоставляется через публичный интерфейс (методы), что повышает надёжность и упрощает изменение реализации.</w:t>
       </w:r>
     </w:p>
     <w:p>
       <w:pPr>
-        <w:spacing w:after="120"/>
+        <w:spacing w:after="120" w:line="276" w:lineRule="auto"/>
+        <w:jc w:val="both"/>
       </w:pPr>
       <w:r>
         <w:rPr>
-          <w:rFonts w:ascii="Times New Roman" w:hAnsi="Times New Roman"/>
+          <w:rFonts w:ascii="Times New Roman" w:hAnsi="Times New Roman" w:eastAsia="Times New Roman"/>
+          <w:b/>
+          <w:i w:val="0"/>
+          <w:sz w:val="28"/>
+        </w:rPr>
+        <w:t xml:space="preserve">Наследование — </w:t>
+      </w:r>
+      <w:r>
+        <w:rPr>
+          <w:rFonts w:ascii="Times New Roman" w:hAnsi="Times New Roman" w:eastAsia="Times New Roman"/>
           <w:b w:val="0"/>
-          <w:sz w:val="24"/>
+          <w:i w:val="0"/>
+          <w:sz w:val="28"/>
         </w:rPr>
-        <w:t>Полиморфизм — объекты разных классов по-разному реагируют на одно сообщение (один интерфейс — много реализаций).</w:t>
+        <w:t>механизм ООП, при котором класс-потомок получает свойства и поведение класса-предка и может дополнять или переопределять их. Обеспечивает повторное использование кода и построение иерархий «общее → частное» (например, Транспорт → Автомобиль).</w:t>
       </w:r>
     </w:p>
     <w:p>
       <w:pPr>
-        <w:pStyle w:val="Heading2"/>
+        <w:spacing w:after="120" w:line="276" w:lineRule="auto"/>
+        <w:jc w:val="both"/>
       </w:pPr>
       <w:r>
-        <w:t>Задание 3. Диаграмма классов</w:t>
+        <w:rPr>
+          <w:rFonts w:ascii="Times New Roman" w:hAnsi="Times New Roman" w:eastAsia="Times New Roman"/>
+          <w:b/>
+          <w:i w:val="0"/>
+          <w:sz w:val="28"/>
+        </w:rPr>
+        <w:t xml:space="preserve">Полиморфизм — </w:t>
+      </w:r>
+      <w:r>
+        <w:rPr>
+          <w:rFonts w:ascii="Times New Roman" w:hAnsi="Times New Roman" w:eastAsia="Times New Roman"/>
+          <w:b w:val="0"/>
+          <w:i w:val="0"/>
+          <w:sz w:val="28"/>
+        </w:rPr>
+        <w:t>способность объектов разных классов реагировать на одно и то же сообщение (вызов метода) по-разному. На практике — переопределение методов в потомках и вызов через ссылку на базовый тип: один интерфейс — множество реализаций.</w:t>
       </w:r>
     </w:p>
     <w:p>
       <w:pPr>
-        <w:spacing w:after="120"/>
+        <w:spacing w:after="160" w:before="240" w:line="276" w:lineRule="auto"/>
       </w:pPr>
       <w:r>
         <w:rPr>
-          <w:rFonts w:ascii="Times New Roman" w:hAnsi="Times New Roman"/>
-          <w:b w:val="0"/>
-          <w:sz w:val="24"/>
+          <w:rFonts w:ascii="Times New Roman" w:hAnsi="Times New Roman" w:eastAsia="Times New Roman"/>
+          <w:b/>
+          <w:i w:val="0"/>
+          <w:sz w:val="28"/>
         </w:rPr>
-        <w:t>Назначение: статическая структура системы — классы, атрибуты, операции и отношения между ними.</w:t>
+        <w:t>Задание 3. Диаграмма классов (7–8 баллов)</w:t>
       </w:r>
     </w:p>
     <w:p>
       <w:pPr>
-        <w:spacing w:after="120"/>
+        <w:spacing w:after="120" w:before="0" w:line="276" w:lineRule="auto"/>
+        <w:jc w:val="both"/>
       </w:pPr>
       <w:r>
         <w:rPr>
-          <w:rFonts w:ascii="Times New Roman" w:hAnsi="Times New Roman"/>
+          <w:rFonts w:ascii="Times New Roman" w:hAnsi="Times New Roman" w:eastAsia="Times New Roman"/>
           <w:b w:val="0"/>
-          <w:sz w:val="24"/>
+          <w:i w:val="0"/>
+          <w:sz w:val="28"/>
         </w:rPr>
-        <w:t>Класс — описание множества объектов с общей структурой и поведением (три секции: имя, атрибуты, методы).</w:t>
+        <w:t>Назначение диаграммы классов: показать статическую структуру системы — классы, их атрибуты и операции, а также отношения между классами (ассоциация, агрегация, композиция, наследование, зависимость, реализация интерфейса). Используется на этапе проектирования ОО-систем.</w:t>
       </w:r>
     </w:p>
     <w:p>
       <w:pPr>
-        <w:spacing w:after="120"/>
+        <w:spacing w:after="120" w:line="276" w:lineRule="auto"/>
+        <w:jc w:val="both"/>
       </w:pPr>
       <w:r>
         <w:rPr>
-          <w:rFonts w:ascii="Times New Roman" w:hAnsi="Times New Roman"/>
+          <w:rFonts w:ascii="Times New Roman" w:hAnsi="Times New Roman" w:eastAsia="Times New Roman"/>
+          <w:b/>
+          <w:i w:val="0"/>
+          <w:sz w:val="28"/>
+        </w:rPr>
+        <w:t xml:space="preserve">Класс — </w:t>
+      </w:r>
+      <w:r>
+        <w:rPr>
+          <w:rFonts w:ascii="Times New Roman" w:hAnsi="Times New Roman" w:eastAsia="Times New Roman"/>
           <w:b w:val="0"/>
-          <w:sz w:val="24"/>
+          <w:i w:val="0"/>
+          <w:sz w:val="28"/>
         </w:rPr>
-        <w:t>Интерфейс — контракт операций без реализации; класс обязуется его реализовать.</w:t>
+        <w:t>описание множества объектов с одинаковой структурой (атрибуты), поведением (операции) и семантикой. На диаграмме — прямоугольник из трёх секций: имя, атрибуты, методы.</w:t>
       </w:r>
     </w:p>
     <w:p>
       <w:pPr>
-        <w:spacing w:after="120"/>
+        <w:spacing w:after="120" w:line="276" w:lineRule="auto"/>
+        <w:jc w:val="both"/>
       </w:pPr>
       <w:r>
         <w:rPr>
-          <w:rFonts w:ascii="Times New Roman" w:hAnsi="Times New Roman"/>
+          <w:rFonts w:ascii="Times New Roman" w:hAnsi="Times New Roman" w:eastAsia="Times New Roman"/>
+          <w:b/>
+          <w:i w:val="0"/>
+          <w:sz w:val="28"/>
+        </w:rPr>
+        <w:t xml:space="preserve">Интерфейс — </w:t>
+      </w:r>
+      <w:r>
+        <w:rPr>
+          <w:rFonts w:ascii="Times New Roman" w:hAnsi="Times New Roman" w:eastAsia="Times New Roman"/>
           <w:b w:val="0"/>
-          <w:sz w:val="24"/>
+          <w:i w:val="0"/>
+          <w:sz w:val="28"/>
         </w:rPr>
-        <w:t>Виды видимости: + public (всем), − private (только класс), # protected (класс и потомки), ~ package (пакет).</w:t>
+        <w:t>контракт (набор операций без реализации), который обязуются реализовать классы. Задаёт «что умеет» объект, не указывая «как». Обозначается кругом («леденец») или прямоугольником со стереотипом &lt;&lt;interface&gt;&gt;.</w:t>
       </w:r>
     </w:p>
     <w:p>
       <w:pPr>
-        <w:spacing w:after="120"/>
+        <w:spacing w:after="80" w:before="0" w:line="276" w:lineRule="auto"/>
       </w:pPr>
       <w:r>
         <w:rPr>
-          <w:rFonts w:ascii="Times New Roman" w:hAnsi="Times New Roman"/>
-          <w:b w:val="0"/>
-          <w:sz w:val="24"/>
+          <w:rFonts w:ascii="Times New Roman" w:hAnsi="Times New Roman" w:eastAsia="Times New Roman"/>
+          <w:b/>
+          <w:i w:val="0"/>
+          <w:sz w:val="28"/>
         </w:rPr>
-        <w:t>Множественность: 1; 0..1; * (0..*); 1..*; конкретные диапазоны (например 2..4). Пример: Заказ 1 — 1..* ПозицияЗаказа.</w:t>
+        <w:t>Виды видимости:</w:t>
       </w:r>
     </w:p>
     <w:p>
       <w:pPr>
-        <w:pStyle w:val="Heading2"/>
+        <w:pStyle w:val="ListBullet"/>
+        <w:spacing w:after="60"/>
       </w:pPr>
       <w:r>
-        <w:t>Задание 4. Диаграмма прецедентов</w:t>
+        <w:rPr>
+          <w:rFonts w:ascii="Times New Roman" w:hAnsi="Times New Roman" w:eastAsia="Times New Roman"/>
+          <w:b w:val="0"/>
+          <w:i w:val="0"/>
+          <w:sz w:val="28"/>
+        </w:rPr>
+        <w:t>+ public — доступно всем;</w:t>
       </w:r>
     </w:p>
     <w:p>
       <w:pPr>
-        <w:spacing w:after="120"/>
+        <w:pStyle w:val="ListBullet"/>
+        <w:spacing w:after="60"/>
       </w:pPr>
       <w:r>
         <w:rPr>
-          <w:rFonts w:ascii="Times New Roman" w:hAnsi="Times New Roman"/>
+          <w:rFonts w:ascii="Times New Roman" w:hAnsi="Times New Roman" w:eastAsia="Times New Roman"/>
           <w:b w:val="0"/>
-          <w:sz w:val="24"/>
+          <w:i w:val="0"/>
+          <w:sz w:val="28"/>
         </w:rPr>
-        <w:t>Пример: система «Библиотека». Актёры: Читатель, Библиотекарь, Система уведомлений.</w:t>
+        <w:t>− private — только внутри класса;</w:t>
       </w:r>
     </w:p>
     <w:p>
       <w:pPr>
-        <w:spacing w:after="120"/>
+        <w:pStyle w:val="ListBullet"/>
+        <w:spacing w:after="60"/>
       </w:pPr>
       <w:r>
         <w:rPr>
-          <w:rFonts w:ascii="Times New Roman" w:hAnsi="Times New Roman"/>
+          <w:rFonts w:ascii="Times New Roman" w:hAnsi="Times New Roman" w:eastAsia="Times New Roman"/>
           <w:b w:val="0"/>
-          <w:sz w:val="24"/>
+          <w:i w:val="0"/>
+          <w:sz w:val="28"/>
         </w:rPr>
-        <w:t>Прецеденты: Поиск книги, Заказать книгу, Получить книгу, Вернуть книгу, Зарегистрировать читателя, Списать книгу, Отправить напоминание.</w:t>
+        <w:t># protected — класс и потомки;</w:t>
       </w:r>
     </w:p>
     <w:p>
       <w:pPr>
-        <w:spacing w:after="120"/>
+        <w:pStyle w:val="ListBullet"/>
+        <w:spacing w:after="60"/>
       </w:pPr>
       <w:r>
         <w:rPr>
-          <w:rFonts w:ascii="Times New Roman" w:hAnsi="Times New Roman"/>
+          <w:rFonts w:ascii="Times New Roman" w:hAnsi="Times New Roman" w:eastAsia="Times New Roman"/>
           <w:b w:val="0"/>
-          <w:sz w:val="24"/>
+          <w:i w:val="0"/>
+          <w:sz w:val="28"/>
         </w:rPr>
-        <w:t>Связи: Читатель — поиск/заказ/получение/возврат; Библиотекарь — регистрация, списание, выдача, возврат; Заказать &lt;&lt;include&gt;&gt; Поиск; Отправить напоминание &lt;&lt;extend&gt;&gt; Вернуть книгу.</w:t>
+        <w:t>~ package — в пределах пакета.</w:t>
       </w:r>
     </w:p>
     <w:p>
       <w:pPr>
-        <w:spacing w:after="120"/>
+        <w:spacing w:after="80" w:before="0" w:line="276" w:lineRule="auto"/>
       </w:pPr>
       <w:r>
         <w:rPr>
-          <w:rFonts w:ascii="Times New Roman" w:hAnsi="Times New Roman"/>
-          <w:b w:val="0"/>
-          <w:sz w:val="24"/>
+          <w:rFonts w:ascii="Times New Roman" w:hAnsi="Times New Roman" w:eastAsia="Times New Roman"/>
+          <w:b/>
+          <w:i w:val="0"/>
+          <w:sz w:val="28"/>
         </w:rPr>
-        <w:t>На чертеже: прямоугольник границы системы, актёры снаружи, овалы внутри, ассоциации и пунктирные &lt;&lt;include&gt;&gt;/&lt;&lt;extend&gt;&gt;.</w:t>
+        <w:t>Множественность отношений:</w:t>
       </w:r>
     </w:p>
     <w:p>
       <w:pPr>
-        <w:pStyle w:val="Heading1"/>
+        <w:pStyle w:val="ListBullet"/>
+        <w:spacing w:after="60"/>
       </w:pPr>
       <w:r>
+        <w:rPr>
+          <w:rFonts w:ascii="Times New Roman" w:hAnsi="Times New Roman" w:eastAsia="Times New Roman"/>
+          <w:b w:val="0"/>
+          <w:i w:val="0"/>
+          <w:sz w:val="28"/>
+        </w:rPr>
+        <w:t>1 — ровно один; 0..1 — ноль или один;</w:t>
+      </w:r>
+    </w:p>
+    <w:p>
+      <w:pPr>
+        <w:pStyle w:val="ListBullet"/>
+        <w:spacing w:after="60"/>
+      </w:pPr>
+      <w:r>
+        <w:rPr>
+          <w:rFonts w:ascii="Times New Roman" w:hAnsi="Times New Roman" w:eastAsia="Times New Roman"/>
+          <w:b w:val="0"/>
+          <w:i w:val="0"/>
+          <w:sz w:val="28"/>
+        </w:rPr>
+        <w:t>* или 0..* — ноль или много; 1..* — один или много;</w:t>
+      </w:r>
+    </w:p>
+    <w:p>
+      <w:pPr>
+        <w:pStyle w:val="ListBullet"/>
+        <w:spacing w:after="60"/>
+      </w:pPr>
+      <w:r>
+        <w:rPr>
+          <w:rFonts w:ascii="Times New Roman" w:hAnsi="Times New Roman" w:eastAsia="Times New Roman"/>
+          <w:b w:val="0"/>
+          <w:i w:val="0"/>
+          <w:sz w:val="28"/>
+        </w:rPr>
+        <w:t>2..4 — от 2 до 4 и т.п.</w:t>
+      </w:r>
+    </w:p>
+    <w:p>
+      <w:pPr>
+        <w:spacing w:after="120" w:before="0" w:line="276" w:lineRule="auto"/>
+        <w:jc w:val="both"/>
+      </w:pPr>
+      <w:r>
+        <w:rPr>
+          <w:rFonts w:ascii="Times New Roman" w:hAnsi="Times New Roman" w:eastAsia="Times New Roman"/>
+          <w:b w:val="0"/>
+          <w:i w:val="0"/>
+          <w:sz w:val="28"/>
+        </w:rPr>
+        <w:t>Пример: Заказ 1 —— 1..* ПозицияЗаказа — у заказа одна или несколько позиций.</w:t>
+      </w:r>
+    </w:p>
+    <w:p>
+      <w:pPr>
+        <w:spacing w:after="160" w:before="240" w:line="276" w:lineRule="auto"/>
+      </w:pPr>
+      <w:r>
+        <w:rPr>
+          <w:rFonts w:ascii="Times New Roman" w:hAnsi="Times New Roman" w:eastAsia="Times New Roman"/>
+          <w:b/>
+          <w:i w:val="0"/>
+          <w:sz w:val="28"/>
+        </w:rPr>
+        <w:t>Задание 4. Диаграмма прецедентов (9–10 баллов)</w:t>
+      </w:r>
+    </w:p>
+    <w:p>
+      <w:pPr>
+        <w:spacing w:after="120" w:before="0" w:line="276" w:lineRule="auto"/>
+        <w:jc w:val="both"/>
+      </w:pPr>
+      <w:r>
+        <w:rPr>
+          <w:rFonts w:ascii="Times New Roman" w:hAnsi="Times New Roman" w:eastAsia="Times New Roman"/>
+          <w:b w:val="0"/>
+          <w:i w:val="0"/>
+          <w:sz w:val="28"/>
+        </w:rPr>
+        <w:t>Пример: система «Библиотека».</w:t>
+      </w:r>
+    </w:p>
+    <w:p>
+      <w:pPr>
+        <w:spacing w:after="120" w:before="0" w:line="276" w:lineRule="auto"/>
+        <w:jc w:val="both"/>
+      </w:pPr>
+      <w:r>
+        <w:rPr>
+          <w:rFonts w:ascii="Times New Roman" w:hAnsi="Times New Roman" w:eastAsia="Times New Roman"/>
+          <w:b w:val="0"/>
+          <w:i w:val="0"/>
+          <w:sz w:val="28"/>
+        </w:rPr>
+        <w:t>Актёры: Читатель, Библиотекарь, Система уведомлений.</w:t>
+      </w:r>
+    </w:p>
+    <w:p>
+      <w:pPr>
+        <w:spacing w:after="120" w:before="0" w:line="276" w:lineRule="auto"/>
+        <w:jc w:val="both"/>
+      </w:pPr>
+      <w:r>
+        <w:rPr>
+          <w:rFonts w:ascii="Times New Roman" w:hAnsi="Times New Roman" w:eastAsia="Times New Roman"/>
+          <w:b w:val="0"/>
+          <w:i w:val="0"/>
+          <w:sz w:val="28"/>
+        </w:rPr>
+        <w:t>Прецеденты: Поиск книги; Заказать книгу; Получить книгу; Вернуть книгу; Зарегистрировать читателя; Списать книгу; Отправить напоминание.</w:t>
+      </w:r>
+    </w:p>
+    <w:p>
+      <w:pPr>
+        <w:spacing w:after="80" w:before="0" w:line="276" w:lineRule="auto"/>
+      </w:pPr>
+      <w:r>
+        <w:rPr>
+          <w:rFonts w:ascii="Times New Roman" w:hAnsi="Times New Roman" w:eastAsia="Times New Roman"/>
+          <w:b/>
+          <w:i w:val="0"/>
+          <w:sz w:val="28"/>
+        </w:rPr>
+        <w:t>Связи:</w:t>
+      </w:r>
+    </w:p>
+    <w:p>
+      <w:pPr>
+        <w:pStyle w:val="ListBullet"/>
+        <w:spacing w:after="60"/>
+      </w:pPr>
+      <w:r>
+        <w:rPr>
+          <w:rFonts w:ascii="Times New Roman" w:hAnsi="Times New Roman" w:eastAsia="Times New Roman"/>
+          <w:b w:val="0"/>
+          <w:i w:val="0"/>
+          <w:sz w:val="28"/>
+        </w:rPr>
+        <w:t>Читатель → Поиск книги, Заказать книгу, Получить книгу, Вернуть книгу;</w:t>
+      </w:r>
+    </w:p>
+    <w:p>
+      <w:pPr>
+        <w:pStyle w:val="ListBullet"/>
+        <w:spacing w:after="60"/>
+      </w:pPr>
+      <w:r>
+        <w:rPr>
+          <w:rFonts w:ascii="Times New Roman" w:hAnsi="Times New Roman" w:eastAsia="Times New Roman"/>
+          <w:b w:val="0"/>
+          <w:i w:val="0"/>
+          <w:sz w:val="28"/>
+        </w:rPr>
+        <w:t>Библиотекарь → Зарегистрировать читателя, Списать книгу, Получить книгу, Вернуть книгу;</w:t>
+      </w:r>
+    </w:p>
+    <w:p>
+      <w:pPr>
+        <w:pStyle w:val="ListBullet"/>
+        <w:spacing w:after="60"/>
+      </w:pPr>
+      <w:r>
+        <w:rPr>
+          <w:rFonts w:ascii="Times New Roman" w:hAnsi="Times New Roman" w:eastAsia="Times New Roman"/>
+          <w:b w:val="0"/>
+          <w:i w:val="0"/>
+          <w:sz w:val="28"/>
+        </w:rPr>
+        <w:t>Заказать книгу &lt;&lt;include&gt;&gt; Поиск книги;</w:t>
+      </w:r>
+    </w:p>
+    <w:p>
+      <w:pPr>
+        <w:pStyle w:val="ListBullet"/>
+        <w:spacing w:after="60"/>
+      </w:pPr>
+      <w:r>
+        <w:rPr>
+          <w:rFonts w:ascii="Times New Roman" w:hAnsi="Times New Roman" w:eastAsia="Times New Roman"/>
+          <w:b w:val="0"/>
+          <w:i w:val="0"/>
+          <w:sz w:val="28"/>
+        </w:rPr>
+        <w:t>Отправить напоминание &lt;&lt;extend&gt;&gt; Вернуть книгу.</w:t>
+      </w:r>
+    </w:p>
+    <w:p>
+      <w:pPr>
+        <w:spacing w:after="120" w:before="0" w:line="276" w:lineRule="auto"/>
+        <w:jc w:val="both"/>
+      </w:pPr>
+      <w:r>
+        <w:rPr>
+          <w:rFonts w:ascii="Times New Roman" w:hAnsi="Times New Roman" w:eastAsia="Times New Roman"/>
+          <w:b w:val="0"/>
+          <w:i w:val="0"/>
+          <w:sz w:val="28"/>
+        </w:rPr>
+        <w:t>Как начертить: граница системы — прямоугольник; актёры снаружи; овалы прецедентов внутри; линии ассоциаций; пунктирные стрелки &lt;&lt;include&gt;&gt; / &lt;&lt;extend&gt;&gt;.</w:t>
+      </w:r>
+    </w:p>
+    <w:p>
+      <w:r>
+        <w:br w:type="page"/>
+      </w:r>
+    </w:p>
+    <w:p>
+      <w:pPr>
+        <w:spacing w:after="240" w:before="360" w:line="276" w:lineRule="auto"/>
+        <w:jc w:val="center"/>
+      </w:pPr>
+      <w:r>
+        <w:rPr>
+          <w:rFonts w:ascii="Times New Roman" w:hAnsi="Times New Roman" w:eastAsia="Times New Roman"/>
+          <w:b/>
+          <w:i w:val="0"/>
+          <w:sz w:val="32"/>
+        </w:rPr>
         <w:t>ВАРИАНТ 3</w:t>
       </w:r>
     </w:p>
     <w:p>
       <w:pPr>
-        <w:pStyle w:val="Heading2"/>
+        <w:spacing w:after="160" w:before="240" w:line="276" w:lineRule="auto"/>
       </w:pPr>
       <w:r>
-        <w:t>Задание 1. Диаграмма последовательности</w:t>
+        <w:rPr>
+          <w:rFonts w:ascii="Times New Roman" w:hAnsi="Times New Roman" w:eastAsia="Times New Roman"/>
+          <w:b/>
+          <w:i w:val="0"/>
+          <w:sz w:val="28"/>
+        </w:rPr>
+        <w:t>Задание 1. Диаграмма последовательности (3–4 балла)</w:t>
       </w:r>
     </w:p>
     <w:p>
       <w:pPr>
-        <w:spacing w:after="120"/>
+        <w:spacing w:after="120" w:before="0" w:line="276" w:lineRule="auto"/>
+        <w:jc w:val="both"/>
       </w:pPr>
       <w:r>
         <w:rPr>
-          <w:rFonts w:ascii="Times New Roman" w:hAnsi="Times New Roman"/>
+          <w:rFonts w:ascii="Times New Roman" w:hAnsi="Times New Roman" w:eastAsia="Times New Roman"/>
           <w:b w:val="0"/>
-          <w:sz w:val="24"/>
+          <w:i w:val="0"/>
+          <w:sz w:val="28"/>
         </w:rPr>
-        <w:t>Назначение: показать взаимодействие объектов во времени — какие сообщения и в каком порядке при выполнении сценария.</w:t>
+        <w:t>Назначение: показать взаимодействие объектов во времени — какие сообщения и в какой последовательности обмениваются объекты (и актёры) при выполнении сценария. Удобна для уточнения динамики прецедента и проектирования вызовов между компонентами.</w:t>
       </w:r>
     </w:p>
     <w:p>
       <w:pPr>
-        <w:spacing w:after="120"/>
+        <w:spacing w:after="80" w:before="0" w:line="276" w:lineRule="auto"/>
       </w:pPr>
       <w:r>
         <w:rPr>
-          <w:rFonts w:ascii="Times New Roman" w:hAnsi="Times New Roman"/>
-          <w:b w:val="0"/>
-          <w:sz w:val="24"/>
+          <w:rFonts w:ascii="Times New Roman" w:hAnsi="Times New Roman" w:eastAsia="Times New Roman"/>
+          <w:b/>
+          <w:i w:val="0"/>
+          <w:sz w:val="28"/>
         </w:rPr>
-        <w:t>Элементы: объекты (прямоугольники вверху), линии жизни (вертикальный пунктир), сообщения (горизонтальные стрелки; порядок сверху вниз), активации (узкие прямоугольники).</w:t>
+        <w:t>Основные элементы:</w:t>
       </w:r>
     </w:p>
     <w:p>
       <w:pPr>
-        <w:spacing w:after="120"/>
+        <w:pStyle w:val="ListBullet"/>
+        <w:spacing w:after="60"/>
       </w:pPr>
       <w:r>
         <w:rPr>
-          <w:rFonts w:ascii="Times New Roman" w:hAnsi="Times New Roman"/>
+          <w:rFonts w:ascii="Times New Roman" w:hAnsi="Times New Roman" w:eastAsia="Times New Roman"/>
           <w:b w:val="0"/>
-          <w:sz w:val="24"/>
+          <w:i w:val="0"/>
+          <w:sz w:val="28"/>
         </w:rPr>
-        <w:t>Синхронные сообщения — отправитель ждёт ответа (сплошная стрелка с закрашенным наконечником); обычные вызовы методов.</w:t>
+        <w:t>Объекты (роли/лифлайны) — участники взаимодействия; прямоугольник вверху (имя:Класс или :Класс).</w:t>
       </w:r>
     </w:p>
     <w:p>
       <w:pPr>
-        <w:spacing w:after="120"/>
+        <w:pStyle w:val="ListBullet"/>
+        <w:spacing w:after="60"/>
       </w:pPr>
       <w:r>
         <w:rPr>
-          <w:rFonts w:ascii="Times New Roman" w:hAnsi="Times New Roman"/>
+          <w:rFonts w:ascii="Times New Roman" w:hAnsi="Times New Roman" w:eastAsia="Times New Roman"/>
           <w:b w:val="0"/>
-          <w:sz w:val="24"/>
+          <w:i w:val="0"/>
+          <w:sz w:val="28"/>
         </w:rPr>
-        <w:t>Асинхронные сообщения — отправитель не ждёт ответа (открытый наконечник); события, сигналы, уведомления.</w:t>
+        <w:t>Линии жизни (lifelines) — вертикальные пунктирные линии вниз от объектов; показывают время участия объекта.</w:t>
       </w:r>
     </w:p>
     <w:p>
       <w:pPr>
-        <w:pStyle w:val="Heading2"/>
+        <w:pStyle w:val="ListBullet"/>
+        <w:spacing w:after="60"/>
       </w:pPr>
       <w:r>
-        <w:t>Задание 2. Управление конфигурацией ПО</w:t>
+        <w:rPr>
+          <w:rFonts w:ascii="Times New Roman" w:hAnsi="Times New Roman" w:eastAsia="Times New Roman"/>
+          <w:b w:val="0"/>
+          <w:i w:val="0"/>
+          <w:sz w:val="28"/>
+        </w:rPr>
+        <w:t>Сообщения — горизонтальные стрелки между линиями жизни с именем операции; порядок сверху вниз = порядок во времени.</w:t>
       </w:r>
     </w:p>
     <w:p>
       <w:pPr>
-        <w:spacing w:after="120"/>
+        <w:pStyle w:val="ListBullet"/>
+        <w:spacing w:after="60"/>
       </w:pPr>
       <w:r>
         <w:rPr>
-          <w:rFonts w:ascii="Times New Roman" w:hAnsi="Times New Roman"/>
+          <w:rFonts w:ascii="Times New Roman" w:hAnsi="Times New Roman" w:eastAsia="Times New Roman"/>
           <w:b w:val="0"/>
-          <w:sz w:val="24"/>
+          <w:i w:val="0"/>
+          <w:sz w:val="28"/>
         </w:rPr>
-        <w:t>Управление конфигурацией ПО (SCM) — идентификация, контроль изменений, учёт состояния и аудит элементов конфигурации на протяжении ЖЦ; возможность воспроизвести любую сборку/релиз.</w:t>
+        <w:t>Активация — узкий прямоугольник на линии жизни на время выполнения операции.</w:t>
       </w:r>
     </w:p>
     <w:p>
       <w:pPr>
-        <w:spacing w:after="120"/>
+        <w:spacing w:after="120" w:line="276" w:lineRule="auto"/>
+        <w:jc w:val="both"/>
       </w:pPr>
       <w:r>
         <w:rPr>
-          <w:rFonts w:ascii="Times New Roman" w:hAnsi="Times New Roman"/>
+          <w:rFonts w:ascii="Times New Roman" w:hAnsi="Times New Roman" w:eastAsia="Times New Roman"/>
+          <w:b/>
+          <w:i w:val="0"/>
+          <w:sz w:val="28"/>
+        </w:rPr>
+        <w:t xml:space="preserve">Синхронные сообщения: </w:t>
+      </w:r>
+      <w:r>
+        <w:rPr>
+          <w:rFonts w:ascii="Times New Roman" w:hAnsi="Times New Roman" w:eastAsia="Times New Roman"/>
           <w:b w:val="0"/>
-          <w:sz w:val="24"/>
+          <w:i w:val="0"/>
+          <w:sz w:val="28"/>
         </w:rPr>
-        <w:t>Идентификация конфигурации — присвоение уникальных идентификаторов элементам (файлы, модули, документы, сборки), схема версий, базовые линии (baselines), описание состава релиза.</w:t>
+        <w:t>отправитель ждёт завершения обработки и ответа. Обозначаются сплошной стрелкой с закрашенным наконечником. Типичны для обычных вызовов методов.</w:t>
       </w:r>
     </w:p>
     <w:p>
       <w:pPr>
-        <w:pStyle w:val="Heading2"/>
+        <w:spacing w:after="120" w:line="276" w:lineRule="auto"/>
+        <w:jc w:val="both"/>
       </w:pPr>
       <w:r>
-        <w:t>Задание 3. Agile</w:t>
+        <w:rPr>
+          <w:rFonts w:ascii="Times New Roman" w:hAnsi="Times New Roman" w:eastAsia="Times New Roman"/>
+          <w:b/>
+          <w:i w:val="0"/>
+          <w:sz w:val="28"/>
+        </w:rPr>
+        <w:t xml:space="preserve">Асинхронные сообщения: </w:t>
+      </w:r>
+      <w:r>
+        <w:rPr>
+          <w:rFonts w:ascii="Times New Roman" w:hAnsi="Times New Roman" w:eastAsia="Times New Roman"/>
+          <w:b w:val="0"/>
+          <w:i w:val="0"/>
+          <w:sz w:val="28"/>
+        </w:rPr>
+        <w:t>отправитель не ждёт ответа и продолжает работу. Обозначаются стрелкой с открытым (незакрашенным) наконечником. Типичны для событий, сигналов, уведомлений.</w:t>
       </w:r>
     </w:p>
     <w:p>
       <w:pPr>
-        <w:spacing w:after="120"/>
+        <w:spacing w:after="160" w:before="240" w:line="276" w:lineRule="auto"/>
       </w:pPr>
       <w:r>
         <w:rPr>
-          <w:rFonts w:ascii="Times New Roman" w:hAnsi="Times New Roman"/>
-          <w:b w:val="0"/>
-          <w:sz w:val="24"/>
+          <w:rFonts w:ascii="Times New Roman" w:hAnsi="Times New Roman" w:eastAsia="Times New Roman"/>
+          <w:b/>
+          <w:i w:val="0"/>
+          <w:sz w:val="28"/>
         </w:rPr>
-        <w:t>Agile — гибкий подход к разработке: итеративная поставка ценности, сотрудничество с заказчиком, готовность к изменениям, самоорганизующиеся команды (Agile Manifesto, 2001).</w:t>
+        <w:t>Задание 2. Управление конфигурацией ПО (5–6 баллов)</w:t>
       </w:r>
     </w:p>
     <w:p>
       <w:pPr>
-        <w:spacing w:after="120"/>
+        <w:spacing w:after="120" w:before="0" w:line="276" w:lineRule="auto"/>
+        <w:jc w:val="both"/>
       </w:pPr>
       <w:r>
         <w:rPr>
-          <w:rFonts w:ascii="Times New Roman" w:hAnsi="Times New Roman"/>
-          <w:b/>
-          <w:sz w:val="24"/>
+          <w:rFonts w:ascii="Times New Roman" w:hAnsi="Times New Roman" w:eastAsia="Times New Roman"/>
+          <w:b w:val="0"/>
+          <w:i w:val="0"/>
+          <w:sz w:val="28"/>
         </w:rPr>
-        <w:t>Принципы Agile:</w:t>
+        <w:t>Управление конфигурацией ПО (Software Configuration Management, SCM) — дисциплина, обеспечивающая идентификацию, контроль изменений, учёт состояния и аудит элементов конфигурации программного продукта на протяжении жизненного цикла. Цель — знать состав версий артефактов, кто и зачем их менял, и иметь возможность воспроизвести любую сборку/релиз.</w:t>
       </w:r>
     </w:p>
     <w:p>
       <w:pPr>
-        <w:pStyle w:val="ListBullet"/>
+        <w:spacing w:after="120" w:before="0" w:line="276" w:lineRule="auto"/>
+        <w:jc w:val="both"/>
       </w:pPr>
       <w:r>
         <w:rPr>
-          <w:rFonts w:ascii="Times New Roman" w:hAnsi="Times New Roman"/>
-          <w:sz w:val="24"/>
+          <w:rFonts w:ascii="Times New Roman" w:hAnsi="Times New Roman" w:eastAsia="Times New Roman"/>
+          <w:b w:val="0"/>
+          <w:i w:val="0"/>
+          <w:sz w:val="28"/>
         </w:rPr>
-        <w:t>Приоритет — удовлетворение заказчика регулярной ранней поставкой ценного ПО.</w:t>
+        <w:t>Идентификация конфигурации — процесс назначения уникальных идентификаторов элементам конфигурации (исходные файлы, модули, документы, сборки, релизы) и фиксации их состава и версий. Включает: выбор элементов конфигурации (CI); схему именования и нумерации версий; базовые линии (baselines) — утверждённые наборы версий; описание связей между элементами (что входит в релиз).</w:t>
       </w:r>
     </w:p>
     <w:p>
       <w:pPr>
-        <w:pStyle w:val="ListBullet"/>
+        <w:spacing w:after="160" w:before="240" w:line="276" w:lineRule="auto"/>
       </w:pPr>
       <w:r>
         <w:rPr>
-          <w:rFonts w:ascii="Times New Roman" w:hAnsi="Times New Roman"/>
-          <w:sz w:val="24"/>
+          <w:rFonts w:ascii="Times New Roman" w:hAnsi="Times New Roman" w:eastAsia="Times New Roman"/>
+          <w:b/>
+          <w:i w:val="0"/>
+          <w:sz w:val="28"/>
+        </w:rPr>
+        <w:t>Задание 3. Agile (7–8 баллов)</w:t>
+      </w:r>
+    </w:p>
+    <w:p>
+      <w:pPr>
+        <w:spacing w:after="120" w:before="0" w:line="276" w:lineRule="auto"/>
+        <w:jc w:val="both"/>
+      </w:pPr>
+      <w:r>
+        <w:rPr>
+          <w:rFonts w:ascii="Times New Roman" w:hAnsi="Times New Roman" w:eastAsia="Times New Roman"/>
+          <w:b w:val="0"/>
+          <w:i w:val="0"/>
+          <w:sz w:val="28"/>
+        </w:rPr>
+        <w:t>Agile (гибкая методология разработки) — подход к разработке ПО, основанный на итеративной поставке ценности, тесном взаимодействии с заказчиком, готовности к изменениям требований и самоорганизующихся командах. Ценности зафиксированы в Agile Manifesto (2001).</w:t>
+      </w:r>
+    </w:p>
+    <w:p>
+      <w:pPr>
+        <w:spacing w:after="80" w:before="0" w:line="276" w:lineRule="auto"/>
+      </w:pPr>
+      <w:r>
+        <w:rPr>
+          <w:rFonts w:ascii="Times New Roman" w:hAnsi="Times New Roman" w:eastAsia="Times New Roman"/>
+          <w:b/>
+          <w:i w:val="0"/>
+          <w:sz w:val="28"/>
+        </w:rPr>
+        <w:t>Принципы Agile (12 принципов Манифеста):</w:t>
+      </w:r>
+    </w:p>
+    <w:p>
+      <w:pPr>
+        <w:pStyle w:val="ListBullet"/>
+        <w:spacing w:after="60"/>
+      </w:pPr>
+      <w:r>
+        <w:rPr>
+          <w:rFonts w:ascii="Times New Roman" w:hAnsi="Times New Roman" w:eastAsia="Times New Roman"/>
+          <w:b w:val="0"/>
+          <w:i w:val="0"/>
+          <w:sz w:val="28"/>
+        </w:rPr>
+        <w:t>Наивысший приоритет — удовлетворение заказчика регулярной и ранней поставкой ценного ПО.</w:t>
+      </w:r>
+    </w:p>
+    <w:p>
+      <w:pPr>
+        <w:pStyle w:val="ListBullet"/>
+        <w:spacing w:after="60"/>
+      </w:pPr>
+      <w:r>
+        <w:rPr>
+          <w:rFonts w:ascii="Times New Roman" w:hAnsi="Times New Roman" w:eastAsia="Times New Roman"/>
+          <w:b w:val="0"/>
+          <w:i w:val="0"/>
+          <w:sz w:val="28"/>
         </w:rPr>
         <w:t>Изменение требований приветствуется даже на поздних стадиях.</w:t>
       </w:r>
@@ -908,11 +1775,14 @@
     <w:p>
       <w:pPr>
         <w:pStyle w:val="ListBullet"/>
+        <w:spacing w:after="60"/>
       </w:pPr>
       <w:r>
         <w:rPr>
-          <w:rFonts w:ascii="Times New Roman" w:hAnsi="Times New Roman"/>
-          <w:sz w:val="24"/>
+          <w:rFonts w:ascii="Times New Roman" w:hAnsi="Times New Roman" w:eastAsia="Times New Roman"/>
+          <w:b w:val="0"/>
+          <w:i w:val="0"/>
+          <w:sz w:val="28"/>
         </w:rPr>
         <w:t>Рабочее ПО поставляется часто (недели, а не месяцы).</w:t>
       </w:r>
@@ -920,11 +1790,14 @@
     <w:p>
       <w:pPr>
         <w:pStyle w:val="ListBullet"/>
+        <w:spacing w:after="60"/>
       </w:pPr>
       <w:r>
         <w:rPr>
-          <w:rFonts w:ascii="Times New Roman" w:hAnsi="Times New Roman"/>
-          <w:sz w:val="24"/>
+          <w:rFonts w:ascii="Times New Roman" w:hAnsi="Times New Roman" w:eastAsia="Times New Roman"/>
+          <w:b w:val="0"/>
+          <w:i w:val="0"/>
+          <w:sz w:val="28"/>
         </w:rPr>
         <w:t>Бизнес и разработчики ежедневно работают вместе.</w:t>
       </w:r>
@@ -932,35 +1805,44 @@
     <w:p>
       <w:pPr>
         <w:pStyle w:val="ListBullet"/>
+        <w:spacing w:after="60"/>
       </w:pPr>
       <w:r>
         <w:rPr>
-          <w:rFonts w:ascii="Times New Roman" w:hAnsi="Times New Roman"/>
-          <w:sz w:val="24"/>
+          <w:rFonts w:ascii="Times New Roman" w:hAnsi="Times New Roman" w:eastAsia="Times New Roman"/>
+          <w:b w:val="0"/>
+          <w:i w:val="0"/>
+          <w:sz w:val="28"/>
         </w:rPr>
-        <w:t>Проекты вокруг мотивированных людей; им доверяют.</w:t>
+        <w:t>Проекты строятся вокруг мотивированных людей; им создают условия и доверяют.</w:t>
       </w:r>
     </w:p>
     <w:p>
       <w:pPr>
         <w:pStyle w:val="ListBullet"/>
+        <w:spacing w:after="60"/>
       </w:pPr>
       <w:r>
         <w:rPr>
-          <w:rFonts w:ascii="Times New Roman" w:hAnsi="Times New Roman"/>
-          <w:sz w:val="24"/>
+          <w:rFonts w:ascii="Times New Roman" w:hAnsi="Times New Roman" w:eastAsia="Times New Roman"/>
+          <w:b w:val="0"/>
+          <w:i w:val="0"/>
+          <w:sz w:val="28"/>
         </w:rPr>
-        <w:t>Самый эффективный способ обмена информацией — личный разговор.</w:t>
+        <w:t>Самый эффективный способ передачи информации — личный разговор.</w:t>
       </w:r>
     </w:p>
     <w:p>
       <w:pPr>
         <w:pStyle w:val="ListBullet"/>
+        <w:spacing w:after="60"/>
       </w:pPr>
       <w:r>
         <w:rPr>
-          <w:rFonts w:ascii="Times New Roman" w:hAnsi="Times New Roman"/>
-          <w:sz w:val="24"/>
+          <w:rFonts w:ascii="Times New Roman" w:hAnsi="Times New Roman" w:eastAsia="Times New Roman"/>
+          <w:b w:val="0"/>
+          <w:i w:val="0"/>
+          <w:sz w:val="28"/>
         </w:rPr>
         <w:t>Рабочее ПО — главный показатель прогресса.</w:t>
       </w:r>
@@ -968,208 +1850,719 @@
     <w:p>
       <w:pPr>
         <w:pStyle w:val="ListBullet"/>
+        <w:spacing w:after="60"/>
       </w:pPr>
       <w:r>
         <w:rPr>
-          <w:rFonts w:ascii="Times New Roman" w:hAnsi="Times New Roman"/>
-          <w:sz w:val="24"/>
+          <w:rFonts w:ascii="Times New Roman" w:hAnsi="Times New Roman" w:eastAsia="Times New Roman"/>
+          <w:b w:val="0"/>
+          <w:i w:val="0"/>
+          <w:sz w:val="28"/>
         </w:rPr>
-        <w:t>Устойчивый темп разработки.</w:t>
+        <w:t>Устойчивый темп разработки (процессы должны позволять постоянный ритм).</w:t>
       </w:r>
     </w:p>
     <w:p>
       <w:pPr>
         <w:pStyle w:val="ListBullet"/>
+        <w:spacing w:after="60"/>
       </w:pPr>
       <w:r>
         <w:rPr>
-          <w:rFonts w:ascii="Times New Roman" w:hAnsi="Times New Roman"/>
-          <w:sz w:val="24"/>
+          <w:rFonts w:ascii="Times New Roman" w:hAnsi="Times New Roman" w:eastAsia="Times New Roman"/>
+          <w:b w:val="0"/>
+          <w:i w:val="0"/>
+          <w:sz w:val="28"/>
         </w:rPr>
-        <w:t>Постоянное внимание к техническому совершенству и дизайну.</w:t>
+        <w:t>Постоянное внимание к техническому совершенству и хорошему дизайну.</w:t>
       </w:r>
     </w:p>
     <w:p>
       <w:pPr>
         <w:pStyle w:val="ListBullet"/>
+        <w:spacing w:after="60"/>
       </w:pPr>
       <w:r>
         <w:rPr>
-          <w:rFonts w:ascii="Times New Roman" w:hAnsi="Times New Roman"/>
-          <w:sz w:val="24"/>
+          <w:rFonts w:ascii="Times New Roman" w:hAnsi="Times New Roman" w:eastAsia="Times New Roman"/>
+          <w:b w:val="0"/>
+          <w:i w:val="0"/>
+          <w:sz w:val="28"/>
         </w:rPr>
-        <w:t>Простота — минимизация лишней работы.</w:t>
+        <w:t>Простота — искусство минимизации лишней работы.</w:t>
       </w:r>
     </w:p>
     <w:p>
       <w:pPr>
         <w:pStyle w:val="ListBullet"/>
+        <w:spacing w:after="60"/>
       </w:pPr>
       <w:r>
         <w:rPr>
-          <w:rFonts w:ascii="Times New Roman" w:hAnsi="Times New Roman"/>
-          <w:sz w:val="24"/>
+          <w:rFonts w:ascii="Times New Roman" w:hAnsi="Times New Roman" w:eastAsia="Times New Roman"/>
+          <w:b w:val="0"/>
+          <w:i w:val="0"/>
+          <w:sz w:val="28"/>
         </w:rPr>
-        <w:t>Лучшие архитектуры и требования — у самоорганизующихся команд.</w:t>
+        <w:t>Лучшие архитектуры, требования и дизайны рождаются у самоорганизующихся команд.</w:t>
       </w:r>
     </w:p>
     <w:p>
       <w:pPr>
         <w:pStyle w:val="ListBullet"/>
+        <w:spacing w:after="60"/>
       </w:pPr>
       <w:r>
         <w:rPr>
-          <w:rFonts w:ascii="Times New Roman" w:hAnsi="Times New Roman"/>
-          <w:sz w:val="24"/>
+          <w:rFonts w:ascii="Times New Roman" w:hAnsi="Times New Roman" w:eastAsia="Times New Roman"/>
+          <w:b w:val="0"/>
+          <w:i w:val="0"/>
+          <w:sz w:val="28"/>
         </w:rPr>
-        <w:t>Регулярная рефлексия и улучшение способов работы.</w:t>
+        <w:t>Команда регулярно анализирует способы стать эффективнее и корректирует работу.</w:t>
       </w:r>
     </w:p>
     <w:p>
       <w:pPr>
-        <w:pStyle w:val="Heading2"/>
+        <w:spacing w:after="160" w:before="240" w:line="276" w:lineRule="auto"/>
       </w:pPr>
       <w:r>
-        <w:t>Задание 4. Диаграмма классов</w:t>
+        <w:rPr>
+          <w:rFonts w:ascii="Times New Roman" w:hAnsi="Times New Roman" w:eastAsia="Times New Roman"/>
+          <w:b/>
+          <w:i w:val="0"/>
+          <w:sz w:val="28"/>
+        </w:rPr>
+        <w:t>Задание 4. Диаграмма классов (9–10 баллов)</w:t>
       </w:r>
     </w:p>
     <w:p>
       <w:pPr>
-        <w:spacing w:after="120"/>
+        <w:spacing w:after="120" w:before="0" w:line="276" w:lineRule="auto"/>
+        <w:jc w:val="both"/>
       </w:pPr>
       <w:r>
         <w:rPr>
-          <w:rFonts w:ascii="Times New Roman" w:hAnsi="Times New Roman"/>
+          <w:rFonts w:ascii="Times New Roman" w:hAnsi="Times New Roman" w:eastAsia="Times New Roman"/>
           <w:b w:val="0"/>
-          <w:sz w:val="24"/>
+          <w:i w:val="0"/>
+          <w:sz w:val="28"/>
         </w:rPr>
-        <w:t>Пример: Покупатель, Заказ, ПозицияЗаказа, Товар, интерфейс Оплата.</w:t>
+        <w:t>Пример предметной области: учёт заказов.</w:t>
       </w:r>
     </w:p>
     <w:p>
       <w:pPr>
-        <w:pStyle w:val="ListBullet"/>
+        <w:spacing w:after="80"/>
+        <w:ind w:left="283"/>
       </w:pPr>
       <w:r>
         <w:rPr>
-          <w:rFonts w:ascii="Times New Roman" w:hAnsi="Times New Roman"/>
-          <w:sz w:val="24"/>
+          <w:rFonts w:ascii="Courier New" w:hAnsi="Courier New" w:eastAsia="Courier New"/>
+          <w:b w:val="0"/>
+          <w:i w:val="0"/>
+          <w:sz w:val="22"/>
         </w:rPr>
-        <w:t>Покупатель (−id, −фио, −email; +оформитьЗаказ(), +войти())</w:t>
+        <w:t>┌─────────────────┐     1    *  ┌─────────────────┐</w:t>
       </w:r>
     </w:p>
     <w:p>
       <w:pPr>
-        <w:pStyle w:val="ListBullet"/>
+        <w:spacing w:after="80"/>
+        <w:ind w:left="283"/>
       </w:pPr>
       <w:r>
         <w:rPr>
-          <w:rFonts w:ascii="Times New Roman" w:hAnsi="Times New Roman"/>
-          <w:sz w:val="24"/>
+          <w:rFonts w:ascii="Courier New" w:hAnsi="Courier New" w:eastAsia="Courier New"/>
+          <w:b w:val="0"/>
+          <w:i w:val="0"/>
+          <w:sz w:val="22"/>
         </w:rPr>
-        <w:t>Заказ (−номер, −дата, −статус; +добавитьПозицию(), +рассчитатьСумму())</w:t>
+        <w:t>│   Покупатель     │─────────────│      Заказ       │</w:t>
       </w:r>
     </w:p>
     <w:p>
       <w:pPr>
-        <w:pStyle w:val="ListBullet"/>
+        <w:spacing w:after="80"/>
+        <w:ind w:left="283"/>
       </w:pPr>
       <w:r>
         <w:rPr>
-          <w:rFonts w:ascii="Times New Roman" w:hAnsi="Times New Roman"/>
-          <w:sz w:val="24"/>
+          <w:rFonts w:ascii="Courier New" w:hAnsi="Courier New" w:eastAsia="Courier New"/>
+          <w:b w:val="0"/>
+          <w:i w:val="0"/>
+          <w:sz w:val="22"/>
         </w:rPr>
-        <w:t>ПозицияЗаказа (−количество, −цена; +сумма())</w:t>
+        <w:t>├─────────────────┤             ├─────────────────┤</w:t>
       </w:r>
     </w:p>
     <w:p>
       <w:pPr>
-        <w:pStyle w:val="ListBullet"/>
+        <w:spacing w:after="80"/>
+        <w:ind w:left="283"/>
       </w:pPr>
       <w:r>
         <w:rPr>
-          <w:rFonts w:ascii="Times New Roman" w:hAnsi="Times New Roman"/>
-          <w:sz w:val="24"/>
+          <w:rFonts w:ascii="Courier New" w:hAnsi="Courier New" w:eastAsia="Courier New"/>
+          <w:b w:val="0"/>
+          <w:i w:val="0"/>
+          <w:sz w:val="22"/>
         </w:rPr>
-        <w:t>Товар (−артикул, −название, −цена; +изменитьЦену())</w:t>
+        <w:t>│ - id: int        │             │ - номер: int     │</w:t>
       </w:r>
     </w:p>
     <w:p>
       <w:pPr>
-        <w:pStyle w:val="ListBullet"/>
+        <w:spacing w:after="80"/>
+        <w:ind w:left="283"/>
       </w:pPr>
       <w:r>
         <w:rPr>
-          <w:rFonts w:ascii="Times New Roman" w:hAnsi="Times New Roman"/>
-          <w:sz w:val="24"/>
+          <w:rFonts w:ascii="Courier New" w:hAnsi="Courier New" w:eastAsia="Courier New"/>
+          <w:b w:val="0"/>
+          <w:i w:val="0"/>
+          <w:sz w:val="22"/>
         </w:rPr>
-        <w:t>Связи: Покупатель 1—* Заказ; Заказ 1—1..* ПозицияЗаказа; ПозицияЗаказа *—1 Товар; Заказ использует Оплата.</w:t>
+        <w:t>│ - фио: string    │             │ - дата: Date     │</w:t>
       </w:r>
     </w:p>
     <w:p>
       <w:pPr>
-        <w:pStyle w:val="Heading1"/>
+        <w:spacing w:after="80"/>
+        <w:ind w:left="283"/>
       </w:pPr>
       <w:r>
+        <w:rPr>
+          <w:rFonts w:ascii="Courier New" w:hAnsi="Courier New" w:eastAsia="Courier New"/>
+          <w:b w:val="0"/>
+          <w:i w:val="0"/>
+          <w:sz w:val="22"/>
+        </w:rPr>
+        <w:t>│ - email: string  │             │ - статус: string │</w:t>
+      </w:r>
+    </w:p>
+    <w:p>
+      <w:pPr>
+        <w:spacing w:after="80"/>
+        <w:ind w:left="283"/>
+      </w:pPr>
+      <w:r>
+        <w:rPr>
+          <w:rFonts w:ascii="Courier New" w:hAnsi="Courier New" w:eastAsia="Courier New"/>
+          <w:b w:val="0"/>
+          <w:i w:val="0"/>
+          <w:sz w:val="22"/>
+        </w:rPr>
+        <w:t>├─────────────────┤             ├─────────────────┤</w:t>
+      </w:r>
+    </w:p>
+    <w:p>
+      <w:pPr>
+        <w:spacing w:after="80"/>
+        <w:ind w:left="283"/>
+      </w:pPr>
+      <w:r>
+        <w:rPr>
+          <w:rFonts w:ascii="Courier New" w:hAnsi="Courier New" w:eastAsia="Courier New"/>
+          <w:b w:val="0"/>
+          <w:i w:val="0"/>
+          <w:sz w:val="22"/>
+        </w:rPr>
+        <w:t>│ + оформитьЗаказ()│             │ + добавитьПозицию│</w:t>
+      </w:r>
+    </w:p>
+    <w:p>
+      <w:pPr>
+        <w:spacing w:after="80"/>
+        <w:ind w:left="283"/>
+      </w:pPr>
+      <w:r>
+        <w:rPr>
+          <w:rFonts w:ascii="Courier New" w:hAnsi="Courier New" w:eastAsia="Courier New"/>
+          <w:b w:val="0"/>
+          <w:i w:val="0"/>
+          <w:sz w:val="22"/>
+        </w:rPr>
+        <w:t>│ + войти()        │             │ + рассчитатьСумму│</w:t>
+      </w:r>
+    </w:p>
+    <w:p>
+      <w:pPr>
+        <w:spacing w:after="80"/>
+        <w:ind w:left="283"/>
+      </w:pPr>
+      <w:r>
+        <w:rPr>
+          <w:rFonts w:ascii="Courier New" w:hAnsi="Courier New" w:eastAsia="Courier New"/>
+          <w:b w:val="0"/>
+          <w:i w:val="0"/>
+          <w:sz w:val="22"/>
+        </w:rPr>
+        <w:t>└─────────────────┘             └────────┬────────┘</w:t>
+      </w:r>
+    </w:p>
+    <w:p>
+      <w:pPr>
+        <w:spacing w:after="80"/>
+        <w:ind w:left="283"/>
+      </w:pPr>
+      <w:r>
+        <w:rPr>
+          <w:rFonts w:ascii="Courier New" w:hAnsi="Courier New" w:eastAsia="Courier New"/>
+          <w:b w:val="0"/>
+          <w:i w:val="0"/>
+          <w:sz w:val="22"/>
+        </w:rPr>
+        <w:t xml:space="preserve">                                        │ 1</w:t>
+      </w:r>
+    </w:p>
+    <w:p>
+      <w:pPr>
+        <w:spacing w:after="80"/>
+        <w:ind w:left="283"/>
+      </w:pPr>
+      <w:r>
+        <w:rPr>
+          <w:rFonts w:ascii="Courier New" w:hAnsi="Courier New" w:eastAsia="Courier New"/>
+          <w:b w:val="0"/>
+          <w:i w:val="0"/>
+          <w:sz w:val="22"/>
+        </w:rPr>
+        <w:t xml:space="preserve">                                        │</w:t>
+      </w:r>
+    </w:p>
+    <w:p>
+      <w:pPr>
+        <w:spacing w:after="80"/>
+        <w:ind w:left="283"/>
+      </w:pPr>
+      <w:r>
+        <w:rPr>
+          <w:rFonts w:ascii="Courier New" w:hAnsi="Courier New" w:eastAsia="Courier New"/>
+          <w:b w:val="0"/>
+          <w:i w:val="0"/>
+          <w:sz w:val="22"/>
+        </w:rPr>
+        <w:t xml:space="preserve">                                   1..* │</w:t>
+      </w:r>
+    </w:p>
+    <w:p>
+      <w:pPr>
+        <w:spacing w:after="80"/>
+        <w:ind w:left="283"/>
+      </w:pPr>
+      <w:r>
+        <w:rPr>
+          <w:rFonts w:ascii="Courier New" w:hAnsi="Courier New" w:eastAsia="Courier New"/>
+          <w:b w:val="0"/>
+          <w:i w:val="0"/>
+          <w:sz w:val="22"/>
+        </w:rPr>
+        <w:t xml:space="preserve">                         ┌──────────────┴───────┐</w:t>
+      </w:r>
+    </w:p>
+    <w:p>
+      <w:pPr>
+        <w:spacing w:after="80"/>
+        <w:ind w:left="283"/>
+      </w:pPr>
+      <w:r>
+        <w:rPr>
+          <w:rFonts w:ascii="Courier New" w:hAnsi="Courier New" w:eastAsia="Courier New"/>
+          <w:b w:val="0"/>
+          <w:i w:val="0"/>
+          <w:sz w:val="22"/>
+        </w:rPr>
+        <w:t xml:space="preserve">                         │   ПозицияЗаказа       │</w:t>
+      </w:r>
+    </w:p>
+    <w:p>
+      <w:pPr>
+        <w:spacing w:after="80"/>
+        <w:ind w:left="283"/>
+      </w:pPr>
+      <w:r>
+        <w:rPr>
+          <w:rFonts w:ascii="Courier New" w:hAnsi="Courier New" w:eastAsia="Courier New"/>
+          <w:b w:val="0"/>
+          <w:i w:val="0"/>
+          <w:sz w:val="22"/>
+        </w:rPr>
+        <w:t xml:space="preserve">                         ├──────────────────────┤</w:t>
+      </w:r>
+    </w:p>
+    <w:p>
+      <w:pPr>
+        <w:spacing w:after="80"/>
+        <w:ind w:left="283"/>
+      </w:pPr>
+      <w:r>
+        <w:rPr>
+          <w:rFonts w:ascii="Courier New" w:hAnsi="Courier New" w:eastAsia="Courier New"/>
+          <w:b w:val="0"/>
+          <w:i w:val="0"/>
+          <w:sz w:val="22"/>
+        </w:rPr>
+        <w:t xml:space="preserve">                         │ - количество: int     │</w:t>
+      </w:r>
+    </w:p>
+    <w:p>
+      <w:pPr>
+        <w:spacing w:after="80"/>
+        <w:ind w:left="283"/>
+      </w:pPr>
+      <w:r>
+        <w:rPr>
+          <w:rFonts w:ascii="Courier New" w:hAnsi="Courier New" w:eastAsia="Courier New"/>
+          <w:b w:val="0"/>
+          <w:i w:val="0"/>
+          <w:sz w:val="22"/>
+        </w:rPr>
+        <w:t xml:space="preserve">                         │ - цена: decimal       │</w:t>
+      </w:r>
+    </w:p>
+    <w:p>
+      <w:pPr>
+        <w:spacing w:after="80"/>
+        <w:ind w:left="283"/>
+      </w:pPr>
+      <w:r>
+        <w:rPr>
+          <w:rFonts w:ascii="Courier New" w:hAnsi="Courier New" w:eastAsia="Courier New"/>
+          <w:b w:val="0"/>
+          <w:i w:val="0"/>
+          <w:sz w:val="22"/>
+        </w:rPr>
+        <w:t xml:space="preserve">                         ├──────────────────────┤</w:t>
+      </w:r>
+    </w:p>
+    <w:p>
+      <w:pPr>
+        <w:spacing w:after="80"/>
+        <w:ind w:left="283"/>
+      </w:pPr>
+      <w:r>
+        <w:rPr>
+          <w:rFonts w:ascii="Courier New" w:hAnsi="Courier New" w:eastAsia="Courier New"/>
+          <w:b w:val="0"/>
+          <w:i w:val="0"/>
+          <w:sz w:val="22"/>
+        </w:rPr>
+        <w:t xml:space="preserve">                         │ + сумма()             │</w:t>
+      </w:r>
+    </w:p>
+    <w:p>
+      <w:pPr>
+        <w:spacing w:after="80"/>
+        <w:ind w:left="283"/>
+      </w:pPr>
+      <w:r>
+        <w:rPr>
+          <w:rFonts w:ascii="Courier New" w:hAnsi="Courier New" w:eastAsia="Courier New"/>
+          <w:b w:val="0"/>
+          <w:i w:val="0"/>
+          <w:sz w:val="22"/>
+        </w:rPr>
+        <w:t xml:space="preserve">                         └──────────┬───────────┘</w:t>
+      </w:r>
+    </w:p>
+    <w:p>
+      <w:pPr>
+        <w:spacing w:after="80"/>
+        <w:ind w:left="283"/>
+      </w:pPr>
+      <w:r>
+        <w:rPr>
+          <w:rFonts w:ascii="Courier New" w:hAnsi="Courier New" w:eastAsia="Courier New"/>
+          <w:b w:val="0"/>
+          <w:i w:val="0"/>
+          <w:sz w:val="22"/>
+        </w:rPr>
+        <w:t xml:space="preserve">                                    │ *</w:t>
+      </w:r>
+    </w:p>
+    <w:p>
+      <w:pPr>
+        <w:spacing w:after="80"/>
+        <w:ind w:left="283"/>
+      </w:pPr>
+      <w:r>
+        <w:rPr>
+          <w:rFonts w:ascii="Courier New" w:hAnsi="Courier New" w:eastAsia="Courier New"/>
+          <w:b w:val="0"/>
+          <w:i w:val="0"/>
+          <w:sz w:val="22"/>
+        </w:rPr>
+        <w:t xml:space="preserve">                                    │ 1</w:t>
+      </w:r>
+    </w:p>
+    <w:p>
+      <w:pPr>
+        <w:spacing w:after="80"/>
+        <w:ind w:left="283"/>
+      </w:pPr>
+      <w:r>
+        <w:rPr>
+          <w:rFonts w:ascii="Courier New" w:hAnsi="Courier New" w:eastAsia="Courier New"/>
+          <w:b w:val="0"/>
+          <w:i w:val="0"/>
+          <w:sz w:val="22"/>
+        </w:rPr>
+        <w:t xml:space="preserve">                         ┌──────────┴───────────┐</w:t>
+      </w:r>
+    </w:p>
+    <w:p>
+      <w:pPr>
+        <w:spacing w:after="80"/>
+        <w:ind w:left="283"/>
+      </w:pPr>
+      <w:r>
+        <w:rPr>
+          <w:rFonts w:ascii="Courier New" w:hAnsi="Courier New" w:eastAsia="Courier New"/>
+          <w:b w:val="0"/>
+          <w:i w:val="0"/>
+          <w:sz w:val="22"/>
+        </w:rPr>
+        <w:t xml:space="preserve">                         │        Товар          │</w:t>
+      </w:r>
+    </w:p>
+    <w:p>
+      <w:pPr>
+        <w:spacing w:after="80"/>
+        <w:ind w:left="283"/>
+      </w:pPr>
+      <w:r>
+        <w:rPr>
+          <w:rFonts w:ascii="Courier New" w:hAnsi="Courier New" w:eastAsia="Courier New"/>
+          <w:b w:val="0"/>
+          <w:i w:val="0"/>
+          <w:sz w:val="22"/>
+        </w:rPr>
+        <w:t xml:space="preserve">                         ├──────────────────────┤</w:t>
+      </w:r>
+    </w:p>
+    <w:p>
+      <w:pPr>
+        <w:spacing w:after="80"/>
+        <w:ind w:left="283"/>
+      </w:pPr>
+      <w:r>
+        <w:rPr>
+          <w:rFonts w:ascii="Courier New" w:hAnsi="Courier New" w:eastAsia="Courier New"/>
+          <w:b w:val="0"/>
+          <w:i w:val="0"/>
+          <w:sz w:val="22"/>
+        </w:rPr>
+        <w:t xml:space="preserve">                         │ - артикул: string     │</w:t>
+      </w:r>
+    </w:p>
+    <w:p>
+      <w:pPr>
+        <w:spacing w:after="80"/>
+        <w:ind w:left="283"/>
+      </w:pPr>
+      <w:r>
+        <w:rPr>
+          <w:rFonts w:ascii="Courier New" w:hAnsi="Courier New" w:eastAsia="Courier New"/>
+          <w:b w:val="0"/>
+          <w:i w:val="0"/>
+          <w:sz w:val="22"/>
+        </w:rPr>
+        <w:t xml:space="preserve">                         │ - название: string    │</w:t>
+      </w:r>
+    </w:p>
+    <w:p>
+      <w:pPr>
+        <w:spacing w:after="80"/>
+        <w:ind w:left="283"/>
+      </w:pPr>
+      <w:r>
+        <w:rPr>
+          <w:rFonts w:ascii="Courier New" w:hAnsi="Courier New" w:eastAsia="Courier New"/>
+          <w:b w:val="0"/>
+          <w:i w:val="0"/>
+          <w:sz w:val="22"/>
+        </w:rPr>
+        <w:t xml:space="preserve">                         │ - цена: decimal       │</w:t>
+      </w:r>
+    </w:p>
+    <w:p>
+      <w:pPr>
+        <w:spacing w:after="80"/>
+        <w:ind w:left="283"/>
+      </w:pPr>
+      <w:r>
+        <w:rPr>
+          <w:rFonts w:ascii="Courier New" w:hAnsi="Courier New" w:eastAsia="Courier New"/>
+          <w:b w:val="0"/>
+          <w:i w:val="0"/>
+          <w:sz w:val="22"/>
+        </w:rPr>
+        <w:t xml:space="preserve">                         └──────────────────────┘</w:t>
+      </w:r>
+    </w:p>
+    <w:p>
+      <w:pPr>
+        <w:spacing w:after="120" w:before="0" w:line="276" w:lineRule="auto"/>
+        <w:jc w:val="both"/>
+      </w:pPr>
+      <w:r>
+        <w:rPr>
+          <w:rFonts w:ascii="Times New Roman" w:hAnsi="Times New Roman" w:eastAsia="Times New Roman"/>
+          <w:b w:val="0"/>
+          <w:i w:val="0"/>
+          <w:sz w:val="28"/>
+        </w:rPr>
+        <w:t>Дополнительно: интерфейс Оплата (+оплатить(сумма): bool); Заказ зависит от / использует Оплата.</w:t>
+      </w:r>
+    </w:p>
+    <w:p>
+      <w:r>
+        <w:br w:type="page"/>
+      </w:r>
+    </w:p>
+    <w:p>
+      <w:pPr>
+        <w:spacing w:after="240" w:before="360" w:line="276" w:lineRule="auto"/>
+        <w:jc w:val="center"/>
+      </w:pPr>
+      <w:r>
+        <w:rPr>
+          <w:rFonts w:ascii="Times New Roman" w:hAnsi="Times New Roman" w:eastAsia="Times New Roman"/>
+          <w:b/>
+          <w:i w:val="0"/>
+          <w:sz w:val="32"/>
+        </w:rPr>
         <w:t>ВАРИАНТ 4</w:t>
       </w:r>
     </w:p>
     <w:p>
       <w:pPr>
-        <w:spacing w:after="120"/>
+        <w:spacing w:after="160" w:before="0" w:line="276" w:lineRule="auto"/>
       </w:pPr>
       <w:r>
         <w:rPr>
-          <w:rFonts w:ascii="Times New Roman" w:hAnsi="Times New Roman"/>
+          <w:rFonts w:ascii="Times New Roman" w:hAnsi="Times New Roman" w:eastAsia="Times New Roman"/>
           <w:b w:val="0"/>
-          <w:sz w:val="24"/>
+          <w:i/>
+          <w:sz w:val="28"/>
         </w:rPr>
-        <w:t>Примечание: в бланке задания пункты 1 и 2 сформулированы одинаково.</w:t>
+        <w:t>Примечание: в бланке задания пункты 1 и 2 сформулированы одинаково (диаграмма коммуникации). Ниже дан полный ответ; для п. 2 приведено углублённое сравнение.</w:t>
       </w:r>
     </w:p>
     <w:p>
       <w:pPr>
-        <w:pStyle w:val="Heading2"/>
+        <w:spacing w:after="160" w:before="240" w:line="276" w:lineRule="auto"/>
       </w:pPr>
       <w:r>
-        <w:t>Задание 1–2. Диаграмма коммуникации</w:t>
+        <w:rPr>
+          <w:rFonts w:ascii="Times New Roman" w:hAnsi="Times New Roman" w:eastAsia="Times New Roman"/>
+          <w:b/>
+          <w:i w:val="0"/>
+          <w:sz w:val="28"/>
+        </w:rPr>
+        <w:t>Задание 1. Диаграмма коммуникации (3–4 балла)</w:t>
       </w:r>
     </w:p>
     <w:p>
       <w:pPr>
-        <w:spacing w:after="120"/>
+        <w:spacing w:after="120" w:before="0" w:line="276" w:lineRule="auto"/>
+        <w:jc w:val="both"/>
       </w:pPr>
       <w:r>
         <w:rPr>
-          <w:rFonts w:ascii="Times New Roman" w:hAnsi="Times New Roman"/>
+          <w:rFonts w:ascii="Times New Roman" w:hAnsi="Times New Roman" w:eastAsia="Times New Roman"/>
           <w:b w:val="0"/>
-          <w:sz w:val="24"/>
+          <w:i w:val="0"/>
+          <w:sz w:val="28"/>
         </w:rPr>
-        <w:t>Назначение: показать структуру связей между объектами и обмен сообщениями; акцент на том, кто с кем связан (порядок сообщений задаётся нумерацией).</w:t>
+        <w:t>Назначение диаграммы коммуникации (Communication Diagram): показать структуру связей между объектами и обмен сообщениями при взаимодействии. Акцент — на том, кто с кем связан, а не на точной временной шкале (хотя порядок сообщений нумеруется).</w:t>
       </w:r>
     </w:p>
     <w:p>
       <w:pPr>
-        <w:spacing w:after="120"/>
+        <w:spacing w:after="80" w:before="0" w:line="276" w:lineRule="auto"/>
       </w:pPr>
       <w:r>
         <w:rPr>
-          <w:rFonts w:ascii="Times New Roman" w:hAnsi="Times New Roman"/>
-          <w:b w:val="0"/>
-          <w:sz w:val="24"/>
+          <w:rFonts w:ascii="Times New Roman" w:hAnsi="Times New Roman" w:eastAsia="Times New Roman"/>
+          <w:b/>
+          <w:i w:val="0"/>
+          <w:sz w:val="28"/>
         </w:rPr>
-        <w:t>Элементы: объекты-роли, связи (links), сообщения вдоль связей с номерами (1, 1.1, 2…), при необходимости актёры.</w:t>
+        <w:t>Основные элементы:</w:t>
       </w:r>
     </w:p>
     <w:p>
       <w:pPr>
-        <w:spacing w:after="120"/>
+        <w:pStyle w:val="ListBullet"/>
+        <w:spacing w:after="60"/>
       </w:pPr>
       <w:r>
         <w:rPr>
-          <w:rFonts w:ascii="Times New Roman" w:hAnsi="Times New Roman"/>
+          <w:rFonts w:ascii="Times New Roman" w:hAnsi="Times New Roman" w:eastAsia="Times New Roman"/>
+          <w:b w:val="0"/>
+          <w:i w:val="0"/>
+          <w:sz w:val="28"/>
+        </w:rPr>
+        <w:t>Объекты (роли) — прямоугольники с именем (:Класс или имя:Класс);</w:t>
+      </w:r>
+    </w:p>
+    <w:p>
+      <w:pPr>
+        <w:pStyle w:val="ListBullet"/>
+        <w:spacing w:after="60"/>
+      </w:pPr>
+      <w:r>
+        <w:rPr>
+          <w:rFonts w:ascii="Times New Roman" w:hAnsi="Times New Roman" w:eastAsia="Times New Roman"/>
+          <w:b w:val="0"/>
+          <w:i w:val="0"/>
+          <w:sz w:val="28"/>
+        </w:rPr>
+        <w:t>Связи (links) — линии между объектами, по которым идут сообщения;</w:t>
+      </w:r>
+    </w:p>
+    <w:p>
+      <w:pPr>
+        <w:pStyle w:val="ListBullet"/>
+        <w:spacing w:after="60"/>
+      </w:pPr>
+      <w:r>
+        <w:rPr>
+          <w:rFonts w:ascii="Times New Roman" w:hAnsi="Times New Roman" w:eastAsia="Times New Roman"/>
+          <w:b w:val="0"/>
+          <w:i w:val="0"/>
+          <w:sz w:val="28"/>
+        </w:rPr>
+        <w:t>Сообщения — стрелки вдоль связей с порядковым номером и именем (1: создать(), 1.1: проверить());</w:t>
+      </w:r>
+    </w:p>
+    <w:p>
+      <w:pPr>
+        <w:pStyle w:val="ListBullet"/>
+        <w:spacing w:after="60"/>
+      </w:pPr>
+      <w:r>
+        <w:rPr>
+          <w:rFonts w:ascii="Times New Roman" w:hAnsi="Times New Roman" w:eastAsia="Times New Roman"/>
+          <w:b w:val="0"/>
+          <w:i w:val="0"/>
+          <w:sz w:val="28"/>
+        </w:rPr>
+        <w:t>Актёры — при участии внешних ролей.</w:t>
+      </w:r>
+    </w:p>
+    <w:p>
+      <w:pPr>
+        <w:spacing w:after="80" w:before="0" w:line="276" w:lineRule="auto"/>
+      </w:pPr>
+      <w:r>
+        <w:rPr>
+          <w:rFonts w:ascii="Times New Roman" w:hAnsi="Times New Roman" w:eastAsia="Times New Roman"/>
           <w:b/>
-          <w:sz w:val="24"/>
+          <w:i w:val="0"/>
+          <w:sz w:val="28"/>
         </w:rPr>
         <w:t>Сравнение с диаграммой последовательности:</w:t>
       </w:r>
@@ -1177,268 +2570,934 @@
     <w:p>
       <w:pPr>
         <w:pStyle w:val="ListBullet"/>
+        <w:spacing w:after="60"/>
       </w:pPr>
       <w:r>
         <w:rPr>
-          <w:rFonts w:ascii="Times New Roman" w:hAnsi="Times New Roman"/>
-          <w:sz w:val="24"/>
+          <w:rFonts w:ascii="Times New Roman" w:hAnsi="Times New Roman" w:eastAsia="Times New Roman"/>
+          <w:b w:val="0"/>
+          <w:i w:val="0"/>
+          <w:sz w:val="28"/>
         </w:rPr>
-        <w:t>Последовательность: акцент на времени (сверху вниз), есть линии жизни и активации.</w:t>
+        <w:t>Последовательность: акцент на времени (порядок сверху вниз), есть линии жизни.</w:t>
       </w:r>
     </w:p>
     <w:p>
       <w:pPr>
         <w:pStyle w:val="ListBullet"/>
+        <w:spacing w:after="60"/>
       </w:pPr>
       <w:r>
         <w:rPr>
-          <w:rFonts w:ascii="Times New Roman" w:hAnsi="Times New Roman"/>
-          <w:sz w:val="24"/>
+          <w:rFonts w:ascii="Times New Roman" w:hAnsi="Times New Roman" w:eastAsia="Times New Roman"/>
+          <w:b w:val="0"/>
+          <w:i w:val="0"/>
+          <w:sz w:val="28"/>
         </w:rPr>
-        <w:t>Коммуникация: акцент на топологии связей, порядок — через номера сообщений.</w:t>
+        <w:t>Коммуникация: акцент на структуре связей объектов, порядок — явная нумерация.</w:t>
       </w:r>
     </w:p>
     <w:p>
       <w:pPr>
         <w:pStyle w:val="ListBullet"/>
+        <w:spacing w:after="60"/>
       </w:pPr>
       <w:r>
         <w:rPr>
-          <w:rFonts w:ascii="Times New Roman" w:hAnsi="Times New Roman"/>
-          <w:sz w:val="24"/>
+          <w:rFonts w:ascii="Times New Roman" w:hAnsi="Times New Roman" w:eastAsia="Times New Roman"/>
+          <w:b w:val="0"/>
+          <w:i w:val="0"/>
+          <w:sz w:val="28"/>
         </w:rPr>
-        <w:t>Семантика сообщений одна; представления взаимозаменяемы, различается удобство чтения.</w:t>
+        <w:t>Последовательность удобнее для сложных сценариев по времени; коммуникация — для обзора «кто с кем общается».</w:t>
       </w:r>
     </w:p>
     <w:p>
       <w:pPr>
-        <w:pStyle w:val="Heading2"/>
+        <w:spacing w:after="120" w:before="0" w:line="276" w:lineRule="auto"/>
+        <w:jc w:val="both"/>
       </w:pPr>
       <w:r>
-        <w:t>Задание 3. Роли и артефакты Scrum</w:t>
+        <w:rPr>
+          <w:rFonts w:ascii="Times New Roman" w:hAnsi="Times New Roman" w:eastAsia="Times New Roman"/>
+          <w:b w:val="0"/>
+          <w:i w:val="0"/>
+          <w:sz w:val="28"/>
+        </w:rPr>
+        <w:t>Отличия: на последовательности явно виден поток времени; на коммуникации — топология взаимодействия. Семантика сообщений одна и та же (диаграммы взаимопреобразуемы), различается способ представления.</w:t>
       </w:r>
     </w:p>
     <w:p>
       <w:pPr>
-        <w:spacing w:after="120"/>
+        <w:spacing w:after="160" w:before="240" w:line="276" w:lineRule="auto"/>
       </w:pPr>
       <w:r>
         <w:rPr>
-          <w:rFonts w:ascii="Times New Roman" w:hAnsi="Times New Roman"/>
+          <w:rFonts w:ascii="Times New Roman" w:hAnsi="Times New Roman" w:eastAsia="Times New Roman"/>
           <w:b/>
-          <w:sz w:val="24"/>
+          <w:i w:val="0"/>
+          <w:sz w:val="28"/>
         </w:rPr>
-        <w:t>Роли:</w:t>
+        <w:t>Задание 2. Диаграмма коммуникации — углубление (5–6 баллов)</w:t>
       </w:r>
     </w:p>
     <w:p>
       <w:pPr>
-        <w:pStyle w:val="ListBullet"/>
+        <w:spacing w:after="120" w:before="0" w:line="276" w:lineRule="auto"/>
+        <w:jc w:val="both"/>
       </w:pPr>
       <w:r>
         <w:rPr>
-          <w:rFonts w:ascii="Times New Roman" w:hAnsi="Times New Roman"/>
-          <w:sz w:val="24"/>
+          <w:rFonts w:ascii="Times New Roman" w:hAnsi="Times New Roman" w:eastAsia="Times New Roman"/>
+          <w:b w:val="0"/>
+          <w:i w:val="0"/>
+          <w:sz w:val="28"/>
         </w:rPr>
-        <w:t>Product Owner — ценность продукта и Product Backlog, приоритеты, приёмка.</w:t>
+        <w:t>Диаграмма коммуникации относится к диаграммам взаимодействия UML и используется на этапе анализа и проектирования для уточнения реализации прецедента.</w:t>
       </w:r>
     </w:p>
     <w:p>
       <w:pPr>
-        <w:pStyle w:val="ListBullet"/>
+        <w:spacing w:after="80" w:before="0" w:line="276" w:lineRule="auto"/>
       </w:pPr>
       <w:r>
         <w:rPr>
-          <w:rFonts w:ascii="Times New Roman" w:hAnsi="Times New Roman"/>
-          <w:sz w:val="24"/>
+          <w:rFonts w:ascii="Times New Roman" w:hAnsi="Times New Roman" w:eastAsia="Times New Roman"/>
+          <w:b/>
+          <w:i w:val="0"/>
+          <w:sz w:val="28"/>
         </w:rPr>
-        <w:t>Scrum Master — следование Scrum, устранение препятствий, фасилитация.</w:t>
+        <w:t>Элементы подробнее:</w:t>
       </w:r>
     </w:p>
     <w:p>
       <w:pPr>
         <w:pStyle w:val="ListBullet"/>
+        <w:spacing w:after="60"/>
       </w:pPr>
       <w:r>
         <w:rPr>
-          <w:rFonts w:ascii="Times New Roman" w:hAnsi="Times New Roman"/>
-          <w:sz w:val="24"/>
+          <w:rFonts w:ascii="Times New Roman" w:hAnsi="Times New Roman" w:eastAsia="Times New Roman"/>
+          <w:b w:val="0"/>
+          <w:i w:val="0"/>
+          <w:sz w:val="28"/>
         </w:rPr>
-        <w:t>Developers — кросс-функциональная команда, создающая Инкремент.</w:t>
+        <w:t>Участники — объекты/роли классификаторов.</w:t>
       </w:r>
     </w:p>
     <w:p>
       <w:pPr>
-        <w:spacing w:after="120"/>
+        <w:pStyle w:val="ListBullet"/>
+        <w:spacing w:after="60"/>
       </w:pPr>
       <w:r>
         <w:rPr>
-          <w:rFonts w:ascii="Times New Roman" w:hAnsi="Times New Roman"/>
-          <w:b/>
-          <w:sz w:val="24"/>
+          <w:rFonts w:ascii="Times New Roman" w:hAnsi="Times New Roman" w:eastAsia="Times New Roman"/>
+          <w:b w:val="0"/>
+          <w:i w:val="0"/>
+          <w:sz w:val="28"/>
         </w:rPr>
-        <w:t>Артефакты:</w:t>
+        <w:t>Связи — экземпляры ассоциаций на время взаимодействия.</w:t>
       </w:r>
     </w:p>
     <w:p>
       <w:pPr>
         <w:pStyle w:val="ListBullet"/>
+        <w:spacing w:after="60"/>
       </w:pPr>
       <w:r>
         <w:rPr>
-          <w:rFonts w:ascii="Times New Roman" w:hAnsi="Times New Roman"/>
-          <w:sz w:val="24"/>
+          <w:rFonts w:ascii="Times New Roman" w:hAnsi="Times New Roman" w:eastAsia="Times New Roman"/>
+          <w:b w:val="0"/>
+          <w:i w:val="0"/>
+          <w:sz w:val="28"/>
         </w:rPr>
-        <w:t>Product Backlog — упорядоченный список всего нужного в продукте.</w:t>
+        <w:t>Сообщения — вызовы операций, сигналы; вложенность отражается нумерацией (1, 1.1, 1.2, 2).</w:t>
       </w:r>
     </w:p>
     <w:p>
       <w:pPr>
         <w:pStyle w:val="ListBullet"/>
+        <w:spacing w:after="60"/>
       </w:pPr>
       <w:r>
         <w:rPr>
-          <w:rFonts w:ascii="Times New Roman" w:hAnsi="Times New Roman"/>
-          <w:sz w:val="24"/>
+          <w:rFonts w:ascii="Times New Roman" w:hAnsi="Times New Roman" w:eastAsia="Times New Roman"/>
+          <w:b w:val="0"/>
+          <w:i w:val="0"/>
+          <w:sz w:val="28"/>
         </w:rPr>
-        <w:t>Sprint Backlog — выбранные на спринт элементы и план их реализации.</w:t>
+        <w:t>Направление стрелки указывает получателя сообщения.</w:t>
       </w:r>
     </w:p>
     <w:p>
       <w:pPr>
-        <w:pStyle w:val="ListBullet"/>
+        <w:spacing w:after="80" w:before="0" w:line="276" w:lineRule="auto"/>
       </w:pPr>
       <w:r>
         <w:rPr>
-          <w:rFonts w:ascii="Times New Roman" w:hAnsi="Times New Roman"/>
-          <w:sz w:val="24"/>
+          <w:rFonts w:ascii="Times New Roman" w:hAnsi="Times New Roman" w:eastAsia="Times New Roman"/>
+          <w:b/>
+          <w:i w:val="0"/>
+          <w:sz w:val="28"/>
         </w:rPr>
-        <w:t>Increment — готовый к использованию результат спринта (соответствует Definition of Done).</w:t>
+        <w:t>Отличия от sequence diagram:</w:t>
       </w:r>
     </w:p>
     <w:p>
       <w:pPr>
-        <w:pStyle w:val="Heading2"/>
+        <w:pStyle w:val="ListBullet"/>
+        <w:spacing w:after="60"/>
       </w:pPr>
       <w:r>
-        <w:t>Задание 4. Диаграмма состояний</w:t>
+        <w:rPr>
+          <w:rFonts w:ascii="Times New Roman" w:hAnsi="Times New Roman" w:eastAsia="Times New Roman"/>
+          <w:b w:val="0"/>
+          <w:i w:val="0"/>
+          <w:sz w:val="28"/>
+        </w:rPr>
+        <w:t>Sequence: ось времени, активации, удобны фрагменты alt / loop / opt.</w:t>
       </w:r>
     </w:p>
     <w:p>
       <w:pPr>
-        <w:spacing w:after="120"/>
+        <w:pStyle w:val="ListBullet"/>
+        <w:spacing w:after="60"/>
       </w:pPr>
       <w:r>
         <w:rPr>
-          <w:rFonts w:ascii="Times New Roman" w:hAnsi="Times New Roman"/>
+          <w:rFonts w:ascii="Times New Roman" w:hAnsi="Times New Roman" w:eastAsia="Times New Roman"/>
           <w:b w:val="0"/>
-          <w:sz w:val="24"/>
+          <w:i w:val="0"/>
+          <w:sz w:val="28"/>
+        </w:rPr>
+        <w:t>Communication: компактность, акцент на связях, порядок только через номера.</w:t>
+      </w:r>
+    </w:p>
+    <w:p>
+      <w:pPr>
+        <w:pStyle w:val="ListBullet"/>
+        <w:spacing w:after="60"/>
+      </w:pPr>
+      <w:r>
+        <w:rPr>
+          <w:rFonts w:ascii="Times New Roman" w:hAnsi="Times New Roman" w:eastAsia="Times New Roman"/>
+          <w:b w:val="0"/>
+          <w:i w:val="0"/>
+          <w:sz w:val="28"/>
+        </w:rPr>
+        <w:t>При большом числе объектов коммуникация читается лучше как «карта», последовательность — лучше как «сценарий во времени».</w:t>
+      </w:r>
+    </w:p>
+    <w:p>
+      <w:pPr>
+        <w:spacing w:after="160" w:before="240" w:line="276" w:lineRule="auto"/>
+      </w:pPr>
+      <w:r>
+        <w:rPr>
+          <w:rFonts w:ascii="Times New Roman" w:hAnsi="Times New Roman" w:eastAsia="Times New Roman"/>
+          <w:b/>
+          <w:i w:val="0"/>
+          <w:sz w:val="28"/>
+        </w:rPr>
+        <w:t>Задание 3. Роли и артефакты Scrum (7–8 баллов)</w:t>
+      </w:r>
+    </w:p>
+    <w:p>
+      <w:pPr>
+        <w:spacing w:after="80" w:before="0" w:line="276" w:lineRule="auto"/>
+      </w:pPr>
+      <w:r>
+        <w:rPr>
+          <w:rFonts w:ascii="Times New Roman" w:hAnsi="Times New Roman" w:eastAsia="Times New Roman"/>
+          <w:b/>
+          <w:i w:val="0"/>
+          <w:sz w:val="28"/>
+        </w:rPr>
+        <w:t>Роли в Scrum:</w:t>
+      </w:r>
+    </w:p>
+    <w:p>
+      <w:pPr>
+        <w:pStyle w:val="ListBullet"/>
+        <w:spacing w:after="60"/>
+      </w:pPr>
+      <w:r>
+        <w:rPr>
+          <w:rFonts w:ascii="Times New Roman" w:hAnsi="Times New Roman" w:eastAsia="Times New Roman"/>
+          <w:b w:val="0"/>
+          <w:i w:val="0"/>
+          <w:sz w:val="28"/>
+        </w:rPr>
+        <w:t>Product Owner (Владелец продукта) — отвечает за ценность продукта и Product Backlog: приоритеты, формулировка требований (user stories), приёмка результата.</w:t>
+      </w:r>
+    </w:p>
+    <w:p>
+      <w:pPr>
+        <w:pStyle w:val="ListBullet"/>
+        <w:spacing w:after="60"/>
+      </w:pPr>
+      <w:r>
+        <w:rPr>
+          <w:rFonts w:ascii="Times New Roman" w:hAnsi="Times New Roman" w:eastAsia="Times New Roman"/>
+          <w:b w:val="0"/>
+          <w:i w:val="0"/>
+          <w:sz w:val="28"/>
+        </w:rPr>
+        <w:t>Scrum Master — помогает команде следовать Scrum, устраняет препятствия, фасилитирует события, защищает команду от внешних помех.</w:t>
+      </w:r>
+    </w:p>
+    <w:p>
+      <w:pPr>
+        <w:pStyle w:val="ListBullet"/>
+        <w:spacing w:after="60"/>
+      </w:pPr>
+      <w:r>
+        <w:rPr>
+          <w:rFonts w:ascii="Times New Roman" w:hAnsi="Times New Roman" w:eastAsia="Times New Roman"/>
+          <w:b w:val="0"/>
+          <w:i w:val="0"/>
+          <w:sz w:val="28"/>
+        </w:rPr>
+        <w:t>Developers (Команда разработки) — кросс-функциональные специалисты, создающие Инкремент; сами оценивают объём работ и решают, как реализовать задачи спринта.</w:t>
+      </w:r>
+    </w:p>
+    <w:p>
+      <w:pPr>
+        <w:spacing w:after="80" w:before="0" w:line="276" w:lineRule="auto"/>
+      </w:pPr>
+      <w:r>
+        <w:rPr>
+          <w:rFonts w:ascii="Times New Roman" w:hAnsi="Times New Roman" w:eastAsia="Times New Roman"/>
+          <w:b/>
+          <w:i w:val="0"/>
+          <w:sz w:val="28"/>
+        </w:rPr>
+        <w:t>Артефакты Scrum:</w:t>
+      </w:r>
+    </w:p>
+    <w:p>
+      <w:pPr>
+        <w:pStyle w:val="ListBullet"/>
+        <w:spacing w:after="60"/>
+      </w:pPr>
+      <w:r>
+        <w:rPr>
+          <w:rFonts w:ascii="Times New Roman" w:hAnsi="Times New Roman" w:eastAsia="Times New Roman"/>
+          <w:b w:val="0"/>
+          <w:i w:val="0"/>
+          <w:sz w:val="28"/>
+        </w:rPr>
+        <w:t>Product Backlog — упорядоченный список всего, что нужно в продукте (требования, улучшения, дефекты); живой документ под ответственностью Product Owner.</w:t>
+      </w:r>
+    </w:p>
+    <w:p>
+      <w:pPr>
+        <w:pStyle w:val="ListBullet"/>
+        <w:spacing w:after="60"/>
+      </w:pPr>
+      <w:r>
+        <w:rPr>
+          <w:rFonts w:ascii="Times New Roman" w:hAnsi="Times New Roman" w:eastAsia="Times New Roman"/>
+          <w:b w:val="0"/>
+          <w:i w:val="0"/>
+          <w:sz w:val="28"/>
+        </w:rPr>
+        <w:t>Sprint Backlog — набор элементов Product Backlog, выбранных на спринт, плюс план их реализации; принадлежит команде разработки.</w:t>
+      </w:r>
+    </w:p>
+    <w:p>
+      <w:pPr>
+        <w:pStyle w:val="ListBullet"/>
+        <w:spacing w:after="60"/>
+      </w:pPr>
+      <w:r>
+        <w:rPr>
+          <w:rFonts w:ascii="Times New Roman" w:hAnsi="Times New Roman" w:eastAsia="Times New Roman"/>
+          <w:b w:val="0"/>
+          <w:i w:val="0"/>
+          <w:sz w:val="28"/>
+        </w:rPr>
+        <w:t>Increment (Инкремент) — сумма всех завершённых элементов бэклога и предыдущих инкрементов; должен быть Done (готовым к использованию) к концу спринта.</w:t>
+      </w:r>
+    </w:p>
+    <w:p>
+      <w:pPr>
+        <w:spacing w:after="120" w:before="0" w:line="276" w:lineRule="auto"/>
+        <w:jc w:val="both"/>
+      </w:pPr>
+      <w:r>
+        <w:rPr>
+          <w:rFonts w:ascii="Times New Roman" w:hAnsi="Times New Roman" w:eastAsia="Times New Roman"/>
+          <w:b w:val="0"/>
+          <w:i w:val="0"/>
+          <w:sz w:val="28"/>
+        </w:rPr>
+        <w:t>Дополнительно: Definition of Done (критерии готовности) как обязательное соглашение; Sprint Goal — цель спринта.</w:t>
+      </w:r>
+    </w:p>
+    <w:p>
+      <w:pPr>
+        <w:spacing w:after="160" w:before="240" w:line="276" w:lineRule="auto"/>
+      </w:pPr>
+      <w:r>
+        <w:rPr>
+          <w:rFonts w:ascii="Times New Roman" w:hAnsi="Times New Roman" w:eastAsia="Times New Roman"/>
+          <w:b/>
+          <w:i w:val="0"/>
+          <w:sz w:val="28"/>
+        </w:rPr>
+        <w:t>Задание 4. Диаграмма состояний (9–10 баллов)</w:t>
+      </w:r>
+    </w:p>
+    <w:p>
+      <w:pPr>
+        <w:spacing w:after="120" w:before="0" w:line="276" w:lineRule="auto"/>
+        <w:jc w:val="both"/>
+      </w:pPr>
+      <w:r>
+        <w:rPr>
+          <w:rFonts w:ascii="Times New Roman" w:hAnsi="Times New Roman" w:eastAsia="Times New Roman"/>
+          <w:b w:val="0"/>
+          <w:i w:val="0"/>
+          <w:sz w:val="28"/>
         </w:rPr>
         <w:t>Пример: жизненный цикл заказа.</w:t>
       </w:r>
     </w:p>
     <w:p>
       <w:pPr>
-        <w:pStyle w:val="ListBullet"/>
+        <w:spacing w:after="80"/>
+        <w:ind w:left="283"/>
       </w:pPr>
       <w:r>
         <w:rPr>
-          <w:rFonts w:ascii="Times New Roman" w:hAnsi="Times New Roman"/>
-          <w:sz w:val="24"/>
+          <w:rFonts w:ascii="Courier New" w:hAnsi="Courier New" w:eastAsia="Courier New"/>
+          <w:b w:val="0"/>
+          <w:i w:val="0"/>
+          <w:sz w:val="22"/>
         </w:rPr>
-        <w:t>[*] → Новый</w:t>
+        <w:t xml:space="preserve">           [*] </w:t>
       </w:r>
     </w:p>
     <w:p>
       <w:pPr>
-        <w:pStyle w:val="ListBullet"/>
+        <w:spacing w:after="80"/>
+        <w:ind w:left="283"/>
       </w:pPr>
       <w:r>
         <w:rPr>
-          <w:rFonts w:ascii="Times New Roman" w:hAnsi="Times New Roman"/>
-          <w:sz w:val="24"/>
+          <w:rFonts w:ascii="Courier New" w:hAnsi="Courier New" w:eastAsia="Courier New"/>
+          <w:b w:val="0"/>
+          <w:i w:val="0"/>
+          <w:sz w:val="22"/>
         </w:rPr>
-        <w:t>Новый → Подтверждён (подтвердить); Новый → Отменён (отменить)</w:t>
+        <w:t xml:space="preserve">            │</w:t>
       </w:r>
     </w:p>
     <w:p>
       <w:pPr>
-        <w:pStyle w:val="ListBullet"/>
+        <w:spacing w:after="80"/>
+        <w:ind w:left="283"/>
       </w:pPr>
       <w:r>
         <w:rPr>
-          <w:rFonts w:ascii="Times New Roman" w:hAnsi="Times New Roman"/>
-          <w:sz w:val="24"/>
+          <w:rFonts w:ascii="Courier New" w:hAnsi="Courier New" w:eastAsia="Courier New"/>
+          <w:b w:val="0"/>
+          <w:i w:val="0"/>
+          <w:sz w:val="22"/>
         </w:rPr>
-        <w:t>Подтверждён → Оплачен (оплатить); Подтверждён → Отменён (отменить)</w:t>
+        <w:t xml:space="preserve">            ▼</w:t>
       </w:r>
     </w:p>
     <w:p>
       <w:pPr>
-        <w:pStyle w:val="ListBullet"/>
+        <w:spacing w:after="80"/>
+        <w:ind w:left="283"/>
       </w:pPr>
       <w:r>
         <w:rPr>
-          <w:rFonts w:ascii="Times New Roman" w:hAnsi="Times New Roman"/>
-          <w:sz w:val="24"/>
+          <w:rFonts w:ascii="Courier New" w:hAnsi="Courier New" w:eastAsia="Courier New"/>
+          <w:b w:val="0"/>
+          <w:i w:val="0"/>
+          <w:sz w:val="22"/>
         </w:rPr>
-        <w:t>Оплачен → ПереданВДоставку (передатьКурьеру)</w:t>
+        <w:t xml:space="preserve">         ┌──────┐  отменить   ┌─────────┐</w:t>
       </w:r>
     </w:p>
     <w:p>
       <w:pPr>
-        <w:pStyle w:val="ListBullet"/>
+        <w:spacing w:after="80"/>
+        <w:ind w:left="283"/>
       </w:pPr>
       <w:r>
         <w:rPr>
-          <w:rFonts w:ascii="Times New Roman" w:hAnsi="Times New Roman"/>
-          <w:sz w:val="24"/>
+          <w:rFonts w:ascii="Courier New" w:hAnsi="Courier New" w:eastAsia="Courier New"/>
+          <w:b w:val="0"/>
+          <w:i w:val="0"/>
+          <w:sz w:val="22"/>
         </w:rPr>
-        <w:t>ПереданВДоставку → Доставлен (вручить)</w:t>
+        <w:t xml:space="preserve">         │ Новый│────────────►│ Отменён │</w:t>
       </w:r>
     </w:p>
     <w:p>
       <w:pPr>
-        <w:pStyle w:val="ListBullet"/>
+        <w:spacing w:after="80"/>
+        <w:ind w:left="283"/>
       </w:pPr>
       <w:r>
         <w:rPr>
-          <w:rFonts w:ascii="Times New Roman" w:hAnsi="Times New Roman"/>
-          <w:sz w:val="24"/>
+          <w:rFonts w:ascii="Courier New" w:hAnsi="Courier New" w:eastAsia="Courier New"/>
+          <w:b w:val="0"/>
+          <w:i w:val="0"/>
+          <w:sz w:val="22"/>
         </w:rPr>
-        <w:t>Доставлен → Закрыт; Отменён → Закрыт; Закрыт → [*]</w:t>
+        <w:t xml:space="preserve">         └──┬───┘             └────┬────┘</w:t>
       </w:r>
     </w:p>
     <w:p>
       <w:pPr>
-        <w:spacing w:after="120"/>
+        <w:spacing w:after="80"/>
+        <w:ind w:left="283"/>
       </w:pPr>
       <w:r>
         <w:rPr>
-          <w:rFonts w:ascii="Times New Roman" w:hAnsi="Times New Roman"/>
+          <w:rFonts w:ascii="Courier New" w:hAnsi="Courier New" w:eastAsia="Courier New"/>
           <w:b w:val="0"/>
-          <w:sz w:val="24"/>
+          <w:i w:val="0"/>
+          <w:sz w:val="22"/>
         </w:rPr>
-        <w:t>На чертеже: залитый круг — начало; скруглённые прямоугольники — состояния; стрелки с событиями — переходы; конечное состояние — круг в кольце.</w:t>
+        <w:t xml:space="preserve">            │ подтвердить          │</w:t>
       </w:r>
     </w:p>
-    <w:p/>
     <w:p>
       <w:pPr>
-        <w:spacing w:after="120"/>
+        <w:spacing w:after="80"/>
+        <w:ind w:left="283"/>
       </w:pPr>
       <w:r>
         <w:rPr>
-          <w:rFonts w:ascii="Times New Roman" w:hAnsi="Times New Roman"/>
+          <w:rFonts w:ascii="Courier New" w:hAnsi="Courier New" w:eastAsia="Courier New"/>
           <w:b w:val="0"/>
-          <w:sz w:val="24"/>
+          <w:i w:val="0"/>
+          <w:sz w:val="22"/>
         </w:rPr>
-        <w:t>Преподаватель: П.Д. Баркун</w:t>
+        <w:t xml:space="preserve">            ▼                      │</w:t>
+      </w:r>
+    </w:p>
+    <w:p>
+      <w:pPr>
+        <w:spacing w:after="80"/>
+        <w:ind w:left="283"/>
+      </w:pPr>
+      <w:r>
+        <w:rPr>
+          <w:rFonts w:ascii="Courier New" w:hAnsi="Courier New" w:eastAsia="Courier New"/>
+          <w:b w:val="0"/>
+          <w:i w:val="0"/>
+          <w:sz w:val="22"/>
+        </w:rPr>
+        <w:t xml:space="preserve">      ┌───────────┐  отменить      │</w:t>
+      </w:r>
+    </w:p>
+    <w:p>
+      <w:pPr>
+        <w:spacing w:after="80"/>
+        <w:ind w:left="283"/>
+      </w:pPr>
+      <w:r>
+        <w:rPr>
+          <w:rFonts w:ascii="Courier New" w:hAnsi="Courier New" w:eastAsia="Courier New"/>
+          <w:b w:val="0"/>
+          <w:i w:val="0"/>
+          <w:sz w:val="22"/>
+        </w:rPr>
+        <w:t xml:space="preserve">      │Подтверждён│───────────────►│</w:t>
+      </w:r>
+    </w:p>
+    <w:p>
+      <w:pPr>
+        <w:spacing w:after="80"/>
+        <w:ind w:left="283"/>
+      </w:pPr>
+      <w:r>
+        <w:rPr>
+          <w:rFonts w:ascii="Courier New" w:hAnsi="Courier New" w:eastAsia="Courier New"/>
+          <w:b w:val="0"/>
+          <w:i w:val="0"/>
+          <w:sz w:val="22"/>
+        </w:rPr>
+        <w:t xml:space="preserve">      └─────┬─────┘                │</w:t>
+      </w:r>
+    </w:p>
+    <w:p>
+      <w:pPr>
+        <w:spacing w:after="80"/>
+        <w:ind w:left="283"/>
+      </w:pPr>
+      <w:r>
+        <w:rPr>
+          <w:rFonts w:ascii="Courier New" w:hAnsi="Courier New" w:eastAsia="Courier New"/>
+          <w:b w:val="0"/>
+          <w:i w:val="0"/>
+          <w:sz w:val="22"/>
+        </w:rPr>
+        <w:t xml:space="preserve">            │ оплатить             │</w:t>
+      </w:r>
+    </w:p>
+    <w:p>
+      <w:pPr>
+        <w:spacing w:after="80"/>
+        <w:ind w:left="283"/>
+      </w:pPr>
+      <w:r>
+        <w:rPr>
+          <w:rFonts w:ascii="Courier New" w:hAnsi="Courier New" w:eastAsia="Courier New"/>
+          <w:b w:val="0"/>
+          <w:i w:val="0"/>
+          <w:sz w:val="22"/>
+        </w:rPr>
+        <w:t xml:space="preserve">            ▼                      │</w:t>
+      </w:r>
+    </w:p>
+    <w:p>
+      <w:pPr>
+        <w:spacing w:after="80"/>
+        <w:ind w:left="283"/>
+      </w:pPr>
+      <w:r>
+        <w:rPr>
+          <w:rFonts w:ascii="Courier New" w:hAnsi="Courier New" w:eastAsia="Courier New"/>
+          <w:b w:val="0"/>
+          <w:i w:val="0"/>
+          <w:sz w:val="22"/>
+        </w:rPr>
+        <w:t xml:space="preserve">        ┌───────┐                  │</w:t>
+      </w:r>
+    </w:p>
+    <w:p>
+      <w:pPr>
+        <w:spacing w:after="80"/>
+        <w:ind w:left="283"/>
+      </w:pPr>
+      <w:r>
+        <w:rPr>
+          <w:rFonts w:ascii="Courier New" w:hAnsi="Courier New" w:eastAsia="Courier New"/>
+          <w:b w:val="0"/>
+          <w:i w:val="0"/>
+          <w:sz w:val="22"/>
+        </w:rPr>
+        <w:t xml:space="preserve">        │Оплачен│                  │</w:t>
+      </w:r>
+    </w:p>
+    <w:p>
+      <w:pPr>
+        <w:spacing w:after="80"/>
+        <w:ind w:left="283"/>
+      </w:pPr>
+      <w:r>
+        <w:rPr>
+          <w:rFonts w:ascii="Courier New" w:hAnsi="Courier New" w:eastAsia="Courier New"/>
+          <w:b w:val="0"/>
+          <w:i w:val="0"/>
+          <w:sz w:val="22"/>
+        </w:rPr>
+        <w:t xml:space="preserve">        └───┬───┘                  │</w:t>
+      </w:r>
+    </w:p>
+    <w:p>
+      <w:pPr>
+        <w:spacing w:after="80"/>
+        <w:ind w:left="283"/>
+      </w:pPr>
+      <w:r>
+        <w:rPr>
+          <w:rFonts w:ascii="Courier New" w:hAnsi="Courier New" w:eastAsia="Courier New"/>
+          <w:b w:val="0"/>
+          <w:i w:val="0"/>
+          <w:sz w:val="22"/>
+        </w:rPr>
+        <w:t xml:space="preserve">            │ передатьКурьеру      │</w:t>
+      </w:r>
+    </w:p>
+    <w:p>
+      <w:pPr>
+        <w:spacing w:after="80"/>
+        <w:ind w:left="283"/>
+      </w:pPr>
+      <w:r>
+        <w:rPr>
+          <w:rFonts w:ascii="Courier New" w:hAnsi="Courier New" w:eastAsia="Courier New"/>
+          <w:b w:val="0"/>
+          <w:i w:val="0"/>
+          <w:sz w:val="22"/>
+        </w:rPr>
+        <w:t xml:space="preserve">            ▼                      │</w:t>
+      </w:r>
+    </w:p>
+    <w:p>
+      <w:pPr>
+        <w:spacing w:after="80"/>
+        <w:ind w:left="283"/>
+      </w:pPr>
+      <w:r>
+        <w:rPr>
+          <w:rFonts w:ascii="Courier New" w:hAnsi="Courier New" w:eastAsia="Courier New"/>
+          <w:b w:val="0"/>
+          <w:i w:val="0"/>
+          <w:sz w:val="22"/>
+        </w:rPr>
+        <w:t xml:space="preserve">   ┌────────────────┐              │</w:t>
+      </w:r>
+    </w:p>
+    <w:p>
+      <w:pPr>
+        <w:spacing w:after="80"/>
+        <w:ind w:left="283"/>
+      </w:pPr>
+      <w:r>
+        <w:rPr>
+          <w:rFonts w:ascii="Courier New" w:hAnsi="Courier New" w:eastAsia="Courier New"/>
+          <w:b w:val="0"/>
+          <w:i w:val="0"/>
+          <w:sz w:val="22"/>
+        </w:rPr>
+        <w:t xml:space="preserve">   │ПереданВДоставку│              │</w:t>
+      </w:r>
+    </w:p>
+    <w:p>
+      <w:pPr>
+        <w:spacing w:after="80"/>
+        <w:ind w:left="283"/>
+      </w:pPr>
+      <w:r>
+        <w:rPr>
+          <w:rFonts w:ascii="Courier New" w:hAnsi="Courier New" w:eastAsia="Courier New"/>
+          <w:b w:val="0"/>
+          <w:i w:val="0"/>
+          <w:sz w:val="22"/>
+        </w:rPr>
+        <w:t xml:space="preserve">   └───────┬────────┘              │</w:t>
+      </w:r>
+    </w:p>
+    <w:p>
+      <w:pPr>
+        <w:spacing w:after="80"/>
+        <w:ind w:left="283"/>
+      </w:pPr>
+      <w:r>
+        <w:rPr>
+          <w:rFonts w:ascii="Courier New" w:hAnsi="Courier New" w:eastAsia="Courier New"/>
+          <w:b w:val="0"/>
+          <w:i w:val="0"/>
+          <w:sz w:val="22"/>
+        </w:rPr>
+        <w:t xml:space="preserve">           │ вручить               │</w:t>
+      </w:r>
+    </w:p>
+    <w:p>
+      <w:pPr>
+        <w:spacing w:after="80"/>
+        <w:ind w:left="283"/>
+      </w:pPr>
+      <w:r>
+        <w:rPr>
+          <w:rFonts w:ascii="Courier New" w:hAnsi="Courier New" w:eastAsia="Courier New"/>
+          <w:b w:val="0"/>
+          <w:i w:val="0"/>
+          <w:sz w:val="22"/>
+        </w:rPr>
+        <w:t xml:space="preserve">           ▼                       │</w:t>
+      </w:r>
+    </w:p>
+    <w:p>
+      <w:pPr>
+        <w:spacing w:after="80"/>
+        <w:ind w:left="283"/>
+      </w:pPr>
+      <w:r>
+        <w:rPr>
+          <w:rFonts w:ascii="Courier New" w:hAnsi="Courier New" w:eastAsia="Courier New"/>
+          <w:b w:val="0"/>
+          <w:i w:val="0"/>
+          <w:sz w:val="22"/>
+        </w:rPr>
+        <w:t xml:space="preserve">      ┌─────────┐                  │</w:t>
+      </w:r>
+    </w:p>
+    <w:p>
+      <w:pPr>
+        <w:spacing w:after="80"/>
+        <w:ind w:left="283"/>
+      </w:pPr>
+      <w:r>
+        <w:rPr>
+          <w:rFonts w:ascii="Courier New" w:hAnsi="Courier New" w:eastAsia="Courier New"/>
+          <w:b w:val="0"/>
+          <w:i w:val="0"/>
+          <w:sz w:val="22"/>
+        </w:rPr>
+        <w:t xml:space="preserve">      │Доставлен│                  │</w:t>
+      </w:r>
+    </w:p>
+    <w:p>
+      <w:pPr>
+        <w:spacing w:after="80"/>
+        <w:ind w:left="283"/>
+      </w:pPr>
+      <w:r>
+        <w:rPr>
+          <w:rFonts w:ascii="Courier New" w:hAnsi="Courier New" w:eastAsia="Courier New"/>
+          <w:b w:val="0"/>
+          <w:i w:val="0"/>
+          <w:sz w:val="22"/>
+        </w:rPr>
+        <w:t xml:space="preserve">      └────┬────┘                  │</w:t>
+      </w:r>
+    </w:p>
+    <w:p>
+      <w:pPr>
+        <w:spacing w:after="80"/>
+        <w:ind w:left="283"/>
+      </w:pPr>
+      <w:r>
+        <w:rPr>
+          <w:rFonts w:ascii="Courier New" w:hAnsi="Courier New" w:eastAsia="Courier New"/>
+          <w:b w:val="0"/>
+          <w:i w:val="0"/>
+          <w:sz w:val="22"/>
+        </w:rPr>
+        <w:t xml:space="preserve">           │ закрыть               │ закрыть</w:t>
+      </w:r>
+    </w:p>
+    <w:p>
+      <w:pPr>
+        <w:spacing w:after="80"/>
+        <w:ind w:left="283"/>
+      </w:pPr>
+      <w:r>
+        <w:rPr>
+          <w:rFonts w:ascii="Courier New" w:hAnsi="Courier New" w:eastAsia="Courier New"/>
+          <w:b w:val="0"/>
+          <w:i w:val="0"/>
+          <w:sz w:val="22"/>
+        </w:rPr>
+        <w:t xml:space="preserve">           ▼                       ▼</w:t>
+      </w:r>
+    </w:p>
+    <w:p>
+      <w:pPr>
+        <w:spacing w:after="80"/>
+        <w:ind w:left="283"/>
+      </w:pPr>
+      <w:r>
+        <w:rPr>
+          <w:rFonts w:ascii="Courier New" w:hAnsi="Courier New" w:eastAsia="Courier New"/>
+          <w:b w:val="0"/>
+          <w:i w:val="0"/>
+          <w:sz w:val="22"/>
+        </w:rPr>
+        <w:t xml:space="preserve">        ┌──────┐◄──────────────────┘</w:t>
+      </w:r>
+    </w:p>
+    <w:p>
+      <w:pPr>
+        <w:spacing w:after="80"/>
+        <w:ind w:left="283"/>
+      </w:pPr>
+      <w:r>
+        <w:rPr>
+          <w:rFonts w:ascii="Courier New" w:hAnsi="Courier New" w:eastAsia="Courier New"/>
+          <w:b w:val="0"/>
+          <w:i w:val="0"/>
+          <w:sz w:val="22"/>
+        </w:rPr>
+        <w:t xml:space="preserve">        │Закрыт│</w:t>
+      </w:r>
+    </w:p>
+    <w:p>
+      <w:pPr>
+        <w:spacing w:after="80"/>
+        <w:ind w:left="283"/>
+      </w:pPr>
+      <w:r>
+        <w:rPr>
+          <w:rFonts w:ascii="Courier New" w:hAnsi="Courier New" w:eastAsia="Courier New"/>
+          <w:b w:val="0"/>
+          <w:i w:val="0"/>
+          <w:sz w:val="22"/>
+        </w:rPr>
+        <w:t xml:space="preserve">        └──┬───┘</w:t>
+      </w:r>
+    </w:p>
+    <w:p>
+      <w:pPr>
+        <w:spacing w:after="80"/>
+        <w:ind w:left="283"/>
+      </w:pPr>
+      <w:r>
+        <w:rPr>
+          <w:rFonts w:ascii="Courier New" w:hAnsi="Courier New" w:eastAsia="Courier New"/>
+          <w:b w:val="0"/>
+          <w:i w:val="0"/>
+          <w:sz w:val="22"/>
+        </w:rPr>
+        <w:t xml:space="preserve">           ▼</w:t>
+      </w:r>
+    </w:p>
+    <w:p>
+      <w:pPr>
+        <w:spacing w:after="80"/>
+        <w:ind w:left="283"/>
+      </w:pPr>
+      <w:r>
+        <w:rPr>
+          <w:rFonts w:ascii="Courier New" w:hAnsi="Courier New" w:eastAsia="Courier New"/>
+          <w:b w:val="0"/>
+          <w:i w:val="0"/>
+          <w:sz w:val="22"/>
+        </w:rPr>
+        <w:t xml:space="preserve">          [*]</w:t>
+      </w:r>
+    </w:p>
+    <w:p>
+      <w:pPr>
+        <w:spacing w:after="120" w:before="0" w:line="276" w:lineRule="auto"/>
+        <w:jc w:val="both"/>
+      </w:pPr>
+      <w:r>
+        <w:rPr>
+          <w:rFonts w:ascii="Times New Roman" w:hAnsi="Times New Roman" w:eastAsia="Times New Roman"/>
+          <w:b w:val="0"/>
+          <w:i w:val="0"/>
+          <w:sz w:val="28"/>
+        </w:rPr>
+        <w:t>Как начертить: начальное состояние — залитый круг; состояния — скруглённые прямоугольники; переходы — стрелки с событием/действием; конечное состояние — круг в кольце.</w:t>
+      </w:r>
+    </w:p>
+    <w:p>
+      <w:pPr>
+        <w:spacing w:after="120" w:before="0" w:line="276" w:lineRule="auto"/>
+      </w:pPr>
+    </w:p>
+    <w:p>
+      <w:pPr>
+        <w:spacing w:after="120" w:before="0" w:line="276" w:lineRule="auto"/>
+        <w:jc w:val="center"/>
+      </w:pPr>
+      <w:r>
+        <w:rPr>
+          <w:rFonts w:ascii="Times New Roman" w:hAnsi="Times New Roman" w:eastAsia="Times New Roman"/>
+          <w:b w:val="0"/>
+          <w:i/>
+          <w:sz w:val="28"/>
+        </w:rPr>
+        <w:t>— Конец ответов —</w:t>
       </w:r>
     </w:p>
     <w:sectPr>
       <w:pgSz w:w="12240" w:h="15840"/>
-      <w:pgMar w:top="1134" w:right="850" w:bottom="1134" w:left="1417" w:header="720" w:footer="720" w:gutter="0"/>
+      <w:pgMar w:top="1134" w:right="850" w:bottom="1134" w:left="1701" w:header="720" w:footer="720" w:gutter="0"/>
       <w:cols w:space="720"/>
       <w:docGrid w:linePitch="360"/>
     </w:sectPr>
@@ -1809,10 +3868,6 @@
     <w:name w:val="Normal"/>
     <w:qFormat/>
     <w:rsid w:val="00FC693F"/>
-    <w:rPr>
-      <w:rFonts w:ascii="Times New Roman" w:hAnsi="Times New Roman"/>
-      <w:sz w:val="24"/>
-    </w:rPr>
   </w:style>
   <w:style w:type="paragraph" w:styleId="Header">
     <w:name w:val="header"/>

</xml_diff>

<commit_message>
Embed drawn UML diagrams into the Word answers file
Add PNG diagrams for sequence, use case, class, state,
communication and IDEF0, and insert them into the docx.

Co-authored-by: MaxChicago <MaxChicago@users.noreply.github.com>
</commit_message>
<xml_diff>
--- a/Kontrolnaya_TRPO_otvety.docx
+++ b/Kontrolnaya_TRPO_otvety.docx
@@ -49,7 +49,7 @@
     </w:p>
     <w:p>
       <w:pPr>
-        <w:spacing w:after="240" w:before="0" w:line="276" w:lineRule="auto"/>
+        <w:spacing w:after="200" w:before="0" w:line="276" w:lineRule="auto"/>
         <w:jc w:val="center"/>
       </w:pPr>
       <w:r>
@@ -64,7 +64,7 @@
     </w:p>
     <w:p>
       <w:pPr>
-        <w:spacing w:after="80" w:before="0" w:line="276" w:lineRule="auto"/>
+        <w:spacing w:after="40" w:before="0" w:line="276" w:lineRule="auto"/>
         <w:jc w:val="center"/>
       </w:pPr>
       <w:r>
@@ -79,7 +79,7 @@
     </w:p>
     <w:p>
       <w:pPr>
-        <w:spacing w:after="80" w:before="0" w:line="276" w:lineRule="auto"/>
+        <w:spacing w:after="40" w:before="0" w:line="276" w:lineRule="auto"/>
         <w:jc w:val="center"/>
       </w:pPr>
       <w:r>
@@ -94,7 +94,7 @@
     </w:p>
     <w:p>
       <w:pPr>
-        <w:spacing w:after="80" w:before="0" w:line="276" w:lineRule="auto"/>
+        <w:spacing w:after="120" w:before="0" w:line="276" w:lineRule="auto"/>
         <w:jc w:val="center"/>
       </w:pPr>
       <w:r>
@@ -109,7 +109,7 @@
     </w:p>
     <w:p>
       <w:pPr>
-        <w:spacing w:after="240" w:before="0" w:line="276" w:lineRule="auto"/>
+        <w:spacing w:after="200" w:before="0" w:line="276" w:lineRule="auto"/>
         <w:jc w:val="center"/>
       </w:pPr>
       <w:r>
@@ -124,7 +124,7 @@
     </w:p>
     <w:p>
       <w:pPr>
-        <w:spacing w:after="480" w:before="0" w:line="276" w:lineRule="auto"/>
+        <w:spacing w:after="320" w:before="0" w:line="276" w:lineRule="auto"/>
         <w:jc w:val="center"/>
       </w:pPr>
       <w:r>
@@ -139,6 +139,21 @@
     </w:p>
     <w:p>
       <w:pPr>
+        <w:spacing w:after="320" w:before="0" w:line="276" w:lineRule="auto"/>
+        <w:jc w:val="center"/>
+      </w:pPr>
+      <w:r>
+        <w:rPr>
+          <w:rFonts w:ascii="Times New Roman" w:hAnsi="Times New Roman" w:eastAsia="Times New Roman"/>
+          <w:b w:val="0"/>
+          <w:i/>
+          <w:sz w:val="28"/>
+        </w:rPr>
+        <w:t>с начерченными UML/IDEF-диаграммами</w:t>
+      </w:r>
+    </w:p>
+    <w:p>
+      <w:pPr>
         <w:spacing w:after="120" w:before="0" w:line="276" w:lineRule="auto"/>
         <w:jc w:val="right"/>
       </w:pPr>
@@ -154,7 +169,7 @@
     </w:p>
     <w:p>
       <w:pPr>
-        <w:spacing w:after="240" w:before="0" w:line="276" w:lineRule="auto"/>
+        <w:spacing w:after="120" w:before="0" w:line="276" w:lineRule="auto"/>
         <w:jc w:val="center"/>
       </w:pPr>
       <w:r>
@@ -174,7 +189,7 @@
     </w:p>
     <w:p>
       <w:pPr>
-        <w:spacing w:after="240" w:before="360" w:line="276" w:lineRule="auto"/>
+        <w:spacing w:after="200" w:before="280" w:line="276" w:lineRule="auto"/>
         <w:jc w:val="center"/>
       </w:pPr>
       <w:r>
@@ -189,7 +204,7 @@
     </w:p>
     <w:p>
       <w:pPr>
-        <w:spacing w:after="160" w:before="240" w:line="276" w:lineRule="auto"/>
+        <w:spacing w:after="120" w:before="200" w:line="276" w:lineRule="auto"/>
       </w:pPr>
       <w:r>
         <w:rPr>
@@ -213,12 +228,12 @@
           <w:i w:val="0"/>
           <w:sz w:val="28"/>
         </w:rPr>
-        <w:t>Жизненный цикл программного обеспечения (ЖЦ ПО) — это период времени от момента принятия решения о необходимости создания программного продукта до момента его полного изъятия из эксплуатации. ЖЦ охватывает все процессы: анализ, проектирование, реализацию, тестирование, внедрение, сопровождение и вывод из эксплуатации.</w:t>
+        <w:t>Жизненный цикл программного обеспечения (ЖЦ ПО) — это период времени от момента принятия решения о необходимости создания программного продукта до момента его полного изъятия из эксплуатации. ЖЦ охватывает анализ, проектирование, реализацию, тестирование, внедрение, сопровождение и вывод из эксплуатации.</w:t>
       </w:r>
     </w:p>
     <w:p>
       <w:pPr>
-        <w:spacing w:after="80" w:before="0" w:line="276" w:lineRule="auto"/>
+        <w:spacing w:after="60" w:before="0" w:line="276" w:lineRule="auto"/>
       </w:pPr>
       <w:r>
         <w:rPr>
@@ -227,13 +242,13 @@
           <w:i w:val="0"/>
           <w:sz w:val="28"/>
         </w:rPr>
-        <w:t>Основные этапы жизненного цикла ПО:</w:t>
+        <w:t>Основные этапы:</w:t>
       </w:r>
     </w:p>
     <w:p>
       <w:pPr>
         <w:pStyle w:val="ListBullet"/>
-        <w:spacing w:after="60"/>
+        <w:spacing w:after="40"/>
       </w:pPr>
       <w:r>
         <w:rPr>
@@ -242,13 +257,13 @@
           <w:i w:val="0"/>
           <w:sz w:val="28"/>
         </w:rPr>
-        <w:t>Анализ требований — выявление и формализация потребностей заказчика и пользователей; формулировка функциональных и нефункциональных требований.</w:t>
+        <w:t>Анализ требований — выявление и формализация потребностей заказчика; функциональные и нефункциональные требования.</w:t>
       </w:r>
     </w:p>
     <w:p>
       <w:pPr>
         <w:pStyle w:val="ListBullet"/>
-        <w:spacing w:after="60"/>
+        <w:spacing w:after="40"/>
       </w:pPr>
       <w:r>
         <w:rPr>
@@ -257,13 +272,13 @@
           <w:i w:val="0"/>
           <w:sz w:val="28"/>
         </w:rPr>
-        <w:t>Проектирование — разработка архитектуры системы, структуры данных, интерфейсов, алгоритмов; создание UML- и других моделей.</w:t>
+        <w:t>Проектирование — архитектура, структуры данных, интерфейсы, алгоритмы, UML-модели.</w:t>
       </w:r>
     </w:p>
     <w:p>
       <w:pPr>
         <w:pStyle w:val="ListBullet"/>
-        <w:spacing w:after="60"/>
+        <w:spacing w:after="40"/>
       </w:pPr>
       <w:r>
         <w:rPr>
@@ -272,13 +287,13 @@
           <w:i w:val="0"/>
           <w:sz w:val="28"/>
         </w:rPr>
-        <w:t>Реализация (кодирование) — написание исходного кода, создание модулей и компонентов согласно проекту.</w:t>
+        <w:t>Реализация (кодирование) — написание исходного кода и сборка модулей.</w:t>
       </w:r>
     </w:p>
     <w:p>
       <w:pPr>
         <w:pStyle w:val="ListBullet"/>
-        <w:spacing w:after="60"/>
+        <w:spacing w:after="40"/>
       </w:pPr>
       <w:r>
         <w:rPr>
@@ -287,13 +302,13 @@
           <w:i w:val="0"/>
           <w:sz w:val="28"/>
         </w:rPr>
-        <w:t>Тестирование — проверка соответствия ПО требованиям, поиск и устранение дефектов (модульное, интеграционное, системное, приёмочное).</w:t>
+        <w:t>Тестирование — проверка соответствия требованиям, поиск и устранение дефектов.</w:t>
       </w:r>
     </w:p>
     <w:p>
       <w:pPr>
         <w:pStyle w:val="ListBullet"/>
-        <w:spacing w:after="60"/>
+        <w:spacing w:after="40"/>
       </w:pPr>
       <w:r>
         <w:rPr>
@@ -302,13 +317,13 @@
           <w:i w:val="0"/>
           <w:sz w:val="28"/>
         </w:rPr>
-        <w:t>Внедрение — установка ПО у заказчика, обучение пользователей, ввод в промышленную эксплуатацию.</w:t>
+        <w:t>Внедрение — установка у заказчика, обучение пользователей, ввод в эксплуатацию.</w:t>
       </w:r>
     </w:p>
     <w:p>
       <w:pPr>
         <w:pStyle w:val="ListBullet"/>
-        <w:spacing w:after="60"/>
+        <w:spacing w:after="40"/>
       </w:pPr>
       <w:r>
         <w:rPr>
@@ -317,13 +332,13 @@
           <w:i w:val="0"/>
           <w:sz w:val="28"/>
         </w:rPr>
-        <w:t>Сопровождение — исправление ошибок, адаптация к новым условиям, развитие функциональности.</w:t>
+        <w:t>Сопровождение — исправление ошибок, адаптация, развитие функциональности.</w:t>
       </w:r>
     </w:p>
     <w:p>
       <w:pPr>
         <w:pStyle w:val="ListBullet"/>
-        <w:spacing w:after="60"/>
+        <w:spacing w:after="40"/>
       </w:pPr>
       <w:r>
         <w:rPr>
@@ -332,12 +347,12 @@
           <w:i w:val="0"/>
           <w:sz w:val="28"/>
         </w:rPr>
-        <w:t>Вывод из эксплуатации — прекращение поддержки и использования системы (при необходимости — миграция данных).</w:t>
+        <w:t>Вывод из эксплуатации — прекращение поддержки (при необходимости — миграция данных).</w:t>
       </w:r>
     </w:p>
     <w:p>
       <w:pPr>
-        <w:spacing w:after="80" w:before="0" w:line="276" w:lineRule="auto"/>
+        <w:spacing w:after="60" w:before="0" w:line="276" w:lineRule="auto"/>
       </w:pPr>
       <w:r>
         <w:rPr>
@@ -366,22 +381,7 @@
     </w:p>
     <w:p>
       <w:pPr>
-        <w:spacing w:after="120" w:before="0" w:line="276" w:lineRule="auto"/>
-        <w:jc w:val="both"/>
-      </w:pPr>
-      <w:r>
-        <w:rPr>
-          <w:rFonts w:ascii="Times New Roman" w:hAnsi="Times New Roman" w:eastAsia="Times New Roman"/>
-          <w:b w:val="0"/>
-          <w:i w:val="0"/>
-          <w:sz w:val="28"/>
-        </w:rPr>
-        <w:t>В итеративных и Agile-моделях этапы могут повторяться циклами, но логическая последовательность внутри итерации сохраняется.</w:t>
-      </w:r>
-    </w:p>
-    <w:p>
-      <w:pPr>
-        <w:spacing w:after="160" w:before="240" w:line="276" w:lineRule="auto"/>
+        <w:spacing w:after="120" w:before="200" w:line="276" w:lineRule="auto"/>
       </w:pPr>
       <w:r>
         <w:rPr>
@@ -405,7 +405,7 @@
           <w:i w:val="0"/>
           <w:sz w:val="28"/>
         </w:rPr>
-        <w:t>Назначение диаграммы вариантов использования (Use Case Diagram): показать, кто взаимодействует с системой и какие функции система предоставляет. Диаграмма описывает границы системы с точки зрения пользователей и внешних систем, не раскрывая внутреннюю реализацию.</w:t>
+        <w:t>Назначение: показать, кто взаимодействует с системой и какие функции система предоставляет; описать границы системы без раскрытия внутренней реализации.</w:t>
       </w:r>
     </w:p>
     <w:p>
@@ -420,7 +420,7 @@
           <w:i w:val="0"/>
           <w:sz w:val="28"/>
         </w:rPr>
-        <w:t xml:space="preserve">Актёр (Actor) — </w:t>
+        <w:t xml:space="preserve">Актёр — </w:t>
       </w:r>
       <w:r>
         <w:rPr>
@@ -429,7 +429,7 @@
           <w:i w:val="0"/>
           <w:sz w:val="28"/>
         </w:rPr>
-        <w:t>внешняя по отношению к системе сущность (человек, организация или другая система), которая взаимодействует с системой для достижения цели. Актёр инициирует прецеденты или участвует в них. Обозначается фигурой «человечек» или стереотипом &lt;&lt;actor&gt;&gt;.</w:t>
+        <w:t>внешняя сущность (человек или система), взаимодействующая с системой для достижения цели.</w:t>
       </w:r>
     </w:p>
     <w:p>
@@ -444,7 +444,7 @@
           <w:i w:val="0"/>
           <w:sz w:val="28"/>
         </w:rPr>
-        <w:t xml:space="preserve">Прецедент (Use Case) — </w:t>
+        <w:t xml:space="preserve">Прецедент — </w:t>
       </w:r>
       <w:r>
         <w:rPr>
@@ -453,7 +453,7 @@
           <w:i w:val="0"/>
           <w:sz w:val="28"/>
         </w:rPr>
-        <w:t>последовательность действий системы, видимая актёру и приводящая к значимому для него результату. Прецедент описывает «что» делает система, а не «как». Обозначается овалом с названием (обычно глагол + объект: «Оформить заказ»).</w:t>
+        <w:t>последовательность действий системы, видимая актёру и дающая значимый результат («что» делает система).</w:t>
       </w:r>
     </w:p>
     <w:p>
@@ -468,7 +468,7 @@
           <w:i w:val="0"/>
           <w:sz w:val="28"/>
         </w:rPr>
-        <w:t xml:space="preserve">Отношение include (включение): </w:t>
+        <w:t xml:space="preserve">Отношение include — </w:t>
       </w:r>
       <w:r>
         <w:rPr>
@@ -477,7 +477,7 @@
           <w:i w:val="0"/>
           <w:sz w:val="28"/>
         </w:rPr>
-        <w:t>обязательное включение поведения одного прецедента в другой. Базовый прецедент всегда выполняет включаемый. Используется для выделения общего фрагмента, который повторяется в нескольких прецедентах. Стрелка: базовый → включаемый, стереотип &lt;&lt;include&gt;&gt;.</w:t>
+        <w:t>обязательное включение поведения одного прецедента в другой; общий фрагмент всегда выполняется. Стрелка: базовый → включаемый, &lt;&lt;include&gt;&gt;.</w:t>
       </w:r>
     </w:p>
     <w:p>
@@ -492,7 +492,7 @@
           <w:i w:val="0"/>
           <w:sz w:val="28"/>
         </w:rPr>
-        <w:t xml:space="preserve">Отношение extend (расширение): </w:t>
+        <w:t xml:space="preserve">Отношение extend — </w:t>
       </w:r>
       <w:r>
         <w:rPr>
@@ -501,12 +501,12 @@
           <w:i w:val="0"/>
           <w:sz w:val="28"/>
         </w:rPr>
-        <w:t>условное расширение базового прецедента дополнительным поведением. Расширяющий прецедент выполняется не всегда, а при определённом условии (точка расширения). Стрелка: расширение → базовый, стереотип &lt;&lt;extend&gt;&gt;.</w:t>
+        <w:t>условное расширение базового прецедента; выполняется не всегда. Стрелка: расширение → базовый, &lt;&lt;extend&gt;&gt;.</w:t>
       </w:r>
     </w:p>
     <w:p>
       <w:pPr>
-        <w:spacing w:after="160" w:before="240" w:line="276" w:lineRule="auto"/>
+        <w:spacing w:after="120" w:before="200" w:line="276" w:lineRule="auto"/>
       </w:pPr>
       <w:r>
         <w:rPr>
@@ -539,7 +539,7 @@
           <w:i w:val="0"/>
           <w:sz w:val="28"/>
         </w:rPr>
-        <w:t>вид тестирования, при котором проверяется, соответствует ли поведение ПО заявленным функциональным требованиям: правильно ли система выполняет функции, обрабатывает входные данные, формирует результаты и сообщения об ошибках. Оценивается «что делает» система, а не «как устроена» внутри.</w:t>
+        <w:t>проверка соответствия поведения ПО функциональным требованиям: корректность функций, обработки данных и результатов. Оценивается «что делает» система.</w:t>
       </w:r>
     </w:p>
     <w:p>
@@ -554,7 +554,7 @@
           <w:i w:val="0"/>
           <w:sz w:val="28"/>
         </w:rPr>
-        <w:t xml:space="preserve">Юзабилити-тестирование (usability testing) — </w:t>
+        <w:t xml:space="preserve">Юзабилити-тестирование — </w:t>
       </w:r>
       <w:r>
         <w:rPr>
@@ -563,12 +563,12 @@
           <w:i w:val="0"/>
           <w:sz w:val="28"/>
         </w:rPr>
-        <w:t>вид тестирования удобства использования интерфейса: насколько легко и эффективно пользователь достигает целей, понятны ли элементы управления, насколько интуитивен сценарий работы. Оцениваются понятность, обучаемость, эффективность, удовлетворённость пользователя.</w:t>
+        <w:t>проверка удобства интерфейса: насколько легко пользователь достигает целей, понятны ли элементы управления. Оцениваются понятность, эффективность, удовлетворённость.</w:t>
       </w:r>
     </w:p>
     <w:p>
       <w:pPr>
-        <w:spacing w:after="160" w:before="240" w:line="276" w:lineRule="auto"/>
+        <w:spacing w:after="120" w:before="200" w:line="276" w:lineRule="auto"/>
       </w:pPr>
       <w:r>
         <w:rPr>
@@ -592,245 +592,62 @@
           <w:i w:val="0"/>
           <w:sz w:val="28"/>
         </w:rPr>
-        <w:t>Пример: оформление заказа в интернет-магазине.</w:t>
+        <w:t>Пример: оформление заказа в интернет-магазине. Участники: Покупатель, :Интерфейс, :Корзина, :Склад, :Оплата.</w:t>
       </w:r>
     </w:p>
     <w:p>
       <w:pPr>
-        <w:spacing w:after="120" w:before="0" w:line="276" w:lineRule="auto"/>
-        <w:jc w:val="both"/>
+        <w:spacing w:before="120" w:after="80"/>
+        <w:jc w:val="center"/>
+      </w:pPr>
+      <w:r>
+        <w:drawing>
+          <wp:inline xmlns:a="http://schemas.openxmlformats.org/drawingml/2006/main" xmlns:pic="http://schemas.openxmlformats.org/drawingml/2006/picture">
+            <wp:extent cx="5852160" cy="4586245"/>
+            <wp:docPr id="1" name="Picture 1"/>
+            <wp:cNvGraphicFramePr>
+              <a:graphicFrameLocks noChangeAspect="1"/>
+            </wp:cNvGraphicFramePr>
+            <a:graphic>
+              <a:graphicData uri="http://schemas.openxmlformats.org/drawingml/2006/picture">
+                <pic:pic>
+                  <pic:nvPicPr>
+                    <pic:cNvPr id="0" name="v1_sequence.png"/>
+                    <pic:cNvPicPr/>
+                  </pic:nvPicPr>
+                  <pic:blipFill>
+                    <a:blip r:embed="rId9"/>
+                    <a:stretch>
+                      <a:fillRect/>
+                    </a:stretch>
+                  </pic:blipFill>
+                  <pic:spPr>
+                    <a:xfrm>
+                      <a:off x="0" y="0"/>
+                      <a:ext cx="5852160" cy="4586245"/>
+                    </a:xfrm>
+                    <a:prstGeom prst="rect"/>
+                  </pic:spPr>
+                </pic:pic>
+              </a:graphicData>
+            </a:graphic>
+          </wp:inline>
+        </w:drawing>
+      </w:r>
+    </w:p>
+    <w:p>
+      <w:pPr>
+        <w:spacing w:after="200" w:before="0" w:line="276" w:lineRule="auto"/>
+        <w:jc w:val="center"/>
       </w:pPr>
       <w:r>
         <w:rPr>
           <w:rFonts w:ascii="Times New Roman" w:hAnsi="Times New Roman" w:eastAsia="Times New Roman"/>
           <w:b w:val="0"/>
-          <w:i w:val="0"/>
-          <w:sz w:val="28"/>
+          <w:i/>
+          <w:sz w:val="24"/>
         </w:rPr>
-        <w:t>Участники: актёр Покупатель; объекты :Интерфейс, :Корзина, :Склад, :Оплата.</w:t>
-      </w:r>
-    </w:p>
-    <w:p>
-      <w:pPr>
-        <w:spacing w:after="80" w:before="0" w:line="276" w:lineRule="auto"/>
-      </w:pPr>
-      <w:r>
-        <w:rPr>
-          <w:rFonts w:ascii="Times New Roman" w:hAnsi="Times New Roman" w:eastAsia="Times New Roman"/>
-          <w:b/>
-          <w:i w:val="0"/>
-          <w:sz w:val="28"/>
-        </w:rPr>
-        <w:t>Последовательность сообщений:</w:t>
-      </w:r>
-    </w:p>
-    <w:p>
-      <w:pPr>
-        <w:spacing w:after="80"/>
-        <w:ind w:left="283"/>
-      </w:pPr>
-      <w:r>
-        <w:rPr>
-          <w:rFonts w:ascii="Courier New" w:hAnsi="Courier New" w:eastAsia="Courier New"/>
-          <w:b w:val="0"/>
-          <w:i w:val="0"/>
-          <w:sz w:val="22"/>
-        </w:rPr>
-        <w:t>Покупатель → Интерфейс : добавитьТовар(id)</w:t>
-      </w:r>
-    </w:p>
-    <w:p>
-      <w:pPr>
-        <w:spacing w:after="80"/>
-        <w:ind w:left="283"/>
-      </w:pPr>
-      <w:r>
-        <w:rPr>
-          <w:rFonts w:ascii="Courier New" w:hAnsi="Courier New" w:eastAsia="Courier New"/>
-          <w:b w:val="0"/>
-          <w:i w:val="0"/>
-          <w:sz w:val="22"/>
-        </w:rPr>
-        <w:t>Интерфейс → Корзина : добавить(id)</w:t>
-      </w:r>
-    </w:p>
-    <w:p>
-      <w:pPr>
-        <w:spacing w:after="80"/>
-        <w:ind w:left="283"/>
-      </w:pPr>
-      <w:r>
-        <w:rPr>
-          <w:rFonts w:ascii="Courier New" w:hAnsi="Courier New" w:eastAsia="Courier New"/>
-          <w:b w:val="0"/>
-          <w:i w:val="0"/>
-          <w:sz w:val="22"/>
-        </w:rPr>
-        <w:t>Корзина → Склад : проверитьНаличие(id)</w:t>
-      </w:r>
-    </w:p>
-    <w:p>
-      <w:pPr>
-        <w:spacing w:after="80"/>
-        <w:ind w:left="283"/>
-      </w:pPr>
-      <w:r>
-        <w:rPr>
-          <w:rFonts w:ascii="Courier New" w:hAnsi="Courier New" w:eastAsia="Courier New"/>
-          <w:b w:val="0"/>
-          <w:i w:val="0"/>
-          <w:sz w:val="22"/>
-        </w:rPr>
-        <w:t>Склад --&gt; Корзина : естьВНаличии</w:t>
-      </w:r>
-    </w:p>
-    <w:p>
-      <w:pPr>
-        <w:spacing w:after="80"/>
-        <w:ind w:left="283"/>
-      </w:pPr>
-      <w:r>
-        <w:rPr>
-          <w:rFonts w:ascii="Courier New" w:hAnsi="Courier New" w:eastAsia="Courier New"/>
-          <w:b w:val="0"/>
-          <w:i w:val="0"/>
-          <w:sz w:val="22"/>
-        </w:rPr>
-        <w:t>Корзина --&gt; Интерфейс : товарДобавлен</w:t>
-      </w:r>
-    </w:p>
-    <w:p>
-      <w:pPr>
-        <w:spacing w:after="80"/>
-        <w:ind w:left="283"/>
-      </w:pPr>
-      <w:r>
-        <w:rPr>
-          <w:rFonts w:ascii="Courier New" w:hAnsi="Courier New" w:eastAsia="Courier New"/>
-          <w:b w:val="0"/>
-          <w:i w:val="0"/>
-          <w:sz w:val="22"/>
-        </w:rPr>
-        <w:t>Интерфейс --&gt; Покупатель : показатьКорзину()</w:t>
-      </w:r>
-    </w:p>
-    <w:p>
-      <w:pPr>
-        <w:spacing w:after="80"/>
-        <w:ind w:left="283"/>
-      </w:pPr>
-      <w:r>
-        <w:rPr>
-          <w:rFonts w:ascii="Courier New" w:hAnsi="Courier New" w:eastAsia="Courier New"/>
-          <w:b w:val="0"/>
-          <w:i w:val="0"/>
-          <w:sz w:val="22"/>
-        </w:rPr>
-      </w:r>
-    </w:p>
-    <w:p>
-      <w:pPr>
-        <w:spacing w:after="80"/>
-        <w:ind w:left="283"/>
-      </w:pPr>
-      <w:r>
-        <w:rPr>
-          <w:rFonts w:ascii="Courier New" w:hAnsi="Courier New" w:eastAsia="Courier New"/>
-          <w:b w:val="0"/>
-          <w:i w:val="0"/>
-          <w:sz w:val="22"/>
-        </w:rPr>
-        <w:t>Покупатель → Интерфейс : оформитьЗаказ()</w:t>
-      </w:r>
-    </w:p>
-    <w:p>
-      <w:pPr>
-        <w:spacing w:after="80"/>
-        <w:ind w:left="283"/>
-      </w:pPr>
-      <w:r>
-        <w:rPr>
-          <w:rFonts w:ascii="Courier New" w:hAnsi="Courier New" w:eastAsia="Courier New"/>
-          <w:b w:val="0"/>
-          <w:i w:val="0"/>
-          <w:sz w:val="22"/>
-        </w:rPr>
-        <w:t>Интерфейс → Корзина : получитьСостав()</w:t>
-      </w:r>
-    </w:p>
-    <w:p>
-      <w:pPr>
-        <w:spacing w:after="80"/>
-        <w:ind w:left="283"/>
-      </w:pPr>
-      <w:r>
-        <w:rPr>
-          <w:rFonts w:ascii="Courier New" w:hAnsi="Courier New" w:eastAsia="Courier New"/>
-          <w:b w:val="0"/>
-          <w:i w:val="0"/>
-          <w:sz w:val="22"/>
-        </w:rPr>
-        <w:t>Корзина --&gt; Интерфейс : списокТоваров</w:t>
-      </w:r>
-    </w:p>
-    <w:p>
-      <w:pPr>
-        <w:spacing w:after="80"/>
-        <w:ind w:left="283"/>
-      </w:pPr>
-      <w:r>
-        <w:rPr>
-          <w:rFonts w:ascii="Courier New" w:hAnsi="Courier New" w:eastAsia="Courier New"/>
-          <w:b w:val="0"/>
-          <w:i w:val="0"/>
-          <w:sz w:val="22"/>
-        </w:rPr>
-        <w:t>Интерфейс → Оплата : оплатить(сумма)</w:t>
-      </w:r>
-    </w:p>
-    <w:p>
-      <w:pPr>
-        <w:spacing w:after="80"/>
-        <w:ind w:left="283"/>
-      </w:pPr>
-      <w:r>
-        <w:rPr>
-          <w:rFonts w:ascii="Courier New" w:hAnsi="Courier New" w:eastAsia="Courier New"/>
-          <w:b w:val="0"/>
-          <w:i w:val="0"/>
-          <w:sz w:val="22"/>
-        </w:rPr>
-        <w:t>Оплата --&gt; Интерфейс : успех</w:t>
-      </w:r>
-    </w:p>
-    <w:p>
-      <w:pPr>
-        <w:spacing w:after="80"/>
-        <w:ind w:left="283"/>
-      </w:pPr>
-      <w:r>
-        <w:rPr>
-          <w:rFonts w:ascii="Courier New" w:hAnsi="Courier New" w:eastAsia="Courier New"/>
-          <w:b w:val="0"/>
-          <w:i w:val="0"/>
-          <w:sz w:val="22"/>
-        </w:rPr>
-        <w:t>Интерфейс --&gt; Покупатель : заказОформлен</w:t>
-      </w:r>
-    </w:p>
-    <w:p>
-      <w:pPr>
-        <w:spacing w:after="120" w:before="0" w:line="276" w:lineRule="auto"/>
-        <w:jc w:val="both"/>
-      </w:pPr>
-      <w:r>
-        <w:rPr>
-          <w:rFonts w:ascii="Times New Roman" w:hAnsi="Times New Roman" w:eastAsia="Times New Roman"/>
-          <w:b w:val="0"/>
-          <w:i w:val="0"/>
-          <w:sz w:val="28"/>
-        </w:rPr>
-        <w:t>Как начертить: слева актёр, далее объекты с вертикальными линиями жизни; горизонтальные стрелки — сообщения (сплошные — вызов, пунктирные — возврат); на линиях жизни — прямоугольники активации.</w:t>
+        <w:t>Рисунок 1 — Диаграмма последовательности (вариант 1, задание 4)</w:t>
       </w:r>
     </w:p>
     <w:p>
@@ -840,7 +657,7 @@
     </w:p>
     <w:p>
       <w:pPr>
-        <w:spacing w:after="240" w:before="360" w:line="276" w:lineRule="auto"/>
+        <w:spacing w:after="200" w:before="280" w:line="276" w:lineRule="auto"/>
         <w:jc w:val="center"/>
       </w:pPr>
       <w:r>
@@ -855,7 +672,7 @@
     </w:p>
     <w:p>
       <w:pPr>
-        <w:spacing w:after="160" w:before="240" w:line="276" w:lineRule="auto"/>
+        <w:spacing w:after="120" w:before="200" w:line="276" w:lineRule="auto"/>
       </w:pPr>
       <w:r>
         <w:rPr>
@@ -879,12 +696,12 @@
           <w:i w:val="0"/>
           <w:sz w:val="28"/>
         </w:rPr>
-        <w:t>Назначение функционального моделирования: описать систему как набор функций (работ), показать, что делает система, какие данные/материалы входят и выходят, чем управляется и какими ресурсами выполняется. Помогает анализировать бизнес-процессы и требования до детального проектирования ПО.</w:t>
+        <w:t>Назначение функционального моделирования: описать систему как набор функций — что делает система, какие входы/выходы, чем управляется и какими ресурсами выполняется.</w:t>
       </w:r>
     </w:p>
     <w:p>
       <w:pPr>
-        <w:spacing w:after="80" w:before="0" w:line="276" w:lineRule="auto"/>
+        <w:spacing w:after="60" w:before="0" w:line="276" w:lineRule="auto"/>
       </w:pPr>
       <w:r>
         <w:rPr>
@@ -899,7 +716,7 @@
     <w:p>
       <w:pPr>
         <w:pStyle w:val="ListBullet"/>
-        <w:spacing w:after="60"/>
+        <w:spacing w:after="40"/>
       </w:pPr>
       <w:r>
         <w:rPr>
@@ -908,13 +725,13 @@
           <w:i w:val="0"/>
           <w:sz w:val="28"/>
         </w:rPr>
-        <w:t>Блоки (Activity / Function) — прямоугольники, обозначающие функции. Название — глагол + объект.</w:t>
+        <w:t>Блоки (функции) — прямоугольники с названием «глагол + объект».</w:t>
       </w:r>
     </w:p>
     <w:p>
       <w:pPr>
         <w:pStyle w:val="ListBullet"/>
-        <w:spacing w:after="60"/>
+        <w:spacing w:after="40"/>
       </w:pPr>
       <w:r>
         <w:rPr>
@@ -923,13 +740,13 @@
           <w:i w:val="0"/>
           <w:sz w:val="28"/>
         </w:rPr>
-        <w:t>Стрелки входа (Input) — слева: объекты, которые преобразуются функцией.</w:t>
+        <w:t>Стрелки входа (слева), выхода (справа), управления (сверху), механизмов (снизу).</w:t>
       </w:r>
     </w:p>
     <w:p>
       <w:pPr>
         <w:pStyle w:val="ListBullet"/>
-        <w:spacing w:after="60"/>
+        <w:spacing w:after="40"/>
       </w:pPr>
       <w:r>
         <w:rPr>
@@ -938,67 +755,7 @@
           <w:i w:val="0"/>
           <w:sz w:val="28"/>
         </w:rPr>
-        <w:t>Стрелки выхода (Output) — справа: результаты функции.</w:t>
-      </w:r>
-    </w:p>
-    <w:p>
-      <w:pPr>
-        <w:pStyle w:val="ListBullet"/>
-        <w:spacing w:after="60"/>
-      </w:pPr>
-      <w:r>
-        <w:rPr>
-          <w:rFonts w:ascii="Times New Roman" w:hAnsi="Times New Roman" w:eastAsia="Times New Roman"/>
-          <w:b w:val="0"/>
-          <w:i w:val="0"/>
-          <w:sz w:val="28"/>
-        </w:rPr>
-        <w:t>Стрелки управления (Control) — сверху: правила, стандарты, ограничения.</w:t>
-      </w:r>
-    </w:p>
-    <w:p>
-      <w:pPr>
-        <w:pStyle w:val="ListBullet"/>
-        <w:spacing w:after="60"/>
-      </w:pPr>
-      <w:r>
-        <w:rPr>
-          <w:rFonts w:ascii="Times New Roman" w:hAnsi="Times New Roman" w:eastAsia="Times New Roman"/>
-          <w:b w:val="0"/>
-          <w:i w:val="0"/>
-          <w:sz w:val="28"/>
-        </w:rPr>
-        <w:t>Стрелки механизмов (Mechanism) — снизу: ресурсы, исполнители, оборудование, ПО.</w:t>
-      </w:r>
-    </w:p>
-    <w:p>
-      <w:pPr>
-        <w:pStyle w:val="ListBullet"/>
-        <w:spacing w:after="60"/>
-      </w:pPr>
-      <w:r>
-        <w:rPr>
-          <w:rFonts w:ascii="Times New Roman" w:hAnsi="Times New Roman" w:eastAsia="Times New Roman"/>
-          <w:b w:val="0"/>
-          <w:i w:val="0"/>
-          <w:sz w:val="28"/>
-        </w:rPr>
-        <w:t>Иерархия диаграмм — декомпозиция: A0 → A1, A2… → A11, A12…</w:t>
-      </w:r>
-    </w:p>
-    <w:p>
-      <w:pPr>
-        <w:pStyle w:val="ListBullet"/>
-        <w:spacing w:after="60"/>
-      </w:pPr>
-      <w:r>
-        <w:rPr>
-          <w:rFonts w:ascii="Times New Roman" w:hAnsi="Times New Roman" w:eastAsia="Times New Roman"/>
-          <w:b w:val="0"/>
-          <w:i w:val="0"/>
-          <w:sz w:val="28"/>
-        </w:rPr>
-        <w:t>Глоссарий, цель и точка зрения модели.</w:t>
+        <w:t>Иерархия декомпозиции (A0 → A1, A2…), глоссарий, цель и точка зрения.</w:t>
       </w:r>
     </w:p>
     <w:p>
@@ -1013,7 +770,7 @@
           <w:i w:val="0"/>
           <w:sz w:val="28"/>
         </w:rPr>
-        <w:t xml:space="preserve">Контекстная диаграмма (A-0): </w:t>
+        <w:t xml:space="preserve">Контекстная диаграмма — </w:t>
       </w:r>
       <w:r>
         <w:rPr>
@@ -1022,12 +779,67 @@
           <w:i w:val="0"/>
           <w:sz w:val="28"/>
         </w:rPr>
-        <w:t>верхний уровень модели IDEF0 — один функциональный блок, представляющий систему целиком, и внешние стрелки (входы, выходы, управление, механизмы), связывающие систему с окружением. Определяет границы моделируемой системы. Дальнейшие диаграммы — декомпозиция этого блока.</w:t>
+        <w:t>верхний уровень: один функциональный блок (вся система) и внешние стрелки. Определяет границы системы.</w:t>
       </w:r>
     </w:p>
     <w:p>
       <w:pPr>
-        <w:spacing w:after="160" w:before="240" w:line="276" w:lineRule="auto"/>
+        <w:spacing w:before="120" w:after="80"/>
+        <w:jc w:val="center"/>
+      </w:pPr>
+      <w:r>
+        <w:drawing>
+          <wp:inline xmlns:a="http://schemas.openxmlformats.org/drawingml/2006/main" xmlns:pic="http://schemas.openxmlformats.org/drawingml/2006/picture">
+            <wp:extent cx="5303520" cy="3939281"/>
+            <wp:docPr id="2" name="Picture 2"/>
+            <wp:cNvGraphicFramePr>
+              <a:graphicFrameLocks noChangeAspect="1"/>
+            </wp:cNvGraphicFramePr>
+            <a:graphic>
+              <a:graphicData uri="http://schemas.openxmlformats.org/drawingml/2006/picture">
+                <pic:pic>
+                  <pic:nvPicPr>
+                    <pic:cNvPr id="0" name="v2_idef0.png"/>
+                    <pic:cNvPicPr/>
+                  </pic:nvPicPr>
+                  <pic:blipFill>
+                    <a:blip r:embed="rId10"/>
+                    <a:stretch>
+                      <a:fillRect/>
+                    </a:stretch>
+                  </pic:blipFill>
+                  <pic:spPr>
+                    <a:xfrm>
+                      <a:off x="0" y="0"/>
+                      <a:ext cx="5303520" cy="3939281"/>
+                    </a:xfrm>
+                    <a:prstGeom prst="rect"/>
+                  </pic:spPr>
+                </pic:pic>
+              </a:graphicData>
+            </a:graphic>
+          </wp:inline>
+        </w:drawing>
+      </w:r>
+    </w:p>
+    <w:p>
+      <w:pPr>
+        <w:spacing w:after="200" w:before="0" w:line="276" w:lineRule="auto"/>
+        <w:jc w:val="center"/>
+      </w:pPr>
+      <w:r>
+        <w:rPr>
+          <w:rFonts w:ascii="Times New Roman" w:hAnsi="Times New Roman" w:eastAsia="Times New Roman"/>
+          <w:b w:val="0"/>
+          <w:i/>
+          <w:sz w:val="24"/>
+        </w:rPr>
+        <w:t>Рисунок 2 — Контекстная диаграмма IDEF0 (A-0)</w:t>
+      </w:r>
+    </w:p>
+    <w:p>
+      <w:pPr>
+        <w:spacing w:after="120" w:before="200" w:line="276" w:lineRule="auto"/>
       </w:pPr>
       <w:r>
         <w:rPr>
@@ -1060,7 +872,7 @@
           <w:i w:val="0"/>
           <w:sz w:val="28"/>
         </w:rPr>
-        <w:t>объединение данных и методов, работающих с этими данными, в одном объекте (классе) и сокрытие внутренней реализации от внешнего кода. Доступ к состоянию объекта предоставляется через публичный интерфейс (методы), что повышает надёжность и упрощает изменение реализации.</w:t>
+        <w:t>объединение данных и методов в объекте и сокрытие реализации; доступ через публичный интерфейс.</w:t>
       </w:r>
     </w:p>
     <w:p>
@@ -1084,7 +896,7 @@
           <w:i w:val="0"/>
           <w:sz w:val="28"/>
         </w:rPr>
-        <w:t>механизм ООП, при котором класс-потомок получает свойства и поведение класса-предка и может дополнять или переопределять их. Обеспечивает повторное использование кода и построение иерархий «общее → частное» (например, Транспорт → Автомобиль).</w:t>
+        <w:t>потомок получает свойства и поведение предка и может их расширять/переопределять.</w:t>
       </w:r>
     </w:p>
     <w:p>
@@ -1108,12 +920,12 @@
           <w:i w:val="0"/>
           <w:sz w:val="28"/>
         </w:rPr>
-        <w:t>способность объектов разных классов реагировать на одно и то же сообщение (вызов метода) по-разному. На практике — переопределение методов в потомках и вызов через ссылку на базовый тип: один интерфейс — множество реализаций.</w:t>
+        <w:t>объекты разных классов по-разному реагируют на одно сообщение (один интерфейс — много реализаций).</w:t>
       </w:r>
     </w:p>
     <w:p>
       <w:pPr>
-        <w:spacing w:after="160" w:before="240" w:line="276" w:lineRule="auto"/>
+        <w:spacing w:after="120" w:before="200" w:line="276" w:lineRule="auto"/>
       </w:pPr>
       <w:r>
         <w:rPr>
@@ -1137,7 +949,7 @@
           <w:i w:val="0"/>
           <w:sz w:val="28"/>
         </w:rPr>
-        <w:t>Назначение диаграммы классов: показать статическую структуру системы — классы, их атрибуты и операции, а также отношения между классами (ассоциация, агрегация, композиция, наследование, зависимость, реализация интерфейса). Используется на этапе проектирования ОО-систем.</w:t>
+        <w:t>Назначение: статическая структура системы — классы, атрибуты, операции и отношения между ними.</w:t>
       </w:r>
     </w:p>
     <w:p>
@@ -1161,7 +973,7 @@
           <w:i w:val="0"/>
           <w:sz w:val="28"/>
         </w:rPr>
-        <w:t>описание множества объектов с одинаковой структурой (атрибуты), поведением (операции) и семантикой. На диаграмме — прямоугольник из трёх секций: имя, атрибуты, методы.</w:t>
+        <w:t>описание множества объектов с общей структурой и поведением (три секции: имя, атрибуты, методы).</w:t>
       </w:r>
     </w:p>
     <w:p>
@@ -1185,27 +997,12 @@
           <w:i w:val="0"/>
           <w:sz w:val="28"/>
         </w:rPr>
-        <w:t>контракт (набор операций без реализации), который обязуются реализовать классы. Задаёт «что умеет» объект, не указывая «как». Обозначается кругом («леденец») или прямоугольником со стереотипом &lt;&lt;interface&gt;&gt;.</w:t>
+        <w:t>контракт операций без реализации.</w:t>
       </w:r>
     </w:p>
     <w:p>
       <w:pPr>
-        <w:spacing w:after="80" w:before="0" w:line="276" w:lineRule="auto"/>
-      </w:pPr>
-      <w:r>
-        <w:rPr>
-          <w:rFonts w:ascii="Times New Roman" w:hAnsi="Times New Roman" w:eastAsia="Times New Roman"/>
-          <w:b/>
-          <w:i w:val="0"/>
-          <w:sz w:val="28"/>
-        </w:rPr>
-        <w:t>Виды видимости:</w:t>
-      </w:r>
-    </w:p>
-    <w:p>
-      <w:pPr>
-        <w:pStyle w:val="ListBullet"/>
-        <w:spacing w:after="60"/>
+        <w:spacing w:after="120" w:before="0" w:line="276" w:lineRule="auto"/>
       </w:pPr>
       <w:r>
         <w:rPr>
@@ -1214,13 +1011,13 @@
           <w:i w:val="0"/>
           <w:sz w:val="28"/>
         </w:rPr>
-        <w:t>+ public — доступно всем;</w:t>
+        <w:t>Виды видимости: + public, − private, # protected, ~ package.</w:t>
       </w:r>
     </w:p>
     <w:p>
       <w:pPr>
-        <w:pStyle w:val="ListBullet"/>
-        <w:spacing w:after="60"/>
+        <w:spacing w:after="120" w:before="0" w:line="276" w:lineRule="auto"/>
+        <w:jc w:val="both"/>
       </w:pPr>
       <w:r>
         <w:rPr>
@@ -1229,116 +1026,12 @@
           <w:i w:val="0"/>
           <w:sz w:val="28"/>
         </w:rPr>
-        <w:t>− private — только внутри класса;</w:t>
+        <w:t>Множественность: 1; 0..1; * (0..*); 1..*; конкретные диапазоны (например 2..4).</w:t>
       </w:r>
     </w:p>
     <w:p>
       <w:pPr>
-        <w:pStyle w:val="ListBullet"/>
-        <w:spacing w:after="60"/>
-      </w:pPr>
-      <w:r>
-        <w:rPr>
-          <w:rFonts w:ascii="Times New Roman" w:hAnsi="Times New Roman" w:eastAsia="Times New Roman"/>
-          <w:b w:val="0"/>
-          <w:i w:val="0"/>
-          <w:sz w:val="28"/>
-        </w:rPr>
-        <w:t># protected — класс и потомки;</w:t>
-      </w:r>
-    </w:p>
-    <w:p>
-      <w:pPr>
-        <w:pStyle w:val="ListBullet"/>
-        <w:spacing w:after="60"/>
-      </w:pPr>
-      <w:r>
-        <w:rPr>
-          <w:rFonts w:ascii="Times New Roman" w:hAnsi="Times New Roman" w:eastAsia="Times New Roman"/>
-          <w:b w:val="0"/>
-          <w:i w:val="0"/>
-          <w:sz w:val="28"/>
-        </w:rPr>
-        <w:t>~ package — в пределах пакета.</w:t>
-      </w:r>
-    </w:p>
-    <w:p>
-      <w:pPr>
-        <w:spacing w:after="80" w:before="0" w:line="276" w:lineRule="auto"/>
-      </w:pPr>
-      <w:r>
-        <w:rPr>
-          <w:rFonts w:ascii="Times New Roman" w:hAnsi="Times New Roman" w:eastAsia="Times New Roman"/>
-          <w:b/>
-          <w:i w:val="0"/>
-          <w:sz w:val="28"/>
-        </w:rPr>
-        <w:t>Множественность отношений:</w:t>
-      </w:r>
-    </w:p>
-    <w:p>
-      <w:pPr>
-        <w:pStyle w:val="ListBullet"/>
-        <w:spacing w:after="60"/>
-      </w:pPr>
-      <w:r>
-        <w:rPr>
-          <w:rFonts w:ascii="Times New Roman" w:hAnsi="Times New Roman" w:eastAsia="Times New Roman"/>
-          <w:b w:val="0"/>
-          <w:i w:val="0"/>
-          <w:sz w:val="28"/>
-        </w:rPr>
-        <w:t>1 — ровно один; 0..1 — ноль или один;</w:t>
-      </w:r>
-    </w:p>
-    <w:p>
-      <w:pPr>
-        <w:pStyle w:val="ListBullet"/>
-        <w:spacing w:after="60"/>
-      </w:pPr>
-      <w:r>
-        <w:rPr>
-          <w:rFonts w:ascii="Times New Roman" w:hAnsi="Times New Roman" w:eastAsia="Times New Roman"/>
-          <w:b w:val="0"/>
-          <w:i w:val="0"/>
-          <w:sz w:val="28"/>
-        </w:rPr>
-        <w:t>* или 0..* — ноль или много; 1..* — один или много;</w:t>
-      </w:r>
-    </w:p>
-    <w:p>
-      <w:pPr>
-        <w:pStyle w:val="ListBullet"/>
-        <w:spacing w:after="60"/>
-      </w:pPr>
-      <w:r>
-        <w:rPr>
-          <w:rFonts w:ascii="Times New Roman" w:hAnsi="Times New Roman" w:eastAsia="Times New Roman"/>
-          <w:b w:val="0"/>
-          <w:i w:val="0"/>
-          <w:sz w:val="28"/>
-        </w:rPr>
-        <w:t>2..4 — от 2 до 4 и т.п.</w:t>
-      </w:r>
-    </w:p>
-    <w:p>
-      <w:pPr>
-        <w:spacing w:after="120" w:before="0" w:line="276" w:lineRule="auto"/>
-        <w:jc w:val="both"/>
-      </w:pPr>
-      <w:r>
-        <w:rPr>
-          <w:rFonts w:ascii="Times New Roman" w:hAnsi="Times New Roman" w:eastAsia="Times New Roman"/>
-          <w:b w:val="0"/>
-          <w:i w:val="0"/>
-          <w:sz w:val="28"/>
-        </w:rPr>
-        <w:t>Пример: Заказ 1 —— 1..* ПозицияЗаказа — у заказа одна или несколько позиций.</w:t>
-      </w:r>
-    </w:p>
-    <w:p>
-      <w:pPr>
-        <w:spacing w:after="160" w:before="240" w:line="276" w:lineRule="auto"/>
+        <w:spacing w:after="120" w:before="200" w:line="276" w:lineRule="auto"/>
       </w:pPr>
       <w:r>
         <w:rPr>
@@ -1362,126 +1055,62 @@
           <w:i w:val="0"/>
           <w:sz w:val="28"/>
         </w:rPr>
-        <w:t>Пример: система «Библиотека».</w:t>
+        <w:t>Пример: система «Библиотека». Актёры: Читатель, Библиотекарь, Система уведомлений. Показаны отношения &lt;&lt;include&gt;&gt; и &lt;&lt;extend&gt;&gt;.</w:t>
       </w:r>
     </w:p>
     <w:p>
       <w:pPr>
-        <w:spacing w:after="120" w:before="0" w:line="276" w:lineRule="auto"/>
-        <w:jc w:val="both"/>
+        <w:spacing w:before="120" w:after="80"/>
+        <w:jc w:val="center"/>
+      </w:pPr>
+      <w:r>
+        <w:drawing>
+          <wp:inline xmlns:a="http://schemas.openxmlformats.org/drawingml/2006/main" xmlns:pic="http://schemas.openxmlformats.org/drawingml/2006/picture">
+            <wp:extent cx="5852160" cy="4407621"/>
+            <wp:docPr id="3" name="Picture 3"/>
+            <wp:cNvGraphicFramePr>
+              <a:graphicFrameLocks noChangeAspect="1"/>
+            </wp:cNvGraphicFramePr>
+            <a:graphic>
+              <a:graphicData uri="http://schemas.openxmlformats.org/drawingml/2006/picture">
+                <pic:pic>
+                  <pic:nvPicPr>
+                    <pic:cNvPr id="0" name="v2_usecase.png"/>
+                    <pic:cNvPicPr/>
+                  </pic:nvPicPr>
+                  <pic:blipFill>
+                    <a:blip r:embed="rId11"/>
+                    <a:stretch>
+                      <a:fillRect/>
+                    </a:stretch>
+                  </pic:blipFill>
+                  <pic:spPr>
+                    <a:xfrm>
+                      <a:off x="0" y="0"/>
+                      <a:ext cx="5852160" cy="4407621"/>
+                    </a:xfrm>
+                    <a:prstGeom prst="rect"/>
+                  </pic:spPr>
+                </pic:pic>
+              </a:graphicData>
+            </a:graphic>
+          </wp:inline>
+        </w:drawing>
+      </w:r>
+    </w:p>
+    <w:p>
+      <w:pPr>
+        <w:spacing w:after="200" w:before="0" w:line="276" w:lineRule="auto"/>
+        <w:jc w:val="center"/>
       </w:pPr>
       <w:r>
         <w:rPr>
           <w:rFonts w:ascii="Times New Roman" w:hAnsi="Times New Roman" w:eastAsia="Times New Roman"/>
           <w:b w:val="0"/>
-          <w:i w:val="0"/>
-          <w:sz w:val="28"/>
+          <w:i/>
+          <w:sz w:val="24"/>
         </w:rPr>
-        <w:t>Актёры: Читатель, Библиотекарь, Система уведомлений.</w:t>
-      </w:r>
-    </w:p>
-    <w:p>
-      <w:pPr>
-        <w:spacing w:after="120" w:before="0" w:line="276" w:lineRule="auto"/>
-        <w:jc w:val="both"/>
-      </w:pPr>
-      <w:r>
-        <w:rPr>
-          <w:rFonts w:ascii="Times New Roman" w:hAnsi="Times New Roman" w:eastAsia="Times New Roman"/>
-          <w:b w:val="0"/>
-          <w:i w:val="0"/>
-          <w:sz w:val="28"/>
-        </w:rPr>
-        <w:t>Прецеденты: Поиск книги; Заказать книгу; Получить книгу; Вернуть книгу; Зарегистрировать читателя; Списать книгу; Отправить напоминание.</w:t>
-      </w:r>
-    </w:p>
-    <w:p>
-      <w:pPr>
-        <w:spacing w:after="80" w:before="0" w:line="276" w:lineRule="auto"/>
-      </w:pPr>
-      <w:r>
-        <w:rPr>
-          <w:rFonts w:ascii="Times New Roman" w:hAnsi="Times New Roman" w:eastAsia="Times New Roman"/>
-          <w:b/>
-          <w:i w:val="0"/>
-          <w:sz w:val="28"/>
-        </w:rPr>
-        <w:t>Связи:</w:t>
-      </w:r>
-    </w:p>
-    <w:p>
-      <w:pPr>
-        <w:pStyle w:val="ListBullet"/>
-        <w:spacing w:after="60"/>
-      </w:pPr>
-      <w:r>
-        <w:rPr>
-          <w:rFonts w:ascii="Times New Roman" w:hAnsi="Times New Roman" w:eastAsia="Times New Roman"/>
-          <w:b w:val="0"/>
-          <w:i w:val="0"/>
-          <w:sz w:val="28"/>
-        </w:rPr>
-        <w:t>Читатель → Поиск книги, Заказать книгу, Получить книгу, Вернуть книгу;</w:t>
-      </w:r>
-    </w:p>
-    <w:p>
-      <w:pPr>
-        <w:pStyle w:val="ListBullet"/>
-        <w:spacing w:after="60"/>
-      </w:pPr>
-      <w:r>
-        <w:rPr>
-          <w:rFonts w:ascii="Times New Roman" w:hAnsi="Times New Roman" w:eastAsia="Times New Roman"/>
-          <w:b w:val="0"/>
-          <w:i w:val="0"/>
-          <w:sz w:val="28"/>
-        </w:rPr>
-        <w:t>Библиотекарь → Зарегистрировать читателя, Списать книгу, Получить книгу, Вернуть книгу;</w:t>
-      </w:r>
-    </w:p>
-    <w:p>
-      <w:pPr>
-        <w:pStyle w:val="ListBullet"/>
-        <w:spacing w:after="60"/>
-      </w:pPr>
-      <w:r>
-        <w:rPr>
-          <w:rFonts w:ascii="Times New Roman" w:hAnsi="Times New Roman" w:eastAsia="Times New Roman"/>
-          <w:b w:val="0"/>
-          <w:i w:val="0"/>
-          <w:sz w:val="28"/>
-        </w:rPr>
-        <w:t>Заказать книгу &lt;&lt;include&gt;&gt; Поиск книги;</w:t>
-      </w:r>
-    </w:p>
-    <w:p>
-      <w:pPr>
-        <w:pStyle w:val="ListBullet"/>
-        <w:spacing w:after="60"/>
-      </w:pPr>
-      <w:r>
-        <w:rPr>
-          <w:rFonts w:ascii="Times New Roman" w:hAnsi="Times New Roman" w:eastAsia="Times New Roman"/>
-          <w:b w:val="0"/>
-          <w:i w:val="0"/>
-          <w:sz w:val="28"/>
-        </w:rPr>
-        <w:t>Отправить напоминание &lt;&lt;extend&gt;&gt; Вернуть книгу.</w:t>
-      </w:r>
-    </w:p>
-    <w:p>
-      <w:pPr>
-        <w:spacing w:after="120" w:before="0" w:line="276" w:lineRule="auto"/>
-        <w:jc w:val="both"/>
-      </w:pPr>
-      <w:r>
-        <w:rPr>
-          <w:rFonts w:ascii="Times New Roman" w:hAnsi="Times New Roman" w:eastAsia="Times New Roman"/>
-          <w:b w:val="0"/>
-          <w:i w:val="0"/>
-          <w:sz w:val="28"/>
-        </w:rPr>
-        <w:t>Как начертить: граница системы — прямоугольник; актёры снаружи; овалы прецедентов внутри; линии ассоциаций; пунктирные стрелки &lt;&lt;include&gt;&gt; / &lt;&lt;extend&gt;&gt;.</w:t>
+        <w:t>Рисунок 3 — Диаграмма прецедентов (вариант 2, задание 4)</w:t>
       </w:r>
     </w:p>
     <w:p>
@@ -1491,7 +1120,7 @@
     </w:p>
     <w:p>
       <w:pPr>
-        <w:spacing w:after="240" w:before="360" w:line="276" w:lineRule="auto"/>
+        <w:spacing w:after="200" w:before="280" w:line="276" w:lineRule="auto"/>
         <w:jc w:val="center"/>
       </w:pPr>
       <w:r>
@@ -1506,7 +1135,7 @@
     </w:p>
     <w:p>
       <w:pPr>
-        <w:spacing w:after="160" w:before="240" w:line="276" w:lineRule="auto"/>
+        <w:spacing w:after="120" w:before="200" w:line="276" w:lineRule="auto"/>
       </w:pPr>
       <w:r>
         <w:rPr>
@@ -1530,27 +1159,13 @@
           <w:i w:val="0"/>
           <w:sz w:val="28"/>
         </w:rPr>
-        <w:t>Назначение: показать взаимодействие объектов во времени — какие сообщения и в какой последовательности обмениваются объекты (и актёры) при выполнении сценария. Удобна для уточнения динамики прецедента и проектирования вызовов между компонентами.</w:t>
+        <w:t>Назначение: показать взаимодействие объектов во времени — какие сообщения и в каком порядке при выполнении сценария.</w:t>
       </w:r>
     </w:p>
     <w:p>
       <w:pPr>
-        <w:spacing w:after="80" w:before="0" w:line="276" w:lineRule="auto"/>
-      </w:pPr>
-      <w:r>
-        <w:rPr>
-          <w:rFonts w:ascii="Times New Roman" w:hAnsi="Times New Roman" w:eastAsia="Times New Roman"/>
-          <w:b/>
-          <w:i w:val="0"/>
-          <w:sz w:val="28"/>
-        </w:rPr>
-        <w:t>Основные элементы:</w:t>
-      </w:r>
-    </w:p>
-    <w:p>
-      <w:pPr>
         <w:pStyle w:val="ListBullet"/>
-        <w:spacing w:after="60"/>
+        <w:spacing w:after="40"/>
       </w:pPr>
       <w:r>
         <w:rPr>
@@ -1559,13 +1174,13 @@
           <w:i w:val="0"/>
           <w:sz w:val="28"/>
         </w:rPr>
-        <w:t>Объекты (роли/лифлайны) — участники взаимодействия; прямоугольник вверху (имя:Класс или :Класс).</w:t>
+        <w:t>Объекты — участники; прямоугольник вверху.</w:t>
       </w:r>
     </w:p>
     <w:p>
       <w:pPr>
         <w:pStyle w:val="ListBullet"/>
-        <w:spacing w:after="60"/>
+        <w:spacing w:after="40"/>
       </w:pPr>
       <w:r>
         <w:rPr>
@@ -1574,13 +1189,13 @@
           <w:i w:val="0"/>
           <w:sz w:val="28"/>
         </w:rPr>
-        <w:t>Линии жизни (lifelines) — вертикальные пунктирные линии вниз от объектов; показывают время участия объекта.</w:t>
+        <w:t>Линии жизни — вертикальный пунктир.</w:t>
       </w:r>
     </w:p>
     <w:p>
       <w:pPr>
         <w:pStyle w:val="ListBullet"/>
-        <w:spacing w:after="60"/>
+        <w:spacing w:after="40"/>
       </w:pPr>
       <w:r>
         <w:rPr>
@@ -1589,13 +1204,13 @@
           <w:i w:val="0"/>
           <w:sz w:val="28"/>
         </w:rPr>
-        <w:t>Сообщения — горизонтальные стрелки между линиями жизни с именем операции; порядок сверху вниз = порядок во времени.</w:t>
+        <w:t>Сообщения — горизонтальные стрелки; порядок сверху вниз.</w:t>
       </w:r>
     </w:p>
     <w:p>
       <w:pPr>
         <w:pStyle w:val="ListBullet"/>
-        <w:spacing w:after="60"/>
+        <w:spacing w:after="40"/>
       </w:pPr>
       <w:r>
         <w:rPr>
@@ -1604,7 +1219,7 @@
           <w:i w:val="0"/>
           <w:sz w:val="28"/>
         </w:rPr>
-        <w:t>Активация — узкий прямоугольник на линии жизни на время выполнения операции.</w:t>
+        <w:t>Активация — узкий прямоугольник на линии жизни.</w:t>
       </w:r>
     </w:p>
     <w:p>
@@ -1628,7 +1243,7 @@
           <w:i w:val="0"/>
           <w:sz w:val="28"/>
         </w:rPr>
-        <w:t>отправитель ждёт завершения обработки и ответа. Обозначаются сплошной стрелкой с закрашенным наконечником. Типичны для обычных вызовов методов.</w:t>
+        <w:t>отправитель ждёт ответа (сплошная стрелка с закрашенным наконечником).</w:t>
       </w:r>
     </w:p>
     <w:p>
@@ -1652,12 +1267,27 @@
           <w:i w:val="0"/>
           <w:sz w:val="28"/>
         </w:rPr>
-        <w:t>отправитель не ждёт ответа и продолжает работу. Обозначаются стрелкой с открытым (незакрашенным) наконечником. Типичны для событий, сигналов, уведомлений.</w:t>
+        <w:t>отправитель не ждёт ответа (открытый наконечник); события, сигналы, уведомления.</w:t>
       </w:r>
     </w:p>
     <w:p>
       <w:pPr>
-        <w:spacing w:after="160" w:before="240" w:line="276" w:lineRule="auto"/>
+        <w:spacing w:after="120" w:before="0" w:line="276" w:lineRule="auto"/>
+        <w:jc w:val="both"/>
+      </w:pPr>
+      <w:r>
+        <w:rPr>
+          <w:rFonts w:ascii="Times New Roman" w:hAnsi="Times New Roman" w:eastAsia="Times New Roman"/>
+          <w:b w:val="0"/>
+          <w:i w:val="0"/>
+          <w:sz w:val="28"/>
+        </w:rPr>
+        <w:t>Пример диаграммы последовательности см. рисунок 1 (вариант 1).</w:t>
+      </w:r>
+    </w:p>
+    <w:p>
+      <w:pPr>
+        <w:spacing w:after="120" w:before="200" w:line="276" w:lineRule="auto"/>
       </w:pPr>
       <w:r>
         <w:rPr>
@@ -1681,7 +1311,7 @@
           <w:i w:val="0"/>
           <w:sz w:val="28"/>
         </w:rPr>
-        <w:t>Управление конфигурацией ПО (Software Configuration Management, SCM) — дисциплина, обеспечивающая идентификацию, контроль изменений, учёт состояния и аудит элементов конфигурации программного продукта на протяжении жизненного цикла. Цель — знать состав версий артефактов, кто и зачем их менял, и иметь возможность воспроизвести любую сборку/релиз.</w:t>
+        <w:t>Управление конфигурацией ПО (SCM) — идентификация, контроль изменений, учёт состояния и аудит элементов конфигурации на протяжении ЖЦ; возможность воспроизвести любую сборку/релиз.</w:t>
       </w:r>
     </w:p>
     <w:p>
@@ -1696,12 +1326,12 @@
           <w:i w:val="0"/>
           <w:sz w:val="28"/>
         </w:rPr>
-        <w:t>Идентификация конфигурации — процесс назначения уникальных идентификаторов элементам конфигурации (исходные файлы, модули, документы, сборки, релизы) и фиксации их состава и версий. Включает: выбор элементов конфигурации (CI); схему именования и нумерации версий; базовые линии (baselines) — утверждённые наборы версий; описание связей между элементами (что входит в релиз).</w:t>
+        <w:t>Идентификация конфигурации — присвоение уникальных идентификаторов элементам (файлы, модули, документы, сборки), схема версий, базовые линии (baselines), описание состава релиза.</w:t>
       </w:r>
     </w:p>
     <w:p>
       <w:pPr>
-        <w:spacing w:after="160" w:before="240" w:line="276" w:lineRule="auto"/>
+        <w:spacing w:after="120" w:before="200" w:line="276" w:lineRule="auto"/>
       </w:pPr>
       <w:r>
         <w:rPr>
@@ -1725,12 +1355,12 @@
           <w:i w:val="0"/>
           <w:sz w:val="28"/>
         </w:rPr>
-        <w:t>Agile (гибкая методология разработки) — подход к разработке ПО, основанный на итеративной поставке ценности, тесном взаимодействии с заказчиком, готовности к изменениям требований и самоорганизующихся командах. Ценности зафиксированы в Agile Manifesto (2001).</w:t>
+        <w:t>Agile — гибкий подход к разработке: итеративная поставка ценности, сотрудничество с заказчиком, готовность к изменениям, самоорганизующиеся команды (Agile Manifesto, 2001).</w:t>
       </w:r>
     </w:p>
     <w:p>
       <w:pPr>
-        <w:spacing w:after="80" w:before="0" w:line="276" w:lineRule="auto"/>
+        <w:spacing w:after="60" w:before="0" w:line="276" w:lineRule="auto"/>
       </w:pPr>
       <w:r>
         <w:rPr>
@@ -1739,13 +1369,13 @@
           <w:i w:val="0"/>
           <w:sz w:val="28"/>
         </w:rPr>
-        <w:t>Принципы Agile (12 принципов Манифеста):</w:t>
+        <w:t>Принципы Agile:</w:t>
       </w:r>
     </w:p>
     <w:p>
       <w:pPr>
         <w:pStyle w:val="ListBullet"/>
-        <w:spacing w:after="60"/>
+        <w:spacing w:after="40"/>
       </w:pPr>
       <w:r>
         <w:rPr>
@@ -1754,13 +1384,13 @@
           <w:i w:val="0"/>
           <w:sz w:val="28"/>
         </w:rPr>
-        <w:t>Наивысший приоритет — удовлетворение заказчика регулярной и ранней поставкой ценного ПО.</w:t>
+        <w:t>Приоритет — удовлетворение заказчика регулярной ранней поставкой ценного ПО.</w:t>
       </w:r>
     </w:p>
     <w:p>
       <w:pPr>
         <w:pStyle w:val="ListBullet"/>
-        <w:spacing w:after="60"/>
+        <w:spacing w:after="40"/>
       </w:pPr>
       <w:r>
         <w:rPr>
@@ -1775,7 +1405,7 @@
     <w:p>
       <w:pPr>
         <w:pStyle w:val="ListBullet"/>
-        <w:spacing w:after="60"/>
+        <w:spacing w:after="40"/>
       </w:pPr>
       <w:r>
         <w:rPr>
@@ -1790,7 +1420,7 @@
     <w:p>
       <w:pPr>
         <w:pStyle w:val="ListBullet"/>
-        <w:spacing w:after="60"/>
+        <w:spacing w:after="40"/>
       </w:pPr>
       <w:r>
         <w:rPr>
@@ -1805,7 +1435,7 @@
     <w:p>
       <w:pPr>
         <w:pStyle w:val="ListBullet"/>
-        <w:spacing w:after="60"/>
+        <w:spacing w:after="40"/>
       </w:pPr>
       <w:r>
         <w:rPr>
@@ -1814,13 +1444,13 @@
           <w:i w:val="0"/>
           <w:sz w:val="28"/>
         </w:rPr>
-        <w:t>Проекты строятся вокруг мотивированных людей; им создают условия и доверяют.</w:t>
+        <w:t>Проекты вокруг мотивированных людей; им доверяют.</w:t>
       </w:r>
     </w:p>
     <w:p>
       <w:pPr>
         <w:pStyle w:val="ListBullet"/>
-        <w:spacing w:after="60"/>
+        <w:spacing w:after="40"/>
       </w:pPr>
       <w:r>
         <w:rPr>
@@ -1829,13 +1459,13 @@
           <w:i w:val="0"/>
           <w:sz w:val="28"/>
         </w:rPr>
-        <w:t>Самый эффективный способ передачи информации — личный разговор.</w:t>
+        <w:t>Самый эффективный способ обмена информацией — личный разговор.</w:t>
       </w:r>
     </w:p>
     <w:p>
       <w:pPr>
         <w:pStyle w:val="ListBullet"/>
-        <w:spacing w:after="60"/>
+        <w:spacing w:after="40"/>
       </w:pPr>
       <w:r>
         <w:rPr>
@@ -1850,7 +1480,7 @@
     <w:p>
       <w:pPr>
         <w:pStyle w:val="ListBullet"/>
-        <w:spacing w:after="60"/>
+        <w:spacing w:after="40"/>
       </w:pPr>
       <w:r>
         <w:rPr>
@@ -1859,13 +1489,13 @@
           <w:i w:val="0"/>
           <w:sz w:val="28"/>
         </w:rPr>
-        <w:t>Устойчивый темп разработки (процессы должны позволять постоянный ритм).</w:t>
+        <w:t>Устойчивый темп разработки.</w:t>
       </w:r>
     </w:p>
     <w:p>
       <w:pPr>
         <w:pStyle w:val="ListBullet"/>
-        <w:spacing w:after="60"/>
+        <w:spacing w:after="40"/>
       </w:pPr>
       <w:r>
         <w:rPr>
@@ -1874,13 +1504,13 @@
           <w:i w:val="0"/>
           <w:sz w:val="28"/>
         </w:rPr>
-        <w:t>Постоянное внимание к техническому совершенству и хорошему дизайну.</w:t>
+        <w:t>Постоянное внимание к техническому совершенству и дизайну.</w:t>
       </w:r>
     </w:p>
     <w:p>
       <w:pPr>
         <w:pStyle w:val="ListBullet"/>
-        <w:spacing w:after="60"/>
+        <w:spacing w:after="40"/>
       </w:pPr>
       <w:r>
         <w:rPr>
@@ -1889,13 +1519,13 @@
           <w:i w:val="0"/>
           <w:sz w:val="28"/>
         </w:rPr>
-        <w:t>Простота — искусство минимизации лишней работы.</w:t>
+        <w:t>Простота — минимизация лишней работы.</w:t>
       </w:r>
     </w:p>
     <w:p>
       <w:pPr>
         <w:pStyle w:val="ListBullet"/>
-        <w:spacing w:after="60"/>
+        <w:spacing w:after="40"/>
       </w:pPr>
       <w:r>
         <w:rPr>
@@ -1904,13 +1534,13 @@
           <w:i w:val="0"/>
           <w:sz w:val="28"/>
         </w:rPr>
-        <w:t>Лучшие архитектуры, требования и дизайны рождаются у самоорганизующихся команд.</w:t>
+        <w:t>Лучшие архитектуры и требования — у самоорганизующихся команд.</w:t>
       </w:r>
     </w:p>
     <w:p>
       <w:pPr>
         <w:pStyle w:val="ListBullet"/>
-        <w:spacing w:after="60"/>
+        <w:spacing w:after="40"/>
       </w:pPr>
       <w:r>
         <w:rPr>
@@ -1919,12 +1549,12 @@
           <w:i w:val="0"/>
           <w:sz w:val="28"/>
         </w:rPr>
-        <w:t>Команда регулярно анализирует способы стать эффективнее и корректирует работу.</w:t>
+        <w:t>Регулярная рефлексия и улучшение способов работы.</w:t>
       </w:r>
     </w:p>
     <w:p>
       <w:pPr>
-        <w:spacing w:after="160" w:before="240" w:line="276" w:lineRule="auto"/>
+        <w:spacing w:after="120" w:before="200" w:line="276" w:lineRule="auto"/>
       </w:pPr>
       <w:r>
         <w:rPr>
@@ -1948,472 +1578,62 @@
           <w:i w:val="0"/>
           <w:sz w:val="28"/>
         </w:rPr>
-        <w:t>Пример предметной области: учёт заказов.</w:t>
+        <w:t>Пример предметной области: учёт заказов (Покупатель, Заказ, ПозицияЗаказа, Товар, интерфейс Оплата).</w:t>
       </w:r>
     </w:p>
     <w:p>
       <w:pPr>
-        <w:spacing w:after="80"/>
-        <w:ind w:left="283"/>
+        <w:spacing w:before="120" w:after="80"/>
+        <w:jc w:val="center"/>
       </w:pPr>
       <w:r>
-        <w:rPr>
-          <w:rFonts w:ascii="Courier New" w:hAnsi="Courier New" w:eastAsia="Courier New"/>
-          <w:b w:val="0"/>
-          <w:i w:val="0"/>
-          <w:sz w:val="22"/>
-        </w:rPr>
-        <w:t>┌─────────────────┐     1    *  ┌─────────────────┐</w:t>
+        <w:drawing>
+          <wp:inline xmlns:a="http://schemas.openxmlformats.org/drawingml/2006/main" xmlns:pic="http://schemas.openxmlformats.org/drawingml/2006/picture">
+            <wp:extent cx="5852160" cy="4586245"/>
+            <wp:docPr id="4" name="Picture 4"/>
+            <wp:cNvGraphicFramePr>
+              <a:graphicFrameLocks noChangeAspect="1"/>
+            </wp:cNvGraphicFramePr>
+            <a:graphic>
+              <a:graphicData uri="http://schemas.openxmlformats.org/drawingml/2006/picture">
+                <pic:pic>
+                  <pic:nvPicPr>
+                    <pic:cNvPr id="0" name="v3_class.png"/>
+                    <pic:cNvPicPr/>
+                  </pic:nvPicPr>
+                  <pic:blipFill>
+                    <a:blip r:embed="rId12"/>
+                    <a:stretch>
+                      <a:fillRect/>
+                    </a:stretch>
+                  </pic:blipFill>
+                  <pic:spPr>
+                    <a:xfrm>
+                      <a:off x="0" y="0"/>
+                      <a:ext cx="5852160" cy="4586245"/>
+                    </a:xfrm>
+                    <a:prstGeom prst="rect"/>
+                  </pic:spPr>
+                </pic:pic>
+              </a:graphicData>
+            </a:graphic>
+          </wp:inline>
+        </w:drawing>
       </w:r>
     </w:p>
     <w:p>
       <w:pPr>
-        <w:spacing w:after="80"/>
-        <w:ind w:left="283"/>
-      </w:pPr>
-      <w:r>
-        <w:rPr>
-          <w:rFonts w:ascii="Courier New" w:hAnsi="Courier New" w:eastAsia="Courier New"/>
-          <w:b w:val="0"/>
-          <w:i w:val="0"/>
-          <w:sz w:val="22"/>
-        </w:rPr>
-        <w:t>│   Покупатель     │─────────────│      Заказ       │</w:t>
-      </w:r>
-    </w:p>
-    <w:p>
-      <w:pPr>
-        <w:spacing w:after="80"/>
-        <w:ind w:left="283"/>
-      </w:pPr>
-      <w:r>
-        <w:rPr>
-          <w:rFonts w:ascii="Courier New" w:hAnsi="Courier New" w:eastAsia="Courier New"/>
-          <w:b w:val="0"/>
-          <w:i w:val="0"/>
-          <w:sz w:val="22"/>
-        </w:rPr>
-        <w:t>├─────────────────┤             ├─────────────────┤</w:t>
-      </w:r>
-    </w:p>
-    <w:p>
-      <w:pPr>
-        <w:spacing w:after="80"/>
-        <w:ind w:left="283"/>
-      </w:pPr>
-      <w:r>
-        <w:rPr>
-          <w:rFonts w:ascii="Courier New" w:hAnsi="Courier New" w:eastAsia="Courier New"/>
-          <w:b w:val="0"/>
-          <w:i w:val="0"/>
-          <w:sz w:val="22"/>
-        </w:rPr>
-        <w:t>│ - id: int        │             │ - номер: int     │</w:t>
-      </w:r>
-    </w:p>
-    <w:p>
-      <w:pPr>
-        <w:spacing w:after="80"/>
-        <w:ind w:left="283"/>
-      </w:pPr>
-      <w:r>
-        <w:rPr>
-          <w:rFonts w:ascii="Courier New" w:hAnsi="Courier New" w:eastAsia="Courier New"/>
-          <w:b w:val="0"/>
-          <w:i w:val="0"/>
-          <w:sz w:val="22"/>
-        </w:rPr>
-        <w:t>│ - фио: string    │             │ - дата: Date     │</w:t>
-      </w:r>
-    </w:p>
-    <w:p>
-      <w:pPr>
-        <w:spacing w:after="80"/>
-        <w:ind w:left="283"/>
-      </w:pPr>
-      <w:r>
-        <w:rPr>
-          <w:rFonts w:ascii="Courier New" w:hAnsi="Courier New" w:eastAsia="Courier New"/>
-          <w:b w:val="0"/>
-          <w:i w:val="0"/>
-          <w:sz w:val="22"/>
-        </w:rPr>
-        <w:t>│ - email: string  │             │ - статус: string │</w:t>
-      </w:r>
-    </w:p>
-    <w:p>
-      <w:pPr>
-        <w:spacing w:after="80"/>
-        <w:ind w:left="283"/>
-      </w:pPr>
-      <w:r>
-        <w:rPr>
-          <w:rFonts w:ascii="Courier New" w:hAnsi="Courier New" w:eastAsia="Courier New"/>
-          <w:b w:val="0"/>
-          <w:i w:val="0"/>
-          <w:sz w:val="22"/>
-        </w:rPr>
-        <w:t>├─────────────────┤             ├─────────────────┤</w:t>
-      </w:r>
-    </w:p>
-    <w:p>
-      <w:pPr>
-        <w:spacing w:after="80"/>
-        <w:ind w:left="283"/>
-      </w:pPr>
-      <w:r>
-        <w:rPr>
-          <w:rFonts w:ascii="Courier New" w:hAnsi="Courier New" w:eastAsia="Courier New"/>
-          <w:b w:val="0"/>
-          <w:i w:val="0"/>
-          <w:sz w:val="22"/>
-        </w:rPr>
-        <w:t>│ + оформитьЗаказ()│             │ + добавитьПозицию│</w:t>
-      </w:r>
-    </w:p>
-    <w:p>
-      <w:pPr>
-        <w:spacing w:after="80"/>
-        <w:ind w:left="283"/>
-      </w:pPr>
-      <w:r>
-        <w:rPr>
-          <w:rFonts w:ascii="Courier New" w:hAnsi="Courier New" w:eastAsia="Courier New"/>
-          <w:b w:val="0"/>
-          <w:i w:val="0"/>
-          <w:sz w:val="22"/>
-        </w:rPr>
-        <w:t>│ + войти()        │             │ + рассчитатьСумму│</w:t>
-      </w:r>
-    </w:p>
-    <w:p>
-      <w:pPr>
-        <w:spacing w:after="80"/>
-        <w:ind w:left="283"/>
-      </w:pPr>
-      <w:r>
-        <w:rPr>
-          <w:rFonts w:ascii="Courier New" w:hAnsi="Courier New" w:eastAsia="Courier New"/>
-          <w:b w:val="0"/>
-          <w:i w:val="0"/>
-          <w:sz w:val="22"/>
-        </w:rPr>
-        <w:t>└─────────────────┘             └────────┬────────┘</w:t>
-      </w:r>
-    </w:p>
-    <w:p>
-      <w:pPr>
-        <w:spacing w:after="80"/>
-        <w:ind w:left="283"/>
-      </w:pPr>
-      <w:r>
-        <w:rPr>
-          <w:rFonts w:ascii="Courier New" w:hAnsi="Courier New" w:eastAsia="Courier New"/>
-          <w:b w:val="0"/>
-          <w:i w:val="0"/>
-          <w:sz w:val="22"/>
-        </w:rPr>
-        <w:t xml:space="preserve">                                        │ 1</w:t>
-      </w:r>
-    </w:p>
-    <w:p>
-      <w:pPr>
-        <w:spacing w:after="80"/>
-        <w:ind w:left="283"/>
-      </w:pPr>
-      <w:r>
-        <w:rPr>
-          <w:rFonts w:ascii="Courier New" w:hAnsi="Courier New" w:eastAsia="Courier New"/>
-          <w:b w:val="0"/>
-          <w:i w:val="0"/>
-          <w:sz w:val="22"/>
-        </w:rPr>
-        <w:t xml:space="preserve">                                        │</w:t>
-      </w:r>
-    </w:p>
-    <w:p>
-      <w:pPr>
-        <w:spacing w:after="80"/>
-        <w:ind w:left="283"/>
-      </w:pPr>
-      <w:r>
-        <w:rPr>
-          <w:rFonts w:ascii="Courier New" w:hAnsi="Courier New" w:eastAsia="Courier New"/>
-          <w:b w:val="0"/>
-          <w:i w:val="0"/>
-          <w:sz w:val="22"/>
-        </w:rPr>
-        <w:t xml:space="preserve">                                   1..* │</w:t>
-      </w:r>
-    </w:p>
-    <w:p>
-      <w:pPr>
-        <w:spacing w:after="80"/>
-        <w:ind w:left="283"/>
-      </w:pPr>
-      <w:r>
-        <w:rPr>
-          <w:rFonts w:ascii="Courier New" w:hAnsi="Courier New" w:eastAsia="Courier New"/>
-          <w:b w:val="0"/>
-          <w:i w:val="0"/>
-          <w:sz w:val="22"/>
-        </w:rPr>
-        <w:t xml:space="preserve">                         ┌──────────────┴───────┐</w:t>
-      </w:r>
-    </w:p>
-    <w:p>
-      <w:pPr>
-        <w:spacing w:after="80"/>
-        <w:ind w:left="283"/>
-      </w:pPr>
-      <w:r>
-        <w:rPr>
-          <w:rFonts w:ascii="Courier New" w:hAnsi="Courier New" w:eastAsia="Courier New"/>
-          <w:b w:val="0"/>
-          <w:i w:val="0"/>
-          <w:sz w:val="22"/>
-        </w:rPr>
-        <w:t xml:space="preserve">                         │   ПозицияЗаказа       │</w:t>
-      </w:r>
-    </w:p>
-    <w:p>
-      <w:pPr>
-        <w:spacing w:after="80"/>
-        <w:ind w:left="283"/>
-      </w:pPr>
-      <w:r>
-        <w:rPr>
-          <w:rFonts w:ascii="Courier New" w:hAnsi="Courier New" w:eastAsia="Courier New"/>
-          <w:b w:val="0"/>
-          <w:i w:val="0"/>
-          <w:sz w:val="22"/>
-        </w:rPr>
-        <w:t xml:space="preserve">                         ├──────────────────────┤</w:t>
-      </w:r>
-    </w:p>
-    <w:p>
-      <w:pPr>
-        <w:spacing w:after="80"/>
-        <w:ind w:left="283"/>
-      </w:pPr>
-      <w:r>
-        <w:rPr>
-          <w:rFonts w:ascii="Courier New" w:hAnsi="Courier New" w:eastAsia="Courier New"/>
-          <w:b w:val="0"/>
-          <w:i w:val="0"/>
-          <w:sz w:val="22"/>
-        </w:rPr>
-        <w:t xml:space="preserve">                         │ - количество: int     │</w:t>
-      </w:r>
-    </w:p>
-    <w:p>
-      <w:pPr>
-        <w:spacing w:after="80"/>
-        <w:ind w:left="283"/>
-      </w:pPr>
-      <w:r>
-        <w:rPr>
-          <w:rFonts w:ascii="Courier New" w:hAnsi="Courier New" w:eastAsia="Courier New"/>
-          <w:b w:val="0"/>
-          <w:i w:val="0"/>
-          <w:sz w:val="22"/>
-        </w:rPr>
-        <w:t xml:space="preserve">                         │ - цена: decimal       │</w:t>
-      </w:r>
-    </w:p>
-    <w:p>
-      <w:pPr>
-        <w:spacing w:after="80"/>
-        <w:ind w:left="283"/>
-      </w:pPr>
-      <w:r>
-        <w:rPr>
-          <w:rFonts w:ascii="Courier New" w:hAnsi="Courier New" w:eastAsia="Courier New"/>
-          <w:b w:val="0"/>
-          <w:i w:val="0"/>
-          <w:sz w:val="22"/>
-        </w:rPr>
-        <w:t xml:space="preserve">                         ├──────────────────────┤</w:t>
-      </w:r>
-    </w:p>
-    <w:p>
-      <w:pPr>
-        <w:spacing w:after="80"/>
-        <w:ind w:left="283"/>
-      </w:pPr>
-      <w:r>
-        <w:rPr>
-          <w:rFonts w:ascii="Courier New" w:hAnsi="Courier New" w:eastAsia="Courier New"/>
-          <w:b w:val="0"/>
-          <w:i w:val="0"/>
-          <w:sz w:val="22"/>
-        </w:rPr>
-        <w:t xml:space="preserve">                         │ + сумма()             │</w:t>
-      </w:r>
-    </w:p>
-    <w:p>
-      <w:pPr>
-        <w:spacing w:after="80"/>
-        <w:ind w:left="283"/>
-      </w:pPr>
-      <w:r>
-        <w:rPr>
-          <w:rFonts w:ascii="Courier New" w:hAnsi="Courier New" w:eastAsia="Courier New"/>
-          <w:b w:val="0"/>
-          <w:i w:val="0"/>
-          <w:sz w:val="22"/>
-        </w:rPr>
-        <w:t xml:space="preserve">                         └──────────┬───────────┘</w:t>
-      </w:r>
-    </w:p>
-    <w:p>
-      <w:pPr>
-        <w:spacing w:after="80"/>
-        <w:ind w:left="283"/>
-      </w:pPr>
-      <w:r>
-        <w:rPr>
-          <w:rFonts w:ascii="Courier New" w:hAnsi="Courier New" w:eastAsia="Courier New"/>
-          <w:b w:val="0"/>
-          <w:i w:val="0"/>
-          <w:sz w:val="22"/>
-        </w:rPr>
-        <w:t xml:space="preserve">                                    │ *</w:t>
-      </w:r>
-    </w:p>
-    <w:p>
-      <w:pPr>
-        <w:spacing w:after="80"/>
-        <w:ind w:left="283"/>
-      </w:pPr>
-      <w:r>
-        <w:rPr>
-          <w:rFonts w:ascii="Courier New" w:hAnsi="Courier New" w:eastAsia="Courier New"/>
-          <w:b w:val="0"/>
-          <w:i w:val="0"/>
-          <w:sz w:val="22"/>
-        </w:rPr>
-        <w:t xml:space="preserve">                                    │ 1</w:t>
-      </w:r>
-    </w:p>
-    <w:p>
-      <w:pPr>
-        <w:spacing w:after="80"/>
-        <w:ind w:left="283"/>
-      </w:pPr>
-      <w:r>
-        <w:rPr>
-          <w:rFonts w:ascii="Courier New" w:hAnsi="Courier New" w:eastAsia="Courier New"/>
-          <w:b w:val="0"/>
-          <w:i w:val="0"/>
-          <w:sz w:val="22"/>
-        </w:rPr>
-        <w:t xml:space="preserve">                         ┌──────────┴───────────┐</w:t>
-      </w:r>
-    </w:p>
-    <w:p>
-      <w:pPr>
-        <w:spacing w:after="80"/>
-        <w:ind w:left="283"/>
-      </w:pPr>
-      <w:r>
-        <w:rPr>
-          <w:rFonts w:ascii="Courier New" w:hAnsi="Courier New" w:eastAsia="Courier New"/>
-          <w:b w:val="0"/>
-          <w:i w:val="0"/>
-          <w:sz w:val="22"/>
-        </w:rPr>
-        <w:t xml:space="preserve">                         │        Товар          │</w:t>
-      </w:r>
-    </w:p>
-    <w:p>
-      <w:pPr>
-        <w:spacing w:after="80"/>
-        <w:ind w:left="283"/>
-      </w:pPr>
-      <w:r>
-        <w:rPr>
-          <w:rFonts w:ascii="Courier New" w:hAnsi="Courier New" w:eastAsia="Courier New"/>
-          <w:b w:val="0"/>
-          <w:i w:val="0"/>
-          <w:sz w:val="22"/>
-        </w:rPr>
-        <w:t xml:space="preserve">                         ├──────────────────────┤</w:t>
-      </w:r>
-    </w:p>
-    <w:p>
-      <w:pPr>
-        <w:spacing w:after="80"/>
-        <w:ind w:left="283"/>
-      </w:pPr>
-      <w:r>
-        <w:rPr>
-          <w:rFonts w:ascii="Courier New" w:hAnsi="Courier New" w:eastAsia="Courier New"/>
-          <w:b w:val="0"/>
-          <w:i w:val="0"/>
-          <w:sz w:val="22"/>
-        </w:rPr>
-        <w:t xml:space="preserve">                         │ - артикул: string     │</w:t>
-      </w:r>
-    </w:p>
-    <w:p>
-      <w:pPr>
-        <w:spacing w:after="80"/>
-        <w:ind w:left="283"/>
-      </w:pPr>
-      <w:r>
-        <w:rPr>
-          <w:rFonts w:ascii="Courier New" w:hAnsi="Courier New" w:eastAsia="Courier New"/>
-          <w:b w:val="0"/>
-          <w:i w:val="0"/>
-          <w:sz w:val="22"/>
-        </w:rPr>
-        <w:t xml:space="preserve">                         │ - название: string    │</w:t>
-      </w:r>
-    </w:p>
-    <w:p>
-      <w:pPr>
-        <w:spacing w:after="80"/>
-        <w:ind w:left="283"/>
-      </w:pPr>
-      <w:r>
-        <w:rPr>
-          <w:rFonts w:ascii="Courier New" w:hAnsi="Courier New" w:eastAsia="Courier New"/>
-          <w:b w:val="0"/>
-          <w:i w:val="0"/>
-          <w:sz w:val="22"/>
-        </w:rPr>
-        <w:t xml:space="preserve">                         │ - цена: decimal       │</w:t>
-      </w:r>
-    </w:p>
-    <w:p>
-      <w:pPr>
-        <w:spacing w:after="80"/>
-        <w:ind w:left="283"/>
-      </w:pPr>
-      <w:r>
-        <w:rPr>
-          <w:rFonts w:ascii="Courier New" w:hAnsi="Courier New" w:eastAsia="Courier New"/>
-          <w:b w:val="0"/>
-          <w:i w:val="0"/>
-          <w:sz w:val="22"/>
-        </w:rPr>
-        <w:t xml:space="preserve">                         └──────────────────────┘</w:t>
-      </w:r>
-    </w:p>
-    <w:p>
-      <w:pPr>
-        <w:spacing w:after="120" w:before="0" w:line="276" w:lineRule="auto"/>
-        <w:jc w:val="both"/>
+        <w:spacing w:after="200" w:before="0" w:line="276" w:lineRule="auto"/>
+        <w:jc w:val="center"/>
       </w:pPr>
       <w:r>
         <w:rPr>
           <w:rFonts w:ascii="Times New Roman" w:hAnsi="Times New Roman" w:eastAsia="Times New Roman"/>
           <w:b w:val="0"/>
-          <w:i w:val="0"/>
-          <w:sz w:val="28"/>
+          <w:i/>
+          <w:sz w:val="24"/>
         </w:rPr>
-        <w:t>Дополнительно: интерфейс Оплата (+оплатить(сумма): bool); Заказ зависит от / использует Оплата.</w:t>
+        <w:t>Рисунок 4 — Диаграмма классов (вариант 3, задание 4)</w:t>
       </w:r>
     </w:p>
     <w:p>
@@ -2423,7 +1643,7 @@
     </w:p>
     <w:p>
       <w:pPr>
-        <w:spacing w:after="240" w:before="360" w:line="276" w:lineRule="auto"/>
+        <w:spacing w:after="200" w:before="280" w:line="276" w:lineRule="auto"/>
         <w:jc w:val="center"/>
       </w:pPr>
       <w:r>
@@ -2438,7 +1658,7 @@
     </w:p>
     <w:p>
       <w:pPr>
-        <w:spacing w:after="160" w:before="0" w:line="276" w:lineRule="auto"/>
+        <w:spacing w:after="120" w:before="0" w:line="276" w:lineRule="auto"/>
       </w:pPr>
       <w:r>
         <w:rPr>
@@ -2447,12 +1667,12 @@
           <w:i/>
           <w:sz w:val="28"/>
         </w:rPr>
-        <w:t>Примечание: в бланке задания пункты 1 и 2 сформулированы одинаково (диаграмма коммуникации). Ниже дан полный ответ; для п. 2 приведено углублённое сравнение.</w:t>
+        <w:t>Примечание: в бланке задания пункты 1 и 2 сформулированы одинаково (диаграмма коммуникации).</w:t>
       </w:r>
     </w:p>
     <w:p>
       <w:pPr>
-        <w:spacing w:after="160" w:before="240" w:line="276" w:lineRule="auto"/>
+        <w:spacing w:after="120" w:before="200" w:line="276" w:lineRule="auto"/>
       </w:pPr>
       <w:r>
         <w:rPr>
@@ -2461,7 +1681,7 @@
           <w:i w:val="0"/>
           <w:sz w:val="28"/>
         </w:rPr>
-        <w:t>Задание 1. Диаграмма коммуникации (3–4 балла)</w:t>
+        <w:t>Задание 1–2. Диаграмма коммуникации (3–6 баллов)</w:t>
       </w:r>
     </w:p>
     <w:p>
@@ -2476,27 +1696,12 @@
           <w:i w:val="0"/>
           <w:sz w:val="28"/>
         </w:rPr>
-        <w:t>Назначение диаграммы коммуникации (Communication Diagram): показать структуру связей между объектами и обмен сообщениями при взаимодействии. Акцент — на том, кто с кем связан, а не на точной временной шкале (хотя порядок сообщений нумеруется).</w:t>
+        <w:t>Назначение: показать структуру связей между объектами и обмен сообщениями; акцент на том, кто с кем связан (порядок сообщений задаётся нумерацией).</w:t>
       </w:r>
     </w:p>
     <w:p>
       <w:pPr>
         <w:spacing w:after="80" w:before="0" w:line="276" w:lineRule="auto"/>
-      </w:pPr>
-      <w:r>
-        <w:rPr>
-          <w:rFonts w:ascii="Times New Roman" w:hAnsi="Times New Roman" w:eastAsia="Times New Roman"/>
-          <w:b/>
-          <w:i w:val="0"/>
-          <w:sz w:val="28"/>
-        </w:rPr>
-        <w:t>Основные элементы:</w:t>
-      </w:r>
-    </w:p>
-    <w:p>
-      <w:pPr>
-        <w:pStyle w:val="ListBullet"/>
-        <w:spacing w:after="60"/>
       </w:pPr>
       <w:r>
         <w:rPr>
@@ -2505,57 +1710,12 @@
           <w:i w:val="0"/>
           <w:sz w:val="28"/>
         </w:rPr>
-        <w:t>Объекты (роли) — прямоугольники с именем (:Класс или имя:Класс);</w:t>
+        <w:t>Элементы: объекты-роли, связи (links), сообщения вдоль связей с номерами (1, 1.1, 2…), актёры.</w:t>
       </w:r>
     </w:p>
     <w:p>
       <w:pPr>
-        <w:pStyle w:val="ListBullet"/>
-        <w:spacing w:after="60"/>
-      </w:pPr>
-      <w:r>
-        <w:rPr>
-          <w:rFonts w:ascii="Times New Roman" w:hAnsi="Times New Roman" w:eastAsia="Times New Roman"/>
-          <w:b w:val="0"/>
-          <w:i w:val="0"/>
-          <w:sz w:val="28"/>
-        </w:rPr>
-        <w:t>Связи (links) — линии между объектами, по которым идут сообщения;</w:t>
-      </w:r>
-    </w:p>
-    <w:p>
-      <w:pPr>
-        <w:pStyle w:val="ListBullet"/>
-        <w:spacing w:after="60"/>
-      </w:pPr>
-      <w:r>
-        <w:rPr>
-          <w:rFonts w:ascii="Times New Roman" w:hAnsi="Times New Roman" w:eastAsia="Times New Roman"/>
-          <w:b w:val="0"/>
-          <w:i w:val="0"/>
-          <w:sz w:val="28"/>
-        </w:rPr>
-        <w:t>Сообщения — стрелки вдоль связей с порядковым номером и именем (1: создать(), 1.1: проверить());</w:t>
-      </w:r>
-    </w:p>
-    <w:p>
-      <w:pPr>
-        <w:pStyle w:val="ListBullet"/>
-        <w:spacing w:after="60"/>
-      </w:pPr>
-      <w:r>
-        <w:rPr>
-          <w:rFonts w:ascii="Times New Roman" w:hAnsi="Times New Roman" w:eastAsia="Times New Roman"/>
-          <w:b w:val="0"/>
-          <w:i w:val="0"/>
-          <w:sz w:val="28"/>
-        </w:rPr>
-        <w:t>Актёры — при участии внешних ролей.</w:t>
-      </w:r>
-    </w:p>
-    <w:p>
-      <w:pPr>
-        <w:spacing w:after="80" w:before="0" w:line="276" w:lineRule="auto"/>
+        <w:spacing w:after="60" w:before="0" w:line="276" w:lineRule="auto"/>
       </w:pPr>
       <w:r>
         <w:rPr>
@@ -2570,7 +1730,7 @@
     <w:p>
       <w:pPr>
         <w:pStyle w:val="ListBullet"/>
-        <w:spacing w:after="60"/>
+        <w:spacing w:after="40"/>
       </w:pPr>
       <w:r>
         <w:rPr>
@@ -2579,13 +1739,13 @@
           <w:i w:val="0"/>
           <w:sz w:val="28"/>
         </w:rPr>
-        <w:t>Последовательность: акцент на времени (порядок сверху вниз), есть линии жизни.</w:t>
+        <w:t>Последовательность: акцент на времени (сверху вниз), есть линии жизни и активации.</w:t>
       </w:r>
     </w:p>
     <w:p>
       <w:pPr>
         <w:pStyle w:val="ListBullet"/>
-        <w:spacing w:after="60"/>
+        <w:spacing w:after="40"/>
       </w:pPr>
       <w:r>
         <w:rPr>
@@ -2594,13 +1754,13 @@
           <w:i w:val="0"/>
           <w:sz w:val="28"/>
         </w:rPr>
-        <w:t>Коммуникация: акцент на структуре связей объектов, порядок — явная нумерация.</w:t>
+        <w:t>Коммуникация: акцент на топологии связей, порядок — через номера сообщений.</w:t>
       </w:r>
     </w:p>
     <w:p>
       <w:pPr>
         <w:pStyle w:val="ListBullet"/>
-        <w:spacing w:after="60"/>
+        <w:spacing w:after="40"/>
       </w:pPr>
       <w:r>
         <w:rPr>
@@ -2609,189 +1769,67 @@
           <w:i w:val="0"/>
           <w:sz w:val="28"/>
         </w:rPr>
-        <w:t>Последовательность удобнее для сложных сценариев по времени; коммуникация — для обзора «кто с кем общается».</w:t>
+        <w:t>Семантика сообщений одна; представления взаимозаменяемы.</w:t>
       </w:r>
     </w:p>
     <w:p>
       <w:pPr>
-        <w:spacing w:after="120" w:before="0" w:line="276" w:lineRule="auto"/>
-        <w:jc w:val="both"/>
+        <w:spacing w:before="120" w:after="80"/>
+        <w:jc w:val="center"/>
+      </w:pPr>
+      <w:r>
+        <w:drawing>
+          <wp:inline xmlns:a="http://schemas.openxmlformats.org/drawingml/2006/main" xmlns:pic="http://schemas.openxmlformats.org/drawingml/2006/picture">
+            <wp:extent cx="5669280" cy="4337243"/>
+            <wp:docPr id="5" name="Picture 5"/>
+            <wp:cNvGraphicFramePr>
+              <a:graphicFrameLocks noChangeAspect="1"/>
+            </wp:cNvGraphicFramePr>
+            <a:graphic>
+              <a:graphicData uri="http://schemas.openxmlformats.org/drawingml/2006/picture">
+                <pic:pic>
+                  <pic:nvPicPr>
+                    <pic:cNvPr id="0" name="v4_communication.png"/>
+                    <pic:cNvPicPr/>
+                  </pic:nvPicPr>
+                  <pic:blipFill>
+                    <a:blip r:embed="rId13"/>
+                    <a:stretch>
+                      <a:fillRect/>
+                    </a:stretch>
+                  </pic:blipFill>
+                  <pic:spPr>
+                    <a:xfrm>
+                      <a:off x="0" y="0"/>
+                      <a:ext cx="5669280" cy="4337243"/>
+                    </a:xfrm>
+                    <a:prstGeom prst="rect"/>
+                  </pic:spPr>
+                </pic:pic>
+              </a:graphicData>
+            </a:graphic>
+          </wp:inline>
+        </w:drawing>
+      </w:r>
+    </w:p>
+    <w:p>
+      <w:pPr>
+        <w:spacing w:after="200" w:before="0" w:line="276" w:lineRule="auto"/>
+        <w:jc w:val="center"/>
       </w:pPr>
       <w:r>
         <w:rPr>
           <w:rFonts w:ascii="Times New Roman" w:hAnsi="Times New Roman" w:eastAsia="Times New Roman"/>
           <w:b w:val="0"/>
-          <w:i w:val="0"/>
-          <w:sz w:val="28"/>
+          <w:i/>
+          <w:sz w:val="24"/>
         </w:rPr>
-        <w:t>Отличия: на последовательности явно виден поток времени; на коммуникации — топология взаимодействия. Семантика сообщений одна и та же (диаграммы взаимопреобразуемы), различается способ представления.</w:t>
+        <w:t>Рисунок 5 — Диаграмма коммуникации (вариант 4, задания 1–2)</w:t>
       </w:r>
     </w:p>
     <w:p>
       <w:pPr>
-        <w:spacing w:after="160" w:before="240" w:line="276" w:lineRule="auto"/>
-      </w:pPr>
-      <w:r>
-        <w:rPr>
-          <w:rFonts w:ascii="Times New Roman" w:hAnsi="Times New Roman" w:eastAsia="Times New Roman"/>
-          <w:b/>
-          <w:i w:val="0"/>
-          <w:sz w:val="28"/>
-        </w:rPr>
-        <w:t>Задание 2. Диаграмма коммуникации — углубление (5–6 баллов)</w:t>
-      </w:r>
-    </w:p>
-    <w:p>
-      <w:pPr>
-        <w:spacing w:after="120" w:before="0" w:line="276" w:lineRule="auto"/>
-        <w:jc w:val="both"/>
-      </w:pPr>
-      <w:r>
-        <w:rPr>
-          <w:rFonts w:ascii="Times New Roman" w:hAnsi="Times New Roman" w:eastAsia="Times New Roman"/>
-          <w:b w:val="0"/>
-          <w:i w:val="0"/>
-          <w:sz w:val="28"/>
-        </w:rPr>
-        <w:t>Диаграмма коммуникации относится к диаграммам взаимодействия UML и используется на этапе анализа и проектирования для уточнения реализации прецедента.</w:t>
-      </w:r>
-    </w:p>
-    <w:p>
-      <w:pPr>
-        <w:spacing w:after="80" w:before="0" w:line="276" w:lineRule="auto"/>
-      </w:pPr>
-      <w:r>
-        <w:rPr>
-          <w:rFonts w:ascii="Times New Roman" w:hAnsi="Times New Roman" w:eastAsia="Times New Roman"/>
-          <w:b/>
-          <w:i w:val="0"/>
-          <w:sz w:val="28"/>
-        </w:rPr>
-        <w:t>Элементы подробнее:</w:t>
-      </w:r>
-    </w:p>
-    <w:p>
-      <w:pPr>
-        <w:pStyle w:val="ListBullet"/>
-        <w:spacing w:after="60"/>
-      </w:pPr>
-      <w:r>
-        <w:rPr>
-          <w:rFonts w:ascii="Times New Roman" w:hAnsi="Times New Roman" w:eastAsia="Times New Roman"/>
-          <w:b w:val="0"/>
-          <w:i w:val="0"/>
-          <w:sz w:val="28"/>
-        </w:rPr>
-        <w:t>Участники — объекты/роли классификаторов.</w:t>
-      </w:r>
-    </w:p>
-    <w:p>
-      <w:pPr>
-        <w:pStyle w:val="ListBullet"/>
-        <w:spacing w:after="60"/>
-      </w:pPr>
-      <w:r>
-        <w:rPr>
-          <w:rFonts w:ascii="Times New Roman" w:hAnsi="Times New Roman" w:eastAsia="Times New Roman"/>
-          <w:b w:val="0"/>
-          <w:i w:val="0"/>
-          <w:sz w:val="28"/>
-        </w:rPr>
-        <w:t>Связи — экземпляры ассоциаций на время взаимодействия.</w:t>
-      </w:r>
-    </w:p>
-    <w:p>
-      <w:pPr>
-        <w:pStyle w:val="ListBullet"/>
-        <w:spacing w:after="60"/>
-      </w:pPr>
-      <w:r>
-        <w:rPr>
-          <w:rFonts w:ascii="Times New Roman" w:hAnsi="Times New Roman" w:eastAsia="Times New Roman"/>
-          <w:b w:val="0"/>
-          <w:i w:val="0"/>
-          <w:sz w:val="28"/>
-        </w:rPr>
-        <w:t>Сообщения — вызовы операций, сигналы; вложенность отражается нумерацией (1, 1.1, 1.2, 2).</w:t>
-      </w:r>
-    </w:p>
-    <w:p>
-      <w:pPr>
-        <w:pStyle w:val="ListBullet"/>
-        <w:spacing w:after="60"/>
-      </w:pPr>
-      <w:r>
-        <w:rPr>
-          <w:rFonts w:ascii="Times New Roman" w:hAnsi="Times New Roman" w:eastAsia="Times New Roman"/>
-          <w:b w:val="0"/>
-          <w:i w:val="0"/>
-          <w:sz w:val="28"/>
-        </w:rPr>
-        <w:t>Направление стрелки указывает получателя сообщения.</w:t>
-      </w:r>
-    </w:p>
-    <w:p>
-      <w:pPr>
-        <w:spacing w:after="80" w:before="0" w:line="276" w:lineRule="auto"/>
-      </w:pPr>
-      <w:r>
-        <w:rPr>
-          <w:rFonts w:ascii="Times New Roman" w:hAnsi="Times New Roman" w:eastAsia="Times New Roman"/>
-          <w:b/>
-          <w:i w:val="0"/>
-          <w:sz w:val="28"/>
-        </w:rPr>
-        <w:t>Отличия от sequence diagram:</w:t>
-      </w:r>
-    </w:p>
-    <w:p>
-      <w:pPr>
-        <w:pStyle w:val="ListBullet"/>
-        <w:spacing w:after="60"/>
-      </w:pPr>
-      <w:r>
-        <w:rPr>
-          <w:rFonts w:ascii="Times New Roman" w:hAnsi="Times New Roman" w:eastAsia="Times New Roman"/>
-          <w:b w:val="0"/>
-          <w:i w:val="0"/>
-          <w:sz w:val="28"/>
-        </w:rPr>
-        <w:t>Sequence: ось времени, активации, удобны фрагменты alt / loop / opt.</w:t>
-      </w:r>
-    </w:p>
-    <w:p>
-      <w:pPr>
-        <w:pStyle w:val="ListBullet"/>
-        <w:spacing w:after="60"/>
-      </w:pPr>
-      <w:r>
-        <w:rPr>
-          <w:rFonts w:ascii="Times New Roman" w:hAnsi="Times New Roman" w:eastAsia="Times New Roman"/>
-          <w:b w:val="0"/>
-          <w:i w:val="0"/>
-          <w:sz w:val="28"/>
-        </w:rPr>
-        <w:t>Communication: компактность, акцент на связях, порядок только через номера.</w:t>
-      </w:r>
-    </w:p>
-    <w:p>
-      <w:pPr>
-        <w:pStyle w:val="ListBullet"/>
-        <w:spacing w:after="60"/>
-      </w:pPr>
-      <w:r>
-        <w:rPr>
-          <w:rFonts w:ascii="Times New Roman" w:hAnsi="Times New Roman" w:eastAsia="Times New Roman"/>
-          <w:b w:val="0"/>
-          <w:i w:val="0"/>
-          <w:sz w:val="28"/>
-        </w:rPr>
-        <w:t>При большом числе объектов коммуникация читается лучше как «карта», последовательность — лучше как «сценарий во времени».</w:t>
-      </w:r>
-    </w:p>
-    <w:p>
-      <w:pPr>
-        <w:spacing w:after="160" w:before="240" w:line="276" w:lineRule="auto"/>
+        <w:spacing w:after="120" w:before="200" w:line="276" w:lineRule="auto"/>
       </w:pPr>
       <w:r>
         <w:rPr>
@@ -2805,7 +1843,7 @@
     </w:p>
     <w:p>
       <w:pPr>
-        <w:spacing w:after="80" w:before="0" w:line="276" w:lineRule="auto"/>
+        <w:spacing w:after="60" w:before="0" w:line="276" w:lineRule="auto"/>
       </w:pPr>
       <w:r>
         <w:rPr>
@@ -2814,13 +1852,13 @@
           <w:i w:val="0"/>
           <w:sz w:val="28"/>
         </w:rPr>
-        <w:t>Роли в Scrum:</w:t>
+        <w:t>Роли:</w:t>
       </w:r>
     </w:p>
     <w:p>
       <w:pPr>
         <w:pStyle w:val="ListBullet"/>
-        <w:spacing w:after="60"/>
+        <w:spacing w:after="40"/>
       </w:pPr>
       <w:r>
         <w:rPr>
@@ -2829,13 +1867,13 @@
           <w:i w:val="0"/>
           <w:sz w:val="28"/>
         </w:rPr>
-        <w:t>Product Owner (Владелец продукта) — отвечает за ценность продукта и Product Backlog: приоритеты, формулировка требований (user stories), приёмка результата.</w:t>
+        <w:t>Product Owner — ценность продукта и Product Backlog, приоритеты, приёмка.</w:t>
       </w:r>
     </w:p>
     <w:p>
       <w:pPr>
         <w:pStyle w:val="ListBullet"/>
-        <w:spacing w:after="60"/>
+        <w:spacing w:after="40"/>
       </w:pPr>
       <w:r>
         <w:rPr>
@@ -2844,13 +1882,13 @@
           <w:i w:val="0"/>
           <w:sz w:val="28"/>
         </w:rPr>
-        <w:t>Scrum Master — помогает команде следовать Scrum, устраняет препятствия, фасилитирует события, защищает команду от внешних помех.</w:t>
+        <w:t>Scrum Master — следование Scrum, устранение препятствий, фасилитация.</w:t>
       </w:r>
     </w:p>
     <w:p>
       <w:pPr>
         <w:pStyle w:val="ListBullet"/>
-        <w:spacing w:after="60"/>
+        <w:spacing w:after="40"/>
       </w:pPr>
       <w:r>
         <w:rPr>
@@ -2859,12 +1897,12 @@
           <w:i w:val="0"/>
           <w:sz w:val="28"/>
         </w:rPr>
-        <w:t>Developers (Команда разработки) — кросс-функциональные специалисты, создающие Инкремент; сами оценивают объём работ и решают, как реализовать задачи спринта.</w:t>
+        <w:t>Developers — кросс-функциональная команда, создающая Инкремент.</w:t>
       </w:r>
     </w:p>
     <w:p>
       <w:pPr>
-        <w:spacing w:after="80" w:before="0" w:line="276" w:lineRule="auto"/>
+        <w:spacing w:after="60" w:before="0" w:line="276" w:lineRule="auto"/>
       </w:pPr>
       <w:r>
         <w:rPr>
@@ -2873,13 +1911,13 @@
           <w:i w:val="0"/>
           <w:sz w:val="28"/>
         </w:rPr>
-        <w:t>Артефакты Scrum:</w:t>
+        <w:t>Артефакты:</w:t>
       </w:r>
     </w:p>
     <w:p>
       <w:pPr>
         <w:pStyle w:val="ListBullet"/>
-        <w:spacing w:after="60"/>
+        <w:spacing w:after="40"/>
       </w:pPr>
       <w:r>
         <w:rPr>
@@ -2888,13 +1926,13 @@
           <w:i w:val="0"/>
           <w:sz w:val="28"/>
         </w:rPr>
-        <w:t>Product Backlog — упорядоченный список всего, что нужно в продукте (требования, улучшения, дефекты); живой документ под ответственностью Product Owner.</w:t>
+        <w:t>Product Backlog — упорядоченный список всего нужного в продукте.</w:t>
       </w:r>
     </w:p>
     <w:p>
       <w:pPr>
         <w:pStyle w:val="ListBullet"/>
-        <w:spacing w:after="60"/>
+        <w:spacing w:after="40"/>
       </w:pPr>
       <w:r>
         <w:rPr>
@@ -2903,13 +1941,13 @@
           <w:i w:val="0"/>
           <w:sz w:val="28"/>
         </w:rPr>
-        <w:t>Sprint Backlog — набор элементов Product Backlog, выбранных на спринт, плюс план их реализации; принадлежит команде разработки.</w:t>
+        <w:t>Sprint Backlog — выбранные на спринт элементы и план их реализации.</w:t>
       </w:r>
     </w:p>
     <w:p>
       <w:pPr>
         <w:pStyle w:val="ListBullet"/>
-        <w:spacing w:after="60"/>
+        <w:spacing w:after="40"/>
       </w:pPr>
       <w:r>
         <w:rPr>
@@ -2918,27 +1956,12 @@
           <w:i w:val="0"/>
           <w:sz w:val="28"/>
         </w:rPr>
-        <w:t>Increment (Инкремент) — сумма всех завершённых элементов бэклога и предыдущих инкрементов; должен быть Done (готовым к использованию) к концу спринта.</w:t>
+        <w:t>Increment — готовый к использованию результат спринта (Definition of Done).</w:t>
       </w:r>
     </w:p>
     <w:p>
       <w:pPr>
-        <w:spacing w:after="120" w:before="0" w:line="276" w:lineRule="auto"/>
-        <w:jc w:val="both"/>
-      </w:pPr>
-      <w:r>
-        <w:rPr>
-          <w:rFonts w:ascii="Times New Roman" w:hAnsi="Times New Roman" w:eastAsia="Times New Roman"/>
-          <w:b w:val="0"/>
-          <w:i w:val="0"/>
-          <w:sz w:val="28"/>
-        </w:rPr>
-        <w:t>Дополнительно: Definition of Done (критерии готовности) как обязательное соглашение; Sprint Goal — цель спринта.</w:t>
-      </w:r>
-    </w:p>
-    <w:p>
-      <w:pPr>
-        <w:spacing w:after="160" w:before="240" w:line="276" w:lineRule="auto"/>
+        <w:spacing w:after="120" w:before="200" w:line="276" w:lineRule="auto"/>
       </w:pPr>
       <w:r>
         <w:rPr>
@@ -2962,527 +1985,67 @@
           <w:i w:val="0"/>
           <w:sz w:val="28"/>
         </w:rPr>
-        <w:t>Пример: жизненный цикл заказа.</w:t>
+        <w:t>Пример: жизненный цикл заказа. Начальное состояние — залитый круг; состояния — скруглённые прямоугольники; переходы — стрелки с событием; конечное — круг в кольце.</w:t>
       </w:r>
     </w:p>
     <w:p>
       <w:pPr>
-        <w:spacing w:after="80"/>
-        <w:ind w:left="283"/>
+        <w:spacing w:before="120" w:after="80"/>
+        <w:jc w:val="center"/>
       </w:pPr>
       <w:r>
-        <w:rPr>
-          <w:rFonts w:ascii="Courier New" w:hAnsi="Courier New" w:eastAsia="Courier New"/>
-          <w:b w:val="0"/>
-          <w:i w:val="0"/>
-          <w:sz w:val="22"/>
-        </w:rPr>
-        <w:t xml:space="preserve">           [*] </w:t>
+        <w:drawing>
+          <wp:inline xmlns:a="http://schemas.openxmlformats.org/drawingml/2006/main" xmlns:pic="http://schemas.openxmlformats.org/drawingml/2006/picture">
+            <wp:extent cx="5486400" cy="4681518"/>
+            <wp:docPr id="6" name="Picture 6"/>
+            <wp:cNvGraphicFramePr>
+              <a:graphicFrameLocks noChangeAspect="1"/>
+            </wp:cNvGraphicFramePr>
+            <a:graphic>
+              <a:graphicData uri="http://schemas.openxmlformats.org/drawingml/2006/picture">
+                <pic:pic>
+                  <pic:nvPicPr>
+                    <pic:cNvPr id="0" name="v4_state.png"/>
+                    <pic:cNvPicPr/>
+                  </pic:nvPicPr>
+                  <pic:blipFill>
+                    <a:blip r:embed="rId14"/>
+                    <a:stretch>
+                      <a:fillRect/>
+                    </a:stretch>
+                  </pic:blipFill>
+                  <pic:spPr>
+                    <a:xfrm>
+                      <a:off x="0" y="0"/>
+                      <a:ext cx="5486400" cy="4681518"/>
+                    </a:xfrm>
+                    <a:prstGeom prst="rect"/>
+                  </pic:spPr>
+                </pic:pic>
+              </a:graphicData>
+            </a:graphic>
+          </wp:inline>
+        </w:drawing>
       </w:r>
     </w:p>
     <w:p>
       <w:pPr>
-        <w:spacing w:after="80"/>
-        <w:ind w:left="283"/>
-      </w:pPr>
-      <w:r>
-        <w:rPr>
-          <w:rFonts w:ascii="Courier New" w:hAnsi="Courier New" w:eastAsia="Courier New"/>
-          <w:b w:val="0"/>
-          <w:i w:val="0"/>
-          <w:sz w:val="22"/>
-        </w:rPr>
-        <w:t xml:space="preserve">            │</w:t>
-      </w:r>
-    </w:p>
-    <w:p>
-      <w:pPr>
-        <w:spacing w:after="80"/>
-        <w:ind w:left="283"/>
-      </w:pPr>
-      <w:r>
-        <w:rPr>
-          <w:rFonts w:ascii="Courier New" w:hAnsi="Courier New" w:eastAsia="Courier New"/>
-          <w:b w:val="0"/>
-          <w:i w:val="0"/>
-          <w:sz w:val="22"/>
-        </w:rPr>
-        <w:t xml:space="preserve">            ▼</w:t>
-      </w:r>
-    </w:p>
-    <w:p>
-      <w:pPr>
-        <w:spacing w:after="80"/>
-        <w:ind w:left="283"/>
-      </w:pPr>
-      <w:r>
-        <w:rPr>
-          <w:rFonts w:ascii="Courier New" w:hAnsi="Courier New" w:eastAsia="Courier New"/>
-          <w:b w:val="0"/>
-          <w:i w:val="0"/>
-          <w:sz w:val="22"/>
-        </w:rPr>
-        <w:t xml:space="preserve">         ┌──────┐  отменить   ┌─────────┐</w:t>
-      </w:r>
-    </w:p>
-    <w:p>
-      <w:pPr>
-        <w:spacing w:after="80"/>
-        <w:ind w:left="283"/>
-      </w:pPr>
-      <w:r>
-        <w:rPr>
-          <w:rFonts w:ascii="Courier New" w:hAnsi="Courier New" w:eastAsia="Courier New"/>
-          <w:b w:val="0"/>
-          <w:i w:val="0"/>
-          <w:sz w:val="22"/>
-        </w:rPr>
-        <w:t xml:space="preserve">         │ Новый│────────────►│ Отменён │</w:t>
-      </w:r>
-    </w:p>
-    <w:p>
-      <w:pPr>
-        <w:spacing w:after="80"/>
-        <w:ind w:left="283"/>
-      </w:pPr>
-      <w:r>
-        <w:rPr>
-          <w:rFonts w:ascii="Courier New" w:hAnsi="Courier New" w:eastAsia="Courier New"/>
-          <w:b w:val="0"/>
-          <w:i w:val="0"/>
-          <w:sz w:val="22"/>
-        </w:rPr>
-        <w:t xml:space="preserve">         └──┬───┘             └────┬────┘</w:t>
-      </w:r>
-    </w:p>
-    <w:p>
-      <w:pPr>
-        <w:spacing w:after="80"/>
-        <w:ind w:left="283"/>
-      </w:pPr>
-      <w:r>
-        <w:rPr>
-          <w:rFonts w:ascii="Courier New" w:hAnsi="Courier New" w:eastAsia="Courier New"/>
-          <w:b w:val="0"/>
-          <w:i w:val="0"/>
-          <w:sz w:val="22"/>
-        </w:rPr>
-        <w:t xml:space="preserve">            │ подтвердить          │</w:t>
-      </w:r>
-    </w:p>
-    <w:p>
-      <w:pPr>
-        <w:spacing w:after="80"/>
-        <w:ind w:left="283"/>
-      </w:pPr>
-      <w:r>
-        <w:rPr>
-          <w:rFonts w:ascii="Courier New" w:hAnsi="Courier New" w:eastAsia="Courier New"/>
-          <w:b w:val="0"/>
-          <w:i w:val="0"/>
-          <w:sz w:val="22"/>
-        </w:rPr>
-        <w:t xml:space="preserve">            ▼                      │</w:t>
-      </w:r>
-    </w:p>
-    <w:p>
-      <w:pPr>
-        <w:spacing w:after="80"/>
-        <w:ind w:left="283"/>
-      </w:pPr>
-      <w:r>
-        <w:rPr>
-          <w:rFonts w:ascii="Courier New" w:hAnsi="Courier New" w:eastAsia="Courier New"/>
-          <w:b w:val="0"/>
-          <w:i w:val="0"/>
-          <w:sz w:val="22"/>
-        </w:rPr>
-        <w:t xml:space="preserve">      ┌───────────┐  отменить      │</w:t>
-      </w:r>
-    </w:p>
-    <w:p>
-      <w:pPr>
-        <w:spacing w:after="80"/>
-        <w:ind w:left="283"/>
-      </w:pPr>
-      <w:r>
-        <w:rPr>
-          <w:rFonts w:ascii="Courier New" w:hAnsi="Courier New" w:eastAsia="Courier New"/>
-          <w:b w:val="0"/>
-          <w:i w:val="0"/>
-          <w:sz w:val="22"/>
-        </w:rPr>
-        <w:t xml:space="preserve">      │Подтверждён│───────────────►│</w:t>
-      </w:r>
-    </w:p>
-    <w:p>
-      <w:pPr>
-        <w:spacing w:after="80"/>
-        <w:ind w:left="283"/>
-      </w:pPr>
-      <w:r>
-        <w:rPr>
-          <w:rFonts w:ascii="Courier New" w:hAnsi="Courier New" w:eastAsia="Courier New"/>
-          <w:b w:val="0"/>
-          <w:i w:val="0"/>
-          <w:sz w:val="22"/>
-        </w:rPr>
-        <w:t xml:space="preserve">      └─────┬─────┘                │</w:t>
-      </w:r>
-    </w:p>
-    <w:p>
-      <w:pPr>
-        <w:spacing w:after="80"/>
-        <w:ind w:left="283"/>
-      </w:pPr>
-      <w:r>
-        <w:rPr>
-          <w:rFonts w:ascii="Courier New" w:hAnsi="Courier New" w:eastAsia="Courier New"/>
-          <w:b w:val="0"/>
-          <w:i w:val="0"/>
-          <w:sz w:val="22"/>
-        </w:rPr>
-        <w:t xml:space="preserve">            │ оплатить             │</w:t>
-      </w:r>
-    </w:p>
-    <w:p>
-      <w:pPr>
-        <w:spacing w:after="80"/>
-        <w:ind w:left="283"/>
-      </w:pPr>
-      <w:r>
-        <w:rPr>
-          <w:rFonts w:ascii="Courier New" w:hAnsi="Courier New" w:eastAsia="Courier New"/>
-          <w:b w:val="0"/>
-          <w:i w:val="0"/>
-          <w:sz w:val="22"/>
-        </w:rPr>
-        <w:t xml:space="preserve">            ▼                      │</w:t>
-      </w:r>
-    </w:p>
-    <w:p>
-      <w:pPr>
-        <w:spacing w:after="80"/>
-        <w:ind w:left="283"/>
-      </w:pPr>
-      <w:r>
-        <w:rPr>
-          <w:rFonts w:ascii="Courier New" w:hAnsi="Courier New" w:eastAsia="Courier New"/>
-          <w:b w:val="0"/>
-          <w:i w:val="0"/>
-          <w:sz w:val="22"/>
-        </w:rPr>
-        <w:t xml:space="preserve">        ┌───────┐                  │</w:t>
-      </w:r>
-    </w:p>
-    <w:p>
-      <w:pPr>
-        <w:spacing w:after="80"/>
-        <w:ind w:left="283"/>
-      </w:pPr>
-      <w:r>
-        <w:rPr>
-          <w:rFonts w:ascii="Courier New" w:hAnsi="Courier New" w:eastAsia="Courier New"/>
-          <w:b w:val="0"/>
-          <w:i w:val="0"/>
-          <w:sz w:val="22"/>
-        </w:rPr>
-        <w:t xml:space="preserve">        │Оплачен│                  │</w:t>
-      </w:r>
-    </w:p>
-    <w:p>
-      <w:pPr>
-        <w:spacing w:after="80"/>
-        <w:ind w:left="283"/>
-      </w:pPr>
-      <w:r>
-        <w:rPr>
-          <w:rFonts w:ascii="Courier New" w:hAnsi="Courier New" w:eastAsia="Courier New"/>
-          <w:b w:val="0"/>
-          <w:i w:val="0"/>
-          <w:sz w:val="22"/>
-        </w:rPr>
-        <w:t xml:space="preserve">        └───┬───┘                  │</w:t>
-      </w:r>
-    </w:p>
-    <w:p>
-      <w:pPr>
-        <w:spacing w:after="80"/>
-        <w:ind w:left="283"/>
-      </w:pPr>
-      <w:r>
-        <w:rPr>
-          <w:rFonts w:ascii="Courier New" w:hAnsi="Courier New" w:eastAsia="Courier New"/>
-          <w:b w:val="0"/>
-          <w:i w:val="0"/>
-          <w:sz w:val="22"/>
-        </w:rPr>
-        <w:t xml:space="preserve">            │ передатьКурьеру      │</w:t>
-      </w:r>
-    </w:p>
-    <w:p>
-      <w:pPr>
-        <w:spacing w:after="80"/>
-        <w:ind w:left="283"/>
-      </w:pPr>
-      <w:r>
-        <w:rPr>
-          <w:rFonts w:ascii="Courier New" w:hAnsi="Courier New" w:eastAsia="Courier New"/>
-          <w:b w:val="0"/>
-          <w:i w:val="0"/>
-          <w:sz w:val="22"/>
-        </w:rPr>
-        <w:t xml:space="preserve">            ▼                      │</w:t>
-      </w:r>
-    </w:p>
-    <w:p>
-      <w:pPr>
-        <w:spacing w:after="80"/>
-        <w:ind w:left="283"/>
-      </w:pPr>
-      <w:r>
-        <w:rPr>
-          <w:rFonts w:ascii="Courier New" w:hAnsi="Courier New" w:eastAsia="Courier New"/>
-          <w:b w:val="0"/>
-          <w:i w:val="0"/>
-          <w:sz w:val="22"/>
-        </w:rPr>
-        <w:t xml:space="preserve">   ┌────────────────┐              │</w:t>
-      </w:r>
-    </w:p>
-    <w:p>
-      <w:pPr>
-        <w:spacing w:after="80"/>
-        <w:ind w:left="283"/>
-      </w:pPr>
-      <w:r>
-        <w:rPr>
-          <w:rFonts w:ascii="Courier New" w:hAnsi="Courier New" w:eastAsia="Courier New"/>
-          <w:b w:val="0"/>
-          <w:i w:val="0"/>
-          <w:sz w:val="22"/>
-        </w:rPr>
-        <w:t xml:space="preserve">   │ПереданВДоставку│              │</w:t>
-      </w:r>
-    </w:p>
-    <w:p>
-      <w:pPr>
-        <w:spacing w:after="80"/>
-        <w:ind w:left="283"/>
-      </w:pPr>
-      <w:r>
-        <w:rPr>
-          <w:rFonts w:ascii="Courier New" w:hAnsi="Courier New" w:eastAsia="Courier New"/>
-          <w:b w:val="0"/>
-          <w:i w:val="0"/>
-          <w:sz w:val="22"/>
-        </w:rPr>
-        <w:t xml:space="preserve">   └───────┬────────┘              │</w:t>
-      </w:r>
-    </w:p>
-    <w:p>
-      <w:pPr>
-        <w:spacing w:after="80"/>
-        <w:ind w:left="283"/>
-      </w:pPr>
-      <w:r>
-        <w:rPr>
-          <w:rFonts w:ascii="Courier New" w:hAnsi="Courier New" w:eastAsia="Courier New"/>
-          <w:b w:val="0"/>
-          <w:i w:val="0"/>
-          <w:sz w:val="22"/>
-        </w:rPr>
-        <w:t xml:space="preserve">           │ вручить               │</w:t>
-      </w:r>
-    </w:p>
-    <w:p>
-      <w:pPr>
-        <w:spacing w:after="80"/>
-        <w:ind w:left="283"/>
-      </w:pPr>
-      <w:r>
-        <w:rPr>
-          <w:rFonts w:ascii="Courier New" w:hAnsi="Courier New" w:eastAsia="Courier New"/>
-          <w:b w:val="0"/>
-          <w:i w:val="0"/>
-          <w:sz w:val="22"/>
-        </w:rPr>
-        <w:t xml:space="preserve">           ▼                       │</w:t>
-      </w:r>
-    </w:p>
-    <w:p>
-      <w:pPr>
-        <w:spacing w:after="80"/>
-        <w:ind w:left="283"/>
-      </w:pPr>
-      <w:r>
-        <w:rPr>
-          <w:rFonts w:ascii="Courier New" w:hAnsi="Courier New" w:eastAsia="Courier New"/>
-          <w:b w:val="0"/>
-          <w:i w:val="0"/>
-          <w:sz w:val="22"/>
-        </w:rPr>
-        <w:t xml:space="preserve">      ┌─────────┐                  │</w:t>
-      </w:r>
-    </w:p>
-    <w:p>
-      <w:pPr>
-        <w:spacing w:after="80"/>
-        <w:ind w:left="283"/>
-      </w:pPr>
-      <w:r>
-        <w:rPr>
-          <w:rFonts w:ascii="Courier New" w:hAnsi="Courier New" w:eastAsia="Courier New"/>
-          <w:b w:val="0"/>
-          <w:i w:val="0"/>
-          <w:sz w:val="22"/>
-        </w:rPr>
-        <w:t xml:space="preserve">      │Доставлен│                  │</w:t>
-      </w:r>
-    </w:p>
-    <w:p>
-      <w:pPr>
-        <w:spacing w:after="80"/>
-        <w:ind w:left="283"/>
-      </w:pPr>
-      <w:r>
-        <w:rPr>
-          <w:rFonts w:ascii="Courier New" w:hAnsi="Courier New" w:eastAsia="Courier New"/>
-          <w:b w:val="0"/>
-          <w:i w:val="0"/>
-          <w:sz w:val="22"/>
-        </w:rPr>
-        <w:t xml:space="preserve">      └────┬────┘                  │</w:t>
-      </w:r>
-    </w:p>
-    <w:p>
-      <w:pPr>
-        <w:spacing w:after="80"/>
-        <w:ind w:left="283"/>
-      </w:pPr>
-      <w:r>
-        <w:rPr>
-          <w:rFonts w:ascii="Courier New" w:hAnsi="Courier New" w:eastAsia="Courier New"/>
-          <w:b w:val="0"/>
-          <w:i w:val="0"/>
-          <w:sz w:val="22"/>
-        </w:rPr>
-        <w:t xml:space="preserve">           │ закрыть               │ закрыть</w:t>
-      </w:r>
-    </w:p>
-    <w:p>
-      <w:pPr>
-        <w:spacing w:after="80"/>
-        <w:ind w:left="283"/>
-      </w:pPr>
-      <w:r>
-        <w:rPr>
-          <w:rFonts w:ascii="Courier New" w:hAnsi="Courier New" w:eastAsia="Courier New"/>
-          <w:b w:val="0"/>
-          <w:i w:val="0"/>
-          <w:sz w:val="22"/>
-        </w:rPr>
-        <w:t xml:space="preserve">           ▼                       ▼</w:t>
-      </w:r>
-    </w:p>
-    <w:p>
-      <w:pPr>
-        <w:spacing w:after="80"/>
-        <w:ind w:left="283"/>
-      </w:pPr>
-      <w:r>
-        <w:rPr>
-          <w:rFonts w:ascii="Courier New" w:hAnsi="Courier New" w:eastAsia="Courier New"/>
-          <w:b w:val="0"/>
-          <w:i w:val="0"/>
-          <w:sz w:val="22"/>
-        </w:rPr>
-        <w:t xml:space="preserve">        ┌──────┐◄──────────────────┘</w:t>
-      </w:r>
-    </w:p>
-    <w:p>
-      <w:pPr>
-        <w:spacing w:after="80"/>
-        <w:ind w:left="283"/>
-      </w:pPr>
-      <w:r>
-        <w:rPr>
-          <w:rFonts w:ascii="Courier New" w:hAnsi="Courier New" w:eastAsia="Courier New"/>
-          <w:b w:val="0"/>
-          <w:i w:val="0"/>
-          <w:sz w:val="22"/>
-        </w:rPr>
-        <w:t xml:space="preserve">        │Закрыт│</w:t>
-      </w:r>
-    </w:p>
-    <w:p>
-      <w:pPr>
-        <w:spacing w:after="80"/>
-        <w:ind w:left="283"/>
-      </w:pPr>
-      <w:r>
-        <w:rPr>
-          <w:rFonts w:ascii="Courier New" w:hAnsi="Courier New" w:eastAsia="Courier New"/>
-          <w:b w:val="0"/>
-          <w:i w:val="0"/>
-          <w:sz w:val="22"/>
-        </w:rPr>
-        <w:t xml:space="preserve">        └──┬───┘</w:t>
-      </w:r>
-    </w:p>
-    <w:p>
-      <w:pPr>
-        <w:spacing w:after="80"/>
-        <w:ind w:left="283"/>
-      </w:pPr>
-      <w:r>
-        <w:rPr>
-          <w:rFonts w:ascii="Courier New" w:hAnsi="Courier New" w:eastAsia="Courier New"/>
-          <w:b w:val="0"/>
-          <w:i w:val="0"/>
-          <w:sz w:val="22"/>
-        </w:rPr>
-        <w:t xml:space="preserve">           ▼</w:t>
-      </w:r>
-    </w:p>
-    <w:p>
-      <w:pPr>
-        <w:spacing w:after="80"/>
-        <w:ind w:left="283"/>
-      </w:pPr>
-      <w:r>
-        <w:rPr>
-          <w:rFonts w:ascii="Courier New" w:hAnsi="Courier New" w:eastAsia="Courier New"/>
-          <w:b w:val="0"/>
-          <w:i w:val="0"/>
-          <w:sz w:val="22"/>
-        </w:rPr>
-        <w:t xml:space="preserve">          [*]</w:t>
-      </w:r>
-    </w:p>
-    <w:p>
-      <w:pPr>
-        <w:spacing w:after="120" w:before="0" w:line="276" w:lineRule="auto"/>
-        <w:jc w:val="both"/>
+        <w:spacing w:after="200" w:before="0" w:line="276" w:lineRule="auto"/>
+        <w:jc w:val="center"/>
       </w:pPr>
       <w:r>
         <w:rPr>
           <w:rFonts w:ascii="Times New Roman" w:hAnsi="Times New Roman" w:eastAsia="Times New Roman"/>
           <w:b w:val="0"/>
-          <w:i w:val="0"/>
-          <w:sz w:val="28"/>
+          <w:i/>
+          <w:sz w:val="24"/>
         </w:rPr>
-        <w:t>Как начертить: начальное состояние — залитый круг; состояния — скруглённые прямоугольники; переходы — стрелки с событием/действием; конечное состояние — круг в кольце.</w:t>
+        <w:t>Рисунок 6 — Диаграмма состояний (вариант 4, задание 4)</w:t>
       </w:r>
     </w:p>
     <w:p>
       <w:pPr>
-        <w:spacing w:after="120" w:before="0" w:line="276" w:lineRule="auto"/>
-      </w:pPr>
-    </w:p>
-    <w:p>
-      <w:pPr>
-        <w:spacing w:after="120" w:before="0" w:line="276" w:lineRule="auto"/>
+        <w:spacing w:after="120" w:before="240" w:line="276" w:lineRule="auto"/>
         <w:jc w:val="center"/>
       </w:pPr>
       <w:r>
@@ -3497,7 +2060,7 @@
     </w:p>
     <w:sectPr>
       <w:pgSz w:w="12240" w:h="15840"/>
-      <w:pgMar w:top="1134" w:right="850" w:bottom="1134" w:left="1701" w:header="720" w:footer="720" w:gutter="0"/>
+      <w:pgMar w:top="1020" w:right="850" w:bottom="1020" w:left="1417" w:header="720" w:footer="720" w:gutter="0"/>
       <w:cols w:space="720"/>
       <w:docGrid w:linePitch="360"/>
     </w:sectPr>

</xml_diff>

<commit_message>
Fix use case diagram layout and refresh Word file
Move write-off use case so <<extend>> clearly links
reminder to return only; rebuild docx with all figures.

Co-authored-by: MaxChicago <MaxChicago@users.noreply.github.com>
</commit_message>
<xml_diff>
--- a/Kontrolnaya_TRPO_otvety.docx
+++ b/Kontrolnaya_TRPO_otvety.docx
@@ -29,7 +29,7 @@
           <w:i w:val="0"/>
           <w:sz w:val="28"/>
         </w:rPr>
-        <w:t>Специальность 5-04-0612-02</w:t>
+        <w:t>Специальность 5-04-0612-02 · Техник-программист</w:t>
       </w:r>
     </w:p>
     <w:p>
@@ -44,72 +44,12 @@
           <w:i w:val="0"/>
           <w:sz w:val="28"/>
         </w:rPr>
-        <w:t>Разработка и сопровождение программного обеспечения информационных систем</w:t>
+        <w:t>Контрольная работа — «Технология разработки программного обеспечения»</w:t>
       </w:r>
     </w:p>
     <w:p>
       <w:pPr>
-        <w:spacing w:after="200" w:before="0" w:line="276" w:lineRule="auto"/>
-        <w:jc w:val="center"/>
-      </w:pPr>
-      <w:r>
-        <w:rPr>
-          <w:rFonts w:ascii="Times New Roman" w:hAnsi="Times New Roman" w:eastAsia="Times New Roman"/>
-          <w:b w:val="0"/>
-          <w:i w:val="0"/>
-          <w:sz w:val="28"/>
-        </w:rPr>
-        <w:t>Квалификация: Техник-программист</w:t>
-      </w:r>
-    </w:p>
-    <w:p>
-      <w:pPr>
-        <w:spacing w:after="40" w:before="0" w:line="276" w:lineRule="auto"/>
-        <w:jc w:val="center"/>
-      </w:pPr>
-      <w:r>
-        <w:rPr>
-          <w:rFonts w:ascii="Times New Roman" w:hAnsi="Times New Roman" w:eastAsia="Times New Roman"/>
-          <w:b/>
-          <w:i w:val="0"/>
-          <w:sz w:val="32"/>
-        </w:rPr>
-        <w:t>Контрольная работа</w:t>
-      </w:r>
-    </w:p>
-    <w:p>
-      <w:pPr>
-        <w:spacing w:after="40" w:before="0" w:line="276" w:lineRule="auto"/>
-        <w:jc w:val="center"/>
-      </w:pPr>
-      <w:r>
-        <w:rPr>
-          <w:rFonts w:ascii="Times New Roman" w:hAnsi="Times New Roman" w:eastAsia="Times New Roman"/>
-          <w:b w:val="0"/>
-          <w:i w:val="0"/>
-          <w:sz w:val="28"/>
-        </w:rPr>
-        <w:t>при проведении самоконтроля</w:t>
-      </w:r>
-    </w:p>
-    <w:p>
-      <w:pPr>
-        <w:spacing w:after="120" w:before="0" w:line="276" w:lineRule="auto"/>
-        <w:jc w:val="center"/>
-      </w:pPr>
-      <w:r>
-        <w:rPr>
-          <w:rFonts w:ascii="Times New Roman" w:hAnsi="Times New Roman" w:eastAsia="Times New Roman"/>
-          <w:b w:val="0"/>
-          <w:i w:val="0"/>
-          <w:sz w:val="28"/>
-        </w:rPr>
-        <w:t>Учебный предмет «Технология разработки программного обеспечения»</w:t>
-      </w:r>
-    </w:p>
-    <w:p>
-      <w:pPr>
-        <w:spacing w:after="200" w:before="0" w:line="276" w:lineRule="auto"/>
+        <w:spacing w:after="160" w:before="0" w:line="276" w:lineRule="auto"/>
         <w:jc w:val="center"/>
       </w:pPr>
       <w:r>
@@ -124,7 +64,7 @@
     </w:p>
     <w:p>
       <w:pPr>
-        <w:spacing w:after="320" w:before="0" w:line="276" w:lineRule="auto"/>
+        <w:spacing w:after="80" w:before="0" w:line="276" w:lineRule="auto"/>
         <w:jc w:val="center"/>
       </w:pPr>
       <w:r>
@@ -139,7 +79,7 @@
     </w:p>
     <w:p>
       <w:pPr>
-        <w:spacing w:after="320" w:before="0" w:line="276" w:lineRule="auto"/>
+        <w:spacing w:after="240" w:before="0" w:line="276" w:lineRule="auto"/>
         <w:jc w:val="center"/>
       </w:pPr>
       <w:r>
@@ -149,7 +89,7 @@
           <w:i/>
           <w:sz w:val="28"/>
         </w:rPr>
-        <w:t>с начерченными UML/IDEF-диаграммами</w:t>
+        <w:t>с начерченными диаграммами</w:t>
       </w:r>
     </w:p>
     <w:p>
@@ -189,7 +129,7 @@
     </w:p>
     <w:p>
       <w:pPr>
-        <w:spacing w:after="200" w:before="280" w:line="276" w:lineRule="auto"/>
+        <w:spacing w:after="160" w:before="240" w:line="276" w:lineRule="auto"/>
         <w:jc w:val="center"/>
       </w:pPr>
       <w:r>
@@ -204,7 +144,8 @@
     </w:p>
     <w:p>
       <w:pPr>
-        <w:spacing w:after="120" w:before="200" w:line="276" w:lineRule="auto"/>
+        <w:spacing w:after="80" w:before="160" w:line="276" w:lineRule="auto"/>
+        <w:jc w:val="left"/>
       </w:pPr>
       <w:r>
         <w:rPr>
@@ -228,12 +169,13 @@
           <w:i w:val="0"/>
           <w:sz w:val="28"/>
         </w:rPr>
-        <w:t>Жизненный цикл программного обеспечения (ЖЦ ПО) — это период времени от момента принятия решения о необходимости создания программного продукта до момента его полного изъятия из эксплуатации. ЖЦ охватывает анализ, проектирование, реализацию, тестирование, внедрение, сопровождение и вывод из эксплуатации.</w:t>
+        <w:t>Жизненный цикл программного обеспечения (ЖЦ ПО) — период времени от момента принятия решения о необходимости создания программного продукта до момента его полного изъятия из эксплуатации.</w:t>
       </w:r>
     </w:p>
     <w:p>
       <w:pPr>
-        <w:spacing w:after="60" w:before="0" w:line="276" w:lineRule="auto"/>
+        <w:spacing w:after="40" w:before="0" w:line="276" w:lineRule="auto"/>
+        <w:jc w:val="left"/>
       </w:pPr>
       <w:r>
         <w:rPr>
@@ -257,7 +199,7 @@
           <w:i w:val="0"/>
           <w:sz w:val="28"/>
         </w:rPr>
-        <w:t>Анализ требований — выявление и формализация потребностей заказчика; функциональные и нефункциональные требования.</w:t>
+        <w:t>Анализ требований</w:t>
       </w:r>
     </w:p>
     <w:p>
@@ -272,7 +214,7 @@
           <w:i w:val="0"/>
           <w:sz w:val="28"/>
         </w:rPr>
-        <w:t>Проектирование — архитектура, структуры данных, интерфейсы, алгоритмы, UML-модели.</w:t>
+        <w:t>Проектирование</w:t>
       </w:r>
     </w:p>
     <w:p>
@@ -287,7 +229,7 @@
           <w:i w:val="0"/>
           <w:sz w:val="28"/>
         </w:rPr>
-        <w:t>Реализация (кодирование) — написание исходного кода и сборка модулей.</w:t>
+        <w:t>Реализация (кодирование)</w:t>
       </w:r>
     </w:p>
     <w:p>
@@ -302,7 +244,7 @@
           <w:i w:val="0"/>
           <w:sz w:val="28"/>
         </w:rPr>
-        <w:t>Тестирование — проверка соответствия требованиям, поиск и устранение дефектов.</w:t>
+        <w:t>Тестирование</w:t>
       </w:r>
     </w:p>
     <w:p>
@@ -317,7 +259,7 @@
           <w:i w:val="0"/>
           <w:sz w:val="28"/>
         </w:rPr>
-        <w:t>Внедрение — установка у заказчика, обучение пользователей, ввод в эксплуатацию.</w:t>
+        <w:t>Внедрение</w:t>
       </w:r>
     </w:p>
     <w:p>
@@ -332,7 +274,7 @@
           <w:i w:val="0"/>
           <w:sz w:val="28"/>
         </w:rPr>
-        <w:t>Сопровождение — исправление ошибок, адаптация, развитие функциональности.</w:t>
+        <w:t>Сопровождение</w:t>
       </w:r>
     </w:p>
     <w:p>
@@ -347,21 +289,7 @@
           <w:i w:val="0"/>
           <w:sz w:val="28"/>
         </w:rPr>
-        <w:t>Вывод из эксплуатации — прекращение поддержки (при необходимости — миграция данных).</w:t>
-      </w:r>
-    </w:p>
-    <w:p>
-      <w:pPr>
-        <w:spacing w:after="60" w:before="0" w:line="276" w:lineRule="auto"/>
-      </w:pPr>
-      <w:r>
-        <w:rPr>
-          <w:rFonts w:ascii="Times New Roman" w:hAnsi="Times New Roman" w:eastAsia="Times New Roman"/>
-          <w:b/>
-          <w:i w:val="0"/>
-          <w:sz w:val="28"/>
-        </w:rPr>
-        <w:t>Последовательность этапов:</w:t>
+        <w:t>Вывод из эксплуатации</w:t>
       </w:r>
     </w:p>
     <w:p>
@@ -376,12 +304,13 @@
           <w:i w:val="0"/>
           <w:sz w:val="28"/>
         </w:rPr>
-        <w:t>Анализ требований → Проектирование → Реализация → Тестирование → Внедрение → Сопровождение → Вывод из эксплуатации.</w:t>
+        <w:t>Последовательность: Анализ требований → Проектирование → Реализация → Тестирование → Внедрение → Сопровождение → Вывод из эксплуатации.</w:t>
       </w:r>
     </w:p>
     <w:p>
       <w:pPr>
-        <w:spacing w:after="120" w:before="200" w:line="276" w:lineRule="auto"/>
+        <w:spacing w:after="80" w:before="160" w:line="276" w:lineRule="auto"/>
+        <w:jc w:val="left"/>
       </w:pPr>
       <w:r>
         <w:rPr>
@@ -405,7 +334,7 @@
           <w:i w:val="0"/>
           <w:sz w:val="28"/>
         </w:rPr>
-        <w:t>Назначение: показать, кто взаимодействует с системой и какие функции система предоставляет; описать границы системы без раскрытия внутренней реализации.</w:t>
+        <w:t>Назначение: показать, кто взаимодействует с системой и какие функции она предоставляет.</w:t>
       </w:r>
     </w:p>
     <w:p>
@@ -429,7 +358,7 @@
           <w:i w:val="0"/>
           <w:sz w:val="28"/>
         </w:rPr>
-        <w:t>внешняя сущность (человек или система), взаимодействующая с системой для достижения цели.</w:t>
+        <w:t>внешняя сущность, взаимодействующая с системой.</w:t>
       </w:r>
     </w:p>
     <w:p>
@@ -453,7 +382,7 @@
           <w:i w:val="0"/>
           <w:sz w:val="28"/>
         </w:rPr>
-        <w:t>последовательность действий системы, видимая актёру и дающая значимый результат («что» делает система).</w:t>
+        <w:t>последовательность действий системы со значимым результатом для актёра.</w:t>
       </w:r>
     </w:p>
     <w:p>
@@ -468,7 +397,7 @@
           <w:i w:val="0"/>
           <w:sz w:val="28"/>
         </w:rPr>
-        <w:t xml:space="preserve">Отношение include — </w:t>
+        <w:t xml:space="preserve">include — </w:t>
       </w:r>
       <w:r>
         <w:rPr>
@@ -477,14 +406,8 @@
           <w:i w:val="0"/>
           <w:sz w:val="28"/>
         </w:rPr>
-        <w:t>обязательное включение поведения одного прецедента в другой; общий фрагмент всегда выполняется. Стрелка: базовый → включаемый, &lt;&lt;include&gt;&gt;.</w:t>
+        <w:t xml:space="preserve">обязательное включение поведения (всегда). </w:t>
       </w:r>
-    </w:p>
-    <w:p>
-      <w:pPr>
-        <w:spacing w:after="120" w:line="276" w:lineRule="auto"/>
-        <w:jc w:val="both"/>
-      </w:pPr>
       <w:r>
         <w:rPr>
           <w:rFonts w:ascii="Times New Roman" w:hAnsi="Times New Roman" w:eastAsia="Times New Roman"/>
@@ -492,7 +415,7 @@
           <w:i w:val="0"/>
           <w:sz w:val="28"/>
         </w:rPr>
-        <w:t xml:space="preserve">Отношение extend — </w:t>
+        <w:t xml:space="preserve">extend — </w:t>
       </w:r>
       <w:r>
         <w:rPr>
@@ -501,12 +424,13 @@
           <w:i w:val="0"/>
           <w:sz w:val="28"/>
         </w:rPr>
-        <w:t>условное расширение базового прецедента; выполняется не всегда. Стрелка: расширение → базовый, &lt;&lt;extend&gt;&gt;.</w:t>
+        <w:t>условное расширение (не всегда).</w:t>
       </w:r>
     </w:p>
     <w:p>
       <w:pPr>
-        <w:spacing w:after="120" w:before="200" w:line="276" w:lineRule="auto"/>
+        <w:spacing w:after="80" w:before="160" w:line="276" w:lineRule="auto"/>
+        <w:jc w:val="left"/>
       </w:pPr>
       <w:r>
         <w:rPr>
@@ -539,7 +463,7 @@
           <w:i w:val="0"/>
           <w:sz w:val="28"/>
         </w:rPr>
-        <w:t>проверка соответствия поведения ПО функциональным требованиям: корректность функций, обработки данных и результатов. Оценивается «что делает» система.</w:t>
+        <w:t>проверка соответствия поведения ПО функциональным требованиям («что делает» система).</w:t>
       </w:r>
     </w:p>
     <w:p>
@@ -563,12 +487,13 @@
           <w:i w:val="0"/>
           <w:sz w:val="28"/>
         </w:rPr>
-        <w:t>проверка удобства интерфейса: насколько легко пользователь достигает целей, понятны ли элементы управления. Оцениваются понятность, эффективность, удовлетворённость.</w:t>
+        <w:t>проверка удобства интерфейса: понятность, эффективность, удовлетворённость.</w:t>
       </w:r>
     </w:p>
     <w:p>
       <w:pPr>
-        <w:spacing w:after="120" w:before="200" w:line="276" w:lineRule="auto"/>
+        <w:spacing w:after="80" w:before="160" w:line="276" w:lineRule="auto"/>
+        <w:jc w:val="left"/>
       </w:pPr>
       <w:r>
         <w:rPr>
@@ -592,12 +517,12 @@
           <w:i w:val="0"/>
           <w:sz w:val="28"/>
         </w:rPr>
-        <w:t>Пример: оформление заказа в интернет-магазине. Участники: Покупатель, :Интерфейс, :Корзина, :Склад, :Оплата.</w:t>
+        <w:t>Пример: оформление заказа (Покупатель, Интерфейс, Корзина, Склад, Оплата).</w:t>
       </w:r>
     </w:p>
     <w:p>
       <w:pPr>
-        <w:spacing w:before="120" w:after="80"/>
+        <w:spacing w:before="80" w:after="40"/>
         <w:jc w:val="center"/>
       </w:pPr>
       <w:r>
@@ -637,7 +562,7 @@
     </w:p>
     <w:p>
       <w:pPr>
-        <w:spacing w:after="200" w:before="0" w:line="276" w:lineRule="auto"/>
+        <w:spacing w:after="160" w:before="0" w:line="276" w:lineRule="auto"/>
         <w:jc w:val="center"/>
       </w:pPr>
       <w:r>
@@ -647,7 +572,7 @@
           <w:i/>
           <w:sz w:val="24"/>
         </w:rPr>
-        <w:t>Рисунок 1 — Диаграмма последовательности (вариант 1, задание 4)</w:t>
+        <w:t>Рисунок 1 — Диаграмма последовательности</w:t>
       </w:r>
     </w:p>
     <w:p>
@@ -657,7 +582,7 @@
     </w:p>
     <w:p>
       <w:pPr>
-        <w:spacing w:after="200" w:before="280" w:line="276" w:lineRule="auto"/>
+        <w:spacing w:after="160" w:before="240" w:line="276" w:lineRule="auto"/>
         <w:jc w:val="center"/>
       </w:pPr>
       <w:r>
@@ -672,7 +597,8 @@
     </w:p>
     <w:p>
       <w:pPr>
-        <w:spacing w:after="120" w:before="200" w:line="276" w:lineRule="auto"/>
+        <w:spacing w:after="80" w:before="160" w:line="276" w:lineRule="auto"/>
+        <w:jc w:val="left"/>
       </w:pPr>
       <w:r>
         <w:rPr>
@@ -696,21 +622,7 @@
           <w:i w:val="0"/>
           <w:sz w:val="28"/>
         </w:rPr>
-        <w:t>Назначение функционального моделирования: описать систему как набор функций — что делает система, какие входы/выходы, чем управляется и какими ресурсами выполняется.</w:t>
-      </w:r>
-    </w:p>
-    <w:p>
-      <w:pPr>
-        <w:spacing w:after="60" w:before="0" w:line="276" w:lineRule="auto"/>
-      </w:pPr>
-      <w:r>
-        <w:rPr>
-          <w:rFonts w:ascii="Times New Roman" w:hAnsi="Times New Roman" w:eastAsia="Times New Roman"/>
-          <w:b/>
-          <w:i w:val="0"/>
-          <w:sz w:val="28"/>
-        </w:rPr>
-        <w:t>Состав модели IDEF0:</w:t>
+        <w:t>Назначение: описать систему как набор функций — входы, выходы, управление, механизмы.</w:t>
       </w:r>
     </w:p>
     <w:p>
@@ -725,7 +637,7 @@
           <w:i w:val="0"/>
           <w:sz w:val="28"/>
         </w:rPr>
-        <w:t>Блоки (функции) — прямоугольники с названием «глагол + объект».</w:t>
+        <w:t>Блоки-функции</w:t>
       </w:r>
     </w:p>
     <w:p>
@@ -740,7 +652,7 @@
           <w:i w:val="0"/>
           <w:sz w:val="28"/>
         </w:rPr>
-        <w:t>Стрелки входа (слева), выхода (справа), управления (сверху), механизмов (снизу).</w:t>
+        <w:t>Стрелки I/C/O/M</w:t>
       </w:r>
     </w:p>
     <w:p>
@@ -755,7 +667,7 @@
           <w:i w:val="0"/>
           <w:sz w:val="28"/>
         </w:rPr>
-        <w:t>Иерархия декомпозиции (A0 → A1, A2…), глоссарий, цель и точка зрения.</w:t>
+        <w:t>Иерархия декомпозиции, глоссарий, цель и точка зрения</w:t>
       </w:r>
     </w:p>
     <w:p>
@@ -779,18 +691,18 @@
           <w:i w:val="0"/>
           <w:sz w:val="28"/>
         </w:rPr>
-        <w:t>верхний уровень: один функциональный блок (вся система) и внешние стрелки. Определяет границы системы.</w:t>
+        <w:t>один блок всей системы и внешние стрелки (границы модели).</w:t>
       </w:r>
     </w:p>
     <w:p>
       <w:pPr>
-        <w:spacing w:before="120" w:after="80"/>
+        <w:spacing w:before="80" w:after="40"/>
         <w:jc w:val="center"/>
       </w:pPr>
       <w:r>
         <w:drawing>
           <wp:inline xmlns:a="http://schemas.openxmlformats.org/drawingml/2006/main" xmlns:pic="http://schemas.openxmlformats.org/drawingml/2006/picture">
-            <wp:extent cx="5303520" cy="3939281"/>
+            <wp:extent cx="5120640" cy="3803444"/>
             <wp:docPr id="2" name="Picture 2"/>
             <wp:cNvGraphicFramePr>
               <a:graphicFrameLocks noChangeAspect="1"/>
@@ -811,7 +723,7 @@
                   <pic:spPr>
                     <a:xfrm>
                       <a:off x="0" y="0"/>
-                      <a:ext cx="5303520" cy="3939281"/>
+                      <a:ext cx="5120640" cy="3803444"/>
                     </a:xfrm>
                     <a:prstGeom prst="rect"/>
                   </pic:spPr>
@@ -824,7 +736,7 @@
     </w:p>
     <w:p>
       <w:pPr>
-        <w:spacing w:after="200" w:before="0" w:line="276" w:lineRule="auto"/>
+        <w:spacing w:after="160" w:before="0" w:line="276" w:lineRule="auto"/>
         <w:jc w:val="center"/>
       </w:pPr>
       <w:r>
@@ -839,7 +751,8 @@
     </w:p>
     <w:p>
       <w:pPr>
-        <w:spacing w:after="120" w:before="200" w:line="276" w:lineRule="auto"/>
+        <w:spacing w:after="80" w:before="160" w:line="276" w:lineRule="auto"/>
+        <w:jc w:val="left"/>
       </w:pPr>
       <w:r>
         <w:rPr>
@@ -872,7 +785,7 @@
           <w:i w:val="0"/>
           <w:sz w:val="28"/>
         </w:rPr>
-        <w:t>объединение данных и методов в объекте и сокрытие реализации; доступ через публичный интерфейс.</w:t>
+        <w:t>объединение данных и методов и сокрытие реализации.</w:t>
       </w:r>
     </w:p>
     <w:p>
@@ -896,7 +809,7 @@
           <w:i w:val="0"/>
           <w:sz w:val="28"/>
         </w:rPr>
-        <w:t>потомок получает свойства и поведение предка и может их расширять/переопределять.</w:t>
+        <w:t>потомок получает и может расширять свойства предка.</w:t>
       </w:r>
     </w:p>
     <w:p>
@@ -920,12 +833,13 @@
           <w:i w:val="0"/>
           <w:sz w:val="28"/>
         </w:rPr>
-        <w:t>объекты разных классов по-разному реагируют на одно сообщение (один интерфейс — много реализаций).</w:t>
+        <w:t>один интерфейс — множество реализаций.</w:t>
       </w:r>
     </w:p>
     <w:p>
       <w:pPr>
-        <w:spacing w:after="120" w:before="200" w:line="276" w:lineRule="auto"/>
+        <w:spacing w:after="80" w:before="160" w:line="276" w:lineRule="auto"/>
+        <w:jc w:val="left"/>
       </w:pPr>
       <w:r>
         <w:rPr>
@@ -949,89 +863,13 @@
           <w:i w:val="0"/>
           <w:sz w:val="28"/>
         </w:rPr>
-        <w:t>Назначение: статическая структура системы — классы, атрибуты, операции и отношения между ними.</w:t>
+        <w:t>Назначение: статическая структура — классы, атрибуты, операции, отношения. Класс — три секции. Интерфейс — контракт без реализации. Видимость: + public, − private, # protected, ~ package. Множественность: 1, 0..1, *, 1..*.</w:t>
       </w:r>
     </w:p>
     <w:p>
       <w:pPr>
-        <w:spacing w:after="120" w:line="276" w:lineRule="auto"/>
-        <w:jc w:val="both"/>
-      </w:pPr>
-      <w:r>
-        <w:rPr>
-          <w:rFonts w:ascii="Times New Roman" w:hAnsi="Times New Roman" w:eastAsia="Times New Roman"/>
-          <w:b/>
-          <w:i w:val="0"/>
-          <w:sz w:val="28"/>
-        </w:rPr>
-        <w:t xml:space="preserve">Класс — </w:t>
-      </w:r>
-      <w:r>
-        <w:rPr>
-          <w:rFonts w:ascii="Times New Roman" w:hAnsi="Times New Roman" w:eastAsia="Times New Roman"/>
-          <w:b w:val="0"/>
-          <w:i w:val="0"/>
-          <w:sz w:val="28"/>
-        </w:rPr>
-        <w:t>описание множества объектов с общей структурой и поведением (три секции: имя, атрибуты, методы).</w:t>
-      </w:r>
-    </w:p>
-    <w:p>
-      <w:pPr>
-        <w:spacing w:after="120" w:line="276" w:lineRule="auto"/>
-        <w:jc w:val="both"/>
-      </w:pPr>
-      <w:r>
-        <w:rPr>
-          <w:rFonts w:ascii="Times New Roman" w:hAnsi="Times New Roman" w:eastAsia="Times New Roman"/>
-          <w:b/>
-          <w:i w:val="0"/>
-          <w:sz w:val="28"/>
-        </w:rPr>
-        <w:t xml:space="preserve">Интерфейс — </w:t>
-      </w:r>
-      <w:r>
-        <w:rPr>
-          <w:rFonts w:ascii="Times New Roman" w:hAnsi="Times New Roman" w:eastAsia="Times New Roman"/>
-          <w:b w:val="0"/>
-          <w:i w:val="0"/>
-          <w:sz w:val="28"/>
-        </w:rPr>
-        <w:t>контракт операций без реализации.</w:t>
-      </w:r>
-    </w:p>
-    <w:p>
-      <w:pPr>
-        <w:spacing w:after="120" w:before="0" w:line="276" w:lineRule="auto"/>
-      </w:pPr>
-      <w:r>
-        <w:rPr>
-          <w:rFonts w:ascii="Times New Roman" w:hAnsi="Times New Roman" w:eastAsia="Times New Roman"/>
-          <w:b w:val="0"/>
-          <w:i w:val="0"/>
-          <w:sz w:val="28"/>
-        </w:rPr>
-        <w:t>Виды видимости: + public, − private, # protected, ~ package.</w:t>
-      </w:r>
-    </w:p>
-    <w:p>
-      <w:pPr>
-        <w:spacing w:after="120" w:before="0" w:line="276" w:lineRule="auto"/>
-        <w:jc w:val="both"/>
-      </w:pPr>
-      <w:r>
-        <w:rPr>
-          <w:rFonts w:ascii="Times New Roman" w:hAnsi="Times New Roman" w:eastAsia="Times New Roman"/>
-          <w:b w:val="0"/>
-          <w:i w:val="0"/>
-          <w:sz w:val="28"/>
-        </w:rPr>
-        <w:t>Множественность: 1; 0..1; * (0..*); 1..*; конкретные диапазоны (например 2..4).</w:t>
-      </w:r>
-    </w:p>
-    <w:p>
-      <w:pPr>
-        <w:spacing w:after="120" w:before="200" w:line="276" w:lineRule="auto"/>
+        <w:spacing w:after="80" w:before="160" w:line="276" w:lineRule="auto"/>
+        <w:jc w:val="left"/>
       </w:pPr>
       <w:r>
         <w:rPr>
@@ -1055,18 +893,18 @@
           <w:i w:val="0"/>
           <w:sz w:val="28"/>
         </w:rPr>
-        <w:t>Пример: система «Библиотека». Актёры: Читатель, Библиотекарь, Система уведомлений. Показаны отношения &lt;&lt;include&gt;&gt; и &lt;&lt;extend&gt;&gt;.</w:t>
+        <w:t>Пример: система «Библиотека». Показаны актёры, прецеденты, &lt;&lt;include&gt;&gt; и &lt;&lt;extend&gt;&gt;.</w:t>
       </w:r>
     </w:p>
     <w:p>
       <w:pPr>
-        <w:spacing w:before="120" w:after="80"/>
+        <w:spacing w:before="80" w:after="40"/>
         <w:jc w:val="center"/>
       </w:pPr>
       <w:r>
         <w:drawing>
           <wp:inline xmlns:a="http://schemas.openxmlformats.org/drawingml/2006/main" xmlns:pic="http://schemas.openxmlformats.org/drawingml/2006/picture">
-            <wp:extent cx="5852160" cy="4407621"/>
+            <wp:extent cx="5943600" cy="4396239"/>
             <wp:docPr id="3" name="Picture 3"/>
             <wp:cNvGraphicFramePr>
               <a:graphicFrameLocks noChangeAspect="1"/>
@@ -1087,7 +925,7 @@
                   <pic:spPr>
                     <a:xfrm>
                       <a:off x="0" y="0"/>
-                      <a:ext cx="5852160" cy="4407621"/>
+                      <a:ext cx="5943600" cy="4396239"/>
                     </a:xfrm>
                     <a:prstGeom prst="rect"/>
                   </pic:spPr>
@@ -1100,7 +938,7 @@
     </w:p>
     <w:p>
       <w:pPr>
-        <w:spacing w:after="200" w:before="0" w:line="276" w:lineRule="auto"/>
+        <w:spacing w:after="160" w:before="0" w:line="276" w:lineRule="auto"/>
         <w:jc w:val="center"/>
       </w:pPr>
       <w:r>
@@ -1110,7 +948,7 @@
           <w:i/>
           <w:sz w:val="24"/>
         </w:rPr>
-        <w:t>Рисунок 3 — Диаграмма прецедентов (вариант 2, задание 4)</w:t>
+        <w:t>Рисунок 3 — Диаграмма прецедентов</w:t>
       </w:r>
     </w:p>
     <w:p>
@@ -1120,7 +958,7 @@
     </w:p>
     <w:p>
       <w:pPr>
-        <w:spacing w:after="200" w:before="280" w:line="276" w:lineRule="auto"/>
+        <w:spacing w:after="160" w:before="240" w:line="276" w:lineRule="auto"/>
         <w:jc w:val="center"/>
       </w:pPr>
       <w:r>
@@ -1135,7 +973,8 @@
     </w:p>
     <w:p>
       <w:pPr>
-        <w:spacing w:after="120" w:before="200" w:line="276" w:lineRule="auto"/>
+        <w:spacing w:after="80" w:before="160" w:line="276" w:lineRule="auto"/>
+        <w:jc w:val="left"/>
       </w:pPr>
       <w:r>
         <w:rPr>
@@ -1159,67 +998,7 @@
           <w:i w:val="0"/>
           <w:sz w:val="28"/>
         </w:rPr>
-        <w:t>Назначение: показать взаимодействие объектов во времени — какие сообщения и в каком порядке при выполнении сценария.</w:t>
-      </w:r>
-    </w:p>
-    <w:p>
-      <w:pPr>
-        <w:pStyle w:val="ListBullet"/>
-        <w:spacing w:after="40"/>
-      </w:pPr>
-      <w:r>
-        <w:rPr>
-          <w:rFonts w:ascii="Times New Roman" w:hAnsi="Times New Roman" w:eastAsia="Times New Roman"/>
-          <w:b w:val="0"/>
-          <w:i w:val="0"/>
-          <w:sz w:val="28"/>
-        </w:rPr>
-        <w:t>Объекты — участники; прямоугольник вверху.</w:t>
-      </w:r>
-    </w:p>
-    <w:p>
-      <w:pPr>
-        <w:pStyle w:val="ListBullet"/>
-        <w:spacing w:after="40"/>
-      </w:pPr>
-      <w:r>
-        <w:rPr>
-          <w:rFonts w:ascii="Times New Roman" w:hAnsi="Times New Roman" w:eastAsia="Times New Roman"/>
-          <w:b w:val="0"/>
-          <w:i w:val="0"/>
-          <w:sz w:val="28"/>
-        </w:rPr>
-        <w:t>Линии жизни — вертикальный пунктир.</w:t>
-      </w:r>
-    </w:p>
-    <w:p>
-      <w:pPr>
-        <w:pStyle w:val="ListBullet"/>
-        <w:spacing w:after="40"/>
-      </w:pPr>
-      <w:r>
-        <w:rPr>
-          <w:rFonts w:ascii="Times New Roman" w:hAnsi="Times New Roman" w:eastAsia="Times New Roman"/>
-          <w:b w:val="0"/>
-          <w:i w:val="0"/>
-          <w:sz w:val="28"/>
-        </w:rPr>
-        <w:t>Сообщения — горизонтальные стрелки; порядок сверху вниз.</w:t>
-      </w:r>
-    </w:p>
-    <w:p>
-      <w:pPr>
-        <w:pStyle w:val="ListBullet"/>
-        <w:spacing w:after="40"/>
-      </w:pPr>
-      <w:r>
-        <w:rPr>
-          <w:rFonts w:ascii="Times New Roman" w:hAnsi="Times New Roman" w:eastAsia="Times New Roman"/>
-          <w:b w:val="0"/>
-          <w:i w:val="0"/>
-          <w:sz w:val="28"/>
-        </w:rPr>
-        <w:t>Активация — узкий прямоугольник на линии жизни.</w:t>
+        <w:t>Назначение: взаимодействие объектов во времени. Элементы: объекты, линии жизни, сообщения, активации.</w:t>
       </w:r>
     </w:p>
     <w:p>
@@ -1234,7 +1013,7 @@
           <w:i w:val="0"/>
           <w:sz w:val="28"/>
         </w:rPr>
-        <w:t xml:space="preserve">Синхронные сообщения: </w:t>
+        <w:t xml:space="preserve">Синхронные — </w:t>
       </w:r>
       <w:r>
         <w:rPr>
@@ -1243,14 +1022,8 @@
           <w:i w:val="0"/>
           <w:sz w:val="28"/>
         </w:rPr>
-        <w:t>отправитель ждёт ответа (сплошная стрелка с закрашенным наконечником).</w:t>
+        <w:t xml:space="preserve">ждут ответа (закрашенный наконечник). </w:t>
       </w:r>
-    </w:p>
-    <w:p>
-      <w:pPr>
-        <w:spacing w:after="120" w:line="276" w:lineRule="auto"/>
-        <w:jc w:val="both"/>
-      </w:pPr>
       <w:r>
         <w:rPr>
           <w:rFonts w:ascii="Times New Roman" w:hAnsi="Times New Roman" w:eastAsia="Times New Roman"/>
@@ -1258,7 +1031,7 @@
           <w:i w:val="0"/>
           <w:sz w:val="28"/>
         </w:rPr>
-        <w:t xml:space="preserve">Асинхронные сообщения: </w:t>
+        <w:t xml:space="preserve">Асинхронные — </w:t>
       </w:r>
       <w:r>
         <w:rPr>
@@ -1267,7 +1040,7 @@
           <w:i w:val="0"/>
           <w:sz w:val="28"/>
         </w:rPr>
-        <w:t>отправитель не ждёт ответа (открытый наконечник); события, сигналы, уведомления.</w:t>
+        <w:t>не ждут ответа (открытый наконечник).</w:t>
       </w:r>
     </w:p>
     <w:p>
@@ -1282,12 +1055,13 @@
           <w:i w:val="0"/>
           <w:sz w:val="28"/>
         </w:rPr>
-        <w:t>Пример диаграммы последовательности см. рисунок 1 (вариант 1).</w:t>
+        <w:t>Пример — рисунок 1.</w:t>
       </w:r>
     </w:p>
     <w:p>
       <w:pPr>
-        <w:spacing w:after="120" w:before="200" w:line="276" w:lineRule="auto"/>
+        <w:spacing w:after="80" w:before="160" w:line="276" w:lineRule="auto"/>
+        <w:jc w:val="left"/>
       </w:pPr>
       <w:r>
         <w:rPr>
@@ -1311,27 +1085,13 @@
           <w:i w:val="0"/>
           <w:sz w:val="28"/>
         </w:rPr>
-        <w:t>Управление конфигурацией ПО (SCM) — идентификация, контроль изменений, учёт состояния и аудит элементов конфигурации на протяжении ЖЦ; возможность воспроизвести любую сборку/релиз.</w:t>
+        <w:t>SCM — идентификация, контроль изменений, учёт и аудит элементов конфигурации; воспроизводимость сборок/релизов. Идентификация конфигурации — уникальные ID, версии, baselines, состав релиза.</w:t>
       </w:r>
     </w:p>
     <w:p>
       <w:pPr>
-        <w:spacing w:after="120" w:before="0" w:line="276" w:lineRule="auto"/>
-        <w:jc w:val="both"/>
-      </w:pPr>
-      <w:r>
-        <w:rPr>
-          <w:rFonts w:ascii="Times New Roman" w:hAnsi="Times New Roman" w:eastAsia="Times New Roman"/>
-          <w:b w:val="0"/>
-          <w:i w:val="0"/>
-          <w:sz w:val="28"/>
-        </w:rPr>
-        <w:t>Идентификация конфигурации — присвоение уникальных идентификаторов элементам (файлы, модули, документы, сборки), схема версий, базовые линии (baselines), описание состава релиза.</w:t>
-      </w:r>
-    </w:p>
-    <w:p>
-      <w:pPr>
-        <w:spacing w:after="120" w:before="200" w:line="276" w:lineRule="auto"/>
+        <w:spacing w:after="80" w:before="160" w:line="276" w:lineRule="auto"/>
+        <w:jc w:val="left"/>
       </w:pPr>
       <w:r>
         <w:rPr>
@@ -1355,12 +1115,13 @@
           <w:i w:val="0"/>
           <w:sz w:val="28"/>
         </w:rPr>
-        <w:t>Agile — гибкий подход к разработке: итеративная поставка ценности, сотрудничество с заказчиком, готовность к изменениям, самоорганизующиеся команды (Agile Manifesto, 2001).</w:t>
+        <w:t>Agile — итеративная поставка ценности, сотрудничество с заказчиком, готовность к изменениям, самоорганизующиеся команды.</w:t>
       </w:r>
     </w:p>
     <w:p>
       <w:pPr>
-        <w:spacing w:after="60" w:before="0" w:line="276" w:lineRule="auto"/>
+        <w:spacing w:after="40" w:before="0" w:line="276" w:lineRule="auto"/>
+        <w:jc w:val="left"/>
       </w:pPr>
       <w:r>
         <w:rPr>
@@ -1369,7 +1130,7 @@
           <w:i w:val="0"/>
           <w:sz w:val="28"/>
         </w:rPr>
-        <w:t>Принципы Agile:</w:t>
+        <w:t>12 принципов Манифеста:</w:t>
       </w:r>
     </w:p>
     <w:p>
@@ -1384,7 +1145,7 @@
           <w:i w:val="0"/>
           <w:sz w:val="28"/>
         </w:rPr>
-        <w:t>Приоритет — удовлетворение заказчика регулярной ранней поставкой ценного ПО.</w:t>
+        <w:t>Ранняя и регулярная поставка ценного ПО</w:t>
       </w:r>
     </w:p>
     <w:p>
@@ -1399,7 +1160,7 @@
           <w:i w:val="0"/>
           <w:sz w:val="28"/>
         </w:rPr>
-        <w:t>Изменение требований приветствуется даже на поздних стадиях.</w:t>
+        <w:t>Приветствие изменений требований</w:t>
       </w:r>
     </w:p>
     <w:p>
@@ -1414,7 +1175,7 @@
           <w:i w:val="0"/>
           <w:sz w:val="28"/>
         </w:rPr>
-        <w:t>Рабочее ПО поставляется часто (недели, а не месяцы).</w:t>
+        <w:t>Частая поставка рабочего ПО</w:t>
       </w:r>
     </w:p>
     <w:p>
@@ -1429,7 +1190,7 @@
           <w:i w:val="0"/>
           <w:sz w:val="28"/>
         </w:rPr>
-        <w:t>Бизнес и разработчики ежедневно работают вместе.</w:t>
+        <w:t>Ежедневное сотрудничество бизнеса и разработчиков</w:t>
       </w:r>
     </w:p>
     <w:p>
@@ -1444,7 +1205,7 @@
           <w:i w:val="0"/>
           <w:sz w:val="28"/>
         </w:rPr>
-        <w:t>Проекты вокруг мотивированных людей; им доверяют.</w:t>
+        <w:t>Мотивированные люди и доверие</w:t>
       </w:r>
     </w:p>
     <w:p>
@@ -1459,7 +1220,7 @@
           <w:i w:val="0"/>
           <w:sz w:val="28"/>
         </w:rPr>
-        <w:t>Самый эффективный способ обмена информацией — личный разговор.</w:t>
+        <w:t>Личное общение как лучший способ коммуникации</w:t>
       </w:r>
     </w:p>
     <w:p>
@@ -1474,7 +1235,7 @@
           <w:i w:val="0"/>
           <w:sz w:val="28"/>
         </w:rPr>
-        <w:t>Рабочее ПО — главный показатель прогресса.</w:t>
+        <w:t>Рабочее ПО — главный показатель прогресса</w:t>
       </w:r>
     </w:p>
     <w:p>
@@ -1489,7 +1250,7 @@
           <w:i w:val="0"/>
           <w:sz w:val="28"/>
         </w:rPr>
-        <w:t>Устойчивый темп разработки.</w:t>
+        <w:t>Устойчивый темп</w:t>
       </w:r>
     </w:p>
     <w:p>
@@ -1504,7 +1265,7 @@
           <w:i w:val="0"/>
           <w:sz w:val="28"/>
         </w:rPr>
-        <w:t>Постоянное внимание к техническому совершенству и дизайну.</w:t>
+        <w:t>Техническое совершенство и дизайн</w:t>
       </w:r>
     </w:p>
     <w:p>
@@ -1519,7 +1280,7 @@
           <w:i w:val="0"/>
           <w:sz w:val="28"/>
         </w:rPr>
-        <w:t>Простота — минимизация лишней работы.</w:t>
+        <w:t>Простота</w:t>
       </w:r>
     </w:p>
     <w:p>
@@ -1534,7 +1295,7 @@
           <w:i w:val="0"/>
           <w:sz w:val="28"/>
         </w:rPr>
-        <w:t>Лучшие архитектуры и требования — у самоорганизующихся команд.</w:t>
+        <w:t>Самоорганизующиеся команды</w:t>
       </w:r>
     </w:p>
     <w:p>
@@ -1549,12 +1310,13 @@
           <w:i w:val="0"/>
           <w:sz w:val="28"/>
         </w:rPr>
-        <w:t>Регулярная рефлексия и улучшение способов работы.</w:t>
+        <w:t>Регулярная рефлексия и улучшение</w:t>
       </w:r>
     </w:p>
     <w:p>
       <w:pPr>
-        <w:spacing w:after="120" w:before="200" w:line="276" w:lineRule="auto"/>
+        <w:spacing w:after="80" w:before="160" w:line="276" w:lineRule="auto"/>
+        <w:jc w:val="left"/>
       </w:pPr>
       <w:r>
         <w:rPr>
@@ -1578,12 +1340,12 @@
           <w:i w:val="0"/>
           <w:sz w:val="28"/>
         </w:rPr>
-        <w:t>Пример предметной области: учёт заказов (Покупатель, Заказ, ПозицияЗаказа, Товар, интерфейс Оплата).</w:t>
+        <w:t>Пример: учёт заказов.</w:t>
       </w:r>
     </w:p>
     <w:p>
       <w:pPr>
-        <w:spacing w:before="120" w:after="80"/>
+        <w:spacing w:before="80" w:after="40"/>
         <w:jc w:val="center"/>
       </w:pPr>
       <w:r>
@@ -1623,7 +1385,7 @@
     </w:p>
     <w:p>
       <w:pPr>
-        <w:spacing w:after="200" w:before="0" w:line="276" w:lineRule="auto"/>
+        <w:spacing w:after="160" w:before="0" w:line="276" w:lineRule="auto"/>
         <w:jc w:val="center"/>
       </w:pPr>
       <w:r>
@@ -1633,7 +1395,7 @@
           <w:i/>
           <w:sz w:val="24"/>
         </w:rPr>
-        <w:t>Рисунок 4 — Диаграмма классов (вариант 3, задание 4)</w:t>
+        <w:t>Рисунок 4 — Диаграмма классов</w:t>
       </w:r>
     </w:p>
     <w:p>
@@ -1643,7 +1405,7 @@
     </w:p>
     <w:p>
       <w:pPr>
-        <w:spacing w:after="200" w:before="280" w:line="276" w:lineRule="auto"/>
+        <w:spacing w:after="160" w:before="240" w:line="276" w:lineRule="auto"/>
         <w:jc w:val="center"/>
       </w:pPr>
       <w:r>
@@ -1659,6 +1421,7 @@
     <w:p>
       <w:pPr>
         <w:spacing w:after="120" w:before="0" w:line="276" w:lineRule="auto"/>
+        <w:jc w:val="left"/>
       </w:pPr>
       <w:r>
         <w:rPr>
@@ -1667,12 +1430,13 @@
           <w:i/>
           <w:sz w:val="28"/>
         </w:rPr>
-        <w:t>Примечание: в бланке задания пункты 1 и 2 сформулированы одинаково (диаграмма коммуникации).</w:t>
+        <w:t>Примечание: в бланке п. 1 и п. 2 сформулированы одинаково.</w:t>
       </w:r>
     </w:p>
     <w:p>
       <w:pPr>
-        <w:spacing w:after="120" w:before="200" w:line="276" w:lineRule="auto"/>
+        <w:spacing w:after="80" w:before="160" w:line="276" w:lineRule="auto"/>
+        <w:jc w:val="left"/>
       </w:pPr>
       <w:r>
         <w:rPr>
@@ -1696,85 +1460,12 @@
           <w:i w:val="0"/>
           <w:sz w:val="28"/>
         </w:rPr>
-        <w:t>Назначение: показать структуру связей между объектами и обмен сообщениями; акцент на том, кто с кем связан (порядок сообщений задаётся нумерацией).</w:t>
+        <w:t>Назначение: структура связей объектов и нумерованные сообщения. В отличие от sequence, акцент на топологии связей, а не на оси времени.</w:t>
       </w:r>
     </w:p>
     <w:p>
       <w:pPr>
-        <w:spacing w:after="80" w:before="0" w:line="276" w:lineRule="auto"/>
-      </w:pPr>
-      <w:r>
-        <w:rPr>
-          <w:rFonts w:ascii="Times New Roman" w:hAnsi="Times New Roman" w:eastAsia="Times New Roman"/>
-          <w:b w:val="0"/>
-          <w:i w:val="0"/>
-          <w:sz w:val="28"/>
-        </w:rPr>
-        <w:t>Элементы: объекты-роли, связи (links), сообщения вдоль связей с номерами (1, 1.1, 2…), актёры.</w:t>
-      </w:r>
-    </w:p>
-    <w:p>
-      <w:pPr>
-        <w:spacing w:after="60" w:before="0" w:line="276" w:lineRule="auto"/>
-      </w:pPr>
-      <w:r>
-        <w:rPr>
-          <w:rFonts w:ascii="Times New Roman" w:hAnsi="Times New Roman" w:eastAsia="Times New Roman"/>
-          <w:b/>
-          <w:i w:val="0"/>
-          <w:sz w:val="28"/>
-        </w:rPr>
-        <w:t>Сравнение с диаграммой последовательности:</w:t>
-      </w:r>
-    </w:p>
-    <w:p>
-      <w:pPr>
-        <w:pStyle w:val="ListBullet"/>
-        <w:spacing w:after="40"/>
-      </w:pPr>
-      <w:r>
-        <w:rPr>
-          <w:rFonts w:ascii="Times New Roman" w:hAnsi="Times New Roman" w:eastAsia="Times New Roman"/>
-          <w:b w:val="0"/>
-          <w:i w:val="0"/>
-          <w:sz w:val="28"/>
-        </w:rPr>
-        <w:t>Последовательность: акцент на времени (сверху вниз), есть линии жизни и активации.</w:t>
-      </w:r>
-    </w:p>
-    <w:p>
-      <w:pPr>
-        <w:pStyle w:val="ListBullet"/>
-        <w:spacing w:after="40"/>
-      </w:pPr>
-      <w:r>
-        <w:rPr>
-          <w:rFonts w:ascii="Times New Roman" w:hAnsi="Times New Roman" w:eastAsia="Times New Roman"/>
-          <w:b w:val="0"/>
-          <w:i w:val="0"/>
-          <w:sz w:val="28"/>
-        </w:rPr>
-        <w:t>Коммуникация: акцент на топологии связей, порядок — через номера сообщений.</w:t>
-      </w:r>
-    </w:p>
-    <w:p>
-      <w:pPr>
-        <w:pStyle w:val="ListBullet"/>
-        <w:spacing w:after="40"/>
-      </w:pPr>
-      <w:r>
-        <w:rPr>
-          <w:rFonts w:ascii="Times New Roman" w:hAnsi="Times New Roman" w:eastAsia="Times New Roman"/>
-          <w:b w:val="0"/>
-          <w:i w:val="0"/>
-          <w:sz w:val="28"/>
-        </w:rPr>
-        <w:t>Семантика сообщений одна; представления взаимозаменяемы.</w:t>
-      </w:r>
-    </w:p>
-    <w:p>
-      <w:pPr>
-        <w:spacing w:before="120" w:after="80"/>
+        <w:spacing w:before="80" w:after="40"/>
         <w:jc w:val="center"/>
       </w:pPr>
       <w:r>
@@ -1814,7 +1505,7 @@
     </w:p>
     <w:p>
       <w:pPr>
-        <w:spacing w:after="200" w:before="0" w:line="276" w:lineRule="auto"/>
+        <w:spacing w:after="160" w:before="0" w:line="276" w:lineRule="auto"/>
         <w:jc w:val="center"/>
       </w:pPr>
       <w:r>
@@ -1824,12 +1515,13 @@
           <w:i/>
           <w:sz w:val="24"/>
         </w:rPr>
-        <w:t>Рисунок 5 — Диаграмма коммуникации (вариант 4, задания 1–2)</w:t>
+        <w:t>Рисунок 5 — Диаграмма коммуникации</w:t>
       </w:r>
     </w:p>
     <w:p>
       <w:pPr>
-        <w:spacing w:after="120" w:before="200" w:line="276" w:lineRule="auto"/>
+        <w:spacing w:after="80" w:before="160" w:line="276" w:lineRule="auto"/>
+        <w:jc w:val="left"/>
       </w:pPr>
       <w:r>
         <w:rPr>
@@ -1843,7 +1535,8 @@
     </w:p>
     <w:p>
       <w:pPr>
-        <w:spacing w:after="60" w:before="0" w:line="276" w:lineRule="auto"/>
+        <w:spacing w:after="40" w:before="0" w:line="276" w:lineRule="auto"/>
+        <w:jc w:val="left"/>
       </w:pPr>
       <w:r>
         <w:rPr>
@@ -1867,7 +1560,7 @@
           <w:i w:val="0"/>
           <w:sz w:val="28"/>
         </w:rPr>
-        <w:t>Product Owner — ценность продукта и Product Backlog, приоритеты, приёмка.</w:t>
+        <w:t>Product Owner — Product Backlog, приоритеты, приёмка</w:t>
       </w:r>
     </w:p>
     <w:p>
@@ -1882,7 +1575,7 @@
           <w:i w:val="0"/>
           <w:sz w:val="28"/>
         </w:rPr>
-        <w:t>Scrum Master — следование Scrum, устранение препятствий, фасилитация.</w:t>
+        <w:t>Scrum Master — Scrum, препятствия, фасилитация</w:t>
       </w:r>
     </w:p>
     <w:p>
@@ -1897,12 +1590,13 @@
           <w:i w:val="0"/>
           <w:sz w:val="28"/>
         </w:rPr>
-        <w:t>Developers — кросс-функциональная команда, создающая Инкремент.</w:t>
+        <w:t>Developers — создание Инкремента</w:t>
       </w:r>
     </w:p>
     <w:p>
       <w:pPr>
-        <w:spacing w:after="60" w:before="0" w:line="276" w:lineRule="auto"/>
+        <w:spacing w:after="40" w:before="0" w:line="276" w:lineRule="auto"/>
+        <w:jc w:val="left"/>
       </w:pPr>
       <w:r>
         <w:rPr>
@@ -1926,7 +1620,7 @@
           <w:i w:val="0"/>
           <w:sz w:val="28"/>
         </w:rPr>
-        <w:t>Product Backlog — упорядоченный список всего нужного в продукте.</w:t>
+        <w:t>Product Backlog</w:t>
       </w:r>
     </w:p>
     <w:p>
@@ -1941,7 +1635,7 @@
           <w:i w:val="0"/>
           <w:sz w:val="28"/>
         </w:rPr>
-        <w:t>Sprint Backlog — выбранные на спринт элементы и план их реализации.</w:t>
+        <w:t>Sprint Backlog</w:t>
       </w:r>
     </w:p>
     <w:p>
@@ -1956,12 +1650,13 @@
           <w:i w:val="0"/>
           <w:sz w:val="28"/>
         </w:rPr>
-        <w:t>Increment — готовый к использованию результат спринта (Definition of Done).</w:t>
+        <w:t>Increment (+ Definition of Done)</w:t>
       </w:r>
     </w:p>
     <w:p>
       <w:pPr>
-        <w:spacing w:after="120" w:before="200" w:line="276" w:lineRule="auto"/>
+        <w:spacing w:after="80" w:before="160" w:line="276" w:lineRule="auto"/>
+        <w:jc w:val="left"/>
       </w:pPr>
       <w:r>
         <w:rPr>
@@ -1985,18 +1680,18 @@
           <w:i w:val="0"/>
           <w:sz w:val="28"/>
         </w:rPr>
-        <w:t>Пример: жизненный цикл заказа. Начальное состояние — залитый круг; состояния — скруглённые прямоугольники; переходы — стрелки с событием; конечное — круг в кольце.</w:t>
+        <w:t>Пример: жизненный цикл заказа.</w:t>
       </w:r>
     </w:p>
     <w:p>
       <w:pPr>
-        <w:spacing w:before="120" w:after="80"/>
+        <w:spacing w:before="80" w:after="40"/>
         <w:jc w:val="center"/>
       </w:pPr>
       <w:r>
         <w:drawing>
           <wp:inline xmlns:a="http://schemas.openxmlformats.org/drawingml/2006/main" xmlns:pic="http://schemas.openxmlformats.org/drawingml/2006/picture">
-            <wp:extent cx="5486400" cy="4681518"/>
+            <wp:extent cx="5394960" cy="4603493"/>
             <wp:docPr id="6" name="Picture 6"/>
             <wp:cNvGraphicFramePr>
               <a:graphicFrameLocks noChangeAspect="1"/>
@@ -2017,7 +1712,7 @@
                   <pic:spPr>
                     <a:xfrm>
                       <a:off x="0" y="0"/>
-                      <a:ext cx="5486400" cy="4681518"/>
+                      <a:ext cx="5394960" cy="4603493"/>
                     </a:xfrm>
                     <a:prstGeom prst="rect"/>
                   </pic:spPr>
@@ -2030,7 +1725,7 @@
     </w:p>
     <w:p>
       <w:pPr>
-        <w:spacing w:after="200" w:before="0" w:line="276" w:lineRule="auto"/>
+        <w:spacing w:after="160" w:before="0" w:line="276" w:lineRule="auto"/>
         <w:jc w:val="center"/>
       </w:pPr>
       <w:r>
@@ -2040,12 +1735,12 @@
           <w:i/>
           <w:sz w:val="24"/>
         </w:rPr>
-        <w:t>Рисунок 6 — Диаграмма состояний (вариант 4, задание 4)</w:t>
+        <w:t>Рисунок 6 — Диаграмма состояний</w:t>
       </w:r>
     </w:p>
     <w:p>
       <w:pPr>
-        <w:spacing w:after="120" w:before="240" w:line="276" w:lineRule="auto"/>
+        <w:spacing w:after="120" w:before="200" w:line="276" w:lineRule="auto"/>
         <w:jc w:val="center"/>
       </w:pPr>
       <w:r>

</xml_diff>

<commit_message>
Expand control-work definitions to a clear academic length
Rewrite each term in several sentences with purpose and meaning,
keeping diagrams and avoiding both slogan-short and overly long answers.

Co-authored-by: MaxChicago <MaxChicago@users.noreply.github.com>
</commit_message>
<xml_diff>
--- a/Kontrolnaya_TRPO_otvety.docx
+++ b/Kontrolnaya_TRPO_otvety.docx
@@ -4,7 +4,8 @@
   <w:body>
     <w:p>
       <w:pPr>
-        <w:spacing w:after="120" w:before="0" w:line="276" w:lineRule="auto"/>
+        <w:spacing w:after="80" w:before="0"/>
+        <w:ind w:firstLine="0"/>
         <w:jc w:val="center"/>
       </w:pPr>
       <w:r>
@@ -19,7 +20,8 @@
     </w:p>
     <w:p>
       <w:pPr>
-        <w:spacing w:after="40" w:before="0" w:line="276" w:lineRule="auto"/>
+        <w:spacing w:after="40" w:before="0"/>
+        <w:ind w:firstLine="0"/>
         <w:jc w:val="center"/>
       </w:pPr>
       <w:r>
@@ -29,12 +31,13 @@
           <w:i w:val="0"/>
           <w:sz w:val="28"/>
         </w:rPr>
-        <w:t>Специальность 5-04-0612-02 · Техник-программист</w:t>
+        <w:t>Специальность 5-04-0612-02</w:t>
       </w:r>
     </w:p>
     <w:p>
       <w:pPr>
-        <w:spacing w:after="40" w:before="0" w:line="276" w:lineRule="auto"/>
+        <w:spacing w:after="40" w:before="0"/>
+        <w:ind w:firstLine="0"/>
         <w:jc w:val="center"/>
       </w:pPr>
       <w:r>
@@ -44,12 +47,77 @@
           <w:i w:val="0"/>
           <w:sz w:val="28"/>
         </w:rPr>
-        <w:t>Контрольная работа — «Технология разработки программного обеспечения»</w:t>
+        <w:t>Разработка и сопровождение программного обеспечения информационных систем</w:t>
       </w:r>
     </w:p>
     <w:p>
       <w:pPr>
-        <w:spacing w:after="160" w:before="0" w:line="276" w:lineRule="auto"/>
+        <w:spacing w:after="200" w:before="0"/>
+        <w:ind w:firstLine="0"/>
+        <w:jc w:val="center"/>
+      </w:pPr>
+      <w:r>
+        <w:rPr>
+          <w:rFonts w:ascii="Times New Roman" w:hAnsi="Times New Roman" w:eastAsia="Times New Roman"/>
+          <w:b w:val="0"/>
+          <w:i w:val="0"/>
+          <w:sz w:val="28"/>
+        </w:rPr>
+        <w:t>Квалификация: Техник-программист</w:t>
+      </w:r>
+    </w:p>
+    <w:p>
+      <w:pPr>
+        <w:spacing w:after="40" w:before="0"/>
+        <w:ind w:firstLine="0"/>
+        <w:jc w:val="center"/>
+      </w:pPr>
+      <w:r>
+        <w:rPr>
+          <w:rFonts w:ascii="Times New Roman" w:hAnsi="Times New Roman" w:eastAsia="Times New Roman"/>
+          <w:b/>
+          <w:i w:val="0"/>
+          <w:sz w:val="32"/>
+        </w:rPr>
+        <w:t>Контрольная работа</w:t>
+      </w:r>
+    </w:p>
+    <w:p>
+      <w:pPr>
+        <w:spacing w:after="40" w:before="0"/>
+        <w:ind w:firstLine="0"/>
+        <w:jc w:val="center"/>
+      </w:pPr>
+      <w:r>
+        <w:rPr>
+          <w:rFonts w:ascii="Times New Roman" w:hAnsi="Times New Roman" w:eastAsia="Times New Roman"/>
+          <w:b w:val="0"/>
+          <w:i w:val="0"/>
+          <w:sz w:val="28"/>
+        </w:rPr>
+        <w:t>при проведении самоконтроля</w:t>
+      </w:r>
+    </w:p>
+    <w:p>
+      <w:pPr>
+        <w:spacing w:after="40" w:before="0"/>
+        <w:ind w:firstLine="0"/>
+        <w:jc w:val="center"/>
+      </w:pPr>
+      <w:r>
+        <w:rPr>
+          <w:rFonts w:ascii="Times New Roman" w:hAnsi="Times New Roman" w:eastAsia="Times New Roman"/>
+          <w:b w:val="0"/>
+          <w:i w:val="0"/>
+          <w:sz w:val="28"/>
+        </w:rPr>
+        <w:t>Учебный предмет «Технология разработки программного обеспечения»</w:t>
+      </w:r>
+    </w:p>
+    <w:p>
+      <w:pPr>
+        <w:spacing w:after="200" w:before="0"/>
+        <w:ind w:firstLine="0"/>
         <w:jc w:val="center"/>
       </w:pPr>
       <w:r>
@@ -64,7 +132,8 @@
     </w:p>
     <w:p>
       <w:pPr>
-        <w:spacing w:after="80" w:before="0" w:line="276" w:lineRule="auto"/>
+        <w:spacing w:after="80" w:before="0"/>
+        <w:ind w:firstLine="0"/>
         <w:jc w:val="center"/>
       </w:pPr>
       <w:r>
@@ -79,7 +148,8 @@
     </w:p>
     <w:p>
       <w:pPr>
-        <w:spacing w:after="240" w:before="0" w:line="276" w:lineRule="auto"/>
+        <w:spacing w:after="320" w:before="0"/>
+        <w:ind w:firstLine="0"/>
         <w:jc w:val="center"/>
       </w:pPr>
       <w:r>
@@ -87,14 +157,15 @@
           <w:rFonts w:ascii="Times New Roman" w:hAnsi="Times New Roman" w:eastAsia="Times New Roman"/>
           <w:b w:val="0"/>
           <w:i/>
-          <w:sz w:val="28"/>
+          <w:sz w:val="24"/>
         </w:rPr>
         <w:t>с начерченными диаграммами</w:t>
       </w:r>
     </w:p>
     <w:p>
       <w:pPr>
-        <w:spacing w:after="120" w:before="0" w:line="276" w:lineRule="auto"/>
+        <w:spacing w:after="80" w:before="0"/>
+        <w:ind w:firstLine="0"/>
         <w:jc w:val="right"/>
       </w:pPr>
       <w:r>
@@ -109,7 +180,8 @@
     </w:p>
     <w:p>
       <w:pPr>
-        <w:spacing w:after="120" w:before="0" w:line="276" w:lineRule="auto"/>
+        <w:spacing w:after="120" w:before="0"/>
+        <w:ind w:firstLine="0"/>
         <w:jc w:val="center"/>
       </w:pPr>
       <w:r>
@@ -129,7 +201,8 @@
     </w:p>
     <w:p>
       <w:pPr>
-        <w:spacing w:after="160" w:before="240" w:line="276" w:lineRule="auto"/>
+        <w:spacing w:after="200" w:before="240"/>
+        <w:ind w:firstLine="0"/>
         <w:jc w:val="center"/>
       </w:pPr>
       <w:r>
@@ -144,7 +217,8 @@
     </w:p>
     <w:p>
       <w:pPr>
-        <w:spacing w:after="80" w:before="160" w:line="276" w:lineRule="auto"/>
+        <w:spacing w:after="120" w:before="200"/>
+        <w:ind w:firstLine="0"/>
         <w:jc w:val="left"/>
       </w:pPr>
       <w:r>
@@ -159,7 +233,33 @@
     </w:p>
     <w:p>
       <w:pPr>
-        <w:spacing w:after="120" w:before="0" w:line="276" w:lineRule="auto"/>
+        <w:spacing w:after="160" w:line="276" w:lineRule="auto"/>
+        <w:ind w:firstLine="709"/>
+        <w:jc w:val="both"/>
+      </w:pPr>
+      <w:r>
+        <w:rPr>
+          <w:rFonts w:ascii="Times New Roman" w:hAnsi="Times New Roman" w:eastAsia="Times New Roman"/>
+          <w:b/>
+          <w:i w:val="0"/>
+          <w:sz w:val="28"/>
+        </w:rPr>
+        <w:t xml:space="preserve">Жизненный цикл программного обеспечения (ЖЦ ПО) — </w:t>
+      </w:r>
+      <w:r>
+        <w:rPr>
+          <w:rFonts w:ascii="Times New Roman" w:hAnsi="Times New Roman" w:eastAsia="Times New Roman"/>
+          <w:b w:val="0"/>
+          <w:i w:val="0"/>
+          <w:sz w:val="28"/>
+        </w:rPr>
+        <w:t>это период от появления решения о создании программного продукта до его полного изъятия из эксплуатации. В это время система проходит связанные стадии: сбор требований, проектирование, реализацию, проверку качества, внедрение, сопровождение и вывод из использования. Понятие ЖЦ помогает упорядочить работы, понимать состав артефактов на каждом этапе и контролировать готовность продукта.</w:t>
+      </w:r>
+    </w:p>
+    <w:p>
+      <w:pPr>
+        <w:spacing w:after="120" w:line="276" w:lineRule="auto"/>
+        <w:ind w:firstLine="709"/>
         <w:jc w:val="both"/>
       </w:pPr>
       <w:r>
@@ -169,13 +269,14 @@
           <w:i w:val="0"/>
           <w:sz w:val="28"/>
         </w:rPr>
-        <w:t>Жизненный цикл программного обеспечения (ЖЦ ПО) — период времени от момента принятия решения о необходимости создания программного продукта до момента его полного изъятия из эксплуатации.</w:t>
+        <w:t>Основные этапы жизненного цикла ПО:</w:t>
       </w:r>
     </w:p>
     <w:p>
       <w:pPr>
-        <w:spacing w:after="40" w:before="0" w:line="276" w:lineRule="auto"/>
-        <w:jc w:val="left"/>
+        <w:spacing w:after="160" w:line="276" w:lineRule="auto"/>
+        <w:ind w:firstLine="709"/>
+        <w:jc w:val="both"/>
       </w:pPr>
       <w:r>
         <w:rPr>
@@ -184,14 +285,8 @@
           <w:i w:val="0"/>
           <w:sz w:val="28"/>
         </w:rPr>
-        <w:t>Основные этапы:</w:t>
+        <w:t xml:space="preserve">1. Анализ требований. </w:t>
       </w:r>
-    </w:p>
-    <w:p>
-      <w:pPr>
-        <w:pStyle w:val="ListBullet"/>
-        <w:spacing w:after="40"/>
-      </w:pPr>
       <w:r>
         <w:rPr>
           <w:rFonts w:ascii="Times New Roman" w:hAnsi="Times New Roman" w:eastAsia="Times New Roman"/>
@@ -199,14 +294,24 @@
           <w:i w:val="0"/>
           <w:sz w:val="28"/>
         </w:rPr>
-        <w:t>Анализ требований</w:t>
+        <w:t>На этапе выясняют, что должна делать система и какие ограничения на неё действуют. Собирают потребности заказчика и пользователей, разделяют функциональные требования (функции) и нефункциональные (производительность, безопасность, удобство и др.). Итог — согласованное описание требований для дальнейшего проектирования.</w:t>
       </w:r>
     </w:p>
     <w:p>
       <w:pPr>
-        <w:pStyle w:val="ListBullet"/>
-        <w:spacing w:after="40"/>
+        <w:spacing w:after="160" w:line="276" w:lineRule="auto"/>
+        <w:ind w:firstLine="709"/>
+        <w:jc w:val="both"/>
       </w:pPr>
+      <w:r>
+        <w:rPr>
+          <w:rFonts w:ascii="Times New Roman" w:hAnsi="Times New Roman" w:eastAsia="Times New Roman"/>
+          <w:b/>
+          <w:i w:val="0"/>
+          <w:sz w:val="28"/>
+        </w:rPr>
+        <w:t xml:space="preserve">2. Проектирование. </w:t>
+      </w:r>
       <w:r>
         <w:rPr>
           <w:rFonts w:ascii="Times New Roman" w:hAnsi="Times New Roman" w:eastAsia="Times New Roman"/>
@@ -214,14 +319,24 @@
           <w:i w:val="0"/>
           <w:sz w:val="28"/>
         </w:rPr>
-        <w:t>Проектирование</w:t>
+        <w:t>По требованиям строят архитектуру системы: состав частей, их взаимодействие, структуры данных и интерфейсы. Часто используют UML-диаграммы. Цель — получить понятный «чертёж» программы до массового кодирования.</w:t>
       </w:r>
     </w:p>
     <w:p>
       <w:pPr>
-        <w:pStyle w:val="ListBullet"/>
-        <w:spacing w:after="40"/>
+        <w:spacing w:after="160" w:line="276" w:lineRule="auto"/>
+        <w:ind w:firstLine="709"/>
+        <w:jc w:val="both"/>
       </w:pPr>
+      <w:r>
+        <w:rPr>
+          <w:rFonts w:ascii="Times New Roman" w:hAnsi="Times New Roman" w:eastAsia="Times New Roman"/>
+          <w:b/>
+          <w:i w:val="0"/>
+          <w:sz w:val="28"/>
+        </w:rPr>
+        <w:t xml:space="preserve">3. Реализация (кодирование). </w:t>
+      </w:r>
       <w:r>
         <w:rPr>
           <w:rFonts w:ascii="Times New Roman" w:hAnsi="Times New Roman" w:eastAsia="Times New Roman"/>
@@ -229,14 +344,24 @@
           <w:i w:val="0"/>
           <w:sz w:val="28"/>
         </w:rPr>
-        <w:t>Реализация (кодирование)</w:t>
+        <w:t>Пишут исходный код, создают модули и компоненты по проекту, собирают работоспособное приложение. Обычно параллельно проводят модульные проверки и готовят сборки.</w:t>
       </w:r>
     </w:p>
     <w:p>
       <w:pPr>
-        <w:pStyle w:val="ListBullet"/>
-        <w:spacing w:after="40"/>
+        <w:spacing w:after="160" w:line="276" w:lineRule="auto"/>
+        <w:ind w:firstLine="709"/>
+        <w:jc w:val="both"/>
       </w:pPr>
+      <w:r>
+        <w:rPr>
+          <w:rFonts w:ascii="Times New Roman" w:hAnsi="Times New Roman" w:eastAsia="Times New Roman"/>
+          <w:b/>
+          <w:i w:val="0"/>
+          <w:sz w:val="28"/>
+        </w:rPr>
+        <w:t xml:space="preserve">4. Тестирование. </w:t>
+      </w:r>
       <w:r>
         <w:rPr>
           <w:rFonts w:ascii="Times New Roman" w:hAnsi="Times New Roman" w:eastAsia="Times New Roman"/>
@@ -244,14 +369,24 @@
           <w:i w:val="0"/>
           <w:sz w:val="28"/>
         </w:rPr>
-        <w:t>Тестирование</w:t>
+        <w:t>Проверяют соответствие системы требованиям и ищут дефекты. Бывает модульное, интеграционное, системное и приёмочное тестирование. Найденные ошибки исправляют и повторяют проверку.</w:t>
       </w:r>
     </w:p>
     <w:p>
       <w:pPr>
-        <w:pStyle w:val="ListBullet"/>
-        <w:spacing w:after="40"/>
+        <w:spacing w:after="160" w:line="276" w:lineRule="auto"/>
+        <w:ind w:firstLine="709"/>
+        <w:jc w:val="both"/>
       </w:pPr>
+      <w:r>
+        <w:rPr>
+          <w:rFonts w:ascii="Times New Roman" w:hAnsi="Times New Roman" w:eastAsia="Times New Roman"/>
+          <w:b/>
+          <w:i w:val="0"/>
+          <w:sz w:val="28"/>
+        </w:rPr>
+        <w:t xml:space="preserve">5. Внедрение. </w:t>
+      </w:r>
       <w:r>
         <w:rPr>
           <w:rFonts w:ascii="Times New Roman" w:hAnsi="Times New Roman" w:eastAsia="Times New Roman"/>
@@ -259,14 +394,24 @@
           <w:i w:val="0"/>
           <w:sz w:val="28"/>
         </w:rPr>
-        <w:t>Внедрение</w:t>
+        <w:t>ПО устанавливают в среде заказчика, настраивают, при необходимости переносят данные и обучают пользователей. После этого система переходит в промышленную эксплуатацию.</w:t>
       </w:r>
     </w:p>
     <w:p>
       <w:pPr>
-        <w:pStyle w:val="ListBullet"/>
-        <w:spacing w:after="40"/>
+        <w:spacing w:after="160" w:line="276" w:lineRule="auto"/>
+        <w:ind w:firstLine="709"/>
+        <w:jc w:val="both"/>
       </w:pPr>
+      <w:r>
+        <w:rPr>
+          <w:rFonts w:ascii="Times New Roman" w:hAnsi="Times New Roman" w:eastAsia="Times New Roman"/>
+          <w:b/>
+          <w:i w:val="0"/>
+          <w:sz w:val="28"/>
+        </w:rPr>
+        <w:t xml:space="preserve">6. Сопровождение. </w:t>
+      </w:r>
       <w:r>
         <w:rPr>
           <w:rFonts w:ascii="Times New Roman" w:hAnsi="Times New Roman" w:eastAsia="Times New Roman"/>
@@ -274,14 +419,24 @@
           <w:i w:val="0"/>
           <w:sz w:val="28"/>
         </w:rPr>
-        <w:t>Сопровождение</w:t>
+        <w:t>В эксплуатации исправляют ошибки, адаптируют ПО к новым условиям и развивают функции по новым запросам. Этот этап часто занимает наибольшую долю стоимости жизненного цикла.</w:t>
       </w:r>
     </w:p>
     <w:p>
       <w:pPr>
-        <w:pStyle w:val="ListBullet"/>
-        <w:spacing w:after="40"/>
+        <w:spacing w:after="160" w:line="276" w:lineRule="auto"/>
+        <w:ind w:firstLine="709"/>
+        <w:jc w:val="both"/>
       </w:pPr>
+      <w:r>
+        <w:rPr>
+          <w:rFonts w:ascii="Times New Roman" w:hAnsi="Times New Roman" w:eastAsia="Times New Roman"/>
+          <w:b/>
+          <w:i w:val="0"/>
+          <w:sz w:val="28"/>
+        </w:rPr>
+        <w:t xml:space="preserve">7. Вывод из эксплуатации. </w:t>
+      </w:r>
       <w:r>
         <w:rPr>
           <w:rFonts w:ascii="Times New Roman" w:hAnsi="Times New Roman" w:eastAsia="Times New Roman"/>
@@ -289,12 +444,13 @@
           <w:i w:val="0"/>
           <w:sz w:val="28"/>
         </w:rPr>
-        <w:t>Вывод из эксплуатации</w:t>
+        <w:t>Когда система больше не нужна или заменяется другой, её снимают с использования: прекращают поддержку, сохраняют или переносят данные, утилизируют устаревшие компоненты.</w:t>
       </w:r>
     </w:p>
     <w:p>
       <w:pPr>
-        <w:spacing w:after="120" w:before="0" w:line="276" w:lineRule="auto"/>
+        <w:spacing w:after="120" w:line="276" w:lineRule="auto"/>
+        <w:ind w:firstLine="709"/>
         <w:jc w:val="both"/>
       </w:pPr>
       <w:r>
@@ -304,12 +460,13 @@
           <w:i w:val="0"/>
           <w:sz w:val="28"/>
         </w:rPr>
-        <w:t>Последовательность: Анализ требований → Проектирование → Реализация → Тестирование → Внедрение → Сопровождение → Вывод из эксплуатации.</w:t>
+        <w:t>Последовательность этапов: Анализ требований → Проектирование → Реализация → Тестирование → Внедрение → Сопровождение → Вывод из эксплуатации. В итеративных и Agile-подходах этапы могут повторяться в каждом цикле, но логический порядок внутри итерации обычно сохраняется.</w:t>
       </w:r>
     </w:p>
     <w:p>
       <w:pPr>
-        <w:spacing w:after="80" w:before="160" w:line="276" w:lineRule="auto"/>
+        <w:spacing w:after="120" w:before="200"/>
+        <w:ind w:firstLine="0"/>
         <w:jc w:val="left"/>
       </w:pPr>
       <w:r>
@@ -324,22 +481,8 @@
     </w:p>
     <w:p>
       <w:pPr>
-        <w:spacing w:after="120" w:before="0" w:line="276" w:lineRule="auto"/>
-        <w:jc w:val="both"/>
-      </w:pPr>
-      <w:r>
-        <w:rPr>
-          <w:rFonts w:ascii="Times New Roman" w:hAnsi="Times New Roman" w:eastAsia="Times New Roman"/>
-          <w:b w:val="0"/>
-          <w:i w:val="0"/>
-          <w:sz w:val="28"/>
-        </w:rPr>
-        <w:t>Назначение: показать, кто взаимодействует с системой и какие функции она предоставляет.</w:t>
-      </w:r>
-    </w:p>
-    <w:p>
-      <w:pPr>
-        <w:spacing w:after="120" w:line="276" w:lineRule="auto"/>
+        <w:spacing w:after="160" w:line="276" w:lineRule="auto"/>
+        <w:ind w:firstLine="709"/>
         <w:jc w:val="both"/>
       </w:pPr>
       <w:r>
@@ -349,7 +492,7 @@
           <w:i w:val="0"/>
           <w:sz w:val="28"/>
         </w:rPr>
-        <w:t xml:space="preserve">Актёр — </w:t>
+        <w:t xml:space="preserve">Назначение диаграммы вариантов использования. </w:t>
       </w:r>
       <w:r>
         <w:rPr>
@@ -358,12 +501,13 @@
           <w:i w:val="0"/>
           <w:sz w:val="28"/>
         </w:rPr>
-        <w:t>внешняя сущность, взаимодействующая с системой.</w:t>
+        <w:t>Диаграмма показывает внешний взгляд на систему: кто с ней работает и какие возможности она даёт. С её помощью очерчивают границы системы и согласуют с заказчиком состав функций, не раскрывая внутреннюю реализацию. Это одна из основных UML-диаграмм на этапе анализа требований.</w:t>
       </w:r>
     </w:p>
     <w:p>
       <w:pPr>
-        <w:spacing w:after="120" w:line="276" w:lineRule="auto"/>
+        <w:spacing w:after="160" w:line="276" w:lineRule="auto"/>
+        <w:ind w:firstLine="709"/>
         <w:jc w:val="both"/>
       </w:pPr>
       <w:r>
@@ -373,7 +517,7 @@
           <w:i w:val="0"/>
           <w:sz w:val="28"/>
         </w:rPr>
-        <w:t xml:space="preserve">Прецедент — </w:t>
+        <w:t xml:space="preserve">Актёр (Actor) — </w:t>
       </w:r>
       <w:r>
         <w:rPr>
@@ -382,12 +526,13 @@
           <w:i w:val="0"/>
           <w:sz w:val="28"/>
         </w:rPr>
-        <w:t>последовательность действий системы со значимым результатом для актёра.</w:t>
+        <w:t>роль внешней сущности, взаимодействующей с системой. Это может быть человек, организация или другая информационная система. Актёр находится вне границ системы и либо запускает прецедент, либо участвует в нём. На диаграмме изображается «человечком» или прямоугольником со стереотипом &lt;&lt;actor&gt;&gt;.</w:t>
       </w:r>
     </w:p>
     <w:p>
       <w:pPr>
-        <w:spacing w:after="120" w:line="276" w:lineRule="auto"/>
+        <w:spacing w:after="160" w:line="276" w:lineRule="auto"/>
+        <w:ind w:firstLine="709"/>
         <w:jc w:val="both"/>
       </w:pPr>
       <w:r>
@@ -397,7 +542,7 @@
           <w:i w:val="0"/>
           <w:sz w:val="28"/>
         </w:rPr>
-        <w:t xml:space="preserve">include — </w:t>
+        <w:t xml:space="preserve">Прецедент (Use Case) — </w:t>
       </w:r>
       <w:r>
         <w:rPr>
@@ -406,8 +551,15 @@
           <w:i w:val="0"/>
           <w:sz w:val="28"/>
         </w:rPr>
-        <w:t xml:space="preserve">обязательное включение поведения (всегда). </w:t>
+        <w:t>завершённый фрагмент поведения системы, видимый актёру и дающий ему полезный результат. Прецедент описывает, что делает система, а не как устроен код. Обычно называется глагольной фразой («Оформить заказ»). На диаграмме обозначается овалом.</w:t>
       </w:r>
+    </w:p>
+    <w:p>
+      <w:pPr>
+        <w:spacing w:after="160" w:line="276" w:lineRule="auto"/>
+        <w:ind w:firstLine="709"/>
+        <w:jc w:val="both"/>
+      </w:pPr>
       <w:r>
         <w:rPr>
           <w:rFonts w:ascii="Times New Roman" w:hAnsi="Times New Roman" w:eastAsia="Times New Roman"/>
@@ -415,7 +567,7 @@
           <w:i w:val="0"/>
           <w:sz w:val="28"/>
         </w:rPr>
-        <w:t xml:space="preserve">extend — </w:t>
+        <w:t xml:space="preserve">Отношение include (включение) — </w:t>
       </w:r>
       <w:r>
         <w:rPr>
@@ -424,12 +576,38 @@
           <w:i w:val="0"/>
           <w:sz w:val="28"/>
         </w:rPr>
-        <w:t>условное расширение (не всегда).</w:t>
+        <w:t>обязательная связь: базовый прецедент всегда выполняет поведение включаемого. Так выносят общий фрагмент, повторяющийся в нескольких сценариях. Рисуют пунктирную стрелку от базового к включаемому со стереотипом &lt;&lt;include&gt;&gt;.</w:t>
       </w:r>
     </w:p>
     <w:p>
       <w:pPr>
-        <w:spacing w:after="80" w:before="160" w:line="276" w:lineRule="auto"/>
+        <w:spacing w:after="160" w:line="276" w:lineRule="auto"/>
+        <w:ind w:firstLine="709"/>
+        <w:jc w:val="both"/>
+      </w:pPr>
+      <w:r>
+        <w:rPr>
+          <w:rFonts w:ascii="Times New Roman" w:hAnsi="Times New Roman" w:eastAsia="Times New Roman"/>
+          <w:b/>
+          <w:i w:val="0"/>
+          <w:sz w:val="28"/>
+        </w:rPr>
+        <w:t xml:space="preserve">Отношение extend (расширение) — </w:t>
+      </w:r>
+      <w:r>
+        <w:rPr>
+          <w:rFonts w:ascii="Times New Roman" w:hAnsi="Times New Roman" w:eastAsia="Times New Roman"/>
+          <w:b w:val="0"/>
+          <w:i w:val="0"/>
+          <w:sz w:val="28"/>
+        </w:rPr>
+        <w:t>условная связь: расширяющий прецедент дополняет базовый только при выполнении условия. В отличие от include, расширение выполняется не всегда. Пунктирная стрелка идёт от расширяющего к базовому со стереотипом &lt;&lt;extend&gt;&gt;.</w:t>
+      </w:r>
+    </w:p>
+    <w:p>
+      <w:pPr>
+        <w:spacing w:after="120" w:before="200"/>
+        <w:ind w:firstLine="0"/>
         <w:jc w:val="left"/>
       </w:pPr>
       <w:r>
@@ -444,7 +622,8 @@
     </w:p>
     <w:p>
       <w:pPr>
-        <w:spacing w:after="120" w:line="276" w:lineRule="auto"/>
+        <w:spacing w:after="160" w:line="276" w:lineRule="auto"/>
+        <w:ind w:firstLine="709"/>
         <w:jc w:val="both"/>
       </w:pPr>
       <w:r>
@@ -463,12 +642,13 @@
           <w:i w:val="0"/>
           <w:sz w:val="28"/>
         </w:rPr>
-        <w:t>проверка соответствия поведения ПО функциональным требованиям («что делает» система).</w:t>
+        <w:t>проверка того, правильно ли система выполняет заявленные функции. На вход подают данные, выполняют сценарии и сравнивают фактический результат с ожидаемым по требованиям. Оценивается внешнее поведение («что делает» программа), а не устройство исходного кода. Примеры: проверка входа в систему, расчёта суммы заказа, сохранения записи.</w:t>
       </w:r>
     </w:p>
     <w:p>
       <w:pPr>
-        <w:spacing w:after="120" w:line="276" w:lineRule="auto"/>
+        <w:spacing w:after="160" w:line="276" w:lineRule="auto"/>
+        <w:ind w:firstLine="709"/>
         <w:jc w:val="both"/>
       </w:pPr>
       <w:r>
@@ -487,12 +667,13 @@
           <w:i w:val="0"/>
           <w:sz w:val="28"/>
         </w:rPr>
-        <w:t>проверка удобства интерфейса: понятность, эффективность, удовлетворённость.</w:t>
+        <w:t>проверка удобства и понятности интерфейса. Смотрят, как быстро и без ошибок пользователь достигает цели, насколько легко учиться работе с системой и насколько интерфейс интуитивен. Здесь важно не только «работает ли кнопка», но и «удобно ли ей пользоваться». Обычно наблюдают за реальными пользователями при выполнении типовых заданий.</w:t>
       </w:r>
     </w:p>
     <w:p>
       <w:pPr>
-        <w:spacing w:after="80" w:before="160" w:line="276" w:lineRule="auto"/>
+        <w:spacing w:after="120" w:before="200"/>
+        <w:ind w:firstLine="0"/>
         <w:jc w:val="left"/>
       </w:pPr>
       <w:r>
@@ -507,7 +688,8 @@
     </w:p>
     <w:p>
       <w:pPr>
-        <w:spacing w:after="120" w:before="0" w:line="276" w:lineRule="auto"/>
+        <w:spacing w:after="120" w:line="276" w:lineRule="auto"/>
+        <w:ind w:firstLine="709"/>
         <w:jc w:val="both"/>
       </w:pPr>
       <w:r>
@@ -517,18 +699,18 @@
           <w:i w:val="0"/>
           <w:sz w:val="28"/>
         </w:rPr>
-        <w:t>Пример: оформление заказа (Покупатель, Интерфейс, Корзина, Склад, Оплата).</w:t>
+        <w:t>Пример диаграммы последовательности для оформления заказа. Участники: Покупатель, :Интерфейс, :Корзина, :Склад, :Оплата. Сплошные стрелки — вызовы, пунктирные — ответы.</w:t>
       </w:r>
     </w:p>
     <w:p>
       <w:pPr>
-        <w:spacing w:before="80" w:after="40"/>
+        <w:spacing w:before="120" w:after="40"/>
         <w:jc w:val="center"/>
       </w:pPr>
       <w:r>
         <w:drawing>
           <wp:inline xmlns:a="http://schemas.openxmlformats.org/drawingml/2006/main" xmlns:pic="http://schemas.openxmlformats.org/drawingml/2006/picture">
-            <wp:extent cx="5852160" cy="4586245"/>
+            <wp:extent cx="5760720" cy="4514585"/>
             <wp:docPr id="1" name="Picture 1"/>
             <wp:cNvGraphicFramePr>
               <a:graphicFrameLocks noChangeAspect="1"/>
@@ -549,7 +731,7 @@
                   <pic:spPr>
                     <a:xfrm>
                       <a:off x="0" y="0"/>
-                      <a:ext cx="5852160" cy="4586245"/>
+                      <a:ext cx="5760720" cy="4514585"/>
                     </a:xfrm>
                     <a:prstGeom prst="rect"/>
                   </pic:spPr>
@@ -562,7 +744,8 @@
     </w:p>
     <w:p>
       <w:pPr>
-        <w:spacing w:after="160" w:before="0" w:line="276" w:lineRule="auto"/>
+        <w:spacing w:after="200" w:before="0"/>
+        <w:ind w:firstLine="0"/>
         <w:jc w:val="center"/>
       </w:pPr>
       <w:r>
@@ -582,7 +765,8 @@
     </w:p>
     <w:p>
       <w:pPr>
-        <w:spacing w:after="160" w:before="240" w:line="276" w:lineRule="auto"/>
+        <w:spacing w:after="200" w:before="240"/>
+        <w:ind w:firstLine="0"/>
         <w:jc w:val="center"/>
       </w:pPr>
       <w:r>
@@ -597,7 +781,8 @@
     </w:p>
     <w:p>
       <w:pPr>
-        <w:spacing w:after="80" w:before="160" w:line="276" w:lineRule="auto"/>
+        <w:spacing w:after="120" w:before="200"/>
+        <w:ind w:firstLine="0"/>
         <w:jc w:val="left"/>
       </w:pPr>
       <w:r>
@@ -612,67 +797,8 @@
     </w:p>
     <w:p>
       <w:pPr>
-        <w:spacing w:after="120" w:before="0" w:line="276" w:lineRule="auto"/>
-        <w:jc w:val="both"/>
-      </w:pPr>
-      <w:r>
-        <w:rPr>
-          <w:rFonts w:ascii="Times New Roman" w:hAnsi="Times New Roman" w:eastAsia="Times New Roman"/>
-          <w:b w:val="0"/>
-          <w:i w:val="0"/>
-          <w:sz w:val="28"/>
-        </w:rPr>
-        <w:t>Назначение: описать систему как набор функций — входы, выходы, управление, механизмы.</w:t>
-      </w:r>
-    </w:p>
-    <w:p>
-      <w:pPr>
-        <w:pStyle w:val="ListBullet"/>
-        <w:spacing w:after="40"/>
-      </w:pPr>
-      <w:r>
-        <w:rPr>
-          <w:rFonts w:ascii="Times New Roman" w:hAnsi="Times New Roman" w:eastAsia="Times New Roman"/>
-          <w:b w:val="0"/>
-          <w:i w:val="0"/>
-          <w:sz w:val="28"/>
-        </w:rPr>
-        <w:t>Блоки-функции</w:t>
-      </w:r>
-    </w:p>
-    <w:p>
-      <w:pPr>
-        <w:pStyle w:val="ListBullet"/>
-        <w:spacing w:after="40"/>
-      </w:pPr>
-      <w:r>
-        <w:rPr>
-          <w:rFonts w:ascii="Times New Roman" w:hAnsi="Times New Roman" w:eastAsia="Times New Roman"/>
-          <w:b w:val="0"/>
-          <w:i w:val="0"/>
-          <w:sz w:val="28"/>
-        </w:rPr>
-        <w:t>Стрелки I/C/O/M</w:t>
-      </w:r>
-    </w:p>
-    <w:p>
-      <w:pPr>
-        <w:pStyle w:val="ListBullet"/>
-        <w:spacing w:after="40"/>
-      </w:pPr>
-      <w:r>
-        <w:rPr>
-          <w:rFonts w:ascii="Times New Roman" w:hAnsi="Times New Roman" w:eastAsia="Times New Roman"/>
-          <w:b w:val="0"/>
-          <w:i w:val="0"/>
-          <w:sz w:val="28"/>
-        </w:rPr>
-        <w:t>Иерархия декомпозиции, глоссарий, цель и точка зрения</w:t>
-      </w:r>
-    </w:p>
-    <w:p>
-      <w:pPr>
-        <w:spacing w:after="120" w:line="276" w:lineRule="auto"/>
+        <w:spacing w:after="160" w:line="276" w:lineRule="auto"/>
+        <w:ind w:firstLine="709"/>
         <w:jc w:val="both"/>
       </w:pPr>
       <w:r>
@@ -682,7 +808,7 @@
           <w:i w:val="0"/>
           <w:sz w:val="28"/>
         </w:rPr>
-        <w:t xml:space="preserve">Контекстная диаграмма — </w:t>
+        <w:t xml:space="preserve">Назначение функционального моделирования. </w:t>
       </w:r>
       <w:r>
         <w:rPr>
@@ -691,12 +817,62 @@
           <w:i w:val="0"/>
           <w:sz w:val="28"/>
         </w:rPr>
-        <w:t>один блок всей системы и внешние стрелки (границы модели).</w:t>
+        <w:t>Нужно, чтобы описать деятельность системы или организации как набор взаимосвязанных работ. Модель показывает, что делается, какие ресурсы потребляются, какой результат получается и чем процесс управляется. Это помогает анализировать бизнес-процессы и формулировать требования к ПО до детального технического проектирования.</w:t>
       </w:r>
     </w:p>
     <w:p>
       <w:pPr>
-        <w:spacing w:before="80" w:after="40"/>
+        <w:spacing w:after="160" w:line="276" w:lineRule="auto"/>
+        <w:ind w:firstLine="709"/>
+        <w:jc w:val="both"/>
+      </w:pPr>
+      <w:r>
+        <w:rPr>
+          <w:rFonts w:ascii="Times New Roman" w:hAnsi="Times New Roman" w:eastAsia="Times New Roman"/>
+          <w:b/>
+          <w:i w:val="0"/>
+          <w:sz w:val="28"/>
+        </w:rPr>
+        <w:t xml:space="preserve">Состав модели IDEF0. </w:t>
+      </w:r>
+      <w:r>
+        <w:rPr>
+          <w:rFonts w:ascii="Times New Roman" w:hAnsi="Times New Roman" w:eastAsia="Times New Roman"/>
+          <w:b w:val="0"/>
+          <w:i w:val="0"/>
+          <w:sz w:val="28"/>
+        </w:rPr>
+        <w:t>Модель строится из функциональных блоков и стрелок. Блок — прямоугольник с работой (обычно «глагол + существительное»). Стрелки: вход слева — то, что преобразуется; выход справа — результат; управление сверху — правила и ограничения; механизм снизу — исполнители, оборудование, ПО. Модель иерархична: верхний блок детализируется на дочерних диаграммах. К модели указывают цель, точку зрения и глоссарий.</w:t>
+      </w:r>
+    </w:p>
+    <w:p>
+      <w:pPr>
+        <w:spacing w:after="160" w:line="276" w:lineRule="auto"/>
+        <w:ind w:firstLine="709"/>
+        <w:jc w:val="both"/>
+      </w:pPr>
+      <w:r>
+        <w:rPr>
+          <w:rFonts w:ascii="Times New Roman" w:hAnsi="Times New Roman" w:eastAsia="Times New Roman"/>
+          <w:b/>
+          <w:i w:val="0"/>
+          <w:sz w:val="28"/>
+        </w:rPr>
+        <w:t xml:space="preserve">Контекстная диаграмма. </w:t>
+      </w:r>
+      <w:r>
+        <w:rPr>
+          <w:rFonts w:ascii="Times New Roman" w:hAnsi="Times New Roman" w:eastAsia="Times New Roman"/>
+          <w:b w:val="0"/>
+          <w:i w:val="0"/>
+          <w:sz w:val="28"/>
+        </w:rPr>
+        <w:t>Самый верхний уровень IDEF0 (часто A-0). На ней один блок — вся система целиком — и только внешние стрелки. Диаграмма фиксирует границы объекта: что входит извне, что уходит наружу, чем система управляется и какими ресурсами поддерживается. Остальные диаграммы — декомпозиция этого блока.</w:t>
+      </w:r>
+    </w:p>
+    <w:p>
+      <w:pPr>
+        <w:spacing w:before="120" w:after="40"/>
         <w:jc w:val="center"/>
       </w:pPr>
       <w:r>
@@ -736,7 +912,8 @@
     </w:p>
     <w:p>
       <w:pPr>
-        <w:spacing w:after="160" w:before="0" w:line="276" w:lineRule="auto"/>
+        <w:spacing w:after="200" w:before="0"/>
+        <w:ind w:firstLine="0"/>
         <w:jc w:val="center"/>
       </w:pPr>
       <w:r>
@@ -751,7 +928,8 @@
     </w:p>
     <w:p>
       <w:pPr>
-        <w:spacing w:after="80" w:before="160" w:line="276" w:lineRule="auto"/>
+        <w:spacing w:after="120" w:before="200"/>
+        <w:ind w:firstLine="0"/>
         <w:jc w:val="left"/>
       </w:pPr>
       <w:r>
@@ -766,7 +944,8 @@
     </w:p>
     <w:p>
       <w:pPr>
-        <w:spacing w:after="120" w:line="276" w:lineRule="auto"/>
+        <w:spacing w:after="160" w:line="276" w:lineRule="auto"/>
+        <w:ind w:firstLine="709"/>
         <w:jc w:val="both"/>
       </w:pPr>
       <w:r>
@@ -785,12 +964,13 @@
           <w:i w:val="0"/>
           <w:sz w:val="28"/>
         </w:rPr>
-        <w:t>объединение данных и методов и сокрытие реализации.</w:t>
+        <w:t>принцип ООП, при котором данные объекта и методы работы с ними объединяются в одном классе, а внутренняя реализация скрывается. Снаружи доступны только разрешённые операции. Благодаря этому можно менять устройство класса, не ломая внешний код, и снижать риск некорректного изменения состояния объекта напрямую.</w:t>
       </w:r>
     </w:p>
     <w:p>
       <w:pPr>
-        <w:spacing w:after="120" w:line="276" w:lineRule="auto"/>
+        <w:spacing w:after="160" w:line="276" w:lineRule="auto"/>
+        <w:ind w:firstLine="709"/>
         <w:jc w:val="both"/>
       </w:pPr>
       <w:r>
@@ -809,12 +989,13 @@
           <w:i w:val="0"/>
           <w:sz w:val="28"/>
         </w:rPr>
-        <w:t>потомок получает и может расширять свойства предка.</w:t>
+        <w:t>механизм создания нового класса (потомка) на основе существующего (предка). Потомок получает атрибуты и методы предка, может добавить свои или переопределить поведение. Это даёт повторное использование кода и иерархии «общее → частное» (например, «Транспорт» → «Автомобиль»).</w:t>
       </w:r>
     </w:p>
     <w:p>
       <w:pPr>
-        <w:spacing w:after="120" w:line="276" w:lineRule="auto"/>
+        <w:spacing w:after="160" w:line="276" w:lineRule="auto"/>
+        <w:ind w:firstLine="709"/>
         <w:jc w:val="both"/>
       </w:pPr>
       <w:r>
@@ -833,12 +1014,13 @@
           <w:i w:val="0"/>
           <w:sz w:val="28"/>
         </w:rPr>
-        <w:t>один интерфейс — множество реализаций.</w:t>
+        <w:t>способность объектов разных классов вызываться через общий интерфейс или базовый тип, но выполнять свою реализацию метода. Обычно проявляется при переопределении методов в потомках: вызывается метод по ссылке на базовый тип, а выполняется код конкретного объекта. Так систему легче расширять без переписывания вызывающего кода.</w:t>
       </w:r>
     </w:p>
     <w:p>
       <w:pPr>
-        <w:spacing w:after="80" w:before="160" w:line="276" w:lineRule="auto"/>
+        <w:spacing w:after="120" w:before="200"/>
+        <w:ind w:firstLine="0"/>
         <w:jc w:val="left"/>
       </w:pPr>
       <w:r>
@@ -853,9 +1035,19 @@
     </w:p>
     <w:p>
       <w:pPr>
-        <w:spacing w:after="120" w:before="0" w:line="276" w:lineRule="auto"/>
+        <w:spacing w:after="160" w:line="276" w:lineRule="auto"/>
+        <w:ind w:firstLine="709"/>
         <w:jc w:val="both"/>
       </w:pPr>
+      <w:r>
+        <w:rPr>
+          <w:rFonts w:ascii="Times New Roman" w:hAnsi="Times New Roman" w:eastAsia="Times New Roman"/>
+          <w:b/>
+          <w:i w:val="0"/>
+          <w:sz w:val="28"/>
+        </w:rPr>
+        <w:t xml:space="preserve">Назначение диаграммы классов. </w:t>
+      </w:r>
       <w:r>
         <w:rPr>
           <w:rFonts w:ascii="Times New Roman" w:hAnsi="Times New Roman" w:eastAsia="Times New Roman"/>
@@ -863,12 +1055,113 @@
           <w:i w:val="0"/>
           <w:sz w:val="28"/>
         </w:rPr>
-        <w:t>Назначение: статическая структура — классы, атрибуты, операции, отношения. Класс — три секции. Интерфейс — контракт без реализации. Видимость: + public, − private, # protected, ~ package. Множественность: 1, 0..1, *, 1..*.</w:t>
+        <w:t>Она отражает статическую структуру ОО-системы: какие есть классы, какими данными и операциями они обладают и как связаны. Диаграмму используют при проектировании модели предметной области и архитектуры. Связи: ассоциация, агрегация, композиция, наследование, зависимость, реализация интерфейса.</w:t>
       </w:r>
     </w:p>
     <w:p>
       <w:pPr>
-        <w:spacing w:after="80" w:before="160" w:line="276" w:lineRule="auto"/>
+        <w:spacing w:after="160" w:line="276" w:lineRule="auto"/>
+        <w:ind w:firstLine="709"/>
+        <w:jc w:val="both"/>
+      </w:pPr>
+      <w:r>
+        <w:rPr>
+          <w:rFonts w:ascii="Times New Roman" w:hAnsi="Times New Roman" w:eastAsia="Times New Roman"/>
+          <w:b/>
+          <w:i w:val="0"/>
+          <w:sz w:val="28"/>
+        </w:rPr>
+        <w:t xml:space="preserve">Класс — </w:t>
+      </w:r>
+      <w:r>
+        <w:rPr>
+          <w:rFonts w:ascii="Times New Roman" w:hAnsi="Times New Roman" w:eastAsia="Times New Roman"/>
+          <w:b w:val="0"/>
+          <w:i w:val="0"/>
+          <w:sz w:val="28"/>
+        </w:rPr>
+        <w:t>описание множества объектов с одинаковой структурой данных, поведением и смыслом в предметной области. Объект — экземпляр класса. На UML класс рисуют прямоугольником из трёх секций: имя, атрибуты, операции.</w:t>
+      </w:r>
+    </w:p>
+    <w:p>
+      <w:pPr>
+        <w:spacing w:after="160" w:line="276" w:lineRule="auto"/>
+        <w:ind w:firstLine="709"/>
+        <w:jc w:val="both"/>
+      </w:pPr>
+      <w:r>
+        <w:rPr>
+          <w:rFonts w:ascii="Times New Roman" w:hAnsi="Times New Roman" w:eastAsia="Times New Roman"/>
+          <w:b/>
+          <w:i w:val="0"/>
+          <w:sz w:val="28"/>
+        </w:rPr>
+        <w:t xml:space="preserve">Интерфейс — </w:t>
+      </w:r>
+      <w:r>
+        <w:rPr>
+          <w:rFonts w:ascii="Times New Roman" w:hAnsi="Times New Roman" w:eastAsia="Times New Roman"/>
+          <w:b w:val="0"/>
+          <w:i w:val="0"/>
+          <w:sz w:val="28"/>
+        </w:rPr>
+        <w:t>набор операций без реализации, то есть контракт для класса. Он задаёт, что объект умеет делать, но не как. Несколько классов могут реализовать один интерфейс по-разному. Показывают кругом («леденец») или прямоугольником &lt;&lt;interface&gt;&gt;.</w:t>
+      </w:r>
+    </w:p>
+    <w:p>
+      <w:pPr>
+        <w:spacing w:after="160" w:line="276" w:lineRule="auto"/>
+        <w:ind w:firstLine="709"/>
+        <w:jc w:val="both"/>
+      </w:pPr>
+      <w:r>
+        <w:rPr>
+          <w:rFonts w:ascii="Times New Roman" w:hAnsi="Times New Roman" w:eastAsia="Times New Roman"/>
+          <w:b/>
+          <w:i w:val="0"/>
+          <w:sz w:val="28"/>
+        </w:rPr>
+        <w:t xml:space="preserve">Виды видимости. </w:t>
+      </w:r>
+      <w:r>
+        <w:rPr>
+          <w:rFonts w:ascii="Times New Roman" w:hAnsi="Times New Roman" w:eastAsia="Times New Roman"/>
+          <w:b w:val="0"/>
+          <w:i w:val="0"/>
+          <w:sz w:val="28"/>
+        </w:rPr>
+        <w:t>Определяют, откуда разрешён доступ к атрибуту или методу. В UML: «+» public — всем; «−» private — только внутри класса; «#» protected — классу и потомкам; «~» package — в пределах пакета. Правильная видимость поддерживает инкапсуляцию.</w:t>
+      </w:r>
+    </w:p>
+    <w:p>
+      <w:pPr>
+        <w:spacing w:after="160" w:line="276" w:lineRule="auto"/>
+        <w:ind w:firstLine="709"/>
+        <w:jc w:val="both"/>
+      </w:pPr>
+      <w:r>
+        <w:rPr>
+          <w:rFonts w:ascii="Times New Roman" w:hAnsi="Times New Roman" w:eastAsia="Times New Roman"/>
+          <w:b/>
+          <w:i w:val="0"/>
+          <w:sz w:val="28"/>
+        </w:rPr>
+        <w:t xml:space="preserve">Множественность отношений. </w:t>
+      </w:r>
+      <w:r>
+        <w:rPr>
+          <w:rFonts w:ascii="Times New Roman" w:hAnsi="Times New Roman" w:eastAsia="Times New Roman"/>
+          <w:b w:val="0"/>
+          <w:i w:val="0"/>
+          <w:sz w:val="28"/>
+        </w:rPr>
+        <w:t>Показывает, сколько объектов одного класса может быть связано с одним объектом другого. Типично: 1; 0..1; * (0..*); 1..*; диапазоны вроде 2..4. Пример: «Заказ 1 — 1..* ПозицияЗаказа» — у заказа есть хотя бы одна позиция.</w:t>
+      </w:r>
+    </w:p>
+    <w:p>
+      <w:pPr>
+        <w:spacing w:after="120" w:before="200"/>
+        <w:ind w:firstLine="0"/>
         <w:jc w:val="left"/>
       </w:pPr>
       <w:r>
@@ -883,7 +1176,8 @@
     </w:p>
     <w:p>
       <w:pPr>
-        <w:spacing w:after="120" w:before="0" w:line="276" w:lineRule="auto"/>
+        <w:spacing w:after="120" w:line="276" w:lineRule="auto"/>
+        <w:ind w:firstLine="709"/>
         <w:jc w:val="both"/>
       </w:pPr>
       <w:r>
@@ -893,18 +1187,18 @@
           <w:i w:val="0"/>
           <w:sz w:val="28"/>
         </w:rPr>
-        <w:t>Пример: система «Библиотека». Показаны актёры, прецеденты, &lt;&lt;include&gt;&gt; и &lt;&lt;extend&gt;&gt;.</w:t>
+        <w:t>Пример для системы «Библиотека»: актёры Читатель, Библиотекарь, Система уведомлений; отношения &lt;&lt;include&gt;&gt; и &lt;&lt;extend&gt;&gt;.</w:t>
       </w:r>
     </w:p>
     <w:p>
       <w:pPr>
-        <w:spacing w:before="80" w:after="40"/>
+        <w:spacing w:before="120" w:after="40"/>
         <w:jc w:val="center"/>
       </w:pPr>
       <w:r>
         <w:drawing>
           <wp:inline xmlns:a="http://schemas.openxmlformats.org/drawingml/2006/main" xmlns:pic="http://schemas.openxmlformats.org/drawingml/2006/picture">
-            <wp:extent cx="5943600" cy="4396239"/>
+            <wp:extent cx="5852160" cy="4328605"/>
             <wp:docPr id="3" name="Picture 3"/>
             <wp:cNvGraphicFramePr>
               <a:graphicFrameLocks noChangeAspect="1"/>
@@ -925,7 +1219,7 @@
                   <pic:spPr>
                     <a:xfrm>
                       <a:off x="0" y="0"/>
-                      <a:ext cx="5943600" cy="4396239"/>
+                      <a:ext cx="5852160" cy="4328605"/>
                     </a:xfrm>
                     <a:prstGeom prst="rect"/>
                   </pic:spPr>
@@ -938,7 +1232,8 @@
     </w:p>
     <w:p>
       <w:pPr>
-        <w:spacing w:after="160" w:before="0" w:line="276" w:lineRule="auto"/>
+        <w:spacing w:after="200" w:before="0"/>
+        <w:ind w:firstLine="0"/>
         <w:jc w:val="center"/>
       </w:pPr>
       <w:r>
@@ -958,7 +1253,8 @@
     </w:p>
     <w:p>
       <w:pPr>
-        <w:spacing w:after="160" w:before="240" w:line="276" w:lineRule="auto"/>
+        <w:spacing w:after="200" w:before="240"/>
+        <w:ind w:firstLine="0"/>
         <w:jc w:val="center"/>
       </w:pPr>
       <w:r>
@@ -973,7 +1269,8 @@
     </w:p>
     <w:p>
       <w:pPr>
-        <w:spacing w:after="80" w:before="160" w:line="276" w:lineRule="auto"/>
+        <w:spacing w:after="120" w:before="200"/>
+        <w:ind w:firstLine="0"/>
         <w:jc w:val="left"/>
       </w:pPr>
       <w:r>
@@ -988,22 +1285,8 @@
     </w:p>
     <w:p>
       <w:pPr>
-        <w:spacing w:after="120" w:before="0" w:line="276" w:lineRule="auto"/>
-        <w:jc w:val="both"/>
-      </w:pPr>
-      <w:r>
-        <w:rPr>
-          <w:rFonts w:ascii="Times New Roman" w:hAnsi="Times New Roman" w:eastAsia="Times New Roman"/>
-          <w:b w:val="0"/>
-          <w:i w:val="0"/>
-          <w:sz w:val="28"/>
-        </w:rPr>
-        <w:t>Назначение: взаимодействие объектов во времени. Элементы: объекты, линии жизни, сообщения, активации.</w:t>
-      </w:r>
-    </w:p>
-    <w:p>
-      <w:pPr>
-        <w:spacing w:after="120" w:line="276" w:lineRule="auto"/>
+        <w:spacing w:after="160" w:line="276" w:lineRule="auto"/>
+        <w:ind w:firstLine="709"/>
         <w:jc w:val="both"/>
       </w:pPr>
       <w:r>
@@ -1013,7 +1296,7 @@
           <w:i w:val="0"/>
           <w:sz w:val="28"/>
         </w:rPr>
-        <w:t xml:space="preserve">Синхронные — </w:t>
+        <w:t xml:space="preserve">Назначение диаграммы последовательности. </w:t>
       </w:r>
       <w:r>
         <w:rPr>
@@ -1022,8 +1305,15 @@
           <w:i w:val="0"/>
           <w:sz w:val="28"/>
         </w:rPr>
-        <w:t xml:space="preserve">ждут ответа (закрашенный наконечник). </w:t>
+        <w:t>Описывает взаимодействие объектов во времени: какие сообщения и в каком порядке при выполнении сценария (часто одного прецедента). Помогает уточнить динамику системы и спроектировать вызовы между компонентами. Главная ось — время (сверху вниз).</w:t>
       </w:r>
+    </w:p>
+    <w:p>
+      <w:pPr>
+        <w:spacing w:after="160" w:line="276" w:lineRule="auto"/>
+        <w:ind w:firstLine="709"/>
+        <w:jc w:val="both"/>
+      </w:pPr>
       <w:r>
         <w:rPr>
           <w:rFonts w:ascii="Times New Roman" w:hAnsi="Times New Roman" w:eastAsia="Times New Roman"/>
@@ -1031,7 +1321,7 @@
           <w:i w:val="0"/>
           <w:sz w:val="28"/>
         </w:rPr>
-        <w:t xml:space="preserve">Асинхронные — </w:t>
+        <w:t xml:space="preserve">Объекты (участники). </w:t>
       </w:r>
       <w:r>
         <w:rPr>
@@ -1040,14 +1330,24 @@
           <w:i w:val="0"/>
           <w:sz w:val="28"/>
         </w:rPr>
-        <w:t>не ждут ответа (открытый наконечник).</w:t>
+        <w:t>Роли или экземпляры классов во взаимодействии. Вверху диаграммы — прямоугольник с именем «имя:Класс» или «:Класс». Слева часто ставят актёра, запускающего сценарий.</w:t>
       </w:r>
     </w:p>
     <w:p>
       <w:pPr>
-        <w:spacing w:after="120" w:before="0" w:line="276" w:lineRule="auto"/>
+        <w:spacing w:after="160" w:line="276" w:lineRule="auto"/>
+        <w:ind w:firstLine="709"/>
         <w:jc w:val="both"/>
       </w:pPr>
+      <w:r>
+        <w:rPr>
+          <w:rFonts w:ascii="Times New Roman" w:hAnsi="Times New Roman" w:eastAsia="Times New Roman"/>
+          <w:b/>
+          <w:i w:val="0"/>
+          <w:sz w:val="28"/>
+        </w:rPr>
+        <w:t xml:space="preserve">Линии жизни. </w:t>
+      </w:r>
       <w:r>
         <w:rPr>
           <w:rFonts w:ascii="Times New Roman" w:hAnsi="Times New Roman" w:eastAsia="Times New Roman"/>
@@ -1055,12 +1355,88 @@
           <w:i w:val="0"/>
           <w:sz w:val="28"/>
         </w:rPr>
-        <w:t>Пример — рисунок 1.</w:t>
+        <w:t>Вертикальная пунктирная линия вниз от участника. Показывает период участия объекта на диаграмме. Пока объект может принимать сообщения, линия жизни продолжается.</w:t>
       </w:r>
     </w:p>
     <w:p>
       <w:pPr>
-        <w:spacing w:after="80" w:before="160" w:line="276" w:lineRule="auto"/>
+        <w:spacing w:after="160" w:line="276" w:lineRule="auto"/>
+        <w:ind w:firstLine="709"/>
+        <w:jc w:val="both"/>
+      </w:pPr>
+      <w:r>
+        <w:rPr>
+          <w:rFonts w:ascii="Times New Roman" w:hAnsi="Times New Roman" w:eastAsia="Times New Roman"/>
+          <w:b/>
+          <w:i w:val="0"/>
+          <w:sz w:val="28"/>
+        </w:rPr>
+        <w:t xml:space="preserve">Сообщения. </w:t>
+      </w:r>
+      <w:r>
+        <w:rPr>
+          <w:rFonts w:ascii="Times New Roman" w:hAnsi="Times New Roman" w:eastAsia="Times New Roman"/>
+          <w:b w:val="0"/>
+          <w:i w:val="0"/>
+          <w:sz w:val="28"/>
+        </w:rPr>
+        <w:t>Передача управления или данных от одного участника другому — горизонтальная стрелка с подписью. Порядок читается сверху вниз. На время обработки на линии жизни рисуют прямоугольник активации.</w:t>
+      </w:r>
+    </w:p>
+    <w:p>
+      <w:pPr>
+        <w:spacing w:after="160" w:line="276" w:lineRule="auto"/>
+        <w:ind w:firstLine="709"/>
+        <w:jc w:val="both"/>
+      </w:pPr>
+      <w:r>
+        <w:rPr>
+          <w:rFonts w:ascii="Times New Roman" w:hAnsi="Times New Roman" w:eastAsia="Times New Roman"/>
+          <w:b/>
+          <w:i w:val="0"/>
+          <w:sz w:val="28"/>
+        </w:rPr>
+        <w:t xml:space="preserve">Синхронные сообщения. </w:t>
+      </w:r>
+      <w:r>
+        <w:rPr>
+          <w:rFonts w:ascii="Times New Roman" w:hAnsi="Times New Roman" w:eastAsia="Times New Roman"/>
+          <w:b w:val="0"/>
+          <w:i w:val="0"/>
+          <w:sz w:val="28"/>
+        </w:rPr>
+        <w:t>Отправитель передаёт вызов и ждёт завершения обработки и ответа. Рисуют сплошной стрелкой с закрашенным наконечником. Это обычный вызов метода: пока нет результата, вызывающий ждёт.</w:t>
+      </w:r>
+    </w:p>
+    <w:p>
+      <w:pPr>
+        <w:spacing w:after="160" w:line="276" w:lineRule="auto"/>
+        <w:ind w:firstLine="709"/>
+        <w:jc w:val="both"/>
+      </w:pPr>
+      <w:r>
+        <w:rPr>
+          <w:rFonts w:ascii="Times New Roman" w:hAnsi="Times New Roman" w:eastAsia="Times New Roman"/>
+          <w:b/>
+          <w:i w:val="0"/>
+          <w:sz w:val="28"/>
+        </w:rPr>
+        <w:t xml:space="preserve">Асинхронные сообщения. </w:t>
+      </w:r>
+      <w:r>
+        <w:rPr>
+          <w:rFonts w:ascii="Times New Roman" w:hAnsi="Times New Roman" w:eastAsia="Times New Roman"/>
+          <w:b w:val="0"/>
+          <w:i w:val="0"/>
+          <w:sz w:val="28"/>
+        </w:rPr>
+        <w:t>Отправитель не ждёт ответа и сразу продолжает работу. Обозначают стрелкой с открытым наконечником. Типичны для событий, сигналов, уведомлений и параллельной обработки.</w:t>
+      </w:r>
+    </w:p>
+    <w:p>
+      <w:pPr>
+        <w:spacing w:after="120" w:before="200"/>
+        <w:ind w:firstLine="0"/>
         <w:jc w:val="left"/>
       </w:pPr>
       <w:r>
@@ -1075,9 +1451,19 @@
     </w:p>
     <w:p>
       <w:pPr>
-        <w:spacing w:after="120" w:before="0" w:line="276" w:lineRule="auto"/>
+        <w:spacing w:after="160" w:line="276" w:lineRule="auto"/>
+        <w:ind w:firstLine="709"/>
         <w:jc w:val="both"/>
       </w:pPr>
+      <w:r>
+        <w:rPr>
+          <w:rFonts w:ascii="Times New Roman" w:hAnsi="Times New Roman" w:eastAsia="Times New Roman"/>
+          <w:b/>
+          <w:i w:val="0"/>
+          <w:sz w:val="28"/>
+        </w:rPr>
+        <w:t xml:space="preserve">Управление конфигурацией ПО (SCM) — </w:t>
+      </w:r>
       <w:r>
         <w:rPr>
           <w:rFonts w:ascii="Times New Roman" w:hAnsi="Times New Roman" w:eastAsia="Times New Roman"/>
@@ -1085,12 +1471,38 @@
           <w:i w:val="0"/>
           <w:sz w:val="28"/>
         </w:rPr>
-        <w:t>SCM — идентификация, контроль изменений, учёт и аудит элементов конфигурации; воспроизводимость сборок/релизов. Идентификация конфигурации — уникальные ID, версии, baselines, состав релиза.</w:t>
+        <w:t>совокупность процессов учёта состава программного продукта, контроля его изменений и восстановления любой утверждённой версии. В конфигурацию входят исходные файлы, модули, документы, сборки, релизы. SCM отвечает, что входит в версию, кто внёс изменение и можно ли повторить ту же сборку. Без этого сложно сопровождать продукт и понимать, какая версия стоит у заказчика.</w:t>
       </w:r>
     </w:p>
     <w:p>
       <w:pPr>
-        <w:spacing w:after="80" w:before="160" w:line="276" w:lineRule="auto"/>
+        <w:spacing w:after="160" w:line="276" w:lineRule="auto"/>
+        <w:ind w:firstLine="709"/>
+        <w:jc w:val="both"/>
+      </w:pPr>
+      <w:r>
+        <w:rPr>
+          <w:rFonts w:ascii="Times New Roman" w:hAnsi="Times New Roman" w:eastAsia="Times New Roman"/>
+          <w:b/>
+          <w:i w:val="0"/>
+          <w:sz w:val="28"/>
+        </w:rPr>
+        <w:t xml:space="preserve">Идентификация конфигурации — </w:t>
+      </w:r>
+      <w:r>
+        <w:rPr>
+          <w:rFonts w:ascii="Times New Roman" w:hAnsi="Times New Roman" w:eastAsia="Times New Roman"/>
+          <w:b w:val="0"/>
+          <w:i w:val="0"/>
+          <w:sz w:val="28"/>
+        </w:rPr>
+        <w:t>процесс, в котором каждому элементу конфигурации дают уникальное обозначение и фиксируют версию. Включает выбор элементов (configuration items), правила именования и нумерации, базовые линии (baselines) — утверждённые наборы версий — и описание состава релиза. Так создаётся «паспорт» системы для дальнейшего отслеживания изменений.</w:t>
+      </w:r>
+    </w:p>
+    <w:p>
+      <w:pPr>
+        <w:spacing w:after="120" w:before="200"/>
+        <w:ind w:firstLine="0"/>
         <w:jc w:val="left"/>
       </w:pPr>
       <w:r>
@@ -1105,7 +1517,33 @@
     </w:p>
     <w:p>
       <w:pPr>
-        <w:spacing w:after="120" w:before="0" w:line="276" w:lineRule="auto"/>
+        <w:spacing w:after="160" w:line="276" w:lineRule="auto"/>
+        <w:ind w:firstLine="709"/>
+        <w:jc w:val="both"/>
+      </w:pPr>
+      <w:r>
+        <w:rPr>
+          <w:rFonts w:ascii="Times New Roman" w:hAnsi="Times New Roman" w:eastAsia="Times New Roman"/>
+          <w:b/>
+          <w:i w:val="0"/>
+          <w:sz w:val="28"/>
+        </w:rPr>
+        <w:t xml:space="preserve">Agile (гибкая методология разработки) — </w:t>
+      </w:r>
+      <w:r>
+        <w:rPr>
+          <w:rFonts w:ascii="Times New Roman" w:hAnsi="Times New Roman" w:eastAsia="Times New Roman"/>
+          <w:b w:val="0"/>
+          <w:i w:val="0"/>
+          <w:sz w:val="28"/>
+        </w:rPr>
+        <w:t>подход к созданию ПО на коротких итерациях, с регулярной поставкой рабочего результата, тесным сотрудничеством с заказчиком и готовностью менять требования. Ценятся люди и взаимодействие, работающий продукт, сотрудничество с клиентом и реакция на изменения (Agile Manifesto, 2001). Вместо попытки сразу утвердить всё ТЗ команда идёт небольшими поставками и получает обратную связь.</w:t>
+      </w:r>
+    </w:p>
+    <w:p>
+      <w:pPr>
+        <w:spacing w:after="120" w:line="276" w:lineRule="auto"/>
+        <w:ind w:firstLine="709"/>
         <w:jc w:val="both"/>
       </w:pPr>
       <w:r>
@@ -1115,28 +1553,13 @@
           <w:i w:val="0"/>
           <w:sz w:val="28"/>
         </w:rPr>
-        <w:t>Agile — итеративная поставка ценности, сотрудничество с заказчиком, готовность к изменениям, самоорганизующиеся команды.</w:t>
-      </w:r>
-    </w:p>
-    <w:p>
-      <w:pPr>
-        <w:spacing w:after="40" w:before="0" w:line="276" w:lineRule="auto"/>
-        <w:jc w:val="left"/>
-      </w:pPr>
-      <w:r>
-        <w:rPr>
-          <w:rFonts w:ascii="Times New Roman" w:hAnsi="Times New Roman" w:eastAsia="Times New Roman"/>
-          <w:b/>
-          <w:i w:val="0"/>
-          <w:sz w:val="28"/>
-        </w:rPr>
-        <w:t>12 принципов Манифеста:</w:t>
+        <w:t>Принципы Agile (12 принципов Манифеста):</w:t>
       </w:r>
     </w:p>
     <w:p>
       <w:pPr>
         <w:pStyle w:val="ListBullet"/>
-        <w:spacing w:after="40"/>
+        <w:spacing w:after="60"/>
       </w:pPr>
       <w:r>
         <w:rPr>
@@ -1145,13 +1568,13 @@
           <w:i w:val="0"/>
           <w:sz w:val="28"/>
         </w:rPr>
-        <w:t>Ранняя и регулярная поставка ценного ПО</w:t>
+        <w:t>Наивысший приоритет — удовлетворять заказчика регулярной и ранней поставкой ценного ПО.</w:t>
       </w:r>
     </w:p>
     <w:p>
       <w:pPr>
         <w:pStyle w:val="ListBullet"/>
-        <w:spacing w:after="40"/>
+        <w:spacing w:after="60"/>
       </w:pPr>
       <w:r>
         <w:rPr>
@@ -1160,13 +1583,13 @@
           <w:i w:val="0"/>
           <w:sz w:val="28"/>
         </w:rPr>
-        <w:t>Приветствие изменений требований</w:t>
+        <w:t>Изменение требований приветствуется даже на поздних стадиях разработки.</w:t>
       </w:r>
     </w:p>
     <w:p>
       <w:pPr>
         <w:pStyle w:val="ListBullet"/>
-        <w:spacing w:after="40"/>
+        <w:spacing w:after="60"/>
       </w:pPr>
       <w:r>
         <w:rPr>
@@ -1175,13 +1598,13 @@
           <w:i w:val="0"/>
           <w:sz w:val="28"/>
         </w:rPr>
-        <w:t>Частая поставка рабочего ПО</w:t>
+        <w:t>Рабочее ПО следует поставлять как можно чаще — от пары недель до пары месяцев.</w:t>
       </w:r>
     </w:p>
     <w:p>
       <w:pPr>
         <w:pStyle w:val="ListBullet"/>
-        <w:spacing w:after="40"/>
+        <w:spacing w:after="60"/>
       </w:pPr>
       <w:r>
         <w:rPr>
@@ -1190,13 +1613,13 @@
           <w:i w:val="0"/>
           <w:sz w:val="28"/>
         </w:rPr>
-        <w:t>Ежедневное сотрудничество бизнеса и разработчиков</w:t>
+        <w:t>Бизнес и разработчики должны ежедневно работать вместе на протяжении проекта.</w:t>
       </w:r>
     </w:p>
     <w:p>
       <w:pPr>
         <w:pStyle w:val="ListBullet"/>
-        <w:spacing w:after="40"/>
+        <w:spacing w:after="60"/>
       </w:pPr>
       <w:r>
         <w:rPr>
@@ -1205,13 +1628,13 @@
           <w:i w:val="0"/>
           <w:sz w:val="28"/>
         </w:rPr>
-        <w:t>Мотивированные люди и доверие</w:t>
+        <w:t>Над проектом работают мотивированные люди; им создают условия, поддержку и доверие.</w:t>
       </w:r>
     </w:p>
     <w:p>
       <w:pPr>
         <w:pStyle w:val="ListBullet"/>
-        <w:spacing w:after="40"/>
+        <w:spacing w:after="60"/>
       </w:pPr>
       <w:r>
         <w:rPr>
@@ -1220,13 +1643,13 @@
           <w:i w:val="0"/>
           <w:sz w:val="28"/>
         </w:rPr>
-        <w:t>Личное общение как лучший способ коммуникации</w:t>
+        <w:t>Самый эффективный способ передачи информации в команде — личный разговор.</w:t>
       </w:r>
     </w:p>
     <w:p>
       <w:pPr>
         <w:pStyle w:val="ListBullet"/>
-        <w:spacing w:after="40"/>
+        <w:spacing w:after="60"/>
       </w:pPr>
       <w:r>
         <w:rPr>
@@ -1235,13 +1658,13 @@
           <w:i w:val="0"/>
           <w:sz w:val="28"/>
         </w:rPr>
-        <w:t>Рабочее ПО — главный показатель прогресса</w:t>
+        <w:t>Рабочее программное обеспечение — главный измеритель прогресса.</w:t>
       </w:r>
     </w:p>
     <w:p>
       <w:pPr>
         <w:pStyle w:val="ListBullet"/>
-        <w:spacing w:after="40"/>
+        <w:spacing w:after="60"/>
       </w:pPr>
       <w:r>
         <w:rPr>
@@ -1250,13 +1673,13 @@
           <w:i w:val="0"/>
           <w:sz w:val="28"/>
         </w:rPr>
-        <w:t>Устойчивый темп</w:t>
+        <w:t>Процессы должны поддерживать постоянный и устойчивый темп работы.</w:t>
       </w:r>
     </w:p>
     <w:p>
       <w:pPr>
         <w:pStyle w:val="ListBullet"/>
-        <w:spacing w:after="40"/>
+        <w:spacing w:after="60"/>
       </w:pPr>
       <w:r>
         <w:rPr>
@@ -1265,13 +1688,13 @@
           <w:i w:val="0"/>
           <w:sz w:val="28"/>
         </w:rPr>
-        <w:t>Техническое совершенство и дизайн</w:t>
+        <w:t>Постоянное внимание к техническому совершенству и хорошему дизайну повышает гибкость.</w:t>
       </w:r>
     </w:p>
     <w:p>
       <w:pPr>
         <w:pStyle w:val="ListBullet"/>
-        <w:spacing w:after="40"/>
+        <w:spacing w:after="60"/>
       </w:pPr>
       <w:r>
         <w:rPr>
@@ -1280,13 +1703,13 @@
           <w:i w:val="0"/>
           <w:sz w:val="28"/>
         </w:rPr>
-        <w:t>Простота</w:t>
+        <w:t>Простота — искусство не делать лишней работы — крайне необходима.</w:t>
       </w:r>
     </w:p>
     <w:p>
       <w:pPr>
         <w:pStyle w:val="ListBullet"/>
-        <w:spacing w:after="40"/>
+        <w:spacing w:after="60"/>
       </w:pPr>
       <w:r>
         <w:rPr>
@@ -1295,13 +1718,13 @@
           <w:i w:val="0"/>
           <w:sz w:val="28"/>
         </w:rPr>
-        <w:t>Самоорганизующиеся команды</w:t>
+        <w:t>Лучшие архитектуры, требования и решения рождаются у самоорганизующихся команд.</w:t>
       </w:r>
     </w:p>
     <w:p>
       <w:pPr>
         <w:pStyle w:val="ListBullet"/>
-        <w:spacing w:after="40"/>
+        <w:spacing w:after="60"/>
       </w:pPr>
       <w:r>
         <w:rPr>
@@ -1310,12 +1733,13 @@
           <w:i w:val="0"/>
           <w:sz w:val="28"/>
         </w:rPr>
-        <w:t>Регулярная рефлексия и улучшение</w:t>
+        <w:t>Команда регулярно анализирует, как стать эффективнее, и корректирует работу.</w:t>
       </w:r>
     </w:p>
     <w:p>
       <w:pPr>
-        <w:spacing w:after="80" w:before="160" w:line="276" w:lineRule="auto"/>
+        <w:spacing w:after="120" w:before="200"/>
+        <w:ind w:firstLine="0"/>
         <w:jc w:val="left"/>
       </w:pPr>
       <w:r>
@@ -1330,7 +1754,8 @@
     </w:p>
     <w:p>
       <w:pPr>
-        <w:spacing w:after="120" w:before="0" w:line="276" w:lineRule="auto"/>
+        <w:spacing w:after="120" w:line="276" w:lineRule="auto"/>
+        <w:ind w:firstLine="709"/>
         <w:jc w:val="both"/>
       </w:pPr>
       <w:r>
@@ -1340,18 +1765,18 @@
           <w:i w:val="0"/>
           <w:sz w:val="28"/>
         </w:rPr>
-        <w:t>Пример: учёт заказов.</w:t>
+        <w:t>Пример предметной области «учёт заказов»: Покупатель, Заказ, ПозицияЗаказа, Товар, интерфейс Оплата.</w:t>
       </w:r>
     </w:p>
     <w:p>
       <w:pPr>
-        <w:spacing w:before="80" w:after="40"/>
+        <w:spacing w:before="120" w:after="40"/>
         <w:jc w:val="center"/>
       </w:pPr>
       <w:r>
         <w:drawing>
           <wp:inline xmlns:a="http://schemas.openxmlformats.org/drawingml/2006/main" xmlns:pic="http://schemas.openxmlformats.org/drawingml/2006/picture">
-            <wp:extent cx="5852160" cy="4586245"/>
+            <wp:extent cx="5760720" cy="4514585"/>
             <wp:docPr id="4" name="Picture 4"/>
             <wp:cNvGraphicFramePr>
               <a:graphicFrameLocks noChangeAspect="1"/>
@@ -1372,7 +1797,7 @@
                   <pic:spPr>
                     <a:xfrm>
                       <a:off x="0" y="0"/>
-                      <a:ext cx="5852160" cy="4586245"/>
+                      <a:ext cx="5760720" cy="4514585"/>
                     </a:xfrm>
                     <a:prstGeom prst="rect"/>
                   </pic:spPr>
@@ -1385,7 +1810,8 @@
     </w:p>
     <w:p>
       <w:pPr>
-        <w:spacing w:after="160" w:before="0" w:line="276" w:lineRule="auto"/>
+        <w:spacing w:after="200" w:before="0"/>
+        <w:ind w:firstLine="0"/>
         <w:jc w:val="center"/>
       </w:pPr>
       <w:r>
@@ -1405,7 +1831,8 @@
     </w:p>
     <w:p>
       <w:pPr>
-        <w:spacing w:after="160" w:before="240" w:line="276" w:lineRule="auto"/>
+        <w:spacing w:after="200" w:before="240"/>
+        <w:ind w:firstLine="0"/>
         <w:jc w:val="center"/>
       </w:pPr>
       <w:r>
@@ -1420,22 +1847,24 @@
     </w:p>
     <w:p>
       <w:pPr>
-        <w:spacing w:after="120" w:before="0" w:line="276" w:lineRule="auto"/>
-        <w:jc w:val="left"/>
+        <w:spacing w:after="160" w:before="0"/>
+        <w:ind w:firstLine="0"/>
+        <w:jc w:val="both"/>
       </w:pPr>
       <w:r>
         <w:rPr>
           <w:rFonts w:ascii="Times New Roman" w:hAnsi="Times New Roman" w:eastAsia="Times New Roman"/>
           <w:b w:val="0"/>
           <w:i/>
-          <w:sz w:val="28"/>
+          <w:sz w:val="24"/>
         </w:rPr>
-        <w:t>Примечание: в бланке п. 1 и п. 2 сформулированы одинаково.</w:t>
+        <w:t>Примечание: в бланке пункты 1 и 2 сформулированы одинаково (оба про диаграмму коммуникации). Ниже — полный ответ; для задания 2 дополнительно углублено сравнение с диаграммой последовательности.</w:t>
       </w:r>
     </w:p>
     <w:p>
       <w:pPr>
-        <w:spacing w:after="80" w:before="160" w:line="276" w:lineRule="auto"/>
+        <w:spacing w:after="120" w:before="200"/>
+        <w:ind w:firstLine="0"/>
         <w:jc w:val="left"/>
       </w:pPr>
       <w:r>
@@ -1445,14 +1874,24 @@
           <w:i w:val="0"/>
           <w:sz w:val="28"/>
         </w:rPr>
-        <w:t>Задание 1–2. Диаграмма коммуникации (3–6 баллов)</w:t>
+        <w:t>Задание 1. Диаграмма коммуникации (3–4 балла)</w:t>
       </w:r>
     </w:p>
     <w:p>
       <w:pPr>
-        <w:spacing w:after="120" w:before="0" w:line="276" w:lineRule="auto"/>
+        <w:spacing w:after="160" w:line="276" w:lineRule="auto"/>
+        <w:ind w:firstLine="709"/>
         <w:jc w:val="both"/>
       </w:pPr>
+      <w:r>
+        <w:rPr>
+          <w:rFonts w:ascii="Times New Roman" w:hAnsi="Times New Roman" w:eastAsia="Times New Roman"/>
+          <w:b/>
+          <w:i w:val="0"/>
+          <w:sz w:val="28"/>
+        </w:rPr>
+        <w:t xml:space="preserve">Назначение диаграммы коммуникации. </w:t>
+      </w:r>
       <w:r>
         <w:rPr>
           <w:rFonts w:ascii="Times New Roman" w:hAnsi="Times New Roman" w:eastAsia="Times New Roman"/>
@@ -1460,18 +1899,159 @@
           <w:i w:val="0"/>
           <w:sz w:val="28"/>
         </w:rPr>
-        <w:t>Назначение: структура связей объектов и нумерованные сообщения. В отличие от sequence, акцент на топологии связей, а не на оси времени.</w:t>
+        <w:t>Показывает, как объекты связаны и какими сообщениями обмениваются при выполнении сценария. Акцент — на структуре взаимодействия («кто с кем связан»), а не на вертикальной шкале времени. Порядок сообщений задаётся номерами (1, 2, 1.1…). Диаграмму применяют при анализе и проектировании как «карту» обмена сообщениями.</w:t>
       </w:r>
     </w:p>
     <w:p>
       <w:pPr>
-        <w:spacing w:before="80" w:after="40"/>
+        <w:spacing w:after="160" w:line="276" w:lineRule="auto"/>
+        <w:ind w:firstLine="709"/>
+        <w:jc w:val="both"/>
+      </w:pPr>
+      <w:r>
+        <w:rPr>
+          <w:rFonts w:ascii="Times New Roman" w:hAnsi="Times New Roman" w:eastAsia="Times New Roman"/>
+          <w:b/>
+          <w:i w:val="0"/>
+          <w:sz w:val="28"/>
+        </w:rPr>
+        <w:t xml:space="preserve">Основные элементы. </w:t>
+      </w:r>
+      <w:r>
+        <w:rPr>
+          <w:rFonts w:ascii="Times New Roman" w:hAnsi="Times New Roman" w:eastAsia="Times New Roman"/>
+          <w:b w:val="0"/>
+          <w:i w:val="0"/>
+          <w:sz w:val="28"/>
+        </w:rPr>
+        <w:t>Участники (объекты/роли) — прямоугольники; связи между ними — линии; сообщения — стрелки вдоль связей с номером и именем операции. При необходимости добавляют актёров. Нумерация отражает последовательность и вложенность вызовов (1.1 выполняется внутри обработки сообщения 1).</w:t>
+      </w:r>
+    </w:p>
+    <w:p>
+      <w:pPr>
+        <w:spacing w:after="160" w:line="276" w:lineRule="auto"/>
+        <w:ind w:firstLine="709"/>
+        <w:jc w:val="both"/>
+      </w:pPr>
+      <w:r>
+        <w:rPr>
+          <w:rFonts w:ascii="Times New Roman" w:hAnsi="Times New Roman" w:eastAsia="Times New Roman"/>
+          <w:b/>
+          <w:i w:val="0"/>
+          <w:sz w:val="28"/>
+        </w:rPr>
+        <w:t xml:space="preserve">Сравнение с диаграммой последовательности и отличия. </w:t>
+      </w:r>
+      <w:r>
+        <w:rPr>
+          <w:rFonts w:ascii="Times New Roman" w:hAnsi="Times New Roman" w:eastAsia="Times New Roman"/>
+          <w:b w:val="0"/>
+          <w:i w:val="0"/>
+          <w:sz w:val="28"/>
+        </w:rPr>
+        <w:t>Обе диаграммы — диаграммы взаимодействия UML и могут описывать один сценарий. На sequence сообщения упорядочены по вертикали, видны линии жизни и активации. На communication важнее топология связей, время закодировано номерами. Sequence удобнее для длинных сценариев «по шагам», communication — для компактного обзора связей. Семантика сообщений одна и та же.</w:t>
+      </w:r>
+    </w:p>
+    <w:p>
+      <w:pPr>
+        <w:spacing w:after="120" w:before="200"/>
+        <w:ind w:firstLine="0"/>
+        <w:jc w:val="left"/>
+      </w:pPr>
+      <w:r>
+        <w:rPr>
+          <w:rFonts w:ascii="Times New Roman" w:hAnsi="Times New Roman" w:eastAsia="Times New Roman"/>
+          <w:b/>
+          <w:i w:val="0"/>
+          <w:sz w:val="28"/>
+        </w:rPr>
+        <w:t>Задание 2. Диаграмма коммуникации — углубление (5–6 баллов)</w:t>
+      </w:r>
+    </w:p>
+    <w:p>
+      <w:pPr>
+        <w:spacing w:after="160" w:line="276" w:lineRule="auto"/>
+        <w:ind w:firstLine="709"/>
+        <w:jc w:val="both"/>
+      </w:pPr>
+      <w:r>
+        <w:rPr>
+          <w:rFonts w:ascii="Times New Roman" w:hAnsi="Times New Roman" w:eastAsia="Times New Roman"/>
+          <w:b/>
+          <w:i w:val="0"/>
+          <w:sz w:val="28"/>
+        </w:rPr>
+        <w:t xml:space="preserve">Место диаграммы в UML. </w:t>
+      </w:r>
+      <w:r>
+        <w:rPr>
+          <w:rFonts w:ascii="Times New Roman" w:hAnsi="Times New Roman" w:eastAsia="Times New Roman"/>
+          <w:b w:val="0"/>
+          <w:i w:val="0"/>
+          <w:sz w:val="28"/>
+        </w:rPr>
+        <w:t>Относится к диаграммам поведения (взаимодействия). Её используют, когда уже понятны классы/объекты и нужно уточнить, как они совместно реализуют прецедент. По сути это другой взгляд на то же взаимодействие, что у sequence diagram.</w:t>
+      </w:r>
+    </w:p>
+    <w:p>
+      <w:pPr>
+        <w:spacing w:after="160" w:line="276" w:lineRule="auto"/>
+        <w:ind w:firstLine="709"/>
+        <w:jc w:val="both"/>
+      </w:pPr>
+      <w:r>
+        <w:rPr>
+          <w:rFonts w:ascii="Times New Roman" w:hAnsi="Times New Roman" w:eastAsia="Times New Roman"/>
+          <w:b/>
+          <w:i w:val="0"/>
+          <w:sz w:val="28"/>
+        </w:rPr>
+        <w:t xml:space="preserve">Элементы подробнее. </w:t>
+      </w:r>
+      <w:r>
+        <w:rPr>
+          <w:rFonts w:ascii="Times New Roman" w:hAnsi="Times New Roman" w:eastAsia="Times New Roman"/>
+          <w:b w:val="0"/>
+          <w:i w:val="0"/>
+          <w:sz w:val="28"/>
+        </w:rPr>
+        <w:t>Участники — роли классификаторов (обычно объекты классов). Связь означает канал передачи сообщений между объектами в данном взаимодействии. Сообщение — вызов операции или сигнал; стрелка указывает получателя. Вложенные вызовы показывают составными номерами: 1, 1.1, 1.2, 2.</w:t>
+      </w:r>
+    </w:p>
+    <w:p>
+      <w:pPr>
+        <w:spacing w:after="160" w:line="276" w:lineRule="auto"/>
+        <w:ind w:firstLine="709"/>
+        <w:jc w:val="both"/>
+      </w:pPr>
+      <w:r>
+        <w:rPr>
+          <w:rFonts w:ascii="Times New Roman" w:hAnsi="Times New Roman" w:eastAsia="Times New Roman"/>
+          <w:b/>
+          <w:i w:val="0"/>
+          <w:sz w:val="28"/>
+        </w:rPr>
+        <w:t xml:space="preserve">Когда выбирать communication, а когда sequence. </w:t>
+      </w:r>
+      <w:r>
+        <w:rPr>
+          <w:rFonts w:ascii="Times New Roman" w:hAnsi="Times New Roman" w:eastAsia="Times New Roman"/>
+          <w:b w:val="0"/>
+          <w:i w:val="0"/>
+          <w:sz w:val="28"/>
+        </w:rPr>
+        <w:t>Если важен порядок и ветвления во времени (alt, loop, opt) — обычно sequence. Если объектов много и нужна сеть связей — communication. Для контрольной достаточно объяснить оба представления и показать нумерованные сообщения на связях.</w:t>
+      </w:r>
+    </w:p>
+    <w:p>
+      <w:pPr>
+        <w:spacing w:before="120" w:after="40"/>
         <w:jc w:val="center"/>
       </w:pPr>
       <w:r>
         <w:drawing>
           <wp:inline xmlns:a="http://schemas.openxmlformats.org/drawingml/2006/main" xmlns:pic="http://schemas.openxmlformats.org/drawingml/2006/picture">
-            <wp:extent cx="5669280" cy="4337243"/>
+            <wp:extent cx="5577840" cy="4267287"/>
             <wp:docPr id="5" name="Picture 5"/>
             <wp:cNvGraphicFramePr>
               <a:graphicFrameLocks noChangeAspect="1"/>
@@ -1492,7 +2072,7 @@
                   <pic:spPr>
                     <a:xfrm>
                       <a:off x="0" y="0"/>
-                      <a:ext cx="5669280" cy="4337243"/>
+                      <a:ext cx="5577840" cy="4267287"/>
                     </a:xfrm>
                     <a:prstGeom prst="rect"/>
                   </pic:spPr>
@@ -1505,7 +2085,8 @@
     </w:p>
     <w:p>
       <w:pPr>
-        <w:spacing w:after="160" w:before="0" w:line="276" w:lineRule="auto"/>
+        <w:spacing w:after="200" w:before="0"/>
+        <w:ind w:firstLine="0"/>
         <w:jc w:val="center"/>
       </w:pPr>
       <w:r>
@@ -1520,7 +2101,8 @@
     </w:p>
     <w:p>
       <w:pPr>
-        <w:spacing w:after="80" w:before="160" w:line="276" w:lineRule="auto"/>
+        <w:spacing w:after="120" w:before="200"/>
+        <w:ind w:firstLine="0"/>
         <w:jc w:val="left"/>
       </w:pPr>
       <w:r>
@@ -1535,8 +2117,25 @@
     </w:p>
     <w:p>
       <w:pPr>
-        <w:spacing w:after="40" w:before="0" w:line="276" w:lineRule="auto"/>
-        <w:jc w:val="left"/>
+        <w:spacing w:after="120" w:line="276" w:lineRule="auto"/>
+        <w:ind w:firstLine="709"/>
+        <w:jc w:val="both"/>
+      </w:pPr>
+      <w:r>
+        <w:rPr>
+          <w:rFonts w:ascii="Times New Roman" w:hAnsi="Times New Roman" w:eastAsia="Times New Roman"/>
+          <w:b w:val="0"/>
+          <w:i w:val="0"/>
+          <w:sz w:val="28"/>
+        </w:rPr>
+        <w:t>Scrum — гибкий каркас управления разработкой короткими циклами (спринтами). В классическом Scrum — три роли и три основных артефакта.</w:t>
+      </w:r>
+    </w:p>
+    <w:p>
+      <w:pPr>
+        <w:spacing w:after="160" w:line="276" w:lineRule="auto"/>
+        <w:ind w:firstLine="709"/>
+        <w:jc w:val="both"/>
       </w:pPr>
       <w:r>
         <w:rPr>
@@ -1545,14 +2144,8 @@
           <w:i w:val="0"/>
           <w:sz w:val="28"/>
         </w:rPr>
-        <w:t>Роли:</w:t>
+        <w:t xml:space="preserve">Product Owner (Владелец продукта) — </w:t>
       </w:r>
-    </w:p>
-    <w:p>
-      <w:pPr>
-        <w:pStyle w:val="ListBullet"/>
-        <w:spacing w:after="40"/>
-      </w:pPr>
       <w:r>
         <w:rPr>
           <w:rFonts w:ascii="Times New Roman" w:hAnsi="Times New Roman" w:eastAsia="Times New Roman"/>
@@ -1560,43 +2153,14 @@
           <w:i w:val="0"/>
           <w:sz w:val="28"/>
         </w:rPr>
-        <w:t>Product Owner — Product Backlog, приоритеты, приёмка</w:t>
+        <w:t>отвечает за ценность продукта и содержание Product Backlog. Формулирует и упорядочивает требования, объясняет приоритеты, принимает результат и представляет интересы заказчика/пользователей. Именно он решает, что важнее сделать раньше.</w:t>
       </w:r>
     </w:p>
     <w:p>
       <w:pPr>
-        <w:pStyle w:val="ListBullet"/>
-        <w:spacing w:after="40"/>
-      </w:pPr>
-      <w:r>
-        <w:rPr>
-          <w:rFonts w:ascii="Times New Roman" w:hAnsi="Times New Roman" w:eastAsia="Times New Roman"/>
-          <w:b w:val="0"/>
-          <w:i w:val="0"/>
-          <w:sz w:val="28"/>
-        </w:rPr>
-        <w:t>Scrum Master — Scrum, препятствия, фасилитация</w:t>
-      </w:r>
-    </w:p>
-    <w:p>
-      <w:pPr>
-        <w:pStyle w:val="ListBullet"/>
-        <w:spacing w:after="40"/>
-      </w:pPr>
-      <w:r>
-        <w:rPr>
-          <w:rFonts w:ascii="Times New Roman" w:hAnsi="Times New Roman" w:eastAsia="Times New Roman"/>
-          <w:b w:val="0"/>
-          <w:i w:val="0"/>
-          <w:sz w:val="28"/>
-        </w:rPr>
-        <w:t>Developers — создание Инкремента</w:t>
-      </w:r>
-    </w:p>
-    <w:p>
-      <w:pPr>
-        <w:spacing w:after="40" w:before="0" w:line="276" w:lineRule="auto"/>
-        <w:jc w:val="left"/>
+        <w:spacing w:after="160" w:line="276" w:lineRule="auto"/>
+        <w:ind w:firstLine="709"/>
+        <w:jc w:val="both"/>
       </w:pPr>
       <w:r>
         <w:rPr>
@@ -1605,14 +2169,8 @@
           <w:i w:val="0"/>
           <w:sz w:val="28"/>
         </w:rPr>
-        <w:t>Артефакты:</w:t>
+        <w:t xml:space="preserve">Scrum Master — </w:t>
       </w:r>
-    </w:p>
-    <w:p>
-      <w:pPr>
-        <w:pStyle w:val="ListBullet"/>
-        <w:spacing w:after="40"/>
-      </w:pPr>
       <w:r>
         <w:rPr>
           <w:rFonts w:ascii="Times New Roman" w:hAnsi="Times New Roman" w:eastAsia="Times New Roman"/>
@@ -1620,14 +2178,24 @@
           <w:i w:val="0"/>
           <w:sz w:val="28"/>
         </w:rPr>
-        <w:t>Product Backlog</w:t>
+        <w:t>помогает команде правильно применять Scrum. Организует события (планирование, ежедневный Scrum, обзор, ретроспективу), устраняет препятствия и защищает команду от внешних помех. Это не начальник разработчиков, а наставник процесса.</w:t>
       </w:r>
     </w:p>
     <w:p>
       <w:pPr>
-        <w:pStyle w:val="ListBullet"/>
-        <w:spacing w:after="40"/>
+        <w:spacing w:after="160" w:line="276" w:lineRule="auto"/>
+        <w:ind w:firstLine="709"/>
+        <w:jc w:val="both"/>
       </w:pPr>
+      <w:r>
+        <w:rPr>
+          <w:rFonts w:ascii="Times New Roman" w:hAnsi="Times New Roman" w:eastAsia="Times New Roman"/>
+          <w:b/>
+          <w:i w:val="0"/>
+          <w:sz w:val="28"/>
+        </w:rPr>
+        <w:t xml:space="preserve">Developers (Команда разработки) — </w:t>
+      </w:r>
       <w:r>
         <w:rPr>
           <w:rFonts w:ascii="Times New Roman" w:hAnsi="Times New Roman" w:eastAsia="Times New Roman"/>
@@ -1635,14 +2203,24 @@
           <w:i w:val="0"/>
           <w:sz w:val="28"/>
         </w:rPr>
-        <w:t>Sprint Backlog</w:t>
+        <w:t>кросс-функциональная группа, которая создаёт Инкремент продукта. Сама оценивает объём работы, выбирает способ реализации задач спринта и несёт общую ответственность за результат. В составе могут быть программисты, тестировщики, аналитики и др.</w:t>
       </w:r>
     </w:p>
     <w:p>
       <w:pPr>
-        <w:pStyle w:val="ListBullet"/>
-        <w:spacing w:after="40"/>
+        <w:spacing w:after="160" w:line="276" w:lineRule="auto"/>
+        <w:ind w:firstLine="709"/>
+        <w:jc w:val="both"/>
       </w:pPr>
+      <w:r>
+        <w:rPr>
+          <w:rFonts w:ascii="Times New Roman" w:hAnsi="Times New Roman" w:eastAsia="Times New Roman"/>
+          <w:b/>
+          <w:i w:val="0"/>
+          <w:sz w:val="28"/>
+        </w:rPr>
+        <w:t xml:space="preserve">Product Backlog — </w:t>
+      </w:r>
       <w:r>
         <w:rPr>
           <w:rFonts w:ascii="Times New Roman" w:hAnsi="Times New Roman" w:eastAsia="Times New Roman"/>
@@ -1650,12 +2228,63 @@
           <w:i w:val="0"/>
           <w:sz w:val="28"/>
         </w:rPr>
-        <w:t>Increment (+ Definition of Done)</w:t>
+        <w:t>упорядоченный список всего, что может понадобиться в продукте: функции, улучшения, дефекты, технические задачи. Это «живой» артефакт, который постоянно уточняется. За содержание и приоритеты отвечает Product Owner.</w:t>
       </w:r>
     </w:p>
     <w:p>
       <w:pPr>
-        <w:spacing w:after="80" w:before="160" w:line="276" w:lineRule="auto"/>
+        <w:spacing w:after="160" w:line="276" w:lineRule="auto"/>
+        <w:ind w:firstLine="709"/>
+        <w:jc w:val="both"/>
+      </w:pPr>
+      <w:r>
+        <w:rPr>
+          <w:rFonts w:ascii="Times New Roman" w:hAnsi="Times New Roman" w:eastAsia="Times New Roman"/>
+          <w:b/>
+          <w:i w:val="0"/>
+          <w:sz w:val="28"/>
+        </w:rPr>
+        <w:t xml:space="preserve">Sprint Backlog — </w:t>
+      </w:r>
+      <w:r>
+        <w:rPr>
+          <w:rFonts w:ascii="Times New Roman" w:hAnsi="Times New Roman" w:eastAsia="Times New Roman"/>
+          <w:b w:val="0"/>
+          <w:i w:val="0"/>
+          <w:sz w:val="28"/>
+        </w:rPr>
+        <w:t>элементы Product Backlog, выбранные на текущий спринт, плюс план их реализации. Принадлежит команде разработки: формируется на планировании и обновляется по ходу спринта.</w:t>
+      </w:r>
+    </w:p>
+    <w:p>
+      <w:pPr>
+        <w:spacing w:after="160" w:line="276" w:lineRule="auto"/>
+        <w:ind w:firstLine="709"/>
+        <w:jc w:val="both"/>
+      </w:pPr>
+      <w:r>
+        <w:rPr>
+          <w:rFonts w:ascii="Times New Roman" w:hAnsi="Times New Roman" w:eastAsia="Times New Roman"/>
+          <w:b/>
+          <w:i w:val="0"/>
+          <w:sz w:val="28"/>
+        </w:rPr>
+        <w:t xml:space="preserve">Increment (Инкремент) — </w:t>
+      </w:r>
+      <w:r>
+        <w:rPr>
+          <w:rFonts w:ascii="Times New Roman" w:hAnsi="Times New Roman" w:eastAsia="Times New Roman"/>
+          <w:b w:val="0"/>
+          <w:i w:val="0"/>
+          <w:sz w:val="28"/>
+        </w:rPr>
+        <w:t>сумма элементов бэклога, завершённых в спринте, и ценности предыдущих инкрементов. Должен быть пригоден к использованию и соответствовать Definition of Done. К концу спринта показывают работоспособный прирост продукта, а не «почти готовый» код.</w:t>
+      </w:r>
+    </w:p>
+    <w:p>
+      <w:pPr>
+        <w:spacing w:after="120" w:before="200"/>
+        <w:ind w:firstLine="0"/>
         <w:jc w:val="left"/>
       </w:pPr>
       <w:r>
@@ -1670,7 +2299,8 @@
     </w:p>
     <w:p>
       <w:pPr>
-        <w:spacing w:after="120" w:before="0" w:line="276" w:lineRule="auto"/>
+        <w:spacing w:after="120" w:line="276" w:lineRule="auto"/>
+        <w:ind w:firstLine="709"/>
         <w:jc w:val="both"/>
       </w:pPr>
       <w:r>
@@ -1680,12 +2310,12 @@
           <w:i w:val="0"/>
           <w:sz w:val="28"/>
         </w:rPr>
-        <w:t>Пример: жизненный цикл заказа.</w:t>
+        <w:t>Диаграмма состояний показывает, в каких состояниях может быть объект и по каким событиям он переходит между ними. Пример — жизненный цикл заказа от создания до закрытия, включая отмену.</w:t>
       </w:r>
     </w:p>
     <w:p>
       <w:pPr>
-        <w:spacing w:before="80" w:after="40"/>
+        <w:spacing w:before="120" w:after="40"/>
         <w:jc w:val="center"/>
       </w:pPr>
       <w:r>
@@ -1725,7 +2355,8 @@
     </w:p>
     <w:p>
       <w:pPr>
-        <w:spacing w:after="160" w:before="0" w:line="276" w:lineRule="auto"/>
+        <w:spacing w:after="200" w:before="0"/>
+        <w:ind w:firstLine="0"/>
         <w:jc w:val="center"/>
       </w:pPr>
       <w:r>
@@ -1740,7 +2371,8 @@
     </w:p>
     <w:p>
       <w:pPr>
-        <w:spacing w:after="120" w:before="200" w:line="276" w:lineRule="auto"/>
+        <w:spacing w:after="120" w:before="240"/>
+        <w:ind w:firstLine="0"/>
         <w:jc w:val="center"/>
       </w:pPr>
       <w:r>
@@ -1748,14 +2380,14 @@
           <w:rFonts w:ascii="Times New Roman" w:hAnsi="Times New Roman" w:eastAsia="Times New Roman"/>
           <w:b w:val="0"/>
           <w:i/>
-          <w:sz w:val="28"/>
+          <w:sz w:val="24"/>
         </w:rPr>
         <w:t>— Конец ответов —</w:t>
       </w:r>
     </w:p>
     <w:sectPr>
       <w:pgSz w:w="12240" w:h="15840"/>
-      <w:pgMar w:top="1020" w:right="850" w:bottom="1020" w:left="1417" w:header="720" w:footer="720" w:gutter="0"/>
+      <w:pgMar w:top="1134" w:right="850" w:bottom="1134" w:left="1417" w:header="720" w:footer="720" w:gutter="0"/>
       <w:cols w:space="720"/>
       <w:docGrid w:linePitch="360"/>
     </w:sectPr>

</xml_diff>

<commit_message>
Expand all control-work definitions into full explanations
Rewrite every term with purpose, meaning, distinguishing details,
and short examples so answers are suitable for submission.

Co-authored-by: MaxChicago <MaxChicago@users.noreply.github.com>
</commit_message>
<xml_diff>
--- a/Kontrolnaya_TRPO_otvety.docx
+++ b/Kontrolnaya_TRPO_otvety.docx
@@ -159,7 +159,7 @@
           <w:i/>
           <w:sz w:val="24"/>
         </w:rPr>
-        <w:t>с начерченными диаграммами</w:t>
+        <w:t>с подробными определениями и начерченными диаграммами</w:t>
       </w:r>
     </w:p>
     <w:p>
@@ -201,7 +201,7 @@
     </w:p>
     <w:p>
       <w:pPr>
-        <w:spacing w:after="200" w:before="240"/>
+        <w:spacing w:after="200" w:before="280"/>
         <w:ind w:firstLine="0"/>
         <w:jc w:val="center"/>
       </w:pPr>
@@ -217,7 +217,7 @@
     </w:p>
     <w:p>
       <w:pPr>
-        <w:spacing w:after="120" w:before="200"/>
+        <w:spacing w:after="160" w:before="240"/>
         <w:ind w:firstLine="0"/>
         <w:jc w:val="left"/>
       </w:pPr>
@@ -233,7 +233,7 @@
     </w:p>
     <w:p>
       <w:pPr>
-        <w:spacing w:after="160" w:line="276" w:lineRule="auto"/>
+        <w:spacing w:after="200" w:line="276" w:lineRule="auto"/>
         <w:ind w:firstLine="709"/>
         <w:jc w:val="both"/>
       </w:pPr>
@@ -244,7 +244,7 @@
           <w:i w:val="0"/>
           <w:sz w:val="28"/>
         </w:rPr>
-        <w:t xml:space="preserve">Жизненный цикл программного обеспечения (ЖЦ ПО) — </w:t>
+        <w:t xml:space="preserve">Определение понятия «Жизненный цикл ПО». </w:t>
       </w:r>
       <w:r>
         <w:rPr>
@@ -253,12 +253,12 @@
           <w:i w:val="0"/>
           <w:sz w:val="28"/>
         </w:rPr>
-        <w:t>это период от появления решения о создании программного продукта до его полного изъятия из эксплуатации. В это время система проходит связанные стадии: сбор требований, проектирование, реализацию, проверку качества, внедрение, сопровождение и вывод из использования. Понятие ЖЦ помогает упорядочить работы, понимать состав артефактов на каждом этапе и контролировать готовность продукта.</w:t>
+        <w:t>Жизненный цикл программного обеспечения (ЖЦ ПО) — это полный период существования программного продукта: от момента, когда принято решение о необходимости его создания, до момента полного изъятия продукта из эксплуатации и прекращения его поддержки. В течение жизненного цикла выполняются все виды работ, связанные с ПО: исследование потребностей, формирование требований, проектирование, кодирование, тестирование, внедрение, эксплуатация, сопровождение и вывод из использования. ЖЦ ПО — не просто календарный срок, а организованная последовательность процессов и этапов, на каждом из которых создаются определённые результаты (документы, модели, код, тесты, сборки). Понятие жизненного цикла нужно для планирования проекта, распределения ролей, контроля качества и понимания, на какой стадии находится продукт. Существуют разные модели жизненного цикла (каскадная, итерационная, спиральная, Agile и др.), но набор основных видов деятельности во многом повторяется. Важно отличать жизненный цикл продукта в целом от одной конкретной итерации разработки внутри него.</w:t>
       </w:r>
     </w:p>
     <w:p>
       <w:pPr>
-        <w:spacing w:after="120" w:line="276" w:lineRule="auto"/>
+        <w:spacing w:after="160" w:line="276" w:lineRule="auto"/>
         <w:ind w:firstLine="709"/>
         <w:jc w:val="both"/>
       </w:pPr>
@@ -269,12 +269,12 @@
           <w:i w:val="0"/>
           <w:sz w:val="28"/>
         </w:rPr>
-        <w:t>Основные этапы жизненного цикла ПО:</w:t>
+        <w:t>Основные этапы жизненного цикла ПО и их содержание:</w:t>
       </w:r>
     </w:p>
     <w:p>
       <w:pPr>
-        <w:spacing w:after="160" w:line="276" w:lineRule="auto"/>
+        <w:spacing w:after="200" w:line="276" w:lineRule="auto"/>
         <w:ind w:firstLine="709"/>
         <w:jc w:val="both"/>
       </w:pPr>
@@ -294,12 +294,12 @@
           <w:i w:val="0"/>
           <w:sz w:val="28"/>
         </w:rPr>
-        <w:t>На этапе выясняют, что должна делать система и какие ограничения на неё действуют. Собирают потребности заказчика и пользователей, разделяют функциональные требования (функции) и нефункциональные (производительность, безопасность, удобство и др.). Итог — согласованное описание требований для дальнейшего проектирования.</w:t>
+        <w:t>Это начальный этап, на котором определяют, зачем нужна система и что она должна уметь. Специалисты общаются с заказчиком и будущими пользователями, изучают предметную область, собирают пожелания и ограничения. Затем требования формулируют, уточняют, устраняют противоречия и фиксируют в документах (техническое задание, спецификация требований, user stories и т.п.). Различают функциональные требования (какие функции должна выполнять система) и нефункциональные (производительность, надёжность, безопасность, удобство, совместимость). Качество анализа критично: ошибки на этом этапе дорого обходятся позже, потому что неправильно понятая потребность приводит к переделке проекта и кода. Результат этапа — согласованный и проверяемый набор требований.</w:t>
       </w:r>
     </w:p>
     <w:p>
       <w:pPr>
-        <w:spacing w:after="160" w:line="276" w:lineRule="auto"/>
+        <w:spacing w:after="200" w:line="276" w:lineRule="auto"/>
         <w:ind w:firstLine="709"/>
         <w:jc w:val="both"/>
       </w:pPr>
@@ -319,12 +319,12 @@
           <w:i w:val="0"/>
           <w:sz w:val="28"/>
         </w:rPr>
-        <w:t>По требованиям строят архитектуру системы: состав частей, их взаимодействие, структуры данных и интерфейсы. Часто используют UML-диаграммы. Цель — получить понятный «чертёж» программы до массового кодирования.</w:t>
+        <w:t>На этапе проектирования на основе требований создают «чертёж» будущей системы. Определяют архитектуру: из каких подсистем и модулей состоит ПО, как они взаимодействуют, где хранятся данные, какие интерфейсы нужны пользователю и другим системам. Проектируют структуру классов, алгоритмы, схемы базы данных, сценарии работы. Для описания решений часто используют UML-диаграммы (прецедентов, классов, последовательности, состояний и др.), а также моделирование процессов (например, IDEF0). Хорошее проектирование снижает риски на этапе кодирования: разработчики понимают, что именно нужно реализовать, и как части системы стыкуются друг с другом. Итог — проектная документация и модели.</w:t>
       </w:r>
     </w:p>
     <w:p>
       <w:pPr>
-        <w:spacing w:after="160" w:line="276" w:lineRule="auto"/>
+        <w:spacing w:after="200" w:line="276" w:lineRule="auto"/>
         <w:ind w:firstLine="709"/>
         <w:jc w:val="both"/>
       </w:pPr>
@@ -344,12 +344,12 @@
           <w:i w:val="0"/>
           <w:sz w:val="28"/>
         </w:rPr>
-        <w:t>Пишут исходный код, создают модули и компоненты по проекту, собирают работоспособное приложение. Обычно параллельно проводят модульные проверки и готовят сборки.</w:t>
+        <w:t>На этом этапе проект превращают в работающую программу: пишут исходный код на выбранных языках, создают модули, библиотеки, пользовательский интерфейс, настраивают взаимодействие с базой данных и внешними сервисами. Код должен соответствовать принятым стандартам оформления и архитектурным решениям. Параллельно обычно выполняют модульное тестирование, ревью кода, сборку приложения в исполняемый вид. Результат этапа — программные компоненты и сборки, готовые к более широкой проверке.</w:t>
       </w:r>
     </w:p>
     <w:p>
       <w:pPr>
-        <w:spacing w:after="160" w:line="276" w:lineRule="auto"/>
+        <w:spacing w:after="200" w:line="276" w:lineRule="auto"/>
         <w:ind w:firstLine="709"/>
         <w:jc w:val="both"/>
       </w:pPr>
@@ -369,12 +369,12 @@
           <w:i w:val="0"/>
           <w:sz w:val="28"/>
         </w:rPr>
-        <w:t>Проверяют соответствие системы требованиям и ищут дефекты. Бывает модульное, интеграционное, системное и приёмочное тестирование. Найденные ошибки исправляют и повторяют проверку.</w:t>
+        <w:t>Тестирование — это процесс проверки, соответствует ли ПО требованиям и ожиданиям, а также поиск дефектов до передачи системы заказчику. Проверяют отдельные модули, затем их совместную работу (интеграционное тестирование), систему в целом и, наконец, проводят приёмочные испытания с участием заказчика. Тестирование бывает функциональным (правильность функций) и нефункциональным (производительность, безопасность, удобство и др.). Найденные ошибки исправляют, после чего регрессионно проверяют, что исправление не сломало уже работавшие части. Цель этапа — повысить качество и снизить риск сбоев в реальной эксплуатации.</w:t>
       </w:r>
     </w:p>
     <w:p>
       <w:pPr>
-        <w:spacing w:after="160" w:line="276" w:lineRule="auto"/>
+        <w:spacing w:after="200" w:line="276" w:lineRule="auto"/>
         <w:ind w:firstLine="709"/>
         <w:jc w:val="both"/>
       </w:pPr>
@@ -394,12 +394,12 @@
           <w:i w:val="0"/>
           <w:sz w:val="28"/>
         </w:rPr>
-        <w:t>ПО устанавливают в среде заказчика, настраивают, при необходимости переносят данные и обучают пользователей. После этого система переходит в промышленную эксплуатацию.</w:t>
+        <w:t>Внедрение — это перевод программного продукта в рабочую среду заказчика. Устанавливают ПО на серверах и рабочих местах, выполняют настройку, миграцию данных из старых систем, интеграцию с другими приложениями. Пользователей обучают работе с системой, готовят инструкции, иногда проводят пилотную эксплуатацию на ограниченной группе. После успешного внедрения система считается введённой в промышленную эксплуатацию. На этом этапе важно предусмотреть план отката, если установка пройдёт неудачно.</w:t>
       </w:r>
     </w:p>
     <w:p>
       <w:pPr>
-        <w:spacing w:after="160" w:line="276" w:lineRule="auto"/>
+        <w:spacing w:after="200" w:line="276" w:lineRule="auto"/>
         <w:ind w:firstLine="709"/>
         <w:jc w:val="both"/>
       </w:pPr>
@@ -419,12 +419,12 @@
           <w:i w:val="0"/>
           <w:sz w:val="28"/>
         </w:rPr>
-        <w:t>В эксплуатации исправляют ошибки, адаптируют ПО к новым условиям и развивают функции по новым запросам. Этот этап часто занимает наибольшую долю стоимости жизненного цикла.</w:t>
+        <w:t>Сопровождение начинается после ввода системы в действие и часто длится дольше всех остальных этапов. В него входят: исправление ошибок, обнаруженных в эксплуатации; адаптация к изменениям окружения (новая ОС, оборудование, законодательство); развитие функциональности по новым запросам заказчика. Сопровождение требует управления версиями, учёта обращений пользователей и контроля изменений, чтобы развитие продукта не разрушало стабильность. По стоимости жизненного цикла сопровождение нередко оказывается самым затратным этапом.</w:t>
       </w:r>
     </w:p>
     <w:p>
       <w:pPr>
-        <w:spacing w:after="160" w:line="276" w:lineRule="auto"/>
+        <w:spacing w:after="200" w:line="276" w:lineRule="auto"/>
         <w:ind w:firstLine="709"/>
         <w:jc w:val="both"/>
       </w:pPr>
@@ -444,12 +444,12 @@
           <w:i w:val="0"/>
           <w:sz w:val="28"/>
         </w:rPr>
-        <w:t>Когда система больше не нужна или заменяется другой, её снимают с использования: прекращают поддержку, сохраняют или переносят данные, утилизируют устаревшие компоненты.</w:t>
+        <w:t>Когда система устарела, больше не нужна или полностью заменена другой, её выводят из эксплуатации. Прекращают поддержку, отключают сервисы, сохраняют или переносят важные данные, утилизируют устаревшие компоненты и документацию. Этот этап тоже нужно планировать: иначе можно потерять данные или нарушить связанные процессы организации.</w:t>
       </w:r>
     </w:p>
     <w:p>
       <w:pPr>
-        <w:spacing w:after="120" w:line="276" w:lineRule="auto"/>
+        <w:spacing w:after="160" w:line="276" w:lineRule="auto"/>
         <w:ind w:firstLine="709"/>
         <w:jc w:val="both"/>
       </w:pPr>
@@ -460,12 +460,12 @@
           <w:i w:val="0"/>
           <w:sz w:val="28"/>
         </w:rPr>
-        <w:t>Последовательность этапов: Анализ требований → Проектирование → Реализация → Тестирование → Внедрение → Сопровождение → Вывод из эксплуатации. В итеративных и Agile-подходах этапы могут повторяться в каждом цикле, но логический порядок внутри итерации обычно сохраняется.</w:t>
+        <w:t>Последовательность этапов: Анализ требований → Проектирование → Реализация → Тестирование → Внедрение → Сопровождение → Вывод из эксплуатации. В каскадной модели этапы идут строго друг за другом. В итеративных и Agile-моделях цикл «требования — проектирование — реализация — тестирование» повторяется многократно, но смысл каждого вида работ сохраняется.</w:t>
       </w:r>
     </w:p>
     <w:p>
       <w:pPr>
-        <w:spacing w:after="120" w:before="200"/>
+        <w:spacing w:after="160" w:before="240"/>
         <w:ind w:firstLine="0"/>
         <w:jc w:val="left"/>
       </w:pPr>
@@ -481,7 +481,7 @@
     </w:p>
     <w:p>
       <w:pPr>
-        <w:spacing w:after="160" w:line="276" w:lineRule="auto"/>
+        <w:spacing w:after="200" w:line="276" w:lineRule="auto"/>
         <w:ind w:firstLine="709"/>
         <w:jc w:val="both"/>
       </w:pPr>
@@ -501,12 +501,12 @@
           <w:i w:val="0"/>
           <w:sz w:val="28"/>
         </w:rPr>
-        <w:t>Диаграмма показывает внешний взгляд на систему: кто с ней работает и какие возможности она даёт. С её помощью очерчивают границы системы и согласуют с заказчиком состав функций, не раскрывая внутреннюю реализацию. Это одна из основных UML-диаграмм на этапе анализа требований.</w:t>
+        <w:t>Диаграмма вариантов использования (Use Case Diagram) описывает систему с точки зрения её внешнего поведения. Она отвечает на вопросы: кто взаимодействует с системой и какие функции (возможности) система предоставляет этим участникам. Диаграмма помогает определить границы системы — что входит в неё, а что остаётся во внешнем окружении. Её активно применяют на этапе анализа требований при обсуждении с заказчиком: проще согласовать список функций на наглядной схеме, чем сразу переходить к детальным алгоритмам. При этом диаграмма не показывает, как именно внутри устроен код или база данных; она фиксирует «что система умеет» для внешнего пользователя. В UML это одна из ключевых диаграмм поведения/требований.</w:t>
       </w:r>
     </w:p>
     <w:p>
       <w:pPr>
-        <w:spacing w:after="160" w:line="276" w:lineRule="auto"/>
+        <w:spacing w:after="200" w:line="276" w:lineRule="auto"/>
         <w:ind w:firstLine="709"/>
         <w:jc w:val="both"/>
       </w:pPr>
@@ -517,7 +517,7 @@
           <w:i w:val="0"/>
           <w:sz w:val="28"/>
         </w:rPr>
-        <w:t xml:space="preserve">Актёр (Actor) — </w:t>
+        <w:t xml:space="preserve">Актёр (Actor). </w:t>
       </w:r>
       <w:r>
         <w:rPr>
@@ -526,12 +526,12 @@
           <w:i w:val="0"/>
           <w:sz w:val="28"/>
         </w:rPr>
-        <w:t>роль внешней сущности, взаимодействующей с системой. Это может быть человек, организация или другая информационная система. Актёр находится вне границ системы и либо запускает прецедент, либо участвует в нём. На диаграмме изображается «человечком» или прямоугольником со стереотипом &lt;&lt;actor&gt;&gt;.</w:t>
+        <w:t>Актёр — это роль внешней по отношению к системе сущности, которая взаимодействует с системой для достижения какой-либо цели. Актёром может быть человек (покупатель, кассир, администратор), подразделение, организация или другая программная/аппаратная система (платёжный шлюз, система уведомлений). Важно понимать, что актёр — это именно роль, а не конкретный человек: один и тот же сотрудник в разное время может выступать в разных ролях. Актёр всегда находится вне границы системы: он инициирует прецеденты или участвует в них, получая от системы результат. На диаграмме актёр обычно изображается стилизованной фигуркой человека либо классификатором со стереотипом &lt;&lt;actor&gt;&gt;. Связь актёра с прецедентом показывают линией ассоциации.</w:t>
       </w:r>
     </w:p>
     <w:p>
       <w:pPr>
-        <w:spacing w:after="160" w:line="276" w:lineRule="auto"/>
+        <w:spacing w:after="200" w:line="276" w:lineRule="auto"/>
         <w:ind w:firstLine="709"/>
         <w:jc w:val="both"/>
       </w:pPr>
@@ -542,7 +542,7 @@
           <w:i w:val="0"/>
           <w:sz w:val="28"/>
         </w:rPr>
-        <w:t xml:space="preserve">Прецедент (Use Case) — </w:t>
+        <w:t xml:space="preserve">Прецедент (Use Case). </w:t>
       </w:r>
       <w:r>
         <w:rPr>
@@ -551,12 +551,12 @@
           <w:i w:val="0"/>
           <w:sz w:val="28"/>
         </w:rPr>
-        <w:t>завершённый фрагмент поведения системы, видимый актёру и дающий ему полезный результат. Прецедент описывает, что делает система, а не как устроен код. Обычно называется глагольной фразой («Оформить заказ»). На диаграмме обозначается овалом.</w:t>
+        <w:t>Прецедент — это описание законченного фрагмента поведения системы, которое наблюдается актёром и приводит к значимому для него результату. Иначе говоря, прецедент — это «услуга» системы, выраженная с точки зрения пользователя. Название прецедента обычно формулируют как действие: «Зарегистрироваться», «Оформить заказ», «Сформировать отчёт». Прецедент описывает, что происходит при взаимодействии, но не детализирует внутренние алгоритмы, классы и SQL-запросы. Один прецедент может включать основной успешный сценарий и альтернативные/исключительные потоки (например, отказ в оплате). На диаграмме прецедент изображается овалом внутри границы системы.</w:t>
       </w:r>
     </w:p>
     <w:p>
       <w:pPr>
-        <w:spacing w:after="160" w:line="276" w:lineRule="auto"/>
+        <w:spacing w:after="200" w:line="276" w:lineRule="auto"/>
         <w:ind w:firstLine="709"/>
         <w:jc w:val="both"/>
       </w:pPr>
@@ -567,7 +567,7 @@
           <w:i w:val="0"/>
           <w:sz w:val="28"/>
         </w:rPr>
-        <w:t xml:space="preserve">Отношение include (включение) — </w:t>
+        <w:t xml:space="preserve">Отношение include (включение). </w:t>
       </w:r>
       <w:r>
         <w:rPr>
@@ -576,12 +576,12 @@
           <w:i w:val="0"/>
           <w:sz w:val="28"/>
         </w:rPr>
-        <w:t>обязательная связь: базовый прецедент всегда выполняет поведение включаемого. Так выносят общий фрагмент, повторяющийся в нескольких сценариях. Рисуют пунктирную стрелку от базового к включаемому со стереотипом &lt;&lt;include&gt;&gt;.</w:t>
+        <w:t>Отношение include означает, что поведение одного прецедента обязательно включается в поведение другого. Базовый прецедент всегда использует включаемый фрагмент как свою неотъемлемую часть. Include применяют, когда один и тот же набор шагов повторяется в нескольких прецедентах и его выгодно вынести отдельно, чтобы не дублировать описание. Пример: прецеденты «Оформить заказ» и «Забронировать товар» оба могут включать прецедент «Авторизоваться». На диаграмме рисуют пунктирную стрелку от базового прецедента к включаемому и подписывают стереотип &lt;&lt;include&gt;&gt;. Стрелка направлена к тому поведению, которое включается.</w:t>
       </w:r>
     </w:p>
     <w:p>
       <w:pPr>
-        <w:spacing w:after="160" w:line="276" w:lineRule="auto"/>
+        <w:spacing w:after="200" w:line="276" w:lineRule="auto"/>
         <w:ind w:firstLine="709"/>
         <w:jc w:val="both"/>
       </w:pPr>
@@ -592,7 +592,7 @@
           <w:i w:val="0"/>
           <w:sz w:val="28"/>
         </w:rPr>
-        <w:t xml:space="preserve">Отношение extend (расширение) — </w:t>
+        <w:t xml:space="preserve">Отношение extend (расширение). </w:t>
       </w:r>
       <w:r>
         <w:rPr>
@@ -601,12 +601,12 @@
           <w:i w:val="0"/>
           <w:sz w:val="28"/>
         </w:rPr>
-        <w:t>условная связь: расширяющий прецедент дополняет базовый только при выполнении условия. В отличие от include, расширение выполняется не всегда. Пунктирная стрелка идёт от расширяющего к базовому со стереотипом &lt;&lt;extend&gt;&gt;.</w:t>
+        <w:t>Отношение extend означает, что один прецедент может при определённых условиях дополнить (расширить) поведение другого. В отличие от include, расширение выполняется не всегда, а только когда срабатывает условие в точке расширения. Extend удобен для необязательных или редких сценариев, которые не нужно «вшивать» в основной поток. Пример: базовый прецедент «Оформить заказ» может расширяться прецедентом «Применить промокод», если покупатель ввёл код скидки. На диаграмме пунктирная стрелка идёт от расширяющего прецедента к базовому со стереотипом &lt;&lt;extend&gt;&gt;. То есть стрелка указывает на тот прецедент, который расширяется.</w:t>
       </w:r>
     </w:p>
     <w:p>
       <w:pPr>
-        <w:spacing w:after="120" w:before="200"/>
+        <w:spacing w:after="160" w:before="240"/>
         <w:ind w:firstLine="0"/>
         <w:jc w:val="left"/>
       </w:pPr>
@@ -622,7 +622,7 @@
     </w:p>
     <w:p>
       <w:pPr>
-        <w:spacing w:after="160" w:line="276" w:lineRule="auto"/>
+        <w:spacing w:after="200" w:line="276" w:lineRule="auto"/>
         <w:ind w:firstLine="709"/>
         <w:jc w:val="both"/>
       </w:pPr>
@@ -633,7 +633,7 @@
           <w:i w:val="0"/>
           <w:sz w:val="28"/>
         </w:rPr>
-        <w:t xml:space="preserve">Функциональное тестирование — </w:t>
+        <w:t xml:space="preserve">Функциональное тестирование. </w:t>
       </w:r>
       <w:r>
         <w:rPr>
@@ -642,12 +642,12 @@
           <w:i w:val="0"/>
           <w:sz w:val="28"/>
         </w:rPr>
-        <w:t>проверка того, правильно ли система выполняет заявленные функции. На вход подают данные, выполняют сценарии и сравнивают фактический результат с ожидаемым по требованиям. Оценивается внешнее поведение («что делает» программа), а не устройство исходного кода. Примеры: проверка входа в систему, расчёта суммы заказа, сохранения записи.</w:t>
+        <w:t>Функциональное тестирование — это вид тестирования, направленный на проверку правильности реализации функций программного обеспечения в соответствии с требованиями. Тестировщик проверяет, выполняет ли система заявленные действия: принимает ли корректные данные, отвергает ли некорректные, выдаёт ли ожидаемый результат, правильно ли меняет состояние данных. Такое тестирование ориентировано на внешнее поведение системы («чёрный ящик»): обычно не требуется знать внутреннее устройство кода, достаточно спецификации и ожидаемого результата. Примеры проверок: успешный и неуспешный вход пользователя, добавление товара в корзину, расчёт итоговой суммы, формирование отчёта, сохранение записи в базе. Функциональное тестирование может проводиться на уровнях модульного, интеграционного, системного и приёмочного тестирования. Его главная цель — убедиться, что система делает именно то, что от неё требуется.</w:t>
       </w:r>
     </w:p>
     <w:p>
       <w:pPr>
-        <w:spacing w:after="160" w:line="276" w:lineRule="auto"/>
+        <w:spacing w:after="200" w:line="276" w:lineRule="auto"/>
         <w:ind w:firstLine="709"/>
         <w:jc w:val="both"/>
       </w:pPr>
@@ -658,7 +658,7 @@
           <w:i w:val="0"/>
           <w:sz w:val="28"/>
         </w:rPr>
-        <w:t xml:space="preserve">Юзабилити-тестирование — </w:t>
+        <w:t xml:space="preserve">Юзабилити-тестирование. </w:t>
       </w:r>
       <w:r>
         <w:rPr>
@@ -667,12 +667,12 @@
           <w:i w:val="0"/>
           <w:sz w:val="28"/>
         </w:rPr>
-        <w:t>проверка удобства и понятности интерфейса. Смотрят, как быстро и без ошибок пользователь достигает цели, насколько легко учиться работе с системой и насколько интерфейс интуитивен. Здесь важно не только «работает ли кнопка», но и «удобно ли ей пользоваться». Обычно наблюдают за реальными пользователями при выполнении типовых заданий.</w:t>
+        <w:t>Юзабилити-тестирование (usability testing) — это проверка удобства использования программного продукта. Здесь оценивают не только «работает ли функция», но и насколько легко, быстро и приятно пользователь достигает своей цели с помощью интерфейса. Анализируют понятность надписей и элементов управления, логичность сценариев, количество ошибок пользователя, скорость обучения, общую удовлетворённость. Обычно тестирование проводят с участием представителей целевой аудитории: им дают типовые задания и наблюдают, где возникают затруднения. По результатам улучшают интерфейс, тексты сообщений, навигацию. Юзабилити-тестирование особенно важно для массовых и клиентских приложений, где сложный или запутанный интерфейс снижает эффективность даже при формально правильной функциональности.</w:t>
       </w:r>
     </w:p>
     <w:p>
       <w:pPr>
-        <w:spacing w:after="120" w:before="200"/>
+        <w:spacing w:after="160" w:before="240"/>
         <w:ind w:firstLine="0"/>
         <w:jc w:val="left"/>
       </w:pPr>
@@ -688,7 +688,7 @@
     </w:p>
     <w:p>
       <w:pPr>
-        <w:spacing w:after="120" w:line="276" w:lineRule="auto"/>
+        <w:spacing w:after="160" w:line="276" w:lineRule="auto"/>
         <w:ind w:firstLine="709"/>
         <w:jc w:val="both"/>
       </w:pPr>
@@ -699,12 +699,12 @@
           <w:i w:val="0"/>
           <w:sz w:val="28"/>
         </w:rPr>
-        <w:t>Пример диаграммы последовательности для оформления заказа. Участники: Покупатель, :Интерфейс, :Корзина, :Склад, :Оплата. Сплошные стрелки — вызовы, пунктирные — ответы.</w:t>
+        <w:t>Ниже приведена диаграмма последовательности для сценария оформления заказа в интернет-магазине. На ней показаны актёр «Покупатель» и объекты системы: :Интерфейс, :Корзина, :Склад, :Оплата. Сообщения отражают порядок взаимодействия во времени: сначала товар добавляется в корзину с проверкой наличия, затем выполняется оформление и оплата. Сплошные стрелки обозначают вызовы, пунктирные — возврат результата.</w:t>
       </w:r>
     </w:p>
     <w:p>
       <w:pPr>
-        <w:spacing w:before="120" w:after="40"/>
+        <w:spacing w:before="160" w:after="40"/>
         <w:jc w:val="center"/>
       </w:pPr>
       <w:r>
@@ -755,7 +755,7 @@
           <w:i/>
           <w:sz w:val="24"/>
         </w:rPr>
-        <w:t>Рисунок 1 — Диаграмма последовательности</w:t>
+        <w:t>Рисунок 1 — Диаграмма последовательности (вариант 1, задание 4)</w:t>
       </w:r>
     </w:p>
     <w:p>
@@ -765,7 +765,7 @@
     </w:p>
     <w:p>
       <w:pPr>
-        <w:spacing w:after="200" w:before="240"/>
+        <w:spacing w:after="200" w:before="280"/>
         <w:ind w:firstLine="0"/>
         <w:jc w:val="center"/>
       </w:pPr>
@@ -781,7 +781,7 @@
     </w:p>
     <w:p>
       <w:pPr>
-        <w:spacing w:after="120" w:before="200"/>
+        <w:spacing w:after="160" w:before="240"/>
         <w:ind w:firstLine="0"/>
         <w:jc w:val="left"/>
       </w:pPr>
@@ -797,7 +797,7 @@
     </w:p>
     <w:p>
       <w:pPr>
-        <w:spacing w:after="160" w:line="276" w:lineRule="auto"/>
+        <w:spacing w:after="200" w:line="276" w:lineRule="auto"/>
         <w:ind w:firstLine="709"/>
         <w:jc w:val="both"/>
       </w:pPr>
@@ -817,12 +817,12 @@
           <w:i w:val="0"/>
           <w:sz w:val="28"/>
         </w:rPr>
-        <w:t>Нужно, чтобы описать деятельность системы или организации как набор взаимосвязанных работ. Модель показывает, что делается, какие ресурсы потребляются, какой результат получается и чем процесс управляется. Это помогает анализировать бизнес-процессы и формулировать требования к ПО до детального технического проектирования.</w:t>
+        <w:t>Функциональное моделирование — это способ описания системы через её функции (работы, процессы), а не через устройство программных модулей. Цель такого моделирования — понять и зафиксировать, что делает система или организация, в какой последовательности выполняются работы, какие ресурсы потребляются и какие результаты производятся. Функциональные модели помогают анализировать бизнес-процессы «как есть» и проектировать процессы «как должно быть», выявлять дублирование, лишние операции и узкие места. На основе этих моделей удобнее формулировать требования к будущему программному обеспечению. Одним из наиболее известных стандартов функционального моделирования является IDEF0.</w:t>
       </w:r>
     </w:p>
     <w:p>
       <w:pPr>
-        <w:spacing w:after="160" w:line="276" w:lineRule="auto"/>
+        <w:spacing w:after="200" w:line="276" w:lineRule="auto"/>
         <w:ind w:firstLine="709"/>
         <w:jc w:val="both"/>
       </w:pPr>
@@ -842,12 +842,12 @@
           <w:i w:val="0"/>
           <w:sz w:val="28"/>
         </w:rPr>
-        <w:t>Модель строится из функциональных блоков и стрелок. Блок — прямоугольник с работой (обычно «глагол + существительное»). Стрелки: вход слева — то, что преобразуется; выход справа — результат; управление сверху — правила и ограничения; механизм снизу — исполнители, оборудование, ПО. Модель иерархична: верхний блок детализируется на дочерних диаграммах. К модели указывают цель, точку зрения и глоссарий.</w:t>
+        <w:t>Модель IDEF0 состоит из диаграмм, на которых система представлена функциональными блоками и стрелками. Функциональный блок — прямоугольник, обозначающий работу; его имя обычно формулируют как «глагол + существительное» (например, «Обработать заказ»). У блока есть четыре стороны для стрелок разного смысла. Вход (Input) подходит слева и обозначает объекты, которые функция преобразует (документы, данные, материалы). Выход (Output) уходит вправо и показывает результат преобразования. Управление (Control) входит сверху и задаёт правила, стандарты, ограничения, приказы — то, чем руководствуются при выполнении работы. Механизм (Mechanism) подходит снизу и показывает ресурсы исполнения: людей, оборудование, программные средства. Модель строится иерархически: контекстный блок детализируется на дочерние функции (A0 → A1, A2, A3…), те — ещё глубже. К модели обязательно указывают цель моделирования, точку зрения и обычно сопровождают глоссарием терминов. Благодаря единым правилам IDEF0 разные специалисты одинаково читают и понимают схему.</w:t>
       </w:r>
     </w:p>
     <w:p>
       <w:pPr>
-        <w:spacing w:after="160" w:line="276" w:lineRule="auto"/>
+        <w:spacing w:after="200" w:line="276" w:lineRule="auto"/>
         <w:ind w:firstLine="709"/>
         <w:jc w:val="both"/>
       </w:pPr>
@@ -867,12 +867,12 @@
           <w:i w:val="0"/>
           <w:sz w:val="28"/>
         </w:rPr>
-        <w:t>Самый верхний уровень IDEF0 (часто A-0). На ней один блок — вся система целиком — и только внешние стрелки. Диаграмма фиксирует границы объекта: что входит извне, что уходит наружу, чем система управляется и какими ресурсами поддерживается. Остальные диаграммы — декомпозиция этого блока.</w:t>
+        <w:t>Контекстная диаграмма — это верхний уровень модели IDEF0 (часто обозначается как A-0). На ней изображается ровно один функциональный блок, который представляет всю моделируемую систему целиком, и набор внешних стрелок, связывающих систему с окружающей средой. Именно контекстная диаграмма определяет границы предмета моделирования: что считается входом извне, что является конечным выходом, какими нормативными правилами система управляется и какими ресурсами поддерживается. Без чёткого контекста последующая детализация может «расползтись» и смешать внутренние детали с внешним окружением. Все следующие диаграммы модели — это последовательная декомпозиция этого единственного контекстного блока.</w:t>
       </w:r>
     </w:p>
     <w:p>
       <w:pPr>
-        <w:spacing w:before="120" w:after="40"/>
+        <w:spacing w:before="160" w:after="40"/>
         <w:jc w:val="center"/>
       </w:pPr>
       <w:r>
@@ -923,12 +923,12 @@
           <w:i/>
           <w:sz w:val="24"/>
         </w:rPr>
-        <w:t>Рисунок 2 — Контекстная диаграмма IDEF0 (A-0)</w:t>
+        <w:t>Рисунок 2 — Пример контекстной диаграммы IDEF0 (A-0)</w:t>
       </w:r>
     </w:p>
     <w:p>
       <w:pPr>
-        <w:spacing w:after="120" w:before="200"/>
+        <w:spacing w:after="160" w:before="240"/>
         <w:ind w:firstLine="0"/>
         <w:jc w:val="left"/>
       </w:pPr>
@@ -944,7 +944,7 @@
     </w:p>
     <w:p>
       <w:pPr>
-        <w:spacing w:after="160" w:line="276" w:lineRule="auto"/>
+        <w:spacing w:after="200" w:line="276" w:lineRule="auto"/>
         <w:ind w:firstLine="709"/>
         <w:jc w:val="both"/>
       </w:pPr>
@@ -955,7 +955,7 @@
           <w:i w:val="0"/>
           <w:sz w:val="28"/>
         </w:rPr>
-        <w:t xml:space="preserve">Инкапсуляция — </w:t>
+        <w:t xml:space="preserve">Инкапсуляция. </w:t>
       </w:r>
       <w:r>
         <w:rPr>
@@ -964,12 +964,12 @@
           <w:i w:val="0"/>
           <w:sz w:val="28"/>
         </w:rPr>
-        <w:t>принцип ООП, при котором данные объекта и методы работы с ними объединяются в одном классе, а внутренняя реализация скрывается. Снаружи доступны только разрешённые операции. Благодаря этому можно менять устройство класса, не ломая внешний код, и снижать риск некорректного изменения состояния объекта напрямую.</w:t>
+        <w:t>Инкапсуляция — один из основных принципов объектно-ориентированного программирования. Он означает, что данные объекта и методы, работающие с этими данными, объединяются в единую сущность — класс/объект, а детали внутренней реализации скрываются от внешнего кода. Снаружи доступ предоставляется только через разрешённый интерфейс (публичные методы), а внутренние поля часто делают закрытыми. Практический смысл инкапсуляции в том, что можно изменить способ хранения данных или алгоритм внутри класса, не переписывая весь код, который этим классом пользуется. Кроме того, объект сам контролирует корректность своего состояния: нельзя «напрямую» записать недопустимое значение в поле, минуя проверки. Пример: у класса «Счёт» поле баланса скрыто, а изменить его можно только методами «пополнить» и «снять», где проверяется допустимость операции.</w:t>
       </w:r>
     </w:p>
     <w:p>
       <w:pPr>
-        <w:spacing w:after="160" w:line="276" w:lineRule="auto"/>
+        <w:spacing w:after="200" w:line="276" w:lineRule="auto"/>
         <w:ind w:firstLine="709"/>
         <w:jc w:val="both"/>
       </w:pPr>
@@ -980,7 +980,7 @@
           <w:i w:val="0"/>
           <w:sz w:val="28"/>
         </w:rPr>
-        <w:t xml:space="preserve">Наследование — </w:t>
+        <w:t xml:space="preserve">Наследование. </w:t>
       </w:r>
       <w:r>
         <w:rPr>
@@ -989,12 +989,12 @@
           <w:i w:val="0"/>
           <w:sz w:val="28"/>
         </w:rPr>
-        <w:t>механизм создания нового класса (потомка) на основе существующего (предка). Потомок получает атрибуты и методы предка, может добавить свои или переопределить поведение. Это даёт повторное использование кода и иерархии «общее → частное» (например, «Транспорт» → «Автомобиль»).</w:t>
+        <w:t>Наследование — механизм ООП, при котором новый класс (класс-потомок, подкласс) создаётся на основе уже существующего класса (класса-предка, суперкласса). Потомок автоматически получает атрибуты и поведение предка и может добавить новые поля и методы либо переопределить унаследованные. Наследование поддерживает повторное использование кода и позволяет строить иерархии «от общего к частному». Например, класс «Сотрудник» может быть предком для классов «Программист» и «Менеджер»: общие свойства (ФИО, табельный номер) описывают один раз в предке, а специфические — в потомках. При этом злоупотребление глубоким наследованием усложняет систему, поэтому наследование применяют осмысленно, когда действительно есть отношение «является разновидностью».</w:t>
       </w:r>
     </w:p>
     <w:p>
       <w:pPr>
-        <w:spacing w:after="160" w:line="276" w:lineRule="auto"/>
+        <w:spacing w:after="200" w:line="276" w:lineRule="auto"/>
         <w:ind w:firstLine="709"/>
         <w:jc w:val="both"/>
       </w:pPr>
@@ -1005,7 +1005,7 @@
           <w:i w:val="0"/>
           <w:sz w:val="28"/>
         </w:rPr>
-        <w:t xml:space="preserve">Полиморфизм — </w:t>
+        <w:t xml:space="preserve">Полиморфизм. </w:t>
       </w:r>
       <w:r>
         <w:rPr>
@@ -1014,12 +1014,12 @@
           <w:i w:val="0"/>
           <w:sz w:val="28"/>
         </w:rPr>
-        <w:t>способность объектов разных классов вызываться через общий интерфейс или базовый тип, но выполнять свою реализацию метода. Обычно проявляется при переопределении методов в потомках: вызывается метод по ссылке на базовый тип, а выполняется код конкретного объекта. Так систему легче расширять без переписывания вызывающего кода.</w:t>
+        <w:t>Полиморфизм — способность объектов разных классов единообразно обрабатываться через общий интерфейс или базовый тип, но при этом выполнять собственную реализацию одного и того же метода. Иначе говоря, одно и то же сообщение (вызов метода) может приводить к разному поведению в зависимости от реального типа объекта. На практике полиморфизм часто реализуется через переопределение методов в классах-потомках и вызов через ссылку на базовый класс или интерфейс. Пример: у базового класса «Фигура» есть метод «площадь()», а в классах «Круг» и «Прямоугольник» он реализован по-разному; цикл может вызывать площадь() для списка фигур, не зная заранее конкретный тип. Полиморфизм делает систему гибкой: новый класс можно добавить, не меняя код, который работает с общим интерфейсом.</w:t>
       </w:r>
     </w:p>
     <w:p>
       <w:pPr>
-        <w:spacing w:after="120" w:before="200"/>
+        <w:spacing w:after="160" w:before="240"/>
         <w:ind w:firstLine="0"/>
         <w:jc w:val="left"/>
       </w:pPr>
@@ -1035,7 +1035,7 @@
     </w:p>
     <w:p>
       <w:pPr>
-        <w:spacing w:after="160" w:line="276" w:lineRule="auto"/>
+        <w:spacing w:after="200" w:line="276" w:lineRule="auto"/>
         <w:ind w:firstLine="709"/>
         <w:jc w:val="both"/>
       </w:pPr>
@@ -1055,12 +1055,12 @@
           <w:i w:val="0"/>
           <w:sz w:val="28"/>
         </w:rPr>
-        <w:t>Она отражает статическую структуру ОО-системы: какие есть классы, какими данными и операциями они обладают и как связаны. Диаграмму используют при проектировании модели предметной области и архитектуры. Связи: ассоциация, агрегация, композиция, наследование, зависимость, реализация интерфейса.</w:t>
+        <w:t>Диаграмма классов — это UML-диаграмма, которая показывает статическую структуру объектно-ориентированной системы. На ней изображают классы, их атрибуты и операции, а также отношения между классами: ассоциации, агрегации, композиции, обобщения (наследование), зависимости и реализации интерфейсов. Диаграмму классов используют на этапе проектирования, чтобы зафиксировать модель предметной области и основу программной архитектуры. Она помогает команде одинаково понимать, какие сущности существуют в системе и как они связаны. В отличие от диаграмм взаимодействия, здесь нет оси времени: показывается устройство системы «в разрезе структуры», а не последовательность вызовов.</w:t>
       </w:r>
     </w:p>
     <w:p>
       <w:pPr>
-        <w:spacing w:after="160" w:line="276" w:lineRule="auto"/>
+        <w:spacing w:after="200" w:line="276" w:lineRule="auto"/>
         <w:ind w:firstLine="709"/>
         <w:jc w:val="both"/>
       </w:pPr>
@@ -1071,7 +1071,7 @@
           <w:i w:val="0"/>
           <w:sz w:val="28"/>
         </w:rPr>
-        <w:t xml:space="preserve">Класс — </w:t>
+        <w:t xml:space="preserve">Класс. </w:t>
       </w:r>
       <w:r>
         <w:rPr>
@@ -1080,12 +1080,12 @@
           <w:i w:val="0"/>
           <w:sz w:val="28"/>
         </w:rPr>
-        <w:t>описание множества объектов с одинаковой структурой данных, поведением и смыслом в предметной области. Объект — экземпляр класса. На UML класс рисуют прямоугольником из трёх секций: имя, атрибуты, операции.</w:t>
+        <w:t>Класс — это описание множества объектов, обладающих одинаковой структурой данных, одинаковым поведением и общей семантикой в предметной области. Класс задаёт шаблон: какие атрибуты есть у объектов и какие операции над ними можно выполнять. Конкретный объект является экземпляром класса и в каждый момент имеет собственные значения атрибутов. На UML-диаграмме класс изображают прямоугольником, разделённым на три секции: имя класса; список атрибутов; список методов. Например, класс «Студент» может содержать атрибуты «фио», «группа» и методы «записатьсяНаКурс()», «получитьОценки()».</w:t>
       </w:r>
     </w:p>
     <w:p>
       <w:pPr>
-        <w:spacing w:after="160" w:line="276" w:lineRule="auto"/>
+        <w:spacing w:after="200" w:line="276" w:lineRule="auto"/>
         <w:ind w:firstLine="709"/>
         <w:jc w:val="both"/>
       </w:pPr>
@@ -1096,7 +1096,7 @@
           <w:i w:val="0"/>
           <w:sz w:val="28"/>
         </w:rPr>
-        <w:t xml:space="preserve">Интерфейс — </w:t>
+        <w:t xml:space="preserve">Интерфейс. </w:t>
       </w:r>
       <w:r>
         <w:rPr>
@@ -1105,12 +1105,12 @@
           <w:i w:val="0"/>
           <w:sz w:val="28"/>
         </w:rPr>
-        <w:t>набор операций без реализации, то есть контракт для класса. Он задаёт, что объект умеет делать, но не как. Несколько классов могут реализовать один интерфейс по-разному. Показывают кругом («леденец») или прямоугольником &lt;&lt;interface&gt;&gt;.</w:t>
+        <w:t>Интерфейс — это контракт, представляющий собой набор операций без их реализации. Класс, реализующий интерфейс, обязан предоставить конкретную реализацию всех объявленных в нём методов. Интерфейс отвечает на вопрос «что объект умеет», но не указывает «как именно это сделано внутри». Благодаря интерфейсам разные классы могут подставляться друг вместо друга, если поддерживают один и тот же контракт. На диаграмме интерфейс обозначают кругом (нотация «леденец») либо прямоугольником со стереотипом &lt;&lt;interface&gt;&gt;. Связь реализации показывают пунктирной стрелкой с незакрашенным треугольником от класса к интерфейсу.</w:t>
       </w:r>
     </w:p>
     <w:p>
       <w:pPr>
-        <w:spacing w:after="160" w:line="276" w:lineRule="auto"/>
+        <w:spacing w:after="200" w:line="276" w:lineRule="auto"/>
         <w:ind w:firstLine="709"/>
         <w:jc w:val="both"/>
       </w:pPr>
@@ -1130,12 +1130,12 @@
           <w:i w:val="0"/>
           <w:sz w:val="28"/>
         </w:rPr>
-        <w:t>Определяют, откуда разрешён доступ к атрибуту или методу. В UML: «+» public — всем; «−» private — только внутри класса; «#» protected — классу и потомкам; «~» package — в пределах пакета. Правильная видимость поддерживает инкапсуляцию.</w:t>
+        <w:t>Видимость определяет область доступа к атрибуту или методу класса — кто имеет право читать или вызывать данный элемент. В UML приняты обозначения: «+» public — элемент доступен любому коду; «−» private — доступен только внутри самого класса; «#» protected — доступен классу и его потомкам; «~» package (package-private) — доступен в пределах одного пакета. Выбор видимости напрямую связан с инкапсуляцией: внутренние детали обычно делают private, а наружу открывают только необходимый публичный интерфейс. Это уменьшает связность системы и защищает объекты от некорректного использования.</w:t>
       </w:r>
     </w:p>
     <w:p>
       <w:pPr>
-        <w:spacing w:after="160" w:line="276" w:lineRule="auto"/>
+        <w:spacing w:after="200" w:line="276" w:lineRule="auto"/>
         <w:ind w:firstLine="709"/>
         <w:jc w:val="both"/>
       </w:pPr>
@@ -1155,12 +1155,12 @@
           <w:i w:val="0"/>
           <w:sz w:val="28"/>
         </w:rPr>
-        <w:t>Показывает, сколько объектов одного класса может быть связано с одним объектом другого. Типично: 1; 0..1; * (0..*); 1..*; диапазоны вроде 2..4. Пример: «Заказ 1 — 1..* ПозицияЗаказа» — у заказа есть хотя бы одна позиция.</w:t>
+        <w:t>Множественность (кратность) указывает, сколько объектов одного класса может участвовать в связи с одним объектом другого класса. Она записывается около конца ассоциации. Наиболее употребимы значения: «1» — ровно один объект; «0..1» — объект может отсутствовать или быть один; «*» или «0..*» — от нуля до многих; «1..*» — один или более; также допустимы точные диапазоны, например «2..5». Пример: связь «Клиент 1 — * Заказ» означает, что один клиент может иметь много заказов, а каждый заказ принадлежит ровно одному клиенту. Правильная множественность важна и для проектирования базы данных, и для понимания бизнес-правил.</w:t>
       </w:r>
     </w:p>
     <w:p>
       <w:pPr>
-        <w:spacing w:after="120" w:before="200"/>
+        <w:spacing w:after="160" w:before="240"/>
         <w:ind w:firstLine="0"/>
         <w:jc w:val="left"/>
       </w:pPr>
@@ -1176,7 +1176,7 @@
     </w:p>
     <w:p>
       <w:pPr>
-        <w:spacing w:after="120" w:line="276" w:lineRule="auto"/>
+        <w:spacing w:after="160" w:line="276" w:lineRule="auto"/>
         <w:ind w:firstLine="709"/>
         <w:jc w:val="both"/>
       </w:pPr>
@@ -1187,12 +1187,12 @@
           <w:i w:val="0"/>
           <w:sz w:val="28"/>
         </w:rPr>
-        <w:t>Пример для системы «Библиотека»: актёры Читатель, Библиотекарь, Система уведомлений; отношения &lt;&lt;include&gt;&gt; и &lt;&lt;extend&gt;&gt;.</w:t>
+        <w:t>На рисунке приведена диаграмма прецедентов системы «Библиотека». Показаны актёры «Читатель», «Библиотекарь» и «Система уведомлений», основные функции системы, а также отношения &lt;&lt;include&gt;&gt; (заказ книги всегда включает поиск) и &lt;&lt;extend&gt;&gt; (отправка напоминания может расширять возврат книги при определённом условии).</w:t>
       </w:r>
     </w:p>
     <w:p>
       <w:pPr>
-        <w:spacing w:before="120" w:after="40"/>
+        <w:spacing w:before="160" w:after="40"/>
         <w:jc w:val="center"/>
       </w:pPr>
       <w:r>
@@ -1243,7 +1243,7 @@
           <w:i/>
           <w:sz w:val="24"/>
         </w:rPr>
-        <w:t>Рисунок 3 — Диаграмма прецедентов</w:t>
+        <w:t>Рисунок 3 — Диаграмма прецедентов (вариант 2, задание 4)</w:t>
       </w:r>
     </w:p>
     <w:p>
@@ -1253,7 +1253,7 @@
     </w:p>
     <w:p>
       <w:pPr>
-        <w:spacing w:after="200" w:before="240"/>
+        <w:spacing w:after="200" w:before="280"/>
         <w:ind w:firstLine="0"/>
         <w:jc w:val="center"/>
       </w:pPr>
@@ -1269,7 +1269,7 @@
     </w:p>
     <w:p>
       <w:pPr>
-        <w:spacing w:after="120" w:before="200"/>
+        <w:spacing w:after="160" w:before="240"/>
         <w:ind w:firstLine="0"/>
         <w:jc w:val="left"/>
       </w:pPr>
@@ -1285,7 +1285,7 @@
     </w:p>
     <w:p>
       <w:pPr>
-        <w:spacing w:after="160" w:line="276" w:lineRule="auto"/>
+        <w:spacing w:after="200" w:line="276" w:lineRule="auto"/>
         <w:ind w:firstLine="709"/>
         <w:jc w:val="both"/>
       </w:pPr>
@@ -1305,12 +1305,12 @@
           <w:i w:val="0"/>
           <w:sz w:val="28"/>
         </w:rPr>
-        <w:t>Описывает взаимодействие объектов во времени: какие сообщения и в каком порядке при выполнении сценария (часто одного прецедента). Помогает уточнить динамику системы и спроектировать вызовы между компонентами. Главная ось — время (сверху вниз).</w:t>
+        <w:t>Диаграмма последовательности (Sequence Diagram) описывает взаимодействие между объектами во времени. Она показывает, какие сообщения (вызовы операций, сигналы, ответы) передаются между участниками и в каком порядке это происходит при выполнении конкретного сценария — часто одного прецедента или его части. Такая диаграмма полезна на этапе проектирования: по ней видно, какие объекты нужны для реализации сценария, кто за что отвечает и как распределены вызовы. Главная визуальная ось — время: чем ниже сообщение на листе, тем позже оно происходит. Поэтому sequence-диаграмму удобно читать как «сценарий по шагам».</w:t>
       </w:r>
     </w:p>
     <w:p>
       <w:pPr>
-        <w:spacing w:after="160" w:line="276" w:lineRule="auto"/>
+        <w:spacing w:after="200" w:line="276" w:lineRule="auto"/>
         <w:ind w:firstLine="709"/>
         <w:jc w:val="both"/>
       </w:pPr>
@@ -1321,7 +1321,7 @@
           <w:i w:val="0"/>
           <w:sz w:val="28"/>
         </w:rPr>
-        <w:t xml:space="preserve">Объекты (участники). </w:t>
+        <w:t xml:space="preserve">Объекты (участники взаимодействия). </w:t>
       </w:r>
       <w:r>
         <w:rPr>
@@ -1330,12 +1330,12 @@
           <w:i w:val="0"/>
           <w:sz w:val="28"/>
         </w:rPr>
-        <w:t>Роли или экземпляры классов во взаимодействии. Вверху диаграммы — прямоугольник с именем «имя:Класс» или «:Класс». Слева часто ставят актёра, запускающего сценарий.</w:t>
+        <w:t>Объекты — это участники обмена сообщениями: экземпляры классов или роли классификаторов. В верхней части диаграммы каждый участник изображается прямоугольником с подписью вида «имяОбъекта:ИмяКласса» или просто «:ИмяКласса», если имя экземпляра неважно. Слева часто размещают актёра, который инициирует сценарий. Именно между этими участниками затем рисуются стрелки сообщений. Набор объектов на диаграмме должен быть достаточным, чтобы полностью объяснить выбранный сценарий, но не перегруженным лишними деталями.</w:t>
       </w:r>
     </w:p>
     <w:p>
       <w:pPr>
-        <w:spacing w:after="160" w:line="276" w:lineRule="auto"/>
+        <w:spacing w:after="200" w:line="276" w:lineRule="auto"/>
         <w:ind w:firstLine="709"/>
         <w:jc w:val="both"/>
       </w:pPr>
@@ -1355,12 +1355,12 @@
           <w:i w:val="0"/>
           <w:sz w:val="28"/>
         </w:rPr>
-        <w:t>Вертикальная пунктирная линия вниз от участника. Показывает период участия объекта на диаграмме. Пока объект может принимать сообщения, линия жизни продолжается.</w:t>
+        <w:t>Линия жизни (lifeline) — вертикальная пунктирная линия, идущая вниз от участника. Она обозначает время существования или участия объекта в данном взаимодействии. Пока линия жизни продолжается, объект может отправлять и принимать сообщения. Если объект создаётся в ходе сценария, его прямоугольник рисуют ниже и линия жизни начинается с момента создания; если уничтожается — линию жизни обрывают крестом. На активных участках линии жизни обычно показывают узкий прямоугольник активации — период, когда объект выполняет операцию.</w:t>
       </w:r>
     </w:p>
     <w:p>
       <w:pPr>
-        <w:spacing w:after="160" w:line="276" w:lineRule="auto"/>
+        <w:spacing w:after="200" w:line="276" w:lineRule="auto"/>
         <w:ind w:firstLine="709"/>
         <w:jc w:val="both"/>
       </w:pPr>
@@ -1380,12 +1380,12 @@
           <w:i w:val="0"/>
           <w:sz w:val="28"/>
         </w:rPr>
-        <w:t>Передача управления или данных от одного участника другому — горизонтальная стрелка с подписью. Порядок читается сверху вниз. На время обработки на линии жизни рисуют прямоугольник активации.</w:t>
+        <w:t>Сообщение — это элемент взаимодействия, обозначающий передачу информации или управления от одного участника другому. На диаграмме сообщение рисуют горизонтальной стрелкой между линиями жизни и подписывают именем операции, сигнала или возвращаемого результата. Порядок сообщений определяется их расположением сверху вниз. Сообщения бывают вызывающими (запрос выполнить действие) и возвратными (передача результата обратно). Без сообщений диаграмма последовательности теряет смысл, так как именно они выражают динамику сценария.</w:t>
       </w:r>
     </w:p>
     <w:p>
       <w:pPr>
-        <w:spacing w:after="160" w:line="276" w:lineRule="auto"/>
+        <w:spacing w:after="200" w:line="276" w:lineRule="auto"/>
         <w:ind w:firstLine="709"/>
         <w:jc w:val="both"/>
       </w:pPr>
@@ -1405,12 +1405,12 @@
           <w:i w:val="0"/>
           <w:sz w:val="28"/>
         </w:rPr>
-        <w:t>Отправитель передаёт вызов и ждёт завершения обработки и ответа. Рисуют сплошной стрелкой с закрашенным наконечником. Это обычный вызов метода: пока нет результата, вызывающий ждёт.</w:t>
+        <w:t>Синхронное сообщение означает, что отправитель после вызова приостанавливает свою работу и ждёт, пока получатель завершит обработку и, как правило, вернёт ответ. Это соответствует обычному вызову метода в большинстве языков программирования: следующая инструкция у вызывающего выполнится только после возврата из вызываемого метода. На UML синхронное сообщение изображают сплошной линией с закрашенным треугольным наконечником. Такие сообщения применяют, когда результат операции нужен сразу для продолжения сценария — например, проверка наличия товара перед добавлением в корзину.</w:t>
       </w:r>
     </w:p>
     <w:p>
       <w:pPr>
-        <w:spacing w:after="160" w:line="276" w:lineRule="auto"/>
+        <w:spacing w:after="200" w:line="276" w:lineRule="auto"/>
         <w:ind w:firstLine="709"/>
         <w:jc w:val="both"/>
       </w:pPr>
@@ -1430,12 +1430,12 @@
           <w:i w:val="0"/>
           <w:sz w:val="28"/>
         </w:rPr>
-        <w:t>Отправитель не ждёт ответа и сразу продолжает работу. Обозначают стрелкой с открытым наконечником. Типичны для событий, сигналов, уведомлений и параллельной обработки.</w:t>
+        <w:t>Асинхронное сообщение означает, что отправитель не ждёт завершения обработки у получателя и сразу продолжает своё выполнение. Получатель обрабатывает сообщение независимо, возможно позже или параллельно. Это характерно для событий, сигналов, очередей сообщений, уведомлений, фоновых задач. На диаграмме асинхронное сообщение обычно рисуют стрелкой с открытым (незакрашенным) наконечником. Пример: система отправляет пользователю уведомление «заказ собран» и не блокирует основной процесс оформления, ожидая прочтения письма.</w:t>
       </w:r>
     </w:p>
     <w:p>
       <w:pPr>
-        <w:spacing w:after="120" w:before="200"/>
+        <w:spacing w:after="160" w:before="240"/>
         <w:ind w:firstLine="0"/>
         <w:jc w:val="left"/>
       </w:pPr>
@@ -1451,7 +1451,7 @@
     </w:p>
     <w:p>
       <w:pPr>
-        <w:spacing w:after="160" w:line="276" w:lineRule="auto"/>
+        <w:spacing w:after="200" w:line="276" w:lineRule="auto"/>
         <w:ind w:firstLine="709"/>
         <w:jc w:val="both"/>
       </w:pPr>
@@ -1462,7 +1462,7 @@
           <w:i w:val="0"/>
           <w:sz w:val="28"/>
         </w:rPr>
-        <w:t xml:space="preserve">Управление конфигурацией ПО (SCM) — </w:t>
+        <w:t xml:space="preserve">Понятие управления конфигурацией ПО. </w:t>
       </w:r>
       <w:r>
         <w:rPr>
@@ -1471,12 +1471,12 @@
           <w:i w:val="0"/>
           <w:sz w:val="28"/>
         </w:rPr>
-        <w:t>совокупность процессов учёта состава программного продукта, контроля его изменений и восстановления любой утверждённой версии. В конфигурацию входят исходные файлы, модули, документы, сборки, релизы. SCM отвечает, что входит в версию, кто внёс изменение и можно ли повторить ту же сборку. Без этого сложно сопровождать продукт и понимать, какая версия стоит у заказчика.</w:t>
+        <w:t>Управление конфигурацией программного обеспечения (Software Configuration Management, SCM) — это дисциплина, которая обеспечивает идентификацию элементов программного продукта, контроль их изменений, учёт текущего состояния и аудит на протяжении всего жизненного цикла. Под конфигурацией понимают согласованный набор артефактов: исходные тексты, модули, библиотеки, документацию, скрипты сборки, установочные пакеты, версии релизов и т.д. Цель SCM — всегда знать, из чего состоит конкретная версия продукта, кто и зачем внёс изменение, можно ли воспроизвести ту же сборку и чем одна версия отличается от другой. На практике SCM опирается на системы контроля версий, процедуры code review, нумерацию релизов, реестр изменений и правила выпуска сборок. Без управления конфигурацией сопровождение и поддержка продукта становятся хаотичными: невозможно надёжно ответить, какая именно версия установлена у заказчика и какие исправления в неё входят.</w:t>
       </w:r>
     </w:p>
     <w:p>
       <w:pPr>
-        <w:spacing w:after="160" w:line="276" w:lineRule="auto"/>
+        <w:spacing w:after="200" w:line="276" w:lineRule="auto"/>
         <w:ind w:firstLine="709"/>
         <w:jc w:val="both"/>
       </w:pPr>
@@ -1487,7 +1487,7 @@
           <w:i w:val="0"/>
           <w:sz w:val="28"/>
         </w:rPr>
-        <w:t xml:space="preserve">Идентификация конфигурации — </w:t>
+        <w:t xml:space="preserve">Идентификация конфигурации. </w:t>
       </w:r>
       <w:r>
         <w:rPr>
@@ -1496,12 +1496,12 @@
           <w:i w:val="0"/>
           <w:sz w:val="28"/>
         </w:rPr>
-        <w:t>процесс, в котором каждому элементу конфигурации дают уникальное обозначение и фиксируют версию. Включает выбор элементов (configuration items), правила именования и нумерации, базовые линии (baselines) — утверждённые наборы версий — и описание состава релиза. Так создаётся «паспорт» системы для дальнейшего отслеживания изменений.</w:t>
+        <w:t>Идентификация конфигурации — один из ключевых процессов SCM. Он заключается в том, что элементы конфигурации выделяют, именуют и однозначно обозначают, а также фиксируют их версии и взаимные связи. Сначала определяют, что считать элементами конфигурации (configuration items): отдельные файлы, компоненты, документы, сборки. Затем задают схему именования и правила версионирования (например, major.minor.patch). Важная часть идентификации — базовые линии (baselines): утверждённые наборы версий элементов на определённый момент, например «версия требований 1.0» или «релиз 2.3». По базовой линии можно восстановить состав системы и отслеживать последующие изменения относительно известной точки. Таким образом, идентификация создаёт «паспорт» продукта, без которого контроль изменений теряет основу.</w:t>
       </w:r>
     </w:p>
     <w:p>
       <w:pPr>
-        <w:spacing w:after="120" w:before="200"/>
+        <w:spacing w:after="160" w:before="240"/>
         <w:ind w:firstLine="0"/>
         <w:jc w:val="left"/>
       </w:pPr>
@@ -1517,7 +1517,7 @@
     </w:p>
     <w:p>
       <w:pPr>
-        <w:spacing w:after="160" w:line="276" w:lineRule="auto"/>
+        <w:spacing w:after="200" w:line="276" w:lineRule="auto"/>
         <w:ind w:firstLine="709"/>
         <w:jc w:val="both"/>
       </w:pPr>
@@ -1528,7 +1528,7 @@
           <w:i w:val="0"/>
           <w:sz w:val="28"/>
         </w:rPr>
-        <w:t xml:space="preserve">Agile (гибкая методология разработки) — </w:t>
+        <w:t xml:space="preserve">Определение Agile. </w:t>
       </w:r>
       <w:r>
         <w:rPr>
@@ -1537,12 +1537,12 @@
           <w:i w:val="0"/>
           <w:sz w:val="28"/>
         </w:rPr>
-        <w:t>подход к созданию ПО на коротких итерациях, с регулярной поставкой рабочего результата, тесным сотрудничеством с заказчиком и готовностью менять требования. Ценятся люди и взаимодействие, работающий продукт, сотрудничество с клиентом и реакция на изменения (Agile Manifesto, 2001). Вместо попытки сразу утвердить всё ТЗ команда идёт небольшими поставками и получает обратную связь.</w:t>
+        <w:t>Agile (гибкая методология, точнее — семейство гибких подходов) — это способ организации разработки программного обеспечения, основанный на коротких итерациях, регулярной поставке работающего продукта, тесном взаимодействии с заказчиком и готовности изменять требования по мере появления новой информации. Ценности Agile сформулированы в Agile Manifesto (2001): люди и взаимодействие важнее процессов и инструментов; работающий продукт важнее исчерпывающей документации; сотрудничество с заказчиком важнее жёсткого контракта; готовность к изменениям важнее следования первоначальному плану. В отличие от классической «водопадной» схемы, где сначала пытаются полностью утвердить все требования, в Agile продукт развивают постепенно: каждые одну-несколько недель команда демонстрирует прирост функциональности и получает обратную связь. К Agile-подходам относят, в частности, Scrum, Kanban, XP и другие практики. Главный смысл Agile — быстрее давать ценность пользователю и снижать риск долгой разработки «не того» продукта.</w:t>
       </w:r>
     </w:p>
     <w:p>
       <w:pPr>
-        <w:spacing w:after="120" w:line="276" w:lineRule="auto"/>
+        <w:spacing w:after="160" w:line="276" w:lineRule="auto"/>
         <w:ind w:firstLine="709"/>
         <w:jc w:val="both"/>
       </w:pPr>
@@ -1553,13 +1553,13 @@
           <w:i w:val="0"/>
           <w:sz w:val="28"/>
         </w:rPr>
-        <w:t>Принципы Agile (12 принципов Манифеста):</w:t>
+        <w:t>Принципы Agile (12 принципов Манифеста) с кратким пояснением:</w:t>
       </w:r>
     </w:p>
     <w:p>
       <w:pPr>
         <w:pStyle w:val="ListBullet"/>
-        <w:spacing w:after="60"/>
+        <w:spacing w:after="80"/>
       </w:pPr>
       <w:r>
         <w:rPr>
@@ -1568,13 +1568,13 @@
           <w:i w:val="0"/>
           <w:sz w:val="28"/>
         </w:rPr>
-        <w:t>Наивысший приоритет — удовлетворять заказчика регулярной и ранней поставкой ценного ПО.</w:t>
+        <w:t>1. Наивысший приоритет — удовлетворять потребности заказчика регулярной и ранней поставкой ценного ПО. Не копить результат месяцами, а показывать пользу как можно раньше.</w:t>
       </w:r>
     </w:p>
     <w:p>
       <w:pPr>
         <w:pStyle w:val="ListBullet"/>
-        <w:spacing w:after="60"/>
+        <w:spacing w:after="80"/>
       </w:pPr>
       <w:r>
         <w:rPr>
@@ -1583,13 +1583,13 @@
           <w:i w:val="0"/>
           <w:sz w:val="28"/>
         </w:rPr>
-        <w:t>Изменение требований приветствуется даже на поздних стадиях разработки.</w:t>
+        <w:t>2. Изменение требований приветствуется даже на поздних стадиях. Гибкость важнее слепого следования устаревшему ТЗ, если изменилась потребность бизнеса.</w:t>
       </w:r>
     </w:p>
     <w:p>
       <w:pPr>
         <w:pStyle w:val="ListBullet"/>
-        <w:spacing w:after="60"/>
+        <w:spacing w:after="80"/>
       </w:pPr>
       <w:r>
         <w:rPr>
@@ -1598,13 +1598,13 @@
           <w:i w:val="0"/>
           <w:sz w:val="28"/>
         </w:rPr>
-        <w:t>Рабочее ПО следует поставлять как можно чаще — от пары недель до пары месяцев.</w:t>
+        <w:t>3. Рабочее ПО поставляют часто — в сроки от пары недель до пары месяцев, предпочитая меньший период. Короткие циклы дают быструю обратную связь.</w:t>
       </w:r>
     </w:p>
     <w:p>
       <w:pPr>
         <w:pStyle w:val="ListBullet"/>
-        <w:spacing w:after="60"/>
+        <w:spacing w:after="80"/>
       </w:pPr>
       <w:r>
         <w:rPr>
@@ -1613,13 +1613,13 @@
           <w:i w:val="0"/>
           <w:sz w:val="28"/>
         </w:rPr>
-        <w:t>Бизнес и разработчики должны ежедневно работать вместе на протяжении проекта.</w:t>
+        <w:t>4. Бизнес и разработчики должны ежедневно работать вместе. Совместная работа уменьшает недопонимание требований.</w:t>
       </w:r>
     </w:p>
     <w:p>
       <w:pPr>
         <w:pStyle w:val="ListBullet"/>
-        <w:spacing w:after="60"/>
+        <w:spacing w:after="80"/>
       </w:pPr>
       <w:r>
         <w:rPr>
@@ -1628,13 +1628,13 @@
           <w:i w:val="0"/>
           <w:sz w:val="28"/>
         </w:rPr>
-        <w:t>Над проектом работают мотивированные люди; им создают условия, поддержку и доверие.</w:t>
+        <w:t>5. Проекты строят вокруг мотивированных людей; им создают условия, поддержку и доверие. Результат зависит от команды сильнее, чем от формальных регламентов.</w:t>
       </w:r>
     </w:p>
     <w:p>
       <w:pPr>
         <w:pStyle w:val="ListBullet"/>
-        <w:spacing w:after="60"/>
+        <w:spacing w:after="80"/>
       </w:pPr>
       <w:r>
         <w:rPr>
@@ -1643,13 +1643,13 @@
           <w:i w:val="0"/>
           <w:sz w:val="28"/>
         </w:rPr>
-        <w:t>Самый эффективный способ передачи информации в команде — личный разговор.</w:t>
+        <w:t>6. Самый эффективный способ передачи информации — личный разговор. Живое обсуждение быстрее устраняет неопределённость, чем длинная переписка.</w:t>
       </w:r>
     </w:p>
     <w:p>
       <w:pPr>
         <w:pStyle w:val="ListBullet"/>
-        <w:spacing w:after="60"/>
+        <w:spacing w:after="80"/>
       </w:pPr>
       <w:r>
         <w:rPr>
@@ -1658,13 +1658,13 @@
           <w:i w:val="0"/>
           <w:sz w:val="28"/>
         </w:rPr>
-        <w:t>Рабочее программное обеспечение — главный измеритель прогресса.</w:t>
+        <w:t>7. Рабочее программное обеспечение — главный показатель прогресса. Оценивают не «процент написанных документов», а реально работающий продукт.</w:t>
       </w:r>
     </w:p>
     <w:p>
       <w:pPr>
         <w:pStyle w:val="ListBullet"/>
-        <w:spacing w:after="60"/>
+        <w:spacing w:after="80"/>
       </w:pPr>
       <w:r>
         <w:rPr>
@@ -1673,13 +1673,13 @@
           <w:i w:val="0"/>
           <w:sz w:val="28"/>
         </w:rPr>
-        <w:t>Процессы должны поддерживать постоянный и устойчивый темп работы.</w:t>
+        <w:t>8. Процессы должны поддерживать устойчивый темп работы. Команда должна иметь возможность работать ровно и долго, без постоянного аврала.</w:t>
       </w:r>
     </w:p>
     <w:p>
       <w:pPr>
         <w:pStyle w:val="ListBullet"/>
-        <w:spacing w:after="60"/>
+        <w:spacing w:after="80"/>
       </w:pPr>
       <w:r>
         <w:rPr>
@@ -1688,13 +1688,13 @@
           <w:i w:val="0"/>
           <w:sz w:val="28"/>
         </w:rPr>
-        <w:t>Постоянное внимание к техническому совершенству и хорошему дизайну повышает гибкость.</w:t>
+        <w:t>9. Постоянное внимание к техническому совершенству и хорошему дизайну повышает гибкость. Качественная архитектура и код облегчают изменения.</w:t>
       </w:r>
     </w:p>
     <w:p>
       <w:pPr>
         <w:pStyle w:val="ListBullet"/>
-        <w:spacing w:after="60"/>
+        <w:spacing w:after="80"/>
       </w:pPr>
       <w:r>
         <w:rPr>
@@ -1703,13 +1703,13 @@
           <w:i w:val="0"/>
           <w:sz w:val="28"/>
         </w:rPr>
-        <w:t>Простота — искусство не делать лишней работы — крайне необходима.</w:t>
+        <w:t>10. Простота — искусство не делать лишней работы — крайне необходима. Не усложнять решение заранее «на всякий случай».</w:t>
       </w:r>
     </w:p>
     <w:p>
       <w:pPr>
         <w:pStyle w:val="ListBullet"/>
-        <w:spacing w:after="60"/>
+        <w:spacing w:after="80"/>
       </w:pPr>
       <w:r>
         <w:rPr>
@@ -1718,13 +1718,13 @@
           <w:i w:val="0"/>
           <w:sz w:val="28"/>
         </w:rPr>
-        <w:t>Лучшие архитектуры, требования и решения рождаются у самоорганизующихся команд.</w:t>
+        <w:t>11. Лучшие архитектуры, требования и проектные решения возникают у самоорганизующихся команд. Команда сама лучше знает, как организовать работу над задачей.</w:t>
       </w:r>
     </w:p>
     <w:p>
       <w:pPr>
         <w:pStyle w:val="ListBullet"/>
-        <w:spacing w:after="60"/>
+        <w:spacing w:after="80"/>
       </w:pPr>
       <w:r>
         <w:rPr>
@@ -1733,12 +1733,12 @@
           <w:i w:val="0"/>
           <w:sz w:val="28"/>
         </w:rPr>
-        <w:t>Команда регулярно анализирует, как стать эффективнее, и корректирует работу.</w:t>
+        <w:t>12. Команда регулярно анализирует способы стать эффективнее и корректирует поведение. Это принцип непрерывного улучшения (ретроспективы).</w:t>
       </w:r>
     </w:p>
     <w:p>
       <w:pPr>
-        <w:spacing w:after="120" w:before="200"/>
+        <w:spacing w:after="160" w:before="240"/>
         <w:ind w:firstLine="0"/>
         <w:jc w:val="left"/>
       </w:pPr>
@@ -1754,7 +1754,7 @@
     </w:p>
     <w:p>
       <w:pPr>
-        <w:spacing w:after="120" w:line="276" w:lineRule="auto"/>
+        <w:spacing w:after="160" w:line="276" w:lineRule="auto"/>
         <w:ind w:firstLine="709"/>
         <w:jc w:val="both"/>
       </w:pPr>
@@ -1765,12 +1765,12 @@
           <w:i w:val="0"/>
           <w:sz w:val="28"/>
         </w:rPr>
-        <w:t>Пример предметной области «учёт заказов»: Покупатель, Заказ, ПозицияЗаказа, Товар, интерфейс Оплата.</w:t>
+        <w:t>На рисунке показана диаграмма классов для предметной области учёта заказов. Классы «Покупатель», «Заказ», «ПозицияЗаказа» и «Товар» связаны ассоциациями с указанной множественностью; «Оплата» представлена как интерфейс, который использует заказ. У классов указаны атрибуты, методы и видимость.</w:t>
       </w:r>
     </w:p>
     <w:p>
       <w:pPr>
-        <w:spacing w:before="120" w:after="40"/>
+        <w:spacing w:before="160" w:after="40"/>
         <w:jc w:val="center"/>
       </w:pPr>
       <w:r>
@@ -1821,7 +1821,7 @@
           <w:i/>
           <w:sz w:val="24"/>
         </w:rPr>
-        <w:t>Рисунок 4 — Диаграмма классов</w:t>
+        <w:t>Рисунок 4 — Диаграмма классов (вариант 3, задание 4)</w:t>
       </w:r>
     </w:p>
     <w:p>
@@ -1831,7 +1831,7 @@
     </w:p>
     <w:p>
       <w:pPr>
-        <w:spacing w:after="200" w:before="240"/>
+        <w:spacing w:after="200" w:before="280"/>
         <w:ind w:firstLine="0"/>
         <w:jc w:val="center"/>
       </w:pPr>
@@ -1847,7 +1847,7 @@
     </w:p>
     <w:p>
       <w:pPr>
-        <w:spacing w:after="160" w:before="0"/>
+        <w:spacing w:after="200" w:before="0"/>
         <w:ind w:firstLine="0"/>
         <w:jc w:val="both"/>
       </w:pPr>
@@ -1858,12 +1858,12 @@
           <w:i/>
           <w:sz w:val="24"/>
         </w:rPr>
-        <w:t>Примечание: в бланке пункты 1 и 2 сформулированы одинаково (оба про диаграмму коммуникации). Ниже — полный ответ; для задания 2 дополнительно углублено сравнение с диаграммой последовательности.</w:t>
+        <w:t>Примечание: в исходном бланке контрольной работы формулировки заданий 1 и 2 совпадают (оба посвящены диаграмме коммуникации). Ниже дан полный развёрнутый ответ по существу вопроса; в задании 2 дополнительно углублены сравнение с диаграммой последовательности и критерии выбора нотации.</w:t>
       </w:r>
     </w:p>
     <w:p>
       <w:pPr>
-        <w:spacing w:after="120" w:before="200"/>
+        <w:spacing w:after="160" w:before="240"/>
         <w:ind w:firstLine="0"/>
         <w:jc w:val="left"/>
       </w:pPr>
@@ -1879,7 +1879,7 @@
     </w:p>
     <w:p>
       <w:pPr>
-        <w:spacing w:after="160" w:line="276" w:lineRule="auto"/>
+        <w:spacing w:after="200" w:line="276" w:lineRule="auto"/>
         <w:ind w:firstLine="709"/>
         <w:jc w:val="both"/>
       </w:pPr>
@@ -1899,12 +1899,12 @@
           <w:i w:val="0"/>
           <w:sz w:val="28"/>
         </w:rPr>
-        <w:t>Показывает, как объекты связаны и какими сообщениями обмениваются при выполнении сценария. Акцент — на структуре взаимодействия («кто с кем связан»), а не на вертикальной шкале времени. Порядок сообщений задаётся номерами (1, 2, 1.1…). Диаграмму применяют при анализе и проектировании как «карту» обмена сообщениями.</w:t>
+        <w:t>Диаграмма коммуникации (Communication Diagram; в более ранних версиях UML — Collaboration Diagram) предназначена для отображения взаимодействия объектов с акцентом на их структурных связях. Она показывает, какие объекты участвуют в сценарии, какими линиями связи они соединены и какие сообщения по этим связям передаются. В отличие от диаграммы последовательности, где доминирует ось времени, здесь на первый план выходит «карта» взаимодействия: сразу видно, кто с кем связан. Порядок сообщений не читается по вертикали листа, а задаётся явной нумерацией (1, 2, 1.1, 1.2, 3…). Диаграмму применяют при анализе и проектировании, когда нужно понять организацию обмена сообщениями в рамках прецедента.</w:t>
       </w:r>
     </w:p>
     <w:p>
       <w:pPr>
-        <w:spacing w:after="160" w:line="276" w:lineRule="auto"/>
+        <w:spacing w:after="200" w:line="276" w:lineRule="auto"/>
         <w:ind w:firstLine="709"/>
         <w:jc w:val="both"/>
       </w:pPr>
@@ -1915,7 +1915,7 @@
           <w:i w:val="0"/>
           <w:sz w:val="28"/>
         </w:rPr>
-        <w:t xml:space="preserve">Основные элементы. </w:t>
+        <w:t xml:space="preserve">Основные элементы диаграммы коммуникации. </w:t>
       </w:r>
       <w:r>
         <w:rPr>
@@ -1924,12 +1924,12 @@
           <w:i w:val="0"/>
           <w:sz w:val="28"/>
         </w:rPr>
-        <w:t>Участники (объекты/роли) — прямоугольники; связи между ними — линии; сообщения — стрелки вдоль связей с номером и именем операции. При необходимости добавляют актёров. Нумерация отражает последовательность и вложенность вызовов (1.1 выполняется внутри обработки сообщения 1).</w:t>
+        <w:t>К основным элементам относятся: участники взаимодействия (объекты или роли), изображаемые прямоугольниками; связи (links) между участниками — линии, по которым могут идти сообщения; сами сообщения — стрелки вдоль связей с номером и именем операции или сигнала; при необходимости — актёры, инициирующие сценарий. Нумерация сообщений отражает последовательность и вложенность: сообщение 1.1 выполняется в ходе обработки сообщения 1. Благодаря этому диаграмма остаётся компактной даже при нескольких объектах, сохраняя информацию о порядке действий.</w:t>
       </w:r>
     </w:p>
     <w:p>
       <w:pPr>
-        <w:spacing w:after="160" w:line="276" w:lineRule="auto"/>
+        <w:spacing w:after="200" w:line="276" w:lineRule="auto"/>
         <w:ind w:firstLine="709"/>
         <w:jc w:val="both"/>
       </w:pPr>
@@ -1949,12 +1949,12 @@
           <w:i w:val="0"/>
           <w:sz w:val="28"/>
         </w:rPr>
-        <w:t>Обе диаграммы — диаграммы взаимодействия UML и могут описывать один сценарий. На sequence сообщения упорядочены по вертикали, видны линии жизни и активации. На communication важнее топология связей, время закодировано номерами. Sequence удобнее для длинных сценариев «по шагам», communication — для компактного обзора связей. Семантика сообщений одна и та же.</w:t>
+        <w:t>Диаграмма коммуникации и диаграмма последовательности относятся к одной группе UML — диаграммам взаимодействия — и могут описывать один и тот же сценарий. На sequence-диаграмме время явно направлено сверху вниз, хорошо видны линии жизни, активации и временные фрагменты (alt, loop, opt). На communication-диаграмме важнее топология связей, а время кодируется номерами сообщений. Следовательно, последовательность удобнее читать как пошаговый сценарий, а коммуникацию — как структурный обзор «кто с кем общается». Семантика сообщений при этом одна: диаграммы взаимопреобразуемы. Выбор зависит от того, что важнее подчеркнуть — порядок во времени или устройство связей.</w:t>
       </w:r>
     </w:p>
     <w:p>
       <w:pPr>
-        <w:spacing w:after="120" w:before="200"/>
+        <w:spacing w:after="160" w:before="240"/>
         <w:ind w:firstLine="0"/>
         <w:jc w:val="left"/>
       </w:pPr>
@@ -1965,12 +1965,12 @@
           <w:i w:val="0"/>
           <w:sz w:val="28"/>
         </w:rPr>
-        <w:t>Задание 2. Диаграмма коммуникации — углубление (5–6 баллов)</w:t>
+        <w:t>Задание 2. Диаграмма коммуникации — углублённый ответ (5–6 баллов)</w:t>
       </w:r>
     </w:p>
     <w:p>
       <w:pPr>
-        <w:spacing w:after="160" w:line="276" w:lineRule="auto"/>
+        <w:spacing w:after="200" w:line="276" w:lineRule="auto"/>
         <w:ind w:firstLine="709"/>
         <w:jc w:val="both"/>
       </w:pPr>
@@ -1981,7 +1981,7 @@
           <w:i w:val="0"/>
           <w:sz w:val="28"/>
         </w:rPr>
-        <w:t xml:space="preserve">Место диаграммы в UML. </w:t>
+        <w:t xml:space="preserve">Место диаграммы коммуникации среди диаграмм UML. </w:t>
       </w:r>
       <w:r>
         <w:rPr>
@@ -1990,12 +1990,12 @@
           <w:i w:val="0"/>
           <w:sz w:val="28"/>
         </w:rPr>
-        <w:t>Относится к диаграммам поведения (взаимодействия). Её используют, когда уже понятны классы/объекты и нужно уточнить, как они совместно реализуют прецедент. По сути это другой взгляд на то же взаимодействие, что у sequence diagram.</w:t>
+        <w:t>Диаграмма коммуникации входит в раздел поведенческих диаграмм UML и конкретно — в семейство диаграмм взаимодействия. Её используют после того, как уже намечены основные классы или объекты, чтобы уточнить, как они совместно реализуют поведение прецедента. Если диаграмма классов отвечает на вопрос «что из себя представляет система статически», то диаграмма коммуникации отвечает: «как объекты обмениваются сообщениями, чтобы выполнить конкретную задачу».</w:t>
       </w:r>
     </w:p>
     <w:p>
       <w:pPr>
-        <w:spacing w:after="160" w:line="276" w:lineRule="auto"/>
+        <w:spacing w:after="200" w:line="276" w:lineRule="auto"/>
         <w:ind w:firstLine="709"/>
         <w:jc w:val="both"/>
       </w:pPr>
@@ -2015,12 +2015,12 @@
           <w:i w:val="0"/>
           <w:sz w:val="28"/>
         </w:rPr>
-        <w:t>Участники — роли классификаторов (обычно объекты классов). Связь означает канал передачи сообщений между объектами в данном взаимодействии. Сообщение — вызов операции или сигнал; стрелка указывает получателя. Вложенные вызовы показывают составными номерами: 1, 1.1, 1.2, 2.</w:t>
+        <w:t>Участник на диаграмме — это роль классификатора в конкретном взаимодействии, чаще всего объект класса. Связь между участниками означает, что в рамках сценария существует канал передачи сообщений (часто это экземпляр ассоциации из модели классов). Сообщение обозначает вызов операции либо посылку сигнала; направление стрелки указывает получателя. Составная нумерация позволяет показать вложенные вызовы без перегруза рисунка. Например, цепочка 1 → 1.1 → 1.2 → 2 читается так: сначала сообщение 1, внутри его обработки — 1.1 и 1.2, затем сообщение 2.</w:t>
       </w:r>
     </w:p>
     <w:p>
       <w:pPr>
-        <w:spacing w:after="160" w:line="276" w:lineRule="auto"/>
+        <w:spacing w:after="200" w:line="276" w:lineRule="auto"/>
         <w:ind w:firstLine="709"/>
         <w:jc w:val="both"/>
       </w:pPr>
@@ -2031,7 +2031,7 @@
           <w:i w:val="0"/>
           <w:sz w:val="28"/>
         </w:rPr>
-        <w:t xml:space="preserve">Когда выбирать communication, а когда sequence. </w:t>
+        <w:t xml:space="preserve">Практическое сравнение с sequence и критерии выбора. </w:t>
       </w:r>
       <w:r>
         <w:rPr>
@@ -2040,12 +2040,12 @@
           <w:i w:val="0"/>
           <w:sz w:val="28"/>
         </w:rPr>
-        <w:t>Если важен порядок и ветвления во времени (alt, loop, opt) — обычно sequence. Если объектов много и нужна сеть связей — communication. Для контрольной достаточно объяснить оба представления и показать нумерованные сообщения на связях.</w:t>
+        <w:t>Если сценарий длинный, содержит ветвления и циклы, обычно удобнее диаграмма последовательности: на ней естественно размещаются комбинированные фрагменты alt/loop/opt и хорошо читается временная логика. Если объектов много и нужно быстро понять, какие пары вообще взаимодействуют, удобнее диаграмма коммуникации: она компактнее показывает сеть связей. В учебной и проектной практике обе формы полезны: sequence — для детального сценария, communication — для обзорной схемы взаимодействия. Для ответа на контрольной достаточно уметь объяснить назначение, элементы, нумерацию сообщений и отличия от sequence.</w:t>
       </w:r>
     </w:p>
     <w:p>
       <w:pPr>
-        <w:spacing w:before="120" w:after="40"/>
+        <w:spacing w:before="160" w:after="40"/>
         <w:jc w:val="center"/>
       </w:pPr>
       <w:r>
@@ -2096,12 +2096,12 @@
           <w:i/>
           <w:sz w:val="24"/>
         </w:rPr>
-        <w:t>Рисунок 5 — Диаграмма коммуникации</w:t>
+        <w:t>Рисунок 5 — Диаграмма коммуникации (вариант 4, задания 1–2)</w:t>
       </w:r>
     </w:p>
     <w:p>
       <w:pPr>
-        <w:spacing w:after="120" w:before="200"/>
+        <w:spacing w:after="160" w:before="240"/>
         <w:ind w:firstLine="0"/>
         <w:jc w:val="left"/>
       </w:pPr>
@@ -2117,7 +2117,7 @@
     </w:p>
     <w:p>
       <w:pPr>
-        <w:spacing w:after="120" w:line="276" w:lineRule="auto"/>
+        <w:spacing w:after="160" w:line="276" w:lineRule="auto"/>
         <w:ind w:firstLine="709"/>
         <w:jc w:val="both"/>
       </w:pPr>
@@ -2128,12 +2128,12 @@
           <w:i w:val="0"/>
           <w:sz w:val="28"/>
         </w:rPr>
-        <w:t>Scrum — гибкий каркас управления разработкой короткими циклами (спринтами). В классическом Scrum — три роли и три основных артефакта.</w:t>
+        <w:t>Scrum — это гибкий каркас (framework) управления разработкой продукта короткими циклами, называемыми спринтами. Работа ведётся итерациями фиксированной длины, в конце каждой из которых должен появляться полезный прирост продукта. В классическом описании Scrum выделяют три роли и три основных артефакта.</w:t>
       </w:r>
     </w:p>
     <w:p>
       <w:pPr>
-        <w:spacing w:after="160" w:line="276" w:lineRule="auto"/>
+        <w:spacing w:after="200" w:line="276" w:lineRule="auto"/>
         <w:ind w:firstLine="709"/>
         <w:jc w:val="both"/>
       </w:pPr>
@@ -2144,7 +2144,7 @@
           <w:i w:val="0"/>
           <w:sz w:val="28"/>
         </w:rPr>
-        <w:t xml:space="preserve">Product Owner (Владелец продукта) — </w:t>
+        <w:t xml:space="preserve">Product Owner (Владелец продукта). </w:t>
       </w:r>
       <w:r>
         <w:rPr>
@@ -2153,12 +2153,12 @@
           <w:i w:val="0"/>
           <w:sz w:val="28"/>
         </w:rPr>
-        <w:t>отвечает за ценность продукта и содержание Product Backlog. Формулирует и упорядочивает требования, объясняет приоритеты, принимает результат и представляет интересы заказчика/пользователей. Именно он решает, что важнее сделать раньше.</w:t>
+        <w:t>Product Owner отвечает за максимизацию ценности продукта и за содержание Product Backlog. Он собирает потребности заказчика и пользователей, формулирует элементы бэклога (часто в виде пользовательских историй), упорядочивает их по приоритету и разъясняет команде, что важнее сделать раньше. Также Product Owner принимает готовый результат и решает, соответствует ли он ожиданиям. Это роль заказчика внутри процесса: не обязательно технический руководитель, но человек, который определяет «что строить» и в какой последовательности.</w:t>
       </w:r>
     </w:p>
     <w:p>
       <w:pPr>
-        <w:spacing w:after="160" w:line="276" w:lineRule="auto"/>
+        <w:spacing w:after="200" w:line="276" w:lineRule="auto"/>
         <w:ind w:firstLine="709"/>
         <w:jc w:val="both"/>
       </w:pPr>
@@ -2169,7 +2169,7 @@
           <w:i w:val="0"/>
           <w:sz w:val="28"/>
         </w:rPr>
-        <w:t xml:space="preserve">Scrum Master — </w:t>
+        <w:t xml:space="preserve">Scrum Master. </w:t>
       </w:r>
       <w:r>
         <w:rPr>
@@ -2178,12 +2178,12 @@
           <w:i w:val="0"/>
           <w:sz w:val="28"/>
         </w:rPr>
-        <w:t>помогает команде правильно применять Scrum. Организует события (планирование, ежедневный Scrum, обзор, ретроспективу), устраняет препятствия и защищает команду от внешних помех. Это не начальник разработчиков, а наставник процесса.</w:t>
+        <w:t>Scrum Master помогает команде и организации правильно применять Scrum. Он фасилитирует события (планирование спринта, Daily Scrum, обзор спринта, ретроспективу), следит за соблюдением договорённостей процесса, помогает устранять препятствия, мешающие работе, и защищает команду от внешних хаотичных вмешательств. Scrum Master — не «начальник программистов» и не замена Product Owner. Его задача — сделать процесс прозрачным и эффективным, развивать самоорганизацию команды и непрерывно улучшать способы работы.</w:t>
       </w:r>
     </w:p>
     <w:p>
       <w:pPr>
-        <w:spacing w:after="160" w:line="276" w:lineRule="auto"/>
+        <w:spacing w:after="200" w:line="276" w:lineRule="auto"/>
         <w:ind w:firstLine="709"/>
         <w:jc w:val="both"/>
       </w:pPr>
@@ -2194,7 +2194,7 @@
           <w:i w:val="0"/>
           <w:sz w:val="28"/>
         </w:rPr>
-        <w:t xml:space="preserve">Developers (Команда разработки) — </w:t>
+        <w:t xml:space="preserve">Developers (Команда разработки). </w:t>
       </w:r>
       <w:r>
         <w:rPr>
@@ -2203,12 +2203,12 @@
           <w:i w:val="0"/>
           <w:sz w:val="28"/>
         </w:rPr>
-        <w:t>кросс-функциональная группа, которая создаёт Инкремент продукта. Сама оценивает объём работы, выбирает способ реализации задач спринта и несёт общую ответственность за результат. В составе могут быть программисты, тестировщики, аналитики и др.</w:t>
+        <w:t>Developers — это кросс-функциональная группа специалистов, которая непосредственно создаёт Инкремент продукта. В состав могут входить программисты, тестировщики, аналитики, дизайнеры и другие роли — в зависимости от продукта. Команда сама оценивает объём работы, решает, как реализовать выбранные задачи, и несёт коллективную ответственность за результат спринта. Важный принцип: команда самоорганизуется в рамках цели спринта. Нет отдельного «прораба», который раздаёт микрозадачи вместо самой команды.</w:t>
       </w:r>
     </w:p>
     <w:p>
       <w:pPr>
-        <w:spacing w:after="160" w:line="276" w:lineRule="auto"/>
+        <w:spacing w:after="200" w:line="276" w:lineRule="auto"/>
         <w:ind w:firstLine="709"/>
         <w:jc w:val="both"/>
       </w:pPr>
@@ -2219,7 +2219,7 @@
           <w:i w:val="0"/>
           <w:sz w:val="28"/>
         </w:rPr>
-        <w:t xml:space="preserve">Product Backlog — </w:t>
+        <w:t xml:space="preserve">Product Backlog. </w:t>
       </w:r>
       <w:r>
         <w:rPr>
@@ -2228,12 +2228,12 @@
           <w:i w:val="0"/>
           <w:sz w:val="28"/>
         </w:rPr>
-        <w:t>упорядоченный список всего, что может понадобиться в продукте: функции, улучшения, дефекты, технические задачи. Это «живой» артефакт, который постоянно уточняется. За содержание и приоритеты отвечает Product Owner.</w:t>
+        <w:t>Product Backlog — упорядоченный список всего, что может понадобиться в продукте: новые функции, изменения, исправления дефектов, технические улучшения. Это единый источник работы для команды. Бэклог «живой»: его постоянно уточняют, дробят крупные элементы на более мелкие, меняют приоритеты. Ответственность за содержание и порядок элементов Product Backlog лежит на Product Owner, хотя детализацию формулировок он часто делает вместе с командой.</w:t>
       </w:r>
     </w:p>
     <w:p>
       <w:pPr>
-        <w:spacing w:after="160" w:line="276" w:lineRule="auto"/>
+        <w:spacing w:after="200" w:line="276" w:lineRule="auto"/>
         <w:ind w:firstLine="709"/>
         <w:jc w:val="both"/>
       </w:pPr>
@@ -2244,7 +2244,7 @@
           <w:i w:val="0"/>
           <w:sz w:val="28"/>
         </w:rPr>
-        <w:t xml:space="preserve">Sprint Backlog — </w:t>
+        <w:t xml:space="preserve">Sprint Backlog. </w:t>
       </w:r>
       <w:r>
         <w:rPr>
@@ -2253,12 +2253,12 @@
           <w:i w:val="0"/>
           <w:sz w:val="28"/>
         </w:rPr>
-        <w:t>элементы Product Backlog, выбранные на текущий спринт, плюс план их реализации. Принадлежит команде разработки: формируется на планировании и обновляется по ходу спринта.</w:t>
+        <w:t>Sprint Backlog — это набор элементов Product Backlog, выбранных для выполнения в текущем спринте, плюс план их реализации. Он формируется на планировании спринта и принадлежит команде разработки. В течение спринта Sprint Backlog обновляют, чтобы было видно, что уже сделано и что осталось для достижения цели спринта. Если Product Backlog отвечает на вопрос «что вообще нужно продукту», то Sprint Backlog отвечает: «что команда обязалась сделать в этом спринте и как к этому идёт».</w:t>
       </w:r>
     </w:p>
     <w:p>
       <w:pPr>
-        <w:spacing w:after="160" w:line="276" w:lineRule="auto"/>
+        <w:spacing w:after="200" w:line="276" w:lineRule="auto"/>
         <w:ind w:firstLine="709"/>
         <w:jc w:val="both"/>
       </w:pPr>
@@ -2269,7 +2269,7 @@
           <w:i w:val="0"/>
           <w:sz w:val="28"/>
         </w:rPr>
-        <w:t xml:space="preserve">Increment (Инкремент) — </w:t>
+        <w:t xml:space="preserve">Increment (Инкремент). </w:t>
       </w:r>
       <w:r>
         <w:rPr>
@@ -2278,12 +2278,12 @@
           <w:i w:val="0"/>
           <w:sz w:val="28"/>
         </w:rPr>
-        <w:t>сумма элементов бэклога, завершённых в спринте, и ценности предыдущих инкрементов. Должен быть пригоден к использованию и соответствовать Definition of Done. К концу спринта показывают работоспособный прирост продукта, а не «почти готовый» код.</w:t>
+        <w:t>Инкремент — это сумма всех элементов бэклога, доведённых до готовности в текущем спринте, вместе с ценностью предыдущих инкрементов. К концу спринта инкремент должен быть пригоден к использованию и соответствовать согласованному Definition of Done — единым критериям готовности (код написан, проверен, интегрирован, задокументирован в нужном объёме и т.д.). Именно инкремент демонстрируют на обзоре спринта: показывают работающий прирост продукта, а не промежуточные обещания. Благодаря регулярным инкрементам заказчик раньше начинает получать реальную пользу.</w:t>
       </w:r>
     </w:p>
     <w:p>
       <w:pPr>
-        <w:spacing w:after="120" w:before="200"/>
+        <w:spacing w:after="160" w:before="240"/>
         <w:ind w:firstLine="0"/>
         <w:jc w:val="left"/>
       </w:pPr>
@@ -2299,7 +2299,7 @@
     </w:p>
     <w:p>
       <w:pPr>
-        <w:spacing w:after="120" w:line="276" w:lineRule="auto"/>
+        <w:spacing w:after="160" w:line="276" w:lineRule="auto"/>
         <w:ind w:firstLine="709"/>
         <w:jc w:val="both"/>
       </w:pPr>
@@ -2310,12 +2310,12 @@
           <w:i w:val="0"/>
           <w:sz w:val="28"/>
         </w:rPr>
-        <w:t>Диаграмма состояний показывает, в каких состояниях может быть объект и по каким событиям он переходит между ними. Пример — жизненный цикл заказа от создания до закрытия, включая отмену.</w:t>
+        <w:t>Диаграмма состояний (state machine diagram) показывает жизненный цикл объекта: в каких состояниях он может находиться и по каким событиям переходит из одного состояния в другое. Начальное состояние обозначают залитым кругом, конечное — кругом в кольце, состояния — скруглёнными прямоугольниками, переходы — стрелками с подписью события или действия. На рисунке приведён пример жизненного цикла заказа: от создания через подтверждение, оплату и доставку до закрытия, а также ветка отмены.</w:t>
       </w:r>
     </w:p>
     <w:p>
       <w:pPr>
-        <w:spacing w:before="120" w:after="40"/>
+        <w:spacing w:before="160" w:after="40"/>
         <w:jc w:val="center"/>
       </w:pPr>
       <w:r>
@@ -2366,12 +2366,12 @@
           <w:i/>
           <w:sz w:val="24"/>
         </w:rPr>
-        <w:t>Рисунок 6 — Диаграмма состояний</w:t>
+        <w:t>Рисунок 6 — Диаграмма состояний (вариант 4, задание 4)</w:t>
       </w:r>
     </w:p>
     <w:p>
       <w:pPr>
-        <w:spacing w:after="120" w:before="240"/>
+        <w:spacing w:after="120" w:before="280"/>
         <w:ind w:firstLine="0"/>
         <w:jc w:val="center"/>
       </w:pPr>

</xml_diff>

<commit_message>
Shorten definitions to a medium exam-ready length
Keep 2–4 sentences per term with diagrams; replace the overly
long answers with a balanced version under clear filenames.

Co-authored-by: MaxChicago <MaxChicago@users.noreply.github.com>
</commit_message>
<xml_diff>
--- a/Kontrolnaya_TRPO_otvety.docx
+++ b/Kontrolnaya_TRPO_otvety.docx
@@ -5,7 +5,6 @@
     <w:p>
       <w:pPr>
         <w:spacing w:after="80" w:before="0"/>
-        <w:ind w:firstLine="0"/>
         <w:jc w:val="center"/>
       </w:pPr>
       <w:r>
@@ -21,7 +20,6 @@
     <w:p>
       <w:pPr>
         <w:spacing w:after="40" w:before="0"/>
-        <w:ind w:firstLine="0"/>
         <w:jc w:val="center"/>
       </w:pPr>
       <w:r>
@@ -31,13 +29,12 @@
           <w:i w:val="0"/>
           <w:sz w:val="28"/>
         </w:rPr>
-        <w:t>Специальность 5-04-0612-02</w:t>
+        <w:t>Специальность 5-04-0612-02 · Техник-программист</w:t>
       </w:r>
     </w:p>
     <w:p>
       <w:pPr>
         <w:spacing w:after="40" w:before="0"/>
-        <w:ind w:firstLine="0"/>
         <w:jc w:val="center"/>
       </w:pPr>
       <w:r>
@@ -47,77 +44,12 @@
           <w:i w:val="0"/>
           <w:sz w:val="28"/>
         </w:rPr>
-        <w:t>Разработка и сопровождение программного обеспечения информационных систем</w:t>
+        <w:t>Контрольная работа — «Технология разработки программного обеспечения»</w:t>
       </w:r>
     </w:p>
     <w:p>
       <w:pPr>
-        <w:spacing w:after="200" w:before="0"/>
-        <w:ind w:firstLine="0"/>
-        <w:jc w:val="center"/>
-      </w:pPr>
-      <w:r>
-        <w:rPr>
-          <w:rFonts w:ascii="Times New Roman" w:hAnsi="Times New Roman" w:eastAsia="Times New Roman"/>
-          <w:b w:val="0"/>
-          <w:i w:val="0"/>
-          <w:sz w:val="28"/>
-        </w:rPr>
-        <w:t>Квалификация: Техник-программист</w:t>
-      </w:r>
-    </w:p>
-    <w:p>
-      <w:pPr>
-        <w:spacing w:after="40" w:before="0"/>
-        <w:ind w:firstLine="0"/>
-        <w:jc w:val="center"/>
-      </w:pPr>
-      <w:r>
-        <w:rPr>
-          <w:rFonts w:ascii="Times New Roman" w:hAnsi="Times New Roman" w:eastAsia="Times New Roman"/>
-          <w:b/>
-          <w:i w:val="0"/>
-          <w:sz w:val="32"/>
-        </w:rPr>
-        <w:t>Контрольная работа</w:t>
-      </w:r>
-    </w:p>
-    <w:p>
-      <w:pPr>
-        <w:spacing w:after="40" w:before="0"/>
-        <w:ind w:firstLine="0"/>
-        <w:jc w:val="center"/>
-      </w:pPr>
-      <w:r>
-        <w:rPr>
-          <w:rFonts w:ascii="Times New Roman" w:hAnsi="Times New Roman" w:eastAsia="Times New Roman"/>
-          <w:b w:val="0"/>
-          <w:i w:val="0"/>
-          <w:sz w:val="28"/>
-        </w:rPr>
-        <w:t>при проведении самоконтроля</w:t>
-      </w:r>
-    </w:p>
-    <w:p>
-      <w:pPr>
-        <w:spacing w:after="40" w:before="0"/>
-        <w:ind w:firstLine="0"/>
-        <w:jc w:val="center"/>
-      </w:pPr>
-      <w:r>
-        <w:rPr>
-          <w:rFonts w:ascii="Times New Roman" w:hAnsi="Times New Roman" w:eastAsia="Times New Roman"/>
-          <w:b w:val="0"/>
-          <w:i w:val="0"/>
-          <w:sz w:val="28"/>
-        </w:rPr>
-        <w:t>Учебный предмет «Технология разработки программного обеспечения»</w:t>
-      </w:r>
-    </w:p>
-    <w:p>
-      <w:pPr>
-        <w:spacing w:after="200" w:before="0"/>
-        <w:ind w:firstLine="0"/>
+        <w:spacing w:after="160" w:before="0"/>
         <w:jc w:val="center"/>
       </w:pPr>
       <w:r>
@@ -133,7 +65,6 @@
     <w:p>
       <w:pPr>
         <w:spacing w:after="80" w:before="0"/>
-        <w:ind w:firstLine="0"/>
         <w:jc w:val="center"/>
       </w:pPr>
       <w:r>
@@ -148,24 +79,7 @@
     </w:p>
     <w:p>
       <w:pPr>
-        <w:spacing w:after="320" w:before="0"/>
-        <w:ind w:firstLine="0"/>
-        <w:jc w:val="center"/>
-      </w:pPr>
-      <w:r>
-        <w:rPr>
-          <w:rFonts w:ascii="Times New Roman" w:hAnsi="Times New Roman" w:eastAsia="Times New Roman"/>
-          <w:b w:val="0"/>
-          <w:i/>
-          <w:sz w:val="24"/>
-        </w:rPr>
-        <w:t>с подробными определениями и начерченными диаграммами</w:t>
-      </w:r>
-    </w:p>
-    <w:p>
-      <w:pPr>
-        <w:spacing w:after="80" w:before="0"/>
-        <w:ind w:firstLine="0"/>
+        <w:spacing w:after="40" w:before="0"/>
         <w:jc w:val="right"/>
       </w:pPr>
       <w:r>
@@ -181,7 +95,6 @@
     <w:p>
       <w:pPr>
         <w:spacing w:after="120" w:before="0"/>
-        <w:ind w:firstLine="0"/>
         <w:jc w:val="center"/>
       </w:pPr>
       <w:r>
@@ -201,8 +114,7 @@
     </w:p>
     <w:p>
       <w:pPr>
-        <w:spacing w:after="200" w:before="280"/>
-        <w:ind w:firstLine="0"/>
+        <w:spacing w:after="160" w:before="240"/>
         <w:jc w:val="center"/>
       </w:pPr>
       <w:r>
@@ -217,8 +129,7 @@
     </w:p>
     <w:p>
       <w:pPr>
-        <w:spacing w:after="160" w:before="240"/>
-        <w:ind w:firstLine="0"/>
+        <w:spacing w:after="120" w:before="200"/>
         <w:jc w:val="left"/>
       </w:pPr>
       <w:r>
@@ -233,7 +144,7 @@
     </w:p>
     <w:p>
       <w:pPr>
-        <w:spacing w:after="200" w:line="276" w:lineRule="auto"/>
+        <w:spacing w:after="160" w:line="276" w:lineRule="auto"/>
         <w:ind w:firstLine="709"/>
         <w:jc w:val="both"/>
       </w:pPr>
@@ -244,7 +155,7 @@
           <w:i w:val="0"/>
           <w:sz w:val="28"/>
         </w:rPr>
-        <w:t xml:space="preserve">Определение понятия «Жизненный цикл ПО». </w:t>
+        <w:t xml:space="preserve">Жизненный цикл ПО — </w:t>
       </w:r>
       <w:r>
         <w:rPr>
@@ -253,7 +164,23 @@
           <w:i w:val="0"/>
           <w:sz w:val="28"/>
         </w:rPr>
-        <w:t>Жизненный цикл программного обеспечения (ЖЦ ПО) — это полный период существования программного продукта: от момента, когда принято решение о необходимости его создания, до момента полного изъятия продукта из эксплуатации и прекращения его поддержки. В течение жизненного цикла выполняются все виды работ, связанные с ПО: исследование потребностей, формирование требований, проектирование, кодирование, тестирование, внедрение, эксплуатация, сопровождение и вывод из использования. ЖЦ ПО — не просто календарный срок, а организованная последовательность процессов и этапов, на каждом из которых создаются определённые результаты (документы, модели, код, тесты, сборки). Понятие жизненного цикла нужно для планирования проекта, распределения ролей, контроля качества и понимания, на какой стадии находится продукт. Существуют разные модели жизненного цикла (каскадная, итерационная, спиральная, Agile и др.), но набор основных видов деятельности во многом повторяется. Важно отличать жизненный цикл продукта в целом от одной конкретной итерации разработки внутри него.</w:t>
+        <w:t>период от принятия решения о создании программного продукта до его полного изъятия из эксплуатации. В это время выполняются анализ требований, проектирование, реализация, тестирование, внедрение, сопровождение и вывод из использования. Понятие ЖЦ нужно для планирования работ и контроля готовности продукта.</w:t>
+      </w:r>
+    </w:p>
+    <w:p>
+      <w:pPr>
+        <w:spacing w:after="120" w:line="276" w:lineRule="auto"/>
+        <w:ind w:firstLine="709"/>
+        <w:jc w:val="both"/>
+      </w:pPr>
+      <w:r>
+        <w:rPr>
+          <w:rFonts w:ascii="Times New Roman" w:hAnsi="Times New Roman" w:eastAsia="Times New Roman"/>
+          <w:b w:val="0"/>
+          <w:i w:val="0"/>
+          <w:sz w:val="28"/>
+        </w:rPr>
+        <w:t>Основные этапы:</w:t>
       </w:r>
     </w:p>
     <w:p>
@@ -265,27 +192,11 @@
       <w:r>
         <w:rPr>
           <w:rFonts w:ascii="Times New Roman" w:hAnsi="Times New Roman" w:eastAsia="Times New Roman"/>
-          <w:b w:val="0"/>
-          <w:i w:val="0"/>
-          <w:sz w:val="28"/>
-        </w:rPr>
-        <w:t>Основные этапы жизненного цикла ПО и их содержание:</w:t>
-      </w:r>
-    </w:p>
-    <w:p>
-      <w:pPr>
-        <w:spacing w:after="200" w:line="276" w:lineRule="auto"/>
-        <w:ind w:firstLine="709"/>
-        <w:jc w:val="both"/>
-      </w:pPr>
-      <w:r>
-        <w:rPr>
-          <w:rFonts w:ascii="Times New Roman" w:hAnsi="Times New Roman" w:eastAsia="Times New Roman"/>
           <w:b/>
           <w:i w:val="0"/>
           <w:sz w:val="28"/>
         </w:rPr>
-        <w:t xml:space="preserve">1. Анализ требований. </w:t>
+        <w:t xml:space="preserve">Анализ требований — </w:t>
       </w:r>
       <w:r>
         <w:rPr>
@@ -294,157 +205,7 @@
           <w:i w:val="0"/>
           <w:sz w:val="28"/>
         </w:rPr>
-        <w:t>Это начальный этап, на котором определяют, зачем нужна система и что она должна уметь. Специалисты общаются с заказчиком и будущими пользователями, изучают предметную область, собирают пожелания и ограничения. Затем требования формулируют, уточняют, устраняют противоречия и фиксируют в документах (техническое задание, спецификация требований, user stories и т.п.). Различают функциональные требования (какие функции должна выполнять система) и нефункциональные (производительность, надёжность, безопасность, удобство, совместимость). Качество анализа критично: ошибки на этом этапе дорого обходятся позже, потому что неправильно понятая потребность приводит к переделке проекта и кода. Результат этапа — согласованный и проверяемый набор требований.</w:t>
-      </w:r>
-    </w:p>
-    <w:p>
-      <w:pPr>
-        <w:spacing w:after="200" w:line="276" w:lineRule="auto"/>
-        <w:ind w:firstLine="709"/>
-        <w:jc w:val="both"/>
-      </w:pPr>
-      <w:r>
-        <w:rPr>
-          <w:rFonts w:ascii="Times New Roman" w:hAnsi="Times New Roman" w:eastAsia="Times New Roman"/>
-          <w:b/>
-          <w:i w:val="0"/>
-          <w:sz w:val="28"/>
-        </w:rPr>
-        <w:t xml:space="preserve">2. Проектирование. </w:t>
-      </w:r>
-      <w:r>
-        <w:rPr>
-          <w:rFonts w:ascii="Times New Roman" w:hAnsi="Times New Roman" w:eastAsia="Times New Roman"/>
-          <w:b w:val="0"/>
-          <w:i w:val="0"/>
-          <w:sz w:val="28"/>
-        </w:rPr>
-        <w:t>На этапе проектирования на основе требований создают «чертёж» будущей системы. Определяют архитектуру: из каких подсистем и модулей состоит ПО, как они взаимодействуют, где хранятся данные, какие интерфейсы нужны пользователю и другим системам. Проектируют структуру классов, алгоритмы, схемы базы данных, сценарии работы. Для описания решений часто используют UML-диаграммы (прецедентов, классов, последовательности, состояний и др.), а также моделирование процессов (например, IDEF0). Хорошее проектирование снижает риски на этапе кодирования: разработчики понимают, что именно нужно реализовать, и как части системы стыкуются друг с другом. Итог — проектная документация и модели.</w:t>
-      </w:r>
-    </w:p>
-    <w:p>
-      <w:pPr>
-        <w:spacing w:after="200" w:line="276" w:lineRule="auto"/>
-        <w:ind w:firstLine="709"/>
-        <w:jc w:val="both"/>
-      </w:pPr>
-      <w:r>
-        <w:rPr>
-          <w:rFonts w:ascii="Times New Roman" w:hAnsi="Times New Roman" w:eastAsia="Times New Roman"/>
-          <w:b/>
-          <w:i w:val="0"/>
-          <w:sz w:val="28"/>
-        </w:rPr>
-        <w:t xml:space="preserve">3. Реализация (кодирование). </w:t>
-      </w:r>
-      <w:r>
-        <w:rPr>
-          <w:rFonts w:ascii="Times New Roman" w:hAnsi="Times New Roman" w:eastAsia="Times New Roman"/>
-          <w:b w:val="0"/>
-          <w:i w:val="0"/>
-          <w:sz w:val="28"/>
-        </w:rPr>
-        <w:t>На этом этапе проект превращают в работающую программу: пишут исходный код на выбранных языках, создают модули, библиотеки, пользовательский интерфейс, настраивают взаимодействие с базой данных и внешними сервисами. Код должен соответствовать принятым стандартам оформления и архитектурным решениям. Параллельно обычно выполняют модульное тестирование, ревью кода, сборку приложения в исполняемый вид. Результат этапа — программные компоненты и сборки, готовые к более широкой проверке.</w:t>
-      </w:r>
-    </w:p>
-    <w:p>
-      <w:pPr>
-        <w:spacing w:after="200" w:line="276" w:lineRule="auto"/>
-        <w:ind w:firstLine="709"/>
-        <w:jc w:val="both"/>
-      </w:pPr>
-      <w:r>
-        <w:rPr>
-          <w:rFonts w:ascii="Times New Roman" w:hAnsi="Times New Roman" w:eastAsia="Times New Roman"/>
-          <w:b/>
-          <w:i w:val="0"/>
-          <w:sz w:val="28"/>
-        </w:rPr>
-        <w:t xml:space="preserve">4. Тестирование. </w:t>
-      </w:r>
-      <w:r>
-        <w:rPr>
-          <w:rFonts w:ascii="Times New Roman" w:hAnsi="Times New Roman" w:eastAsia="Times New Roman"/>
-          <w:b w:val="0"/>
-          <w:i w:val="0"/>
-          <w:sz w:val="28"/>
-        </w:rPr>
-        <w:t>Тестирование — это процесс проверки, соответствует ли ПО требованиям и ожиданиям, а также поиск дефектов до передачи системы заказчику. Проверяют отдельные модули, затем их совместную работу (интеграционное тестирование), систему в целом и, наконец, проводят приёмочные испытания с участием заказчика. Тестирование бывает функциональным (правильность функций) и нефункциональным (производительность, безопасность, удобство и др.). Найденные ошибки исправляют, после чего регрессионно проверяют, что исправление не сломало уже работавшие части. Цель этапа — повысить качество и снизить риск сбоев в реальной эксплуатации.</w:t>
-      </w:r>
-    </w:p>
-    <w:p>
-      <w:pPr>
-        <w:spacing w:after="200" w:line="276" w:lineRule="auto"/>
-        <w:ind w:firstLine="709"/>
-        <w:jc w:val="both"/>
-      </w:pPr>
-      <w:r>
-        <w:rPr>
-          <w:rFonts w:ascii="Times New Roman" w:hAnsi="Times New Roman" w:eastAsia="Times New Roman"/>
-          <w:b/>
-          <w:i w:val="0"/>
-          <w:sz w:val="28"/>
-        </w:rPr>
-        <w:t xml:space="preserve">5. Внедрение. </w:t>
-      </w:r>
-      <w:r>
-        <w:rPr>
-          <w:rFonts w:ascii="Times New Roman" w:hAnsi="Times New Roman" w:eastAsia="Times New Roman"/>
-          <w:b w:val="0"/>
-          <w:i w:val="0"/>
-          <w:sz w:val="28"/>
-        </w:rPr>
-        <w:t>Внедрение — это перевод программного продукта в рабочую среду заказчика. Устанавливают ПО на серверах и рабочих местах, выполняют настройку, миграцию данных из старых систем, интеграцию с другими приложениями. Пользователей обучают работе с системой, готовят инструкции, иногда проводят пилотную эксплуатацию на ограниченной группе. После успешного внедрения система считается введённой в промышленную эксплуатацию. На этом этапе важно предусмотреть план отката, если установка пройдёт неудачно.</w:t>
-      </w:r>
-    </w:p>
-    <w:p>
-      <w:pPr>
-        <w:spacing w:after="200" w:line="276" w:lineRule="auto"/>
-        <w:ind w:firstLine="709"/>
-        <w:jc w:val="both"/>
-      </w:pPr>
-      <w:r>
-        <w:rPr>
-          <w:rFonts w:ascii="Times New Roman" w:hAnsi="Times New Roman" w:eastAsia="Times New Roman"/>
-          <w:b/>
-          <w:i w:val="0"/>
-          <w:sz w:val="28"/>
-        </w:rPr>
-        <w:t xml:space="preserve">6. Сопровождение. </w:t>
-      </w:r>
-      <w:r>
-        <w:rPr>
-          <w:rFonts w:ascii="Times New Roman" w:hAnsi="Times New Roman" w:eastAsia="Times New Roman"/>
-          <w:b w:val="0"/>
-          <w:i w:val="0"/>
-          <w:sz w:val="28"/>
-        </w:rPr>
-        <w:t>Сопровождение начинается после ввода системы в действие и часто длится дольше всех остальных этапов. В него входят: исправление ошибок, обнаруженных в эксплуатации; адаптация к изменениям окружения (новая ОС, оборудование, законодательство); развитие функциональности по новым запросам заказчика. Сопровождение требует управления версиями, учёта обращений пользователей и контроля изменений, чтобы развитие продукта не разрушало стабильность. По стоимости жизненного цикла сопровождение нередко оказывается самым затратным этапом.</w:t>
-      </w:r>
-    </w:p>
-    <w:p>
-      <w:pPr>
-        <w:spacing w:after="200" w:line="276" w:lineRule="auto"/>
-        <w:ind w:firstLine="709"/>
-        <w:jc w:val="both"/>
-      </w:pPr>
-      <w:r>
-        <w:rPr>
-          <w:rFonts w:ascii="Times New Roman" w:hAnsi="Times New Roman" w:eastAsia="Times New Roman"/>
-          <w:b/>
-          <w:i w:val="0"/>
-          <w:sz w:val="28"/>
-        </w:rPr>
-        <w:t xml:space="preserve">7. Вывод из эксплуатации. </w:t>
-      </w:r>
-      <w:r>
-        <w:rPr>
-          <w:rFonts w:ascii="Times New Roman" w:hAnsi="Times New Roman" w:eastAsia="Times New Roman"/>
-          <w:b w:val="0"/>
-          <w:i w:val="0"/>
-          <w:sz w:val="28"/>
-        </w:rPr>
-        <w:t>Когда система устарела, больше не нужна или полностью заменена другой, её выводят из эксплуатации. Прекращают поддержку, отключают сервисы, сохраняют или переносят важные данные, утилизируют устаревшие компоненты и документацию. Этот этап тоже нужно планировать: иначе можно потерять данные или нарушить связанные процессы организации.</w:t>
+        <w:t>выявление и фиксация того, что должна делать система. Собирают потребности заказчика, разделяют функциональные и нефункциональные требования, согласовывают результат.</w:t>
       </w:r>
     </w:p>
     <w:p>
@@ -456,17 +217,166 @@
       <w:r>
         <w:rPr>
           <w:rFonts w:ascii="Times New Roman" w:hAnsi="Times New Roman" w:eastAsia="Times New Roman"/>
+          <w:b/>
+          <w:i w:val="0"/>
+          <w:sz w:val="28"/>
+        </w:rPr>
+        <w:t xml:space="preserve">Проектирование — </w:t>
+      </w:r>
+      <w:r>
+        <w:rPr>
+          <w:rFonts w:ascii="Times New Roman" w:hAnsi="Times New Roman" w:eastAsia="Times New Roman"/>
           <w:b w:val="0"/>
           <w:i w:val="0"/>
           <w:sz w:val="28"/>
         </w:rPr>
-        <w:t>Последовательность этапов: Анализ требований → Проектирование → Реализация → Тестирование → Внедрение → Сопровождение → Вывод из эксплуатации. В каскадной модели этапы идут строго друг за другом. В итеративных и Agile-моделях цикл «требования — проектирование — реализация — тестирование» повторяется многократно, но смысл каждого вида работ сохраняется.</w:t>
+        <w:t>разработка архитектуры, структур данных, интерфейсов и моделей (в том числе UML) на основе требований. Итог — «чертёж» будущей системы.</w:t>
       </w:r>
     </w:p>
     <w:p>
       <w:pPr>
-        <w:spacing w:after="160" w:before="240"/>
-        <w:ind w:firstLine="0"/>
+        <w:spacing w:after="160" w:line="276" w:lineRule="auto"/>
+        <w:ind w:firstLine="709"/>
+        <w:jc w:val="both"/>
+      </w:pPr>
+      <w:r>
+        <w:rPr>
+          <w:rFonts w:ascii="Times New Roman" w:hAnsi="Times New Roman" w:eastAsia="Times New Roman"/>
+          <w:b/>
+          <w:i w:val="0"/>
+          <w:sz w:val="28"/>
+        </w:rPr>
+        <w:t xml:space="preserve">Реализация — </w:t>
+      </w:r>
+      <w:r>
+        <w:rPr>
+          <w:rFonts w:ascii="Times New Roman" w:hAnsi="Times New Roman" w:eastAsia="Times New Roman"/>
+          <w:b w:val="0"/>
+          <w:i w:val="0"/>
+          <w:sz w:val="28"/>
+        </w:rPr>
+        <w:t>написание исходного кода и сборка модулей согласно проекту.</w:t>
+      </w:r>
+    </w:p>
+    <w:p>
+      <w:pPr>
+        <w:spacing w:after="160" w:line="276" w:lineRule="auto"/>
+        <w:ind w:firstLine="709"/>
+        <w:jc w:val="both"/>
+      </w:pPr>
+      <w:r>
+        <w:rPr>
+          <w:rFonts w:ascii="Times New Roman" w:hAnsi="Times New Roman" w:eastAsia="Times New Roman"/>
+          <w:b/>
+          <w:i w:val="0"/>
+          <w:sz w:val="28"/>
+        </w:rPr>
+        <w:t xml:space="preserve">Тестирование — </w:t>
+      </w:r>
+      <w:r>
+        <w:rPr>
+          <w:rFonts w:ascii="Times New Roman" w:hAnsi="Times New Roman" w:eastAsia="Times New Roman"/>
+          <w:b w:val="0"/>
+          <w:i w:val="0"/>
+          <w:sz w:val="28"/>
+        </w:rPr>
+        <w:t>проверка соответствия ПО требованиям и поиск дефектов (модульное, интеграционное, системное, приёмочное).</w:t>
+      </w:r>
+    </w:p>
+    <w:p>
+      <w:pPr>
+        <w:spacing w:after="160" w:line="276" w:lineRule="auto"/>
+        <w:ind w:firstLine="709"/>
+        <w:jc w:val="both"/>
+      </w:pPr>
+      <w:r>
+        <w:rPr>
+          <w:rFonts w:ascii="Times New Roman" w:hAnsi="Times New Roman" w:eastAsia="Times New Roman"/>
+          <w:b/>
+          <w:i w:val="0"/>
+          <w:sz w:val="28"/>
+        </w:rPr>
+        <w:t xml:space="preserve">Внедрение — </w:t>
+      </w:r>
+      <w:r>
+        <w:rPr>
+          <w:rFonts w:ascii="Times New Roman" w:hAnsi="Times New Roman" w:eastAsia="Times New Roman"/>
+          <w:b w:val="0"/>
+          <w:i w:val="0"/>
+          <w:sz w:val="28"/>
+        </w:rPr>
+        <w:t>установка системы у заказчика, настройка, обучение пользователей и ввод в эксплуатацию.</w:t>
+      </w:r>
+    </w:p>
+    <w:p>
+      <w:pPr>
+        <w:spacing w:after="160" w:line="276" w:lineRule="auto"/>
+        <w:ind w:firstLine="709"/>
+        <w:jc w:val="both"/>
+      </w:pPr>
+      <w:r>
+        <w:rPr>
+          <w:rFonts w:ascii="Times New Roman" w:hAnsi="Times New Roman" w:eastAsia="Times New Roman"/>
+          <w:b/>
+          <w:i w:val="0"/>
+          <w:sz w:val="28"/>
+        </w:rPr>
+        <w:t xml:space="preserve">Сопровождение — </w:t>
+      </w:r>
+      <w:r>
+        <w:rPr>
+          <w:rFonts w:ascii="Times New Roman" w:hAnsi="Times New Roman" w:eastAsia="Times New Roman"/>
+          <w:b w:val="0"/>
+          <w:i w:val="0"/>
+          <w:sz w:val="28"/>
+        </w:rPr>
+        <w:t>исправление ошибок, адаптация к новым условиям и развитие функций после внедрения.</w:t>
+      </w:r>
+    </w:p>
+    <w:p>
+      <w:pPr>
+        <w:spacing w:after="160" w:line="276" w:lineRule="auto"/>
+        <w:ind w:firstLine="709"/>
+        <w:jc w:val="both"/>
+      </w:pPr>
+      <w:r>
+        <w:rPr>
+          <w:rFonts w:ascii="Times New Roman" w:hAnsi="Times New Roman" w:eastAsia="Times New Roman"/>
+          <w:b/>
+          <w:i w:val="0"/>
+          <w:sz w:val="28"/>
+        </w:rPr>
+        <w:t xml:space="preserve">Вывод из эксплуатации — </w:t>
+      </w:r>
+      <w:r>
+        <w:rPr>
+          <w:rFonts w:ascii="Times New Roman" w:hAnsi="Times New Roman" w:eastAsia="Times New Roman"/>
+          <w:b w:val="0"/>
+          <w:i w:val="0"/>
+          <w:sz w:val="28"/>
+        </w:rPr>
+        <w:t>прекращение поддержки системы, при необходимости — сохранение или перенос данных.</w:t>
+      </w:r>
+    </w:p>
+    <w:p>
+      <w:pPr>
+        <w:spacing w:after="120" w:line="276" w:lineRule="auto"/>
+        <w:ind w:firstLine="709"/>
+        <w:jc w:val="both"/>
+      </w:pPr>
+      <w:r>
+        <w:rPr>
+          <w:rFonts w:ascii="Times New Roman" w:hAnsi="Times New Roman" w:eastAsia="Times New Roman"/>
+          <w:b w:val="0"/>
+          <w:i w:val="0"/>
+          <w:sz w:val="28"/>
+        </w:rPr>
+        <w:t>Последовательность: Анализ требований → Проектирование → Реализация → Тестирование → Внедрение → Сопровождение → Вывод из эксплуатации.</w:t>
+      </w:r>
+    </w:p>
+    <w:p>
+      <w:pPr>
+        <w:spacing w:after="120" w:before="200"/>
         <w:jc w:val="left"/>
       </w:pPr>
       <w:r>
@@ -481,7 +391,7 @@
     </w:p>
     <w:p>
       <w:pPr>
-        <w:spacing w:after="200" w:line="276" w:lineRule="auto"/>
+        <w:spacing w:after="160" w:line="276" w:lineRule="auto"/>
         <w:ind w:firstLine="709"/>
         <w:jc w:val="both"/>
       </w:pPr>
@@ -492,7 +402,7 @@
           <w:i w:val="0"/>
           <w:sz w:val="28"/>
         </w:rPr>
-        <w:t xml:space="preserve">Назначение диаграммы вариантов использования. </w:t>
+        <w:t xml:space="preserve">Назначение диаграммы use case — </w:t>
       </w:r>
       <w:r>
         <w:rPr>
@@ -501,12 +411,12 @@
           <w:i w:val="0"/>
           <w:sz w:val="28"/>
         </w:rPr>
-        <w:t>Диаграмма вариантов использования (Use Case Diagram) описывает систему с точки зрения её внешнего поведения. Она отвечает на вопросы: кто взаимодействует с системой и какие функции (возможности) система предоставляет этим участникам. Диаграмма помогает определить границы системы — что входит в неё, а что остаётся во внешнем окружении. Её активно применяют на этапе анализа требований при обсуждении с заказчиком: проще согласовать список функций на наглядной схеме, чем сразу переходить к детальным алгоритмам. При этом диаграмма не показывает, как именно внутри устроен код или база данных; она фиксирует «что система умеет» для внешнего пользователя. В UML это одна из ключевых диаграмм поведения/требований.</w:t>
+        <w:t>показать, кто взаимодействует с системой и какие функции она предоставляет. Диаграмма задаёт границы системы с точки зрения пользователей, не раскрывая внутреннюю реализацию.</w:t>
       </w:r>
     </w:p>
     <w:p>
       <w:pPr>
-        <w:spacing w:after="200" w:line="276" w:lineRule="auto"/>
+        <w:spacing w:after="160" w:line="276" w:lineRule="auto"/>
         <w:ind w:firstLine="709"/>
         <w:jc w:val="both"/>
       </w:pPr>
@@ -517,7 +427,7 @@
           <w:i w:val="0"/>
           <w:sz w:val="28"/>
         </w:rPr>
-        <w:t xml:space="preserve">Актёр (Actor). </w:t>
+        <w:t xml:space="preserve">Актёр — </w:t>
       </w:r>
       <w:r>
         <w:rPr>
@@ -526,12 +436,12 @@
           <w:i w:val="0"/>
           <w:sz w:val="28"/>
         </w:rPr>
-        <w:t>Актёр — это роль внешней по отношению к системе сущности, которая взаимодействует с системой для достижения какой-либо цели. Актёром может быть человек (покупатель, кассир, администратор), подразделение, организация или другая программная/аппаратная система (платёжный шлюз, система уведомлений). Важно понимать, что актёр — это именно роль, а не конкретный человек: один и тот же сотрудник в разное время может выступать в разных ролях. Актёр всегда находится вне границы системы: он инициирует прецеденты или участвует в них, получая от системы результат. На диаграмме актёр обычно изображается стилизованной фигуркой человека либо классификатором со стереотипом &lt;&lt;actor&gt;&gt;. Связь актёра с прецедентом показывают линией ассоциации.</w:t>
+        <w:t>внешняя роль (человек или другая система), которая взаимодействует с системой для достижения цели. Находится вне границ системы и инициирует прецеденты или участвует в них.</w:t>
       </w:r>
     </w:p>
     <w:p>
       <w:pPr>
-        <w:spacing w:after="200" w:line="276" w:lineRule="auto"/>
+        <w:spacing w:after="160" w:line="276" w:lineRule="auto"/>
         <w:ind w:firstLine="709"/>
         <w:jc w:val="both"/>
       </w:pPr>
@@ -542,7 +452,7 @@
           <w:i w:val="0"/>
           <w:sz w:val="28"/>
         </w:rPr>
-        <w:t xml:space="preserve">Прецедент (Use Case). </w:t>
+        <w:t xml:space="preserve">Прецедент — </w:t>
       </w:r>
       <w:r>
         <w:rPr>
@@ -551,12 +461,12 @@
           <w:i w:val="0"/>
           <w:sz w:val="28"/>
         </w:rPr>
-        <w:t>Прецедент — это описание законченного фрагмента поведения системы, которое наблюдается актёром и приводит к значимому для него результату. Иначе говоря, прецедент — это «услуга» системы, выраженная с точки зрения пользователя. Название прецедента обычно формулируют как действие: «Зарегистрироваться», «Оформить заказ», «Сформировать отчёт». Прецедент описывает, что происходит при взаимодействии, но не детализирует внутренние алгоритмы, классы и SQL-запросы. Один прецедент может включать основной успешный сценарий и альтернативные/исключительные потоки (например, отказ в оплате). На диаграмме прецедент изображается овалом внутри границы системы.</w:t>
+        <w:t>законченный фрагмент поведения системы, видимый актёру и дающий ему значимый результат. Описывает «что» делает система, а не «как» устроен код. На диаграмме — овал.</w:t>
       </w:r>
     </w:p>
     <w:p>
       <w:pPr>
-        <w:spacing w:after="200" w:line="276" w:lineRule="auto"/>
+        <w:spacing w:after="160" w:line="276" w:lineRule="auto"/>
         <w:ind w:firstLine="709"/>
         <w:jc w:val="both"/>
       </w:pPr>
@@ -567,7 +477,7 @@
           <w:i w:val="0"/>
           <w:sz w:val="28"/>
         </w:rPr>
-        <w:t xml:space="preserve">Отношение include (включение). </w:t>
+        <w:t xml:space="preserve">Отношение include — </w:t>
       </w:r>
       <w:r>
         <w:rPr>
@@ -576,12 +486,12 @@
           <w:i w:val="0"/>
           <w:sz w:val="28"/>
         </w:rPr>
-        <w:t>Отношение include означает, что поведение одного прецедента обязательно включается в поведение другого. Базовый прецедент всегда использует включаемый фрагмент как свою неотъемлемую часть. Include применяют, когда один и тот же набор шагов повторяется в нескольких прецедентах и его выгодно вынести отдельно, чтобы не дублировать описание. Пример: прецеденты «Оформить заказ» и «Забронировать товар» оба могут включать прецедент «Авторизоваться». На диаграмме рисуют пунктирную стрелку от базового прецедента к включаемому и подписывают стереотип &lt;&lt;include&gt;&gt;. Стрелка направлена к тому поведению, которое включается.</w:t>
+        <w:t>обязательное включение одного прецедента в другой: базовый всегда выполняет включаемый. Используется для общего повторяющегося фрагмента. Стрелка: базовый → включаемый, &lt;&lt;include&gt;&gt;.</w:t>
       </w:r>
     </w:p>
     <w:p>
       <w:pPr>
-        <w:spacing w:after="200" w:line="276" w:lineRule="auto"/>
+        <w:spacing w:after="160" w:line="276" w:lineRule="auto"/>
         <w:ind w:firstLine="709"/>
         <w:jc w:val="both"/>
       </w:pPr>
@@ -592,7 +502,7 @@
           <w:i w:val="0"/>
           <w:sz w:val="28"/>
         </w:rPr>
-        <w:t xml:space="preserve">Отношение extend (расширение). </w:t>
+        <w:t xml:space="preserve">Отношение extend — </w:t>
       </w:r>
       <w:r>
         <w:rPr>
@@ -601,13 +511,12 @@
           <w:i w:val="0"/>
           <w:sz w:val="28"/>
         </w:rPr>
-        <w:t>Отношение extend означает, что один прецедент может при определённых условиях дополнить (расширить) поведение другого. В отличие от include, расширение выполняется не всегда, а только когда срабатывает условие в точке расширения. Extend удобен для необязательных или редких сценариев, которые не нужно «вшивать» в основной поток. Пример: базовый прецедент «Оформить заказ» может расширяться прецедентом «Применить промокод», если покупатель ввёл код скидки. На диаграмме пунктирная стрелка идёт от расширяющего прецедента к базовому со стереотипом &lt;&lt;extend&gt;&gt;. То есть стрелка указывает на тот прецедент, который расширяется.</w:t>
+        <w:t>условное расширение базового прецедента: дополнительное поведение выполняется не всегда, а при условии. Стрелка: расширение → базовый, &lt;&lt;extend&gt;&gt;.</w:t>
       </w:r>
     </w:p>
     <w:p>
       <w:pPr>
-        <w:spacing w:after="160" w:before="240"/>
-        <w:ind w:firstLine="0"/>
+        <w:spacing w:after="120" w:before="200"/>
         <w:jc w:val="left"/>
       </w:pPr>
       <w:r>
@@ -622,7 +531,7 @@
     </w:p>
     <w:p>
       <w:pPr>
-        <w:spacing w:after="200" w:line="276" w:lineRule="auto"/>
+        <w:spacing w:after="160" w:line="276" w:lineRule="auto"/>
         <w:ind w:firstLine="709"/>
         <w:jc w:val="both"/>
       </w:pPr>
@@ -633,7 +542,7 @@
           <w:i w:val="0"/>
           <w:sz w:val="28"/>
         </w:rPr>
-        <w:t xml:space="preserve">Функциональное тестирование. </w:t>
+        <w:t xml:space="preserve">Функциональное тестирование — </w:t>
       </w:r>
       <w:r>
         <w:rPr>
@@ -642,12 +551,12 @@
           <w:i w:val="0"/>
           <w:sz w:val="28"/>
         </w:rPr>
-        <w:t>Функциональное тестирование — это вид тестирования, направленный на проверку правильности реализации функций программного обеспечения в соответствии с требованиями. Тестировщик проверяет, выполняет ли система заявленные действия: принимает ли корректные данные, отвергает ли некорректные, выдаёт ли ожидаемый результат, правильно ли меняет состояние данных. Такое тестирование ориентировано на внешнее поведение системы («чёрный ящик»): обычно не требуется знать внутреннее устройство кода, достаточно спецификации и ожидаемого результата. Примеры проверок: успешный и неуспешный вход пользователя, добавление товара в корзину, расчёт итоговой суммы, формирование отчёта, сохранение записи в базе. Функциональное тестирование может проводиться на уровнях модульного, интеграционного, системного и приёмочного тестирования. Его главная цель — убедиться, что система делает именно то, что от неё требуется.</w:t>
+        <w:t>проверка правильности выполнения функций системы по требованиям. Сравнивают фактический результат с ожидаемым. Оценивается поведение («что делает» система), а не устройство кода.</w:t>
       </w:r>
     </w:p>
     <w:p>
       <w:pPr>
-        <w:spacing w:after="200" w:line="276" w:lineRule="auto"/>
+        <w:spacing w:after="160" w:line="276" w:lineRule="auto"/>
         <w:ind w:firstLine="709"/>
         <w:jc w:val="both"/>
       </w:pPr>
@@ -658,7 +567,7 @@
           <w:i w:val="0"/>
           <w:sz w:val="28"/>
         </w:rPr>
-        <w:t xml:space="preserve">Юзабилити-тестирование. </w:t>
+        <w:t xml:space="preserve">Юзабилити-тестирование — </w:t>
       </w:r>
       <w:r>
         <w:rPr>
@@ -667,13 +576,12 @@
           <w:i w:val="0"/>
           <w:sz w:val="28"/>
         </w:rPr>
-        <w:t>Юзабилити-тестирование (usability testing) — это проверка удобства использования программного продукта. Здесь оценивают не только «работает ли функция», но и насколько легко, быстро и приятно пользователь достигает своей цели с помощью интерфейса. Анализируют понятность надписей и элементов управления, логичность сценариев, количество ошибок пользователя, скорость обучения, общую удовлетворённость. Обычно тестирование проводят с участием представителей целевой аудитории: им дают типовые задания и наблюдают, где возникают затруднения. По результатам улучшают интерфейс, тексты сообщений, навигацию. Юзабилити-тестирование особенно важно для массовых и клиентских приложений, где сложный или запутанный интерфейс снижает эффективность даже при формально правильной функциональности.</w:t>
+        <w:t>проверка удобства интерфейса: насколько легко и быстро пользователь достигает цели, понятны ли элементы управления. Важно не только «работает ли», но и «удобно ли пользоваться».</w:t>
       </w:r>
     </w:p>
     <w:p>
       <w:pPr>
-        <w:spacing w:after="160" w:before="240"/>
-        <w:ind w:firstLine="0"/>
+        <w:spacing w:after="120" w:before="200"/>
         <w:jc w:val="left"/>
       </w:pPr>
       <w:r>
@@ -688,7 +596,7 @@
     </w:p>
     <w:p>
       <w:pPr>
-        <w:spacing w:after="160" w:line="276" w:lineRule="auto"/>
+        <w:spacing w:after="120" w:line="276" w:lineRule="auto"/>
         <w:ind w:firstLine="709"/>
         <w:jc w:val="both"/>
       </w:pPr>
@@ -699,12 +607,12 @@
           <w:i w:val="0"/>
           <w:sz w:val="28"/>
         </w:rPr>
-        <w:t>Ниже приведена диаграмма последовательности для сценария оформления заказа в интернет-магазине. На ней показаны актёр «Покупатель» и объекты системы: :Интерфейс, :Корзина, :Склад, :Оплата. Сообщения отражают порядок взаимодействия во времени: сначала товар добавляется в корзину с проверкой наличия, затем выполняется оформление и оплата. Сплошные стрелки обозначают вызовы, пунктирные — возврат результата.</w:t>
+        <w:t>Пример: оформление заказа (Покупатель, Интерфейс, Корзина, Склад, Оплата).</w:t>
       </w:r>
     </w:p>
     <w:p>
       <w:pPr>
-        <w:spacing w:before="160" w:after="40"/>
+        <w:spacing w:before="120" w:after="40"/>
         <w:jc w:val="center"/>
       </w:pPr>
       <w:r>
@@ -744,8 +652,7 @@
     </w:p>
     <w:p>
       <w:pPr>
-        <w:spacing w:after="200" w:before="0"/>
-        <w:ind w:firstLine="0"/>
+        <w:spacing w:after="160" w:before="0"/>
         <w:jc w:val="center"/>
       </w:pPr>
       <w:r>
@@ -755,7 +662,7 @@
           <w:i/>
           <w:sz w:val="24"/>
         </w:rPr>
-        <w:t>Рисунок 1 — Диаграмма последовательности (вариант 1, задание 4)</w:t>
+        <w:t>Рисунок 1 — Диаграмма последовательности</w:t>
       </w:r>
     </w:p>
     <w:p>
@@ -765,8 +672,7 @@
     </w:p>
     <w:p>
       <w:pPr>
-        <w:spacing w:after="200" w:before="280"/>
-        <w:ind w:firstLine="0"/>
+        <w:spacing w:after="160" w:before="240"/>
         <w:jc w:val="center"/>
       </w:pPr>
       <w:r>
@@ -781,8 +687,7 @@
     </w:p>
     <w:p>
       <w:pPr>
-        <w:spacing w:after="160" w:before="240"/>
-        <w:ind w:firstLine="0"/>
+        <w:spacing w:after="120" w:before="200"/>
         <w:jc w:val="left"/>
       </w:pPr>
       <w:r>
@@ -797,7 +702,7 @@
     </w:p>
     <w:p>
       <w:pPr>
-        <w:spacing w:after="200" w:line="276" w:lineRule="auto"/>
+        <w:spacing w:after="160" w:line="276" w:lineRule="auto"/>
         <w:ind w:firstLine="709"/>
         <w:jc w:val="both"/>
       </w:pPr>
@@ -808,7 +713,7 @@
           <w:i w:val="0"/>
           <w:sz w:val="28"/>
         </w:rPr>
-        <w:t xml:space="preserve">Назначение функционального моделирования. </w:t>
+        <w:t xml:space="preserve">Назначение функционального моделирования — </w:t>
       </w:r>
       <w:r>
         <w:rPr>
@@ -817,12 +722,12 @@
           <w:i w:val="0"/>
           <w:sz w:val="28"/>
         </w:rPr>
-        <w:t>Функциональное моделирование — это способ описания системы через её функции (работы, процессы), а не через устройство программных модулей. Цель такого моделирования — понять и зафиксировать, что делает система или организация, в какой последовательности выполняются работы, какие ресурсы потребляются и какие результаты производятся. Функциональные модели помогают анализировать бизнес-процессы «как есть» и проектировать процессы «как должно быть», выявлять дублирование, лишние операции и узкие места. На основе этих моделей удобнее формулировать требования к будущему программному обеспечению. Одним из наиболее известных стандартов функционального моделирования является IDEF0.</w:t>
+        <w:t>описать систему как набор функций: что делается, какие входы и выходы, чем процесс управляется и какими ресурсами выполняется. Помогает анализировать процессы и формулировать требования к ПО.</w:t>
       </w:r>
     </w:p>
     <w:p>
       <w:pPr>
-        <w:spacing w:after="200" w:line="276" w:lineRule="auto"/>
+        <w:spacing w:after="160" w:line="276" w:lineRule="auto"/>
         <w:ind w:firstLine="709"/>
         <w:jc w:val="both"/>
       </w:pPr>
@@ -833,7 +738,7 @@
           <w:i w:val="0"/>
           <w:sz w:val="28"/>
         </w:rPr>
-        <w:t xml:space="preserve">Состав модели IDEF0. </w:t>
+        <w:t xml:space="preserve">Состав модели IDEF0 — </w:t>
       </w:r>
       <w:r>
         <w:rPr>
@@ -842,12 +747,12 @@
           <w:i w:val="0"/>
           <w:sz w:val="28"/>
         </w:rPr>
-        <w:t>Модель IDEF0 состоит из диаграмм, на которых система представлена функциональными блоками и стрелками. Функциональный блок — прямоугольник, обозначающий работу; его имя обычно формулируют как «глагол + существительное» (например, «Обработать заказ»). У блока есть четыре стороны для стрелок разного смысла. Вход (Input) подходит слева и обозначает объекты, которые функция преобразует (документы, данные, материалы). Выход (Output) уходит вправо и показывает результат преобразования. Управление (Control) входит сверху и задаёт правила, стандарты, ограничения, приказы — то, чем руководствуются при выполнении работы. Механизм (Mechanism) подходит снизу и показывает ресурсы исполнения: людей, оборудование, программные средства. Модель строится иерархически: контекстный блок детализируется на дочерние функции (A0 → A1, A2, A3…), те — ещё глубже. К модели обязательно указывают цель моделирования, точку зрения и обычно сопровождают глоссарием терминов. Благодаря единым правилам IDEF0 разные специалисты одинаково читают и понимают схему.</w:t>
+        <w:t>функциональные блоки (работы) и стрелки четырёх типов: вход (слева), выход (справа), управление (сверху), механизм (снизу). Модель иерархична: блоки декомпозируются на дочерние диаграммы. Указывают также цель, точку зрения и глоссарий.</w:t>
       </w:r>
     </w:p>
     <w:p>
       <w:pPr>
-        <w:spacing w:after="200" w:line="276" w:lineRule="auto"/>
+        <w:spacing w:after="160" w:line="276" w:lineRule="auto"/>
         <w:ind w:firstLine="709"/>
         <w:jc w:val="both"/>
       </w:pPr>
@@ -858,7 +763,7 @@
           <w:i w:val="0"/>
           <w:sz w:val="28"/>
         </w:rPr>
-        <w:t xml:space="preserve">Контекстная диаграмма. </w:t>
+        <w:t xml:space="preserve">Контекстная диаграмма — </w:t>
       </w:r>
       <w:r>
         <w:rPr>
@@ -867,18 +772,18 @@
           <w:i w:val="0"/>
           <w:sz w:val="28"/>
         </w:rPr>
-        <w:t>Контекстная диаграмма — это верхний уровень модели IDEF0 (часто обозначается как A-0). На ней изображается ровно один функциональный блок, который представляет всю моделируемую систему целиком, и набор внешних стрелок, связывающих систему с окружающей средой. Именно контекстная диаграмма определяет границы предмета моделирования: что считается входом извне, что является конечным выходом, какими нормативными правилами система управляется и какими ресурсами поддерживается. Без чёткого контекста последующая детализация может «расползтись» и смешать внутренние детали с внешним окружением. Все следующие диаграммы модели — это последовательная декомпозиция этого единственного контекстного блока.</w:t>
+        <w:t>верхний уровень IDEF0: один блок всей системы и внешние стрелки. Определяет границы моделируемого объекта. Остальные диаграммы — его декомпозиция.</w:t>
       </w:r>
     </w:p>
     <w:p>
       <w:pPr>
-        <w:spacing w:before="160" w:after="40"/>
+        <w:spacing w:before="120" w:after="40"/>
         <w:jc w:val="center"/>
       </w:pPr>
       <w:r>
         <w:drawing>
           <wp:inline xmlns:a="http://schemas.openxmlformats.org/drawingml/2006/main" xmlns:pic="http://schemas.openxmlformats.org/drawingml/2006/picture">
-            <wp:extent cx="5120640" cy="3803444"/>
+            <wp:extent cx="5029200" cy="3735525"/>
             <wp:docPr id="2" name="Picture 2"/>
             <wp:cNvGraphicFramePr>
               <a:graphicFrameLocks noChangeAspect="1"/>
@@ -899,7 +804,7 @@
                   <pic:spPr>
                     <a:xfrm>
                       <a:off x="0" y="0"/>
-                      <a:ext cx="5120640" cy="3803444"/>
+                      <a:ext cx="5029200" cy="3735525"/>
                     </a:xfrm>
                     <a:prstGeom prst="rect"/>
                   </pic:spPr>
@@ -912,8 +817,7 @@
     </w:p>
     <w:p>
       <w:pPr>
-        <w:spacing w:after="200" w:before="0"/>
-        <w:ind w:firstLine="0"/>
+        <w:spacing w:after="160" w:before="0"/>
         <w:jc w:val="center"/>
       </w:pPr>
       <w:r>
@@ -923,13 +827,12 @@
           <w:i/>
           <w:sz w:val="24"/>
         </w:rPr>
-        <w:t>Рисунок 2 — Пример контекстной диаграммы IDEF0 (A-0)</w:t>
+        <w:t>Рисунок 2 — Контекстная диаграмма IDEF0</w:t>
       </w:r>
     </w:p>
     <w:p>
       <w:pPr>
-        <w:spacing w:after="160" w:before="240"/>
-        <w:ind w:firstLine="0"/>
+        <w:spacing w:after="120" w:before="200"/>
         <w:jc w:val="left"/>
       </w:pPr>
       <w:r>
@@ -944,7 +847,7 @@
     </w:p>
     <w:p>
       <w:pPr>
-        <w:spacing w:after="200" w:line="276" w:lineRule="auto"/>
+        <w:spacing w:after="160" w:line="276" w:lineRule="auto"/>
         <w:ind w:firstLine="709"/>
         <w:jc w:val="both"/>
       </w:pPr>
@@ -955,7 +858,7 @@
           <w:i w:val="0"/>
           <w:sz w:val="28"/>
         </w:rPr>
-        <w:t xml:space="preserve">Инкапсуляция. </w:t>
+        <w:t xml:space="preserve">Инкапсуляция — </w:t>
       </w:r>
       <w:r>
         <w:rPr>
@@ -964,12 +867,12 @@
           <w:i w:val="0"/>
           <w:sz w:val="28"/>
         </w:rPr>
-        <w:t>Инкапсуляция — один из основных принципов объектно-ориентированного программирования. Он означает, что данные объекта и методы, работающие с этими данными, объединяются в единую сущность — класс/объект, а детали внутренней реализации скрываются от внешнего кода. Снаружи доступ предоставляется только через разрешённый интерфейс (публичные методы), а внутренние поля часто делают закрытыми. Практический смысл инкапсуляции в том, что можно изменить способ хранения данных или алгоритм внутри класса, не переписывая весь код, который этим классом пользуется. Кроме того, объект сам контролирует корректность своего состояния: нельзя «напрямую» записать недопустимое значение в поле, минуя проверки. Пример: у класса «Счёт» поле баланса скрыто, а изменить его можно только методами «пополнить» и «снять», где проверяется допустимость операции.</w:t>
+        <w:t>объединение данных и методов в одном объекте и сокрытие внутренней реализации. Снаружи доступен только публичный интерфейс. Это повышает надёжность и позволяет менять реализацию без поломки внешнего кода.</w:t>
       </w:r>
     </w:p>
     <w:p>
       <w:pPr>
-        <w:spacing w:after="200" w:line="276" w:lineRule="auto"/>
+        <w:spacing w:after="160" w:line="276" w:lineRule="auto"/>
         <w:ind w:firstLine="709"/>
         <w:jc w:val="both"/>
       </w:pPr>
@@ -980,7 +883,7 @@
           <w:i w:val="0"/>
           <w:sz w:val="28"/>
         </w:rPr>
-        <w:t xml:space="preserve">Наследование. </w:t>
+        <w:t xml:space="preserve">Наследование — </w:t>
       </w:r>
       <w:r>
         <w:rPr>
@@ -989,12 +892,12 @@
           <w:i w:val="0"/>
           <w:sz w:val="28"/>
         </w:rPr>
-        <w:t>Наследование — механизм ООП, при котором новый класс (класс-потомок, подкласс) создаётся на основе уже существующего класса (класса-предка, суперкласса). Потомок автоматически получает атрибуты и поведение предка и может добавить новые поля и методы либо переопределить унаследованные. Наследование поддерживает повторное использование кода и позволяет строить иерархии «от общего к частному». Например, класс «Сотрудник» может быть предком для классов «Программист» и «Менеджер»: общие свойства (ФИО, табельный номер) описывают один раз в предке, а специфические — в потомках. При этом злоупотребление глубоким наследованием усложняет систему, поэтому наследование применяют осмысленно, когда действительно есть отношение «является разновидностью».</w:t>
+        <w:t>создание класса-потомка на основе класса-предка. Потомок получает свойства и поведение предка и может их расширять или переопределять. Обеспечивает повторное использование кода и иерархии «общее → частное».</w:t>
       </w:r>
     </w:p>
     <w:p>
       <w:pPr>
-        <w:spacing w:after="200" w:line="276" w:lineRule="auto"/>
+        <w:spacing w:after="160" w:line="276" w:lineRule="auto"/>
         <w:ind w:firstLine="709"/>
         <w:jc w:val="both"/>
       </w:pPr>
@@ -1005,7 +908,7 @@
           <w:i w:val="0"/>
           <w:sz w:val="28"/>
         </w:rPr>
-        <w:t xml:space="preserve">Полиморфизм. </w:t>
+        <w:t xml:space="preserve">Полиморфизм — </w:t>
       </w:r>
       <w:r>
         <w:rPr>
@@ -1014,13 +917,12 @@
           <w:i w:val="0"/>
           <w:sz w:val="28"/>
         </w:rPr>
-        <w:t>Полиморфизм — способность объектов разных классов единообразно обрабатываться через общий интерфейс или базовый тип, но при этом выполнять собственную реализацию одного и того же метода. Иначе говоря, одно и то же сообщение (вызов метода) может приводить к разному поведению в зависимости от реального типа объекта. На практике полиморфизм часто реализуется через переопределение методов в классах-потомках и вызов через ссылку на базовый класс или интерфейс. Пример: у базового класса «Фигура» есть метод «площадь()», а в классах «Круг» и «Прямоугольник» он реализован по-разному; цикл может вызывать площадь() для списка фигур, не зная заранее конкретный тип. Полиморфизм делает систему гибкой: новый класс можно добавить, не меняя код, который работает с общим интерфейсом.</w:t>
+        <w:t>способность объектов разных классов одинаково вызываться через общий интерфейс, но выполнять свою реализацию метода. Один интерфейс — много реализаций; систему легче расширять.</w:t>
       </w:r>
     </w:p>
     <w:p>
       <w:pPr>
-        <w:spacing w:after="160" w:before="240"/>
-        <w:ind w:firstLine="0"/>
+        <w:spacing w:after="120" w:before="200"/>
         <w:jc w:val="left"/>
       </w:pPr>
       <w:r>
@@ -1035,7 +937,7 @@
     </w:p>
     <w:p>
       <w:pPr>
-        <w:spacing w:after="200" w:line="276" w:lineRule="auto"/>
+        <w:spacing w:after="160" w:line="276" w:lineRule="auto"/>
         <w:ind w:firstLine="709"/>
         <w:jc w:val="both"/>
       </w:pPr>
@@ -1046,7 +948,7 @@
           <w:i w:val="0"/>
           <w:sz w:val="28"/>
         </w:rPr>
-        <w:t xml:space="preserve">Назначение диаграммы классов. </w:t>
+        <w:t xml:space="preserve">Назначение диаграммы классов — </w:t>
       </w:r>
       <w:r>
         <w:rPr>
@@ -1055,12 +957,12 @@
           <w:i w:val="0"/>
           <w:sz w:val="28"/>
         </w:rPr>
-        <w:t>Диаграмма классов — это UML-диаграмма, которая показывает статическую структуру объектно-ориентированной системы. На ней изображают классы, их атрибуты и операции, а также отношения между классами: ассоциации, агрегации, композиции, обобщения (наследование), зависимости и реализации интерфейсов. Диаграмму классов используют на этапе проектирования, чтобы зафиксировать модель предметной области и основу программной архитектуры. Она помогает команде одинаково понимать, какие сущности существуют в системе и как они связаны. В отличие от диаграмм взаимодействия, здесь нет оси времени: показывается устройство системы «в разрезе структуры», а не последовательность вызовов.</w:t>
+        <w:t>показать статическую структуру системы: классы, атрибуты, операции и связи между ними. Используется при проектировании ОО-систем.</w:t>
       </w:r>
     </w:p>
     <w:p>
       <w:pPr>
-        <w:spacing w:after="200" w:line="276" w:lineRule="auto"/>
+        <w:spacing w:after="160" w:line="276" w:lineRule="auto"/>
         <w:ind w:firstLine="709"/>
         <w:jc w:val="both"/>
       </w:pPr>
@@ -1071,7 +973,7 @@
           <w:i w:val="0"/>
           <w:sz w:val="28"/>
         </w:rPr>
-        <w:t xml:space="preserve">Класс. </w:t>
+        <w:t xml:space="preserve">Класс — </w:t>
       </w:r>
       <w:r>
         <w:rPr>
@@ -1080,12 +982,12 @@
           <w:i w:val="0"/>
           <w:sz w:val="28"/>
         </w:rPr>
-        <w:t>Класс — это описание множества объектов, обладающих одинаковой структурой данных, одинаковым поведением и общей семантикой в предметной области. Класс задаёт шаблон: какие атрибуты есть у объектов и какие операции над ними можно выполнять. Конкретный объект является экземпляром класса и в каждый момент имеет собственные значения атрибутов. На UML-диаграмме класс изображают прямоугольником, разделённым на три секции: имя класса; список атрибутов; список методов. Например, класс «Студент» может содержать атрибуты «фио», «группа» и методы «записатьсяНаКурс()», «получитьОценки()».</w:t>
+        <w:t>описание множества объектов с общей структурой и поведением. На диаграмме — прямоугольник из трёх секций: имя, атрибуты, методы.</w:t>
       </w:r>
     </w:p>
     <w:p>
       <w:pPr>
-        <w:spacing w:after="200" w:line="276" w:lineRule="auto"/>
+        <w:spacing w:after="160" w:line="276" w:lineRule="auto"/>
         <w:ind w:firstLine="709"/>
         <w:jc w:val="both"/>
       </w:pPr>
@@ -1096,7 +998,7 @@
           <w:i w:val="0"/>
           <w:sz w:val="28"/>
         </w:rPr>
-        <w:t xml:space="preserve">Интерфейс. </w:t>
+        <w:t xml:space="preserve">Интерфейс — </w:t>
       </w:r>
       <w:r>
         <w:rPr>
@@ -1105,12 +1007,12 @@
           <w:i w:val="0"/>
           <w:sz w:val="28"/>
         </w:rPr>
-        <w:t>Интерфейс — это контракт, представляющий собой набор операций без их реализации. Класс, реализующий интерфейс, обязан предоставить конкретную реализацию всех объявленных в нём методов. Интерфейс отвечает на вопрос «что объект умеет», но не указывает «как именно это сделано внутри». Благодаря интерфейсам разные классы могут подставляться друг вместо друга, если поддерживают один и тот же контракт. На диаграмме интерфейс обозначают кругом (нотация «леденец») либо прямоугольником со стереотипом &lt;&lt;interface&gt;&gt;. Связь реализации показывают пунктирной стрелкой с незакрашенным треугольником от класса к интерфейсу.</w:t>
+        <w:t>набор операций без реализации (контракт). Класс, реализующий интерфейс, обязан предоставить эти операции. Обозначается &lt;&lt;interface&gt;&gt; или «леденцом».</w:t>
       </w:r>
     </w:p>
     <w:p>
       <w:pPr>
-        <w:spacing w:after="200" w:line="276" w:lineRule="auto"/>
+        <w:spacing w:after="160" w:line="276" w:lineRule="auto"/>
         <w:ind w:firstLine="709"/>
         <w:jc w:val="both"/>
       </w:pPr>
@@ -1121,7 +1023,7 @@
           <w:i w:val="0"/>
           <w:sz w:val="28"/>
         </w:rPr>
-        <w:t xml:space="preserve">Виды видимости. </w:t>
+        <w:t xml:space="preserve">Виды видимости — </w:t>
       </w:r>
       <w:r>
         <w:rPr>
@@ -1130,12 +1032,12 @@
           <w:i w:val="0"/>
           <w:sz w:val="28"/>
         </w:rPr>
-        <w:t>Видимость определяет область доступа к атрибуту или методу класса — кто имеет право читать или вызывать данный элемент. В UML приняты обозначения: «+» public — элемент доступен любому коду; «−» private — доступен только внутри самого класса; «#» protected — доступен классу и его потомкам; «~» package (package-private) — доступен в пределах одного пакета. Выбор видимости напрямую связан с инкапсуляцией: внутренние детали обычно делают private, а наружу открывают только необходимый публичный интерфейс. Это уменьшает связность системы и защищает объекты от некорректного использования.</w:t>
+        <w:t>+ public (всем), − private (только класс), # protected (класс и потомки), ~ package (в пределах пакета).</w:t>
       </w:r>
     </w:p>
     <w:p>
       <w:pPr>
-        <w:spacing w:after="200" w:line="276" w:lineRule="auto"/>
+        <w:spacing w:after="160" w:line="276" w:lineRule="auto"/>
         <w:ind w:firstLine="709"/>
         <w:jc w:val="both"/>
       </w:pPr>
@@ -1146,7 +1048,7 @@
           <w:i w:val="0"/>
           <w:sz w:val="28"/>
         </w:rPr>
-        <w:t xml:space="preserve">Множественность отношений. </w:t>
+        <w:t xml:space="preserve">Множественность — </w:t>
       </w:r>
       <w:r>
         <w:rPr>
@@ -1155,13 +1057,12 @@
           <w:i w:val="0"/>
           <w:sz w:val="28"/>
         </w:rPr>
-        <w:t>Множественность (кратность) указывает, сколько объектов одного класса может участвовать в связи с одним объектом другого класса. Она записывается около конца ассоциации. Наиболее употребимы значения: «1» — ровно один объект; «0..1» — объект может отсутствовать или быть один; «*» или «0..*» — от нуля до многих; «1..*» — один или более; также допустимы точные диапазоны, например «2..5». Пример: связь «Клиент 1 — * Заказ» означает, что один клиент может иметь много заказов, а каждый заказ принадлежит ровно одному клиенту. Правильная множественность важна и для проектирования базы данных, и для понимания бизнес-правил.</w:t>
+        <w:t>сколько объектов одного класса связано с объектом другого: 1; 0..1; * (0..*); 1..*. Пример: Заказ 1 — 1..* ПозицияЗаказа.</w:t>
       </w:r>
     </w:p>
     <w:p>
       <w:pPr>
-        <w:spacing w:after="160" w:before="240"/>
-        <w:ind w:firstLine="0"/>
+        <w:spacing w:after="120" w:before="200"/>
         <w:jc w:val="left"/>
       </w:pPr>
       <w:r>
@@ -1176,7 +1077,7 @@
     </w:p>
     <w:p>
       <w:pPr>
-        <w:spacing w:after="160" w:line="276" w:lineRule="auto"/>
+        <w:spacing w:after="120" w:line="276" w:lineRule="auto"/>
         <w:ind w:firstLine="709"/>
         <w:jc w:val="both"/>
       </w:pPr>
@@ -1187,18 +1088,18 @@
           <w:i w:val="0"/>
           <w:sz w:val="28"/>
         </w:rPr>
-        <w:t>На рисунке приведена диаграмма прецедентов системы «Библиотека». Показаны актёры «Читатель», «Библиотекарь» и «Система уведомлений», основные функции системы, а также отношения &lt;&lt;include&gt;&gt; (заказ книги всегда включает поиск) и &lt;&lt;extend&gt;&gt; (отправка напоминания может расширять возврат книги при определённом условии).</w:t>
+        <w:t>Пример: система «Библиотека» (Читатель, Библиотекарь, Система уведомлений; &lt;&lt;include&gt;&gt;, &lt;&lt;extend&gt;&gt;).</w:t>
       </w:r>
     </w:p>
     <w:p>
       <w:pPr>
-        <w:spacing w:before="160" w:after="40"/>
+        <w:spacing w:before="120" w:after="40"/>
         <w:jc w:val="center"/>
       </w:pPr>
       <w:r>
         <w:drawing>
           <wp:inline xmlns:a="http://schemas.openxmlformats.org/drawingml/2006/main" xmlns:pic="http://schemas.openxmlformats.org/drawingml/2006/picture">
-            <wp:extent cx="5852160" cy="4328605"/>
+            <wp:extent cx="5760720" cy="4260971"/>
             <wp:docPr id="3" name="Picture 3"/>
             <wp:cNvGraphicFramePr>
               <a:graphicFrameLocks noChangeAspect="1"/>
@@ -1219,7 +1120,7 @@
                   <pic:spPr>
                     <a:xfrm>
                       <a:off x="0" y="0"/>
-                      <a:ext cx="5852160" cy="4328605"/>
+                      <a:ext cx="5760720" cy="4260971"/>
                     </a:xfrm>
                     <a:prstGeom prst="rect"/>
                   </pic:spPr>
@@ -1232,8 +1133,7 @@
     </w:p>
     <w:p>
       <w:pPr>
-        <w:spacing w:after="200" w:before="0"/>
-        <w:ind w:firstLine="0"/>
+        <w:spacing w:after="160" w:before="0"/>
         <w:jc w:val="center"/>
       </w:pPr>
       <w:r>
@@ -1243,7 +1143,7 @@
           <w:i/>
           <w:sz w:val="24"/>
         </w:rPr>
-        <w:t>Рисунок 3 — Диаграмма прецедентов (вариант 2, задание 4)</w:t>
+        <w:t>Рисунок 3 — Диаграмма прецедентов</w:t>
       </w:r>
     </w:p>
     <w:p>
@@ -1253,8 +1153,7 @@
     </w:p>
     <w:p>
       <w:pPr>
-        <w:spacing w:after="200" w:before="280"/>
-        <w:ind w:firstLine="0"/>
+        <w:spacing w:after="160" w:before="240"/>
         <w:jc w:val="center"/>
       </w:pPr>
       <w:r>
@@ -1269,8 +1168,7 @@
     </w:p>
     <w:p>
       <w:pPr>
-        <w:spacing w:after="160" w:before="240"/>
-        <w:ind w:firstLine="0"/>
+        <w:spacing w:after="120" w:before="200"/>
         <w:jc w:val="left"/>
       </w:pPr>
       <w:r>
@@ -1285,7 +1183,7 @@
     </w:p>
     <w:p>
       <w:pPr>
-        <w:spacing w:after="200" w:line="276" w:lineRule="auto"/>
+        <w:spacing w:after="160" w:line="276" w:lineRule="auto"/>
         <w:ind w:firstLine="709"/>
         <w:jc w:val="both"/>
       </w:pPr>
@@ -1296,7 +1194,7 @@
           <w:i w:val="0"/>
           <w:sz w:val="28"/>
         </w:rPr>
-        <w:t xml:space="preserve">Назначение диаграммы последовательности. </w:t>
+        <w:t xml:space="preserve">Назначение — </w:t>
       </w:r>
       <w:r>
         <w:rPr>
@@ -1305,12 +1203,12 @@
           <w:i w:val="0"/>
           <w:sz w:val="28"/>
         </w:rPr>
-        <w:t>Диаграмма последовательности (Sequence Diagram) описывает взаимодействие между объектами во времени. Она показывает, какие сообщения (вызовы операций, сигналы, ответы) передаются между участниками и в каком порядке это происходит при выполнении конкретного сценария — часто одного прецедента или его части. Такая диаграмма полезна на этапе проектирования: по ней видно, какие объекты нужны для реализации сценария, кто за что отвечает и как распределены вызовы. Главная визуальная ось — время: чем ниже сообщение на листе, тем позже оно происходит. Поэтому sequence-диаграмму удобно читать как «сценарий по шагам».</w:t>
+        <w:t>показать взаимодействие объектов во времени: какие сообщения и в каком порядке при выполнении сценария. Удобна для уточнения динамики прецедента.</w:t>
       </w:r>
     </w:p>
     <w:p>
       <w:pPr>
-        <w:spacing w:after="200" w:line="276" w:lineRule="auto"/>
+        <w:spacing w:after="160" w:line="276" w:lineRule="auto"/>
         <w:ind w:firstLine="709"/>
         <w:jc w:val="both"/>
       </w:pPr>
@@ -1321,7 +1219,7 @@
           <w:i w:val="0"/>
           <w:sz w:val="28"/>
         </w:rPr>
-        <w:t xml:space="preserve">Объекты (участники взаимодействия). </w:t>
+        <w:t xml:space="preserve">Объекты — </w:t>
       </w:r>
       <w:r>
         <w:rPr>
@@ -1330,12 +1228,12 @@
           <w:i w:val="0"/>
           <w:sz w:val="28"/>
         </w:rPr>
-        <w:t>Объекты — это участники обмена сообщениями: экземпляры классов или роли классификаторов. В верхней части диаграммы каждый участник изображается прямоугольником с подписью вида «имяОбъекта:ИмяКласса» или просто «:ИмяКласса», если имя экземпляра неважно. Слева часто размещают актёра, который инициирует сценарий. Именно между этими участниками затем рисуются стрелки сообщений. Набор объектов на диаграмме должен быть достаточным, чтобы полностью объяснить выбранный сценарий, но не перегруженным лишними деталями.</w:t>
+        <w:t>участники взаимодействия; вверху диаграммы — прямоугольники с именем (:Класс или имя:Класс).</w:t>
       </w:r>
     </w:p>
     <w:p>
       <w:pPr>
-        <w:spacing w:after="200" w:line="276" w:lineRule="auto"/>
+        <w:spacing w:after="160" w:line="276" w:lineRule="auto"/>
         <w:ind w:firstLine="709"/>
         <w:jc w:val="both"/>
       </w:pPr>
@@ -1346,7 +1244,7 @@
           <w:i w:val="0"/>
           <w:sz w:val="28"/>
         </w:rPr>
-        <w:t xml:space="preserve">Линии жизни. </w:t>
+        <w:t xml:space="preserve">Линии жизни — </w:t>
       </w:r>
       <w:r>
         <w:rPr>
@@ -1355,12 +1253,12 @@
           <w:i w:val="0"/>
           <w:sz w:val="28"/>
         </w:rPr>
-        <w:t>Линия жизни (lifeline) — вертикальная пунктирная линия, идущая вниз от участника. Она обозначает время существования или участия объекта в данном взаимодействии. Пока линия жизни продолжается, объект может отправлять и принимать сообщения. Если объект создаётся в ходе сценария, его прямоугольник рисуют ниже и линия жизни начинается с момента создания; если уничтожается — линию жизни обрывают крестом. На активных участках линии жизни обычно показывают узкий прямоугольник активации — период, когда объект выполняет операцию.</w:t>
+        <w:t>вертикальные пунктирные линии от объектов; показывают время участия объекта.</w:t>
       </w:r>
     </w:p>
     <w:p>
       <w:pPr>
-        <w:spacing w:after="200" w:line="276" w:lineRule="auto"/>
+        <w:spacing w:after="160" w:line="276" w:lineRule="auto"/>
         <w:ind w:firstLine="709"/>
         <w:jc w:val="both"/>
       </w:pPr>
@@ -1371,7 +1269,7 @@
           <w:i w:val="0"/>
           <w:sz w:val="28"/>
         </w:rPr>
-        <w:t xml:space="preserve">Сообщения. </w:t>
+        <w:t xml:space="preserve">Сообщения — </w:t>
       </w:r>
       <w:r>
         <w:rPr>
@@ -1380,12 +1278,12 @@
           <w:i w:val="0"/>
           <w:sz w:val="28"/>
         </w:rPr>
-        <w:t>Сообщение — это элемент взаимодействия, обозначающий передачу информации или управления от одного участника другому. На диаграмме сообщение рисуют горизонтальной стрелкой между линиями жизни и подписывают именем операции, сигнала или возвращаемого результата. Порядок сообщений определяется их расположением сверху вниз. Сообщения бывают вызывающими (запрос выполнить действие) и возвратными (передача результата обратно). Без сообщений диаграмма последовательности теряет смысл, так как именно они выражают динамику сценария.</w:t>
+        <w:t>горизонтальные стрелки между линиями жизни с именем операции; порядок — сверху вниз. На время обработки рисуют активацию.</w:t>
       </w:r>
     </w:p>
     <w:p>
       <w:pPr>
-        <w:spacing w:after="200" w:line="276" w:lineRule="auto"/>
+        <w:spacing w:after="160" w:line="276" w:lineRule="auto"/>
         <w:ind w:firstLine="709"/>
         <w:jc w:val="both"/>
       </w:pPr>
@@ -1396,7 +1294,7 @@
           <w:i w:val="0"/>
           <w:sz w:val="28"/>
         </w:rPr>
-        <w:t xml:space="preserve">Синхронные сообщения. </w:t>
+        <w:t xml:space="preserve">Синхронные сообщения — </w:t>
       </w:r>
       <w:r>
         <w:rPr>
@@ -1405,12 +1303,12 @@
           <w:i w:val="0"/>
           <w:sz w:val="28"/>
         </w:rPr>
-        <w:t>Синхронное сообщение означает, что отправитель после вызова приостанавливает свою работу и ждёт, пока получатель завершит обработку и, как правило, вернёт ответ. Это соответствует обычному вызову метода в большинстве языков программирования: следующая инструкция у вызывающего выполнится только после возврата из вызываемого метода. На UML синхронное сообщение изображают сплошной линией с закрашенным треугольным наконечником. Такие сообщения применяют, когда результат операции нужен сразу для продолжения сценария — например, проверка наличия товара перед добавлением в корзину.</w:t>
+        <w:t>отправитель ждёт ответа. Сплошная стрелка с закрашенным наконечником; обычный вызов метода.</w:t>
       </w:r>
     </w:p>
     <w:p>
       <w:pPr>
-        <w:spacing w:after="200" w:line="276" w:lineRule="auto"/>
+        <w:spacing w:after="160" w:line="276" w:lineRule="auto"/>
         <w:ind w:firstLine="709"/>
         <w:jc w:val="both"/>
       </w:pPr>
@@ -1421,7 +1319,7 @@
           <w:i w:val="0"/>
           <w:sz w:val="28"/>
         </w:rPr>
-        <w:t xml:space="preserve">Асинхронные сообщения. </w:t>
+        <w:t xml:space="preserve">Асинхронные сообщения — </w:t>
       </w:r>
       <w:r>
         <w:rPr>
@@ -1430,13 +1328,12 @@
           <w:i w:val="0"/>
           <w:sz w:val="28"/>
         </w:rPr>
-        <w:t>Асинхронное сообщение означает, что отправитель не ждёт завершения обработки у получателя и сразу продолжает своё выполнение. Получатель обрабатывает сообщение независимо, возможно позже или параллельно. Это характерно для событий, сигналов, очередей сообщений, уведомлений, фоновых задач. На диаграмме асинхронное сообщение обычно рисуют стрелкой с открытым (незакрашенным) наконечником. Пример: система отправляет пользователю уведомление «заказ собран» и не блокирует основной процесс оформления, ожидая прочтения письма.</w:t>
+        <w:t>отправитель не ждёт ответа и продолжает работу. Стрелка с открытым наконечником; события, сигналы, уведомления.</w:t>
       </w:r>
     </w:p>
     <w:p>
       <w:pPr>
-        <w:spacing w:after="160" w:before="240"/>
-        <w:ind w:firstLine="0"/>
+        <w:spacing w:after="120" w:before="200"/>
         <w:jc w:val="left"/>
       </w:pPr>
       <w:r>
@@ -1451,7 +1348,7 @@
     </w:p>
     <w:p>
       <w:pPr>
-        <w:spacing w:after="200" w:line="276" w:lineRule="auto"/>
+        <w:spacing w:after="160" w:line="276" w:lineRule="auto"/>
         <w:ind w:firstLine="709"/>
         <w:jc w:val="both"/>
       </w:pPr>
@@ -1462,7 +1359,7 @@
           <w:i w:val="0"/>
           <w:sz w:val="28"/>
         </w:rPr>
-        <w:t xml:space="preserve">Понятие управления конфигурацией ПО. </w:t>
+        <w:t xml:space="preserve">Управление конфигурацией ПО (SCM) — </w:t>
       </w:r>
       <w:r>
         <w:rPr>
@@ -1471,12 +1368,12 @@
           <w:i w:val="0"/>
           <w:sz w:val="28"/>
         </w:rPr>
-        <w:t>Управление конфигурацией программного обеспечения (Software Configuration Management, SCM) — это дисциплина, которая обеспечивает идентификацию элементов программного продукта, контроль их изменений, учёт текущего состояния и аудит на протяжении всего жизненного цикла. Под конфигурацией понимают согласованный набор артефактов: исходные тексты, модули, библиотеки, документацию, скрипты сборки, установочные пакеты, версии релизов и т.д. Цель SCM — всегда знать, из чего состоит конкретная версия продукта, кто и зачем внёс изменение, можно ли воспроизвести ту же сборку и чем одна версия отличается от другой. На практике SCM опирается на системы контроля версий, процедуры code review, нумерацию релизов, реестр изменений и правила выпуска сборок. Без управления конфигурацией сопровождение и поддержка продукта становятся хаотичными: невозможно надёжно ответить, какая именно версия установлена у заказчика и какие исправления в неё входят.</w:t>
+        <w:t>процессы идентификации элементов продукта, контроля изменений, учёта состояния и аудита на протяжении ЖЦ. Цель — знать состав версии, историю изменений и уметь воспроизвести сборку/релиз.</w:t>
       </w:r>
     </w:p>
     <w:p>
       <w:pPr>
-        <w:spacing w:after="200" w:line="276" w:lineRule="auto"/>
+        <w:spacing w:after="160" w:line="276" w:lineRule="auto"/>
         <w:ind w:firstLine="709"/>
         <w:jc w:val="both"/>
       </w:pPr>
@@ -1487,7 +1384,7 @@
           <w:i w:val="0"/>
           <w:sz w:val="28"/>
         </w:rPr>
-        <w:t xml:space="preserve">Идентификация конфигурации. </w:t>
+        <w:t xml:space="preserve">Идентификация конфигурации — </w:t>
       </w:r>
       <w:r>
         <w:rPr>
@@ -1496,13 +1393,12 @@
           <w:i w:val="0"/>
           <w:sz w:val="28"/>
         </w:rPr>
-        <w:t>Идентификация конфигурации — один из ключевых процессов SCM. Он заключается в том, что элементы конфигурации выделяют, именуют и однозначно обозначают, а также фиксируют их версии и взаимные связи. Сначала определяют, что считать элементами конфигурации (configuration items): отдельные файлы, компоненты, документы, сборки. Затем задают схему именования и правила версионирования (например, major.minor.patch). Важная часть идентификации — базовые линии (baselines): утверждённые наборы версий элементов на определённый момент, например «версия требований 1.0» или «релиз 2.3». По базовой линии можно восстановить состав системы и отслеживать последующие изменения относительно известной точки. Таким образом, идентификация создаёт «паспорт» продукта, без которого контроль изменений теряет основу.</w:t>
+        <w:t>присвоение элементам уникальных обозначений и фиксация версий. Включает выбор элементов конфигурации, схему нумерации версий, базовые линии (baselines) и описание состава релиза.</w:t>
       </w:r>
     </w:p>
     <w:p>
       <w:pPr>
-        <w:spacing w:after="160" w:before="240"/>
-        <w:ind w:firstLine="0"/>
+        <w:spacing w:after="120" w:before="200"/>
         <w:jc w:val="left"/>
       </w:pPr>
       <w:r>
@@ -1517,7 +1413,7 @@
     </w:p>
     <w:p>
       <w:pPr>
-        <w:spacing w:after="200" w:line="276" w:lineRule="auto"/>
+        <w:spacing w:after="160" w:line="276" w:lineRule="auto"/>
         <w:ind w:firstLine="709"/>
         <w:jc w:val="both"/>
       </w:pPr>
@@ -1528,7 +1424,7 @@
           <w:i w:val="0"/>
           <w:sz w:val="28"/>
         </w:rPr>
-        <w:t xml:space="preserve">Определение Agile. </w:t>
+        <w:t xml:space="preserve">Agile — </w:t>
       </w:r>
       <w:r>
         <w:rPr>
@@ -1537,12 +1433,12 @@
           <w:i w:val="0"/>
           <w:sz w:val="28"/>
         </w:rPr>
-        <w:t>Agile (гибкая методология, точнее — семейство гибких подходов) — это способ организации разработки программного обеспечения, основанный на коротких итерациях, регулярной поставке работающего продукта, тесном взаимодействии с заказчиком и готовности изменять требования по мере появления новой информации. Ценности Agile сформулированы в Agile Manifesto (2001): люди и взаимодействие важнее процессов и инструментов; работающий продукт важнее исчерпывающей документации; сотрудничество с заказчиком важнее жёсткого контракта; готовность к изменениям важнее следования первоначальному плану. В отличие от классической «водопадной» схемы, где сначала пытаются полностью утвердить все требования, в Agile продукт развивают постепенно: каждые одну-несколько недель команда демонстрирует прирост функциональности и получает обратную связь. К Agile-подходам относят, в частности, Scrum, Kanban, XP и другие практики. Главный смысл Agile — быстрее давать ценность пользователю и снижать риск долгой разработки «не того» продукта.</w:t>
+        <w:t>гибкий подход к разработке: короткие итерации, регулярная поставка рабочего ПО, сотрудничество с заказчиком и готовность к изменению требований. Ценности зафиксированы в Agile Manifesto (2001).</w:t>
       </w:r>
     </w:p>
     <w:p>
       <w:pPr>
-        <w:spacing w:after="160" w:line="276" w:lineRule="auto"/>
+        <w:spacing w:after="120" w:line="276" w:lineRule="auto"/>
         <w:ind w:firstLine="709"/>
         <w:jc w:val="both"/>
       </w:pPr>
@@ -1553,13 +1449,13 @@
           <w:i w:val="0"/>
           <w:sz w:val="28"/>
         </w:rPr>
-        <w:t>Принципы Agile (12 принципов Манифеста) с кратким пояснением:</w:t>
+        <w:t>Принципы Agile:</w:t>
       </w:r>
     </w:p>
     <w:p>
       <w:pPr>
         <w:pStyle w:val="ListBullet"/>
-        <w:spacing w:after="80"/>
+        <w:spacing w:after="60"/>
       </w:pPr>
       <w:r>
         <w:rPr>
@@ -1568,13 +1464,13 @@
           <w:i w:val="0"/>
           <w:sz w:val="28"/>
         </w:rPr>
-        <w:t>1. Наивысший приоритет — удовлетворять потребности заказчика регулярной и ранней поставкой ценного ПО. Не копить результат месяцами, а показывать пользу как можно раньше.</w:t>
+        <w:t>Ранняя и регулярная поставка ценного ПО заказчику.</w:t>
       </w:r>
     </w:p>
     <w:p>
       <w:pPr>
         <w:pStyle w:val="ListBullet"/>
-        <w:spacing w:after="80"/>
+        <w:spacing w:after="60"/>
       </w:pPr>
       <w:r>
         <w:rPr>
@@ -1583,13 +1479,13 @@
           <w:i w:val="0"/>
           <w:sz w:val="28"/>
         </w:rPr>
-        <w:t>2. Изменение требований приветствуется даже на поздних стадиях. Гибкость важнее слепого следования устаревшему ТЗ, если изменилась потребность бизнеса.</w:t>
+        <w:t>Изменение требований приветствуется даже на поздних стадиях.</w:t>
       </w:r>
     </w:p>
     <w:p>
       <w:pPr>
         <w:pStyle w:val="ListBullet"/>
-        <w:spacing w:after="80"/>
+        <w:spacing w:after="60"/>
       </w:pPr>
       <w:r>
         <w:rPr>
@@ -1598,13 +1494,13 @@
           <w:i w:val="0"/>
           <w:sz w:val="28"/>
         </w:rPr>
-        <w:t>3. Рабочее ПО поставляют часто — в сроки от пары недель до пары месяцев, предпочитая меньший период. Короткие циклы дают быструю обратную связь.</w:t>
+        <w:t>Частая поставка рабочего ПО (недели, а не месяцы).</w:t>
       </w:r>
     </w:p>
     <w:p>
       <w:pPr>
         <w:pStyle w:val="ListBullet"/>
-        <w:spacing w:after="80"/>
+        <w:spacing w:after="60"/>
       </w:pPr>
       <w:r>
         <w:rPr>
@@ -1613,13 +1509,13 @@
           <w:i w:val="0"/>
           <w:sz w:val="28"/>
         </w:rPr>
-        <w:t>4. Бизнес и разработчики должны ежедневно работать вместе. Совместная работа уменьшает недопонимание требований.</w:t>
+        <w:t>Ежедневное сотрудничество бизнеса и разработчиков.</w:t>
       </w:r>
     </w:p>
     <w:p>
       <w:pPr>
         <w:pStyle w:val="ListBullet"/>
-        <w:spacing w:after="80"/>
+        <w:spacing w:after="60"/>
       </w:pPr>
       <w:r>
         <w:rPr>
@@ -1628,13 +1524,13 @@
           <w:i w:val="0"/>
           <w:sz w:val="28"/>
         </w:rPr>
-        <w:t>5. Проекты строят вокруг мотивированных людей; им создают условия, поддержку и доверие. Результат зависит от команды сильнее, чем от формальных регламентов.</w:t>
+        <w:t>Проект вокруг мотивированных людей; им доверяют.</w:t>
       </w:r>
     </w:p>
     <w:p>
       <w:pPr>
         <w:pStyle w:val="ListBullet"/>
-        <w:spacing w:after="80"/>
+        <w:spacing w:after="60"/>
       </w:pPr>
       <w:r>
         <w:rPr>
@@ -1643,13 +1539,13 @@
           <w:i w:val="0"/>
           <w:sz w:val="28"/>
         </w:rPr>
-        <w:t>6. Самый эффективный способ передачи информации — личный разговор. Живое обсуждение быстрее устраняет неопределённость, чем длинная переписка.</w:t>
+        <w:t>Лучший способ обмена информацией — личный разговор.</w:t>
       </w:r>
     </w:p>
     <w:p>
       <w:pPr>
         <w:pStyle w:val="ListBullet"/>
-        <w:spacing w:after="80"/>
+        <w:spacing w:after="60"/>
       </w:pPr>
       <w:r>
         <w:rPr>
@@ -1658,13 +1554,13 @@
           <w:i w:val="0"/>
           <w:sz w:val="28"/>
         </w:rPr>
-        <w:t>7. Рабочее программное обеспечение — главный показатель прогресса. Оценивают не «процент написанных документов», а реально работающий продукт.</w:t>
+        <w:t>Рабочее ПО — главный показатель прогресса.</w:t>
       </w:r>
     </w:p>
     <w:p>
       <w:pPr>
         <w:pStyle w:val="ListBullet"/>
-        <w:spacing w:after="80"/>
+        <w:spacing w:after="60"/>
       </w:pPr>
       <w:r>
         <w:rPr>
@@ -1673,13 +1569,13 @@
           <w:i w:val="0"/>
           <w:sz w:val="28"/>
         </w:rPr>
-        <w:t>8. Процессы должны поддерживать устойчивый темп работы. Команда должна иметь возможность работать ровно и долго, без постоянного аврала.</w:t>
+        <w:t>Устойчивый темп разработки.</w:t>
       </w:r>
     </w:p>
     <w:p>
       <w:pPr>
         <w:pStyle w:val="ListBullet"/>
-        <w:spacing w:after="80"/>
+        <w:spacing w:after="60"/>
       </w:pPr>
       <w:r>
         <w:rPr>
@@ -1688,13 +1584,13 @@
           <w:i w:val="0"/>
           <w:sz w:val="28"/>
         </w:rPr>
-        <w:t>9. Постоянное внимание к техническому совершенству и хорошему дизайну повышает гибкость. Качественная архитектура и код облегчают изменения.</w:t>
+        <w:t>Внимание к техническому совершенству и дизайну.</w:t>
       </w:r>
     </w:p>
     <w:p>
       <w:pPr>
         <w:pStyle w:val="ListBullet"/>
-        <w:spacing w:after="80"/>
+        <w:spacing w:after="60"/>
       </w:pPr>
       <w:r>
         <w:rPr>
@@ -1703,13 +1599,13 @@
           <w:i w:val="0"/>
           <w:sz w:val="28"/>
         </w:rPr>
-        <w:t>10. Простота — искусство не делать лишней работы — крайне необходима. Не усложнять решение заранее «на всякий случай».</w:t>
+        <w:t>Простота — не делать лишней работы.</w:t>
       </w:r>
     </w:p>
     <w:p>
       <w:pPr>
         <w:pStyle w:val="ListBullet"/>
-        <w:spacing w:after="80"/>
+        <w:spacing w:after="60"/>
       </w:pPr>
       <w:r>
         <w:rPr>
@@ -1718,13 +1614,13 @@
           <w:i w:val="0"/>
           <w:sz w:val="28"/>
         </w:rPr>
-        <w:t>11. Лучшие архитектуры, требования и проектные решения возникают у самоорганизующихся команд. Команда сама лучше знает, как организовать работу над задачей.</w:t>
+        <w:t>Лучшие решения у самоорганизующихся команд.</w:t>
       </w:r>
     </w:p>
     <w:p>
       <w:pPr>
         <w:pStyle w:val="ListBullet"/>
-        <w:spacing w:after="80"/>
+        <w:spacing w:after="60"/>
       </w:pPr>
       <w:r>
         <w:rPr>
@@ -1733,13 +1629,12 @@
           <w:i w:val="0"/>
           <w:sz w:val="28"/>
         </w:rPr>
-        <w:t>12. Команда регулярно анализирует способы стать эффективнее и корректирует поведение. Это принцип непрерывного улучшения (ретроспективы).</w:t>
+        <w:t>Регулярная рефлексия и улучшение работы.</w:t>
       </w:r>
     </w:p>
     <w:p>
       <w:pPr>
-        <w:spacing w:after="160" w:before="240"/>
-        <w:ind w:firstLine="0"/>
+        <w:spacing w:after="120" w:before="200"/>
         <w:jc w:val="left"/>
       </w:pPr>
       <w:r>
@@ -1754,7 +1649,7 @@
     </w:p>
     <w:p>
       <w:pPr>
-        <w:spacing w:after="160" w:line="276" w:lineRule="auto"/>
+        <w:spacing w:after="120" w:line="276" w:lineRule="auto"/>
         <w:ind w:firstLine="709"/>
         <w:jc w:val="both"/>
       </w:pPr>
@@ -1765,12 +1660,12 @@
           <w:i w:val="0"/>
           <w:sz w:val="28"/>
         </w:rPr>
-        <w:t>На рисунке показана диаграмма классов для предметной области учёта заказов. Классы «Покупатель», «Заказ», «ПозицияЗаказа» и «Товар» связаны ассоциациями с указанной множественностью; «Оплата» представлена как интерфейс, который использует заказ. У классов указаны атрибуты, методы и видимость.</w:t>
+        <w:t>Пример: учёт заказов (Покупатель, Заказ, ПозицияЗаказа, Товар, интерфейс Оплата).</w:t>
       </w:r>
     </w:p>
     <w:p>
       <w:pPr>
-        <w:spacing w:before="160" w:after="40"/>
+        <w:spacing w:before="120" w:after="40"/>
         <w:jc w:val="center"/>
       </w:pPr>
       <w:r>
@@ -1810,8 +1705,7 @@
     </w:p>
     <w:p>
       <w:pPr>
-        <w:spacing w:after="200" w:before="0"/>
-        <w:ind w:firstLine="0"/>
+        <w:spacing w:after="160" w:before="0"/>
         <w:jc w:val="center"/>
       </w:pPr>
       <w:r>
@@ -1821,7 +1715,7 @@
           <w:i/>
           <w:sz w:val="24"/>
         </w:rPr>
-        <w:t>Рисунок 4 — Диаграмма классов (вариант 3, задание 4)</w:t>
+        <w:t>Рисунок 4 — Диаграмма классов</w:t>
       </w:r>
     </w:p>
     <w:p>
@@ -1831,8 +1725,7 @@
     </w:p>
     <w:p>
       <w:pPr>
-        <w:spacing w:after="200" w:before="280"/>
-        <w:ind w:firstLine="0"/>
+        <w:spacing w:after="160" w:before="240"/>
         <w:jc w:val="center"/>
       </w:pPr>
       <w:r>
@@ -1847,8 +1740,7 @@
     </w:p>
     <w:p>
       <w:pPr>
-        <w:spacing w:after="200" w:before="0"/>
-        <w:ind w:firstLine="0"/>
+        <w:spacing w:after="160" w:before="0"/>
         <w:jc w:val="both"/>
       </w:pPr>
       <w:r>
@@ -1858,13 +1750,12 @@
           <w:i/>
           <w:sz w:val="24"/>
         </w:rPr>
-        <w:t>Примечание: в исходном бланке контрольной работы формулировки заданий 1 и 2 совпадают (оба посвящены диаграмме коммуникации). Ниже дан полный развёрнутый ответ по существу вопроса; в задании 2 дополнительно углублены сравнение с диаграммой последовательности и критерии выбора нотации.</w:t>
+        <w:t>Примечание: в бланке задания 1 и 2 сформулированы одинаково (диаграмма коммуникации).</w:t>
       </w:r>
     </w:p>
     <w:p>
       <w:pPr>
-        <w:spacing w:after="160" w:before="240"/>
-        <w:ind w:firstLine="0"/>
+        <w:spacing w:after="120" w:before="200"/>
         <w:jc w:val="left"/>
       </w:pPr>
       <w:r>
@@ -1879,7 +1770,7 @@
     </w:p>
     <w:p>
       <w:pPr>
-        <w:spacing w:after="200" w:line="276" w:lineRule="auto"/>
+        <w:spacing w:after="160" w:line="276" w:lineRule="auto"/>
         <w:ind w:firstLine="709"/>
         <w:jc w:val="both"/>
       </w:pPr>
@@ -1890,7 +1781,7 @@
           <w:i w:val="0"/>
           <w:sz w:val="28"/>
         </w:rPr>
-        <w:t xml:space="preserve">Назначение диаграммы коммуникации. </w:t>
+        <w:t xml:space="preserve">Назначение — </w:t>
       </w:r>
       <w:r>
         <w:rPr>
@@ -1899,12 +1790,12 @@
           <w:i w:val="0"/>
           <w:sz w:val="28"/>
         </w:rPr>
-        <w:t>Диаграмма коммуникации (Communication Diagram; в более ранних версиях UML — Collaboration Diagram) предназначена для отображения взаимодействия объектов с акцентом на их структурных связях. Она показывает, какие объекты участвуют в сценарии, какими линиями связи они соединены и какие сообщения по этим связям передаются. В отличие от диаграммы последовательности, где доминирует ось времени, здесь на первый план выходит «карта» взаимодействия: сразу видно, кто с кем связан. Порядок сообщений не читается по вертикали листа, а задаётся явной нумерацией (1, 2, 1.1, 1.2, 3…). Диаграмму применяют при анализе и проектировании, когда нужно понять организацию обмена сообщениями в рамках прецедента.</w:t>
+        <w:t>показать структуру связей объектов и обмен сообщениями при выполнении сценария. Акцент на том, кто с кем связан; порядок сообщений задаётся нумерацией.</w:t>
       </w:r>
     </w:p>
     <w:p>
       <w:pPr>
-        <w:spacing w:after="200" w:line="276" w:lineRule="auto"/>
+        <w:spacing w:after="160" w:line="276" w:lineRule="auto"/>
         <w:ind w:firstLine="709"/>
         <w:jc w:val="both"/>
       </w:pPr>
@@ -1915,7 +1806,7 @@
           <w:i w:val="0"/>
           <w:sz w:val="28"/>
         </w:rPr>
-        <w:t xml:space="preserve">Основные элементы диаграммы коммуникации. </w:t>
+        <w:t xml:space="preserve">Основные элементы — </w:t>
       </w:r>
       <w:r>
         <w:rPr>
@@ -1924,12 +1815,12 @@
           <w:i w:val="0"/>
           <w:sz w:val="28"/>
         </w:rPr>
-        <w:t>К основным элементам относятся: участники взаимодействия (объекты или роли), изображаемые прямоугольниками; связи (links) между участниками — линии, по которым могут идти сообщения; сами сообщения — стрелки вдоль связей с номером и именем операции или сигнала; при необходимости — актёры, инициирующие сценарий. Нумерация сообщений отражает последовательность и вложенность: сообщение 1.1 выполняется в ходе обработки сообщения 1. Благодаря этому диаграмма остаётся компактной даже при нескольких объектах, сохраняя информацию о порядке действий.</w:t>
+        <w:t>объекты (роли), связи между ними, сообщения вдоль связей с номерами (1, 1.1, 2…), при необходимости актёры.</w:t>
       </w:r>
     </w:p>
     <w:p>
       <w:pPr>
-        <w:spacing w:after="200" w:line="276" w:lineRule="auto"/>
+        <w:spacing w:after="160" w:line="276" w:lineRule="auto"/>
         <w:ind w:firstLine="709"/>
         <w:jc w:val="both"/>
       </w:pPr>
@@ -1940,7 +1831,7 @@
           <w:i w:val="0"/>
           <w:sz w:val="28"/>
         </w:rPr>
-        <w:t xml:space="preserve">Сравнение с диаграммой последовательности и отличия. </w:t>
+        <w:t xml:space="preserve">Отличие от диаграммы последовательности — </w:t>
       </w:r>
       <w:r>
         <w:rPr>
@@ -1949,13 +1840,12 @@
           <w:i w:val="0"/>
           <w:sz w:val="28"/>
         </w:rPr>
-        <w:t>Диаграмма коммуникации и диаграмма последовательности относятся к одной группе UML — диаграммам взаимодействия — и могут описывать один и тот же сценарий. На sequence-диаграмме время явно направлено сверху вниз, хорошо видны линии жизни, активации и временные фрагменты (alt, loop, opt). На communication-диаграмме важнее топология связей, а время кодируется номерами сообщений. Следовательно, последовательность удобнее читать как пошаговый сценарий, а коммуникацию — как структурный обзор «кто с кем общается». Семантика сообщений при этом одна: диаграммы взаимопреобразуемы. Выбор зависит от того, что важнее подчеркнуть — порядок во времени или устройство связей.</w:t>
+        <w:t>sequence подчёркивает время (сверху вниз, линии жизни); communication — топологию связей (порядок через номера). Семантика сообщений одна, различается способ представления.</w:t>
       </w:r>
     </w:p>
     <w:p>
       <w:pPr>
-        <w:spacing w:after="160" w:before="240"/>
-        <w:ind w:firstLine="0"/>
+        <w:spacing w:after="120" w:before="200"/>
         <w:jc w:val="left"/>
       </w:pPr>
       <w:r>
@@ -1965,12 +1855,12 @@
           <w:i w:val="0"/>
           <w:sz w:val="28"/>
         </w:rPr>
-        <w:t>Задание 2. Диаграмма коммуникации — углублённый ответ (5–6 баллов)</w:t>
+        <w:t>Задание 2. Диаграмма коммуникации — дополнение (5–6 баллов)</w:t>
       </w:r>
     </w:p>
     <w:p>
       <w:pPr>
-        <w:spacing w:after="200" w:line="276" w:lineRule="auto"/>
+        <w:spacing w:after="160" w:line="276" w:lineRule="auto"/>
         <w:ind w:firstLine="709"/>
         <w:jc w:val="both"/>
       </w:pPr>
@@ -1981,7 +1871,7 @@
           <w:i w:val="0"/>
           <w:sz w:val="28"/>
         </w:rPr>
-        <w:t xml:space="preserve">Место диаграммы коммуникации среди диаграмм UML. </w:t>
+        <w:t xml:space="preserve">Углубление сравнения. </w:t>
       </w:r>
       <w:r>
         <w:rPr>
@@ -1990,62 +1880,12 @@
           <w:i w:val="0"/>
           <w:sz w:val="28"/>
         </w:rPr>
-        <w:t>Диаграмма коммуникации входит в раздел поведенческих диаграмм UML и конкретно — в семейство диаграмм взаимодействия. Её используют после того, как уже намечены основные классы или объекты, чтобы уточнить, как они совместно реализуют поведение прецедента. Если диаграмма классов отвечает на вопрос «что из себя представляет система статически», то диаграмма коммуникации отвечает: «как объекты обмениваются сообщениями, чтобы выполнить конкретную задачу».</w:t>
+        <w:t>Обе диаграммы — диаграммы взаимодействия UML. Sequence удобнее для длинных сценариев и ветвлений во времени; communication — для компактного обзора «кто с кем общается». Нумерация отражает последовательность и вложенность вызовов.</w:t>
       </w:r>
     </w:p>
     <w:p>
       <w:pPr>
-        <w:spacing w:after="200" w:line="276" w:lineRule="auto"/>
-        <w:ind w:firstLine="709"/>
-        <w:jc w:val="both"/>
-      </w:pPr>
-      <w:r>
-        <w:rPr>
-          <w:rFonts w:ascii="Times New Roman" w:hAnsi="Times New Roman" w:eastAsia="Times New Roman"/>
-          <w:b/>
-          <w:i w:val="0"/>
-          <w:sz w:val="28"/>
-        </w:rPr>
-        <w:t xml:space="preserve">Элементы подробнее. </w:t>
-      </w:r>
-      <w:r>
-        <w:rPr>
-          <w:rFonts w:ascii="Times New Roman" w:hAnsi="Times New Roman" w:eastAsia="Times New Roman"/>
-          <w:b w:val="0"/>
-          <w:i w:val="0"/>
-          <w:sz w:val="28"/>
-        </w:rPr>
-        <w:t>Участник на диаграмме — это роль классификатора в конкретном взаимодействии, чаще всего объект класса. Связь между участниками означает, что в рамках сценария существует канал передачи сообщений (часто это экземпляр ассоциации из модели классов). Сообщение обозначает вызов операции либо посылку сигнала; направление стрелки указывает получателя. Составная нумерация позволяет показать вложенные вызовы без перегруза рисунка. Например, цепочка 1 → 1.1 → 1.2 → 2 читается так: сначала сообщение 1, внутри его обработки — 1.1 и 1.2, затем сообщение 2.</w:t>
-      </w:r>
-    </w:p>
-    <w:p>
-      <w:pPr>
-        <w:spacing w:after="200" w:line="276" w:lineRule="auto"/>
-        <w:ind w:firstLine="709"/>
-        <w:jc w:val="both"/>
-      </w:pPr>
-      <w:r>
-        <w:rPr>
-          <w:rFonts w:ascii="Times New Roman" w:hAnsi="Times New Roman" w:eastAsia="Times New Roman"/>
-          <w:b/>
-          <w:i w:val="0"/>
-          <w:sz w:val="28"/>
-        </w:rPr>
-        <w:t xml:space="preserve">Практическое сравнение с sequence и критерии выбора. </w:t>
-      </w:r>
-      <w:r>
-        <w:rPr>
-          <w:rFonts w:ascii="Times New Roman" w:hAnsi="Times New Roman" w:eastAsia="Times New Roman"/>
-          <w:b w:val="0"/>
-          <w:i w:val="0"/>
-          <w:sz w:val="28"/>
-        </w:rPr>
-        <w:t>Если сценарий длинный, содержит ветвления и циклы, обычно удобнее диаграмма последовательности: на ней естественно размещаются комбинированные фрагменты alt/loop/opt и хорошо читается временная логика. Если объектов много и нужно быстро понять, какие пары вообще взаимодействуют, удобнее диаграмма коммуникации: она компактнее показывает сеть связей. В учебной и проектной практике обе формы полезны: sequence — для детального сценария, communication — для обзорной схемы взаимодействия. Для ответа на контрольной достаточно уметь объяснить назначение, элементы, нумерацию сообщений и отличия от sequence.</w:t>
-      </w:r>
-    </w:p>
-    <w:p>
-      <w:pPr>
-        <w:spacing w:before="160" w:after="40"/>
+        <w:spacing w:before="120" w:after="40"/>
         <w:jc w:val="center"/>
       </w:pPr>
       <w:r>
@@ -2085,8 +1925,7 @@
     </w:p>
     <w:p>
       <w:pPr>
-        <w:spacing w:after="200" w:before="0"/>
-        <w:ind w:firstLine="0"/>
+        <w:spacing w:after="160" w:before="0"/>
         <w:jc w:val="center"/>
       </w:pPr>
       <w:r>
@@ -2096,13 +1935,12 @@
           <w:i/>
           <w:sz w:val="24"/>
         </w:rPr>
-        <w:t>Рисунок 5 — Диаграмма коммуникации (вариант 4, задания 1–2)</w:t>
+        <w:t>Рисунок 5 — Диаграмма коммуникации</w:t>
       </w:r>
     </w:p>
     <w:p>
       <w:pPr>
-        <w:spacing w:after="160" w:before="240"/>
-        <w:ind w:firstLine="0"/>
+        <w:spacing w:after="120" w:before="200"/>
         <w:jc w:val="left"/>
       </w:pPr>
       <w:r>
@@ -2124,16 +1962,25 @@
       <w:r>
         <w:rPr>
           <w:rFonts w:ascii="Times New Roman" w:hAnsi="Times New Roman" w:eastAsia="Times New Roman"/>
+          <w:b/>
+          <w:i w:val="0"/>
+          <w:sz w:val="28"/>
+        </w:rPr>
+        <w:t xml:space="preserve">Product Owner — </w:t>
+      </w:r>
+      <w:r>
+        <w:rPr>
+          <w:rFonts w:ascii="Times New Roman" w:hAnsi="Times New Roman" w:eastAsia="Times New Roman"/>
           <w:b w:val="0"/>
           <w:i w:val="0"/>
           <w:sz w:val="28"/>
         </w:rPr>
-        <w:t>Scrum — это гибкий каркас (framework) управления разработкой продукта короткими циклами, называемыми спринтами. Работа ведётся итерациями фиксированной длины, в конце каждой из которых должен появляться полезный прирост продукта. В классическом описании Scrum выделяют три роли и три основных артефакта.</w:t>
+        <w:t>отвечает за ценность продукта и Product Backlog: формулирует требования, задаёт приоритеты, принимает результат.</w:t>
       </w:r>
     </w:p>
     <w:p>
       <w:pPr>
-        <w:spacing w:after="200" w:line="276" w:lineRule="auto"/>
+        <w:spacing w:after="160" w:line="276" w:lineRule="auto"/>
         <w:ind w:firstLine="709"/>
         <w:jc w:val="both"/>
       </w:pPr>
@@ -2144,7 +1991,7 @@
           <w:i w:val="0"/>
           <w:sz w:val="28"/>
         </w:rPr>
-        <w:t xml:space="preserve">Product Owner (Владелец продукта). </w:t>
+        <w:t xml:space="preserve">Scrum Master — </w:t>
       </w:r>
       <w:r>
         <w:rPr>
@@ -2153,12 +2000,12 @@
           <w:i w:val="0"/>
           <w:sz w:val="28"/>
         </w:rPr>
-        <w:t>Product Owner отвечает за максимизацию ценности продукта и за содержание Product Backlog. Он собирает потребности заказчика и пользователей, формулирует элементы бэклога (часто в виде пользовательских историй), упорядочивает их по приоритету и разъясняет команде, что важнее сделать раньше. Также Product Owner принимает готовый результат и решает, соответствует ли он ожиданиям. Это роль заказчика внутри процесса: не обязательно технический руководитель, но человек, который определяет «что строить» и в какой последовательности.</w:t>
+        <w:t>помогает следовать Scrum, устраняет препятствия, фасилитирует события, защищает команду от помех.</w:t>
       </w:r>
     </w:p>
     <w:p>
       <w:pPr>
-        <w:spacing w:after="200" w:line="276" w:lineRule="auto"/>
+        <w:spacing w:after="160" w:line="276" w:lineRule="auto"/>
         <w:ind w:firstLine="709"/>
         <w:jc w:val="both"/>
       </w:pPr>
@@ -2169,7 +2016,7 @@
           <w:i w:val="0"/>
           <w:sz w:val="28"/>
         </w:rPr>
-        <w:t xml:space="preserve">Scrum Master. </w:t>
+        <w:t xml:space="preserve">Developers — </w:t>
       </w:r>
       <w:r>
         <w:rPr>
@@ -2178,12 +2025,12 @@
           <w:i w:val="0"/>
           <w:sz w:val="28"/>
         </w:rPr>
-        <w:t>Scrum Master помогает команде и организации правильно применять Scrum. Он фасилитирует события (планирование спринта, Daily Scrum, обзор спринта, ретроспективу), следит за соблюдением договорённостей процесса, помогает устранять препятствия, мешающие работе, и защищает команду от внешних хаотичных вмешательств. Scrum Master — не «начальник программистов» и не замена Product Owner. Его задача — сделать процесс прозрачным и эффективным, развивать самоорганизацию команды и непрерывно улучшать способы работы.</w:t>
+        <w:t>кросс-функциональная команда, создающая Инкремент; сама оценивает работу и решает, как её выполнить.</w:t>
       </w:r>
     </w:p>
     <w:p>
       <w:pPr>
-        <w:spacing w:after="200" w:line="276" w:lineRule="auto"/>
+        <w:spacing w:after="160" w:line="276" w:lineRule="auto"/>
         <w:ind w:firstLine="709"/>
         <w:jc w:val="both"/>
       </w:pPr>
@@ -2194,7 +2041,7 @@
           <w:i w:val="0"/>
           <w:sz w:val="28"/>
         </w:rPr>
-        <w:t xml:space="preserve">Developers (Команда разработки). </w:t>
+        <w:t xml:space="preserve">Product Backlog — </w:t>
       </w:r>
       <w:r>
         <w:rPr>
@@ -2203,12 +2050,12 @@
           <w:i w:val="0"/>
           <w:sz w:val="28"/>
         </w:rPr>
-        <w:t>Developers — это кросс-функциональная группа специалистов, которая непосредственно создаёт Инкремент продукта. В состав могут входить программисты, тестировщики, аналитики, дизайнеры и другие роли — в зависимости от продукта. Команда сама оценивает объём работы, решает, как реализовать выбранные задачи, и несёт коллективную ответственность за результат спринта. Важный принцип: команда самоорганизуется в рамках цели спринта. Нет отдельного «прораба», который раздаёт микрозадачи вместо самой команды.</w:t>
+        <w:t>упорядоченный список всего нужного в продукте (функции, улучшения, дефекты); ведёт Product Owner.</w:t>
       </w:r>
     </w:p>
     <w:p>
       <w:pPr>
-        <w:spacing w:after="200" w:line="276" w:lineRule="auto"/>
+        <w:spacing w:after="160" w:line="276" w:lineRule="auto"/>
         <w:ind w:firstLine="709"/>
         <w:jc w:val="both"/>
       </w:pPr>
@@ -2219,7 +2066,7 @@
           <w:i w:val="0"/>
           <w:sz w:val="28"/>
         </w:rPr>
-        <w:t xml:space="preserve">Product Backlog. </w:t>
+        <w:t xml:space="preserve">Sprint Backlog — </w:t>
       </w:r>
       <w:r>
         <w:rPr>
@@ -2228,12 +2075,12 @@
           <w:i w:val="0"/>
           <w:sz w:val="28"/>
         </w:rPr>
-        <w:t>Product Backlog — упорядоченный список всего, что может понадобиться в продукте: новые функции, изменения, исправления дефектов, технические улучшения. Это единый источник работы для команды. Бэклог «живой»: его постоянно уточняют, дробят крупные элементы на более мелкие, меняют приоритеты. Ответственность за содержание и порядок элементов Product Backlog лежит на Product Owner, хотя детализацию формулировок он часто делает вместе с командой.</w:t>
+        <w:t>элементы бэклога, выбранные на спринт, плюс план их реализации; принадлежит команде разработки.</w:t>
       </w:r>
     </w:p>
     <w:p>
       <w:pPr>
-        <w:spacing w:after="200" w:line="276" w:lineRule="auto"/>
+        <w:spacing w:after="160" w:line="276" w:lineRule="auto"/>
         <w:ind w:firstLine="709"/>
         <w:jc w:val="both"/>
       </w:pPr>
@@ -2244,7 +2091,7 @@
           <w:i w:val="0"/>
           <w:sz w:val="28"/>
         </w:rPr>
-        <w:t xml:space="preserve">Sprint Backlog. </w:t>
+        <w:t xml:space="preserve">Increment — </w:t>
       </w:r>
       <w:r>
         <w:rPr>
@@ -2253,38 +2100,12 @@
           <w:i w:val="0"/>
           <w:sz w:val="28"/>
         </w:rPr>
-        <w:t>Sprint Backlog — это набор элементов Product Backlog, выбранных для выполнения в текущем спринте, плюс план их реализации. Он формируется на планировании спринта и принадлежит команде разработки. В течение спринта Sprint Backlog обновляют, чтобы было видно, что уже сделано и что осталось для достижения цели спринта. Если Product Backlog отвечает на вопрос «что вообще нужно продукту», то Sprint Backlog отвечает: «что команда обязалась сделать в этом спринте и как к этому идёт».</w:t>
+        <w:t>готовый к использованию прирост продукта за спринт, соответствующий Definition of Done.</w:t>
       </w:r>
     </w:p>
     <w:p>
       <w:pPr>
-        <w:spacing w:after="200" w:line="276" w:lineRule="auto"/>
-        <w:ind w:firstLine="709"/>
-        <w:jc w:val="both"/>
-      </w:pPr>
-      <w:r>
-        <w:rPr>
-          <w:rFonts w:ascii="Times New Roman" w:hAnsi="Times New Roman" w:eastAsia="Times New Roman"/>
-          <w:b/>
-          <w:i w:val="0"/>
-          <w:sz w:val="28"/>
-        </w:rPr>
-        <w:t xml:space="preserve">Increment (Инкремент). </w:t>
-      </w:r>
-      <w:r>
-        <w:rPr>
-          <w:rFonts w:ascii="Times New Roman" w:hAnsi="Times New Roman" w:eastAsia="Times New Roman"/>
-          <w:b w:val="0"/>
-          <w:i w:val="0"/>
-          <w:sz w:val="28"/>
-        </w:rPr>
-        <w:t>Инкремент — это сумма всех элементов бэклога, доведённых до готовности в текущем спринте, вместе с ценностью предыдущих инкрементов. К концу спринта инкремент должен быть пригоден к использованию и соответствовать согласованному Definition of Done — единым критериям готовности (код написан, проверен, интегрирован, задокументирован в нужном объёме и т.д.). Именно инкремент демонстрируют на обзоре спринта: показывают работающий прирост продукта, а не промежуточные обещания. Благодаря регулярным инкрементам заказчик раньше начинает получать реальную пользу.</w:t>
-      </w:r>
-    </w:p>
-    <w:p>
-      <w:pPr>
-        <w:spacing w:after="160" w:before="240"/>
-        <w:ind w:firstLine="0"/>
+        <w:spacing w:after="120" w:before="200"/>
         <w:jc w:val="left"/>
       </w:pPr>
       <w:r>
@@ -2299,7 +2120,7 @@
     </w:p>
     <w:p>
       <w:pPr>
-        <w:spacing w:after="160" w:line="276" w:lineRule="auto"/>
+        <w:spacing w:after="120" w:line="276" w:lineRule="auto"/>
         <w:ind w:firstLine="709"/>
         <w:jc w:val="both"/>
       </w:pPr>
@@ -2310,18 +2131,18 @@
           <w:i w:val="0"/>
           <w:sz w:val="28"/>
         </w:rPr>
-        <w:t>Диаграмма состояний (state machine diagram) показывает жизненный цикл объекта: в каких состояниях он может находиться и по каким событиям переходит из одного состояния в другое. Начальное состояние обозначают залитым кругом, конечное — кругом в кольце, состояния — скруглёнными прямоугольниками, переходы — стрелками с подписью события или действия. На рисунке приведён пример жизненного цикла заказа: от создания через подтверждение, оплату и доставку до закрытия, а также ветка отмены.</w:t>
+        <w:t>Пример: жизненный цикл заказа (Новый → Подтверждён → Оплачен → Доставка → Доставлен → Закрыт; ветка Отменён).</w:t>
       </w:r>
     </w:p>
     <w:p>
       <w:pPr>
-        <w:spacing w:before="160" w:after="40"/>
+        <w:spacing w:before="120" w:after="40"/>
         <w:jc w:val="center"/>
       </w:pPr>
       <w:r>
         <w:drawing>
           <wp:inline xmlns:a="http://schemas.openxmlformats.org/drawingml/2006/main" xmlns:pic="http://schemas.openxmlformats.org/drawingml/2006/picture">
-            <wp:extent cx="5394960" cy="4603493"/>
+            <wp:extent cx="5303520" cy="4525468"/>
             <wp:docPr id="6" name="Picture 6"/>
             <wp:cNvGraphicFramePr>
               <a:graphicFrameLocks noChangeAspect="1"/>
@@ -2342,7 +2163,7 @@
                   <pic:spPr>
                     <a:xfrm>
                       <a:off x="0" y="0"/>
-                      <a:ext cx="5394960" cy="4603493"/>
+                      <a:ext cx="5303520" cy="4525468"/>
                     </a:xfrm>
                     <a:prstGeom prst="rect"/>
                   </pic:spPr>
@@ -2355,8 +2176,7 @@
     </w:p>
     <w:p>
       <w:pPr>
-        <w:spacing w:after="200" w:before="0"/>
-        <w:ind w:firstLine="0"/>
+        <w:spacing w:after="160" w:before="0"/>
         <w:jc w:val="center"/>
       </w:pPr>
       <w:r>
@@ -2366,13 +2186,12 @@
           <w:i/>
           <w:sz w:val="24"/>
         </w:rPr>
-        <w:t>Рисунок 6 — Диаграмма состояний (вариант 4, задание 4)</w:t>
+        <w:t>Рисунок 6 — Диаграмма состояний</w:t>
       </w:r>
     </w:p>
     <w:p>
       <w:pPr>
-        <w:spacing w:after="120" w:before="280"/>
-        <w:ind w:firstLine="0"/>
+        <w:spacing w:after="120" w:before="200"/>
         <w:jc w:val="center"/>
       </w:pPr>
       <w:r>

</xml_diff>

<commit_message>
Simplify control-work answers with shorter plain language
Rewrite definitions in simpler wording and less text; keep
diagrams; add Kontrolnaya_TRPO_PROSTO.docx for easy download.

Co-authored-by: MaxChicago <MaxChicago@users.noreply.github.com>
</commit_message>
<xml_diff>
--- a/Kontrolnaya_TRPO_otvety.docx
+++ b/Kontrolnaya_TRPO_otvety.docx
@@ -144,7 +144,7 @@
     </w:p>
     <w:p>
       <w:pPr>
-        <w:spacing w:after="160" w:line="276" w:lineRule="auto"/>
+        <w:spacing w:after="120" w:line="276" w:lineRule="auto"/>
         <w:ind w:firstLine="709"/>
         <w:jc w:val="both"/>
       </w:pPr>
@@ -164,7 +164,7 @@
           <w:i w:val="0"/>
           <w:sz w:val="28"/>
         </w:rPr>
-        <w:t>период от принятия решения о создании программного продукта до его полного изъятия из эксплуатации. В это время выполняются анализ требований, проектирование, реализация, тестирование, внедрение, сопровождение и вывод из использования. Понятие ЖЦ нужно для планирования работ и контроля готовности продукта.</w:t>
+        <w:t>время от решения создать программу до её полного снятия с использования. В него входят все этапы разработки, внедрения и сопровождения.</w:t>
       </w:r>
     </w:p>
     <w:p>
@@ -185,19 +185,9 @@
     </w:p>
     <w:p>
       <w:pPr>
-        <w:spacing w:after="160" w:line="276" w:lineRule="auto"/>
-        <w:ind w:firstLine="709"/>
-        <w:jc w:val="both"/>
+        <w:pStyle w:val="ListBullet"/>
+        <w:spacing w:after="40"/>
       </w:pPr>
-      <w:r>
-        <w:rPr>
-          <w:rFonts w:ascii="Times New Roman" w:hAnsi="Times New Roman" w:eastAsia="Times New Roman"/>
-          <w:b/>
-          <w:i w:val="0"/>
-          <w:sz w:val="28"/>
-        </w:rPr>
-        <w:t xml:space="preserve">Анализ требований — </w:t>
-      </w:r>
       <w:r>
         <w:rPr>
           <w:rFonts w:ascii="Times New Roman" w:hAnsi="Times New Roman" w:eastAsia="Times New Roman"/>
@@ -205,24 +195,14 @@
           <w:i w:val="0"/>
           <w:sz w:val="28"/>
         </w:rPr>
-        <w:t>выявление и фиксация того, что должна делать система. Собирают потребности заказчика, разделяют функциональные и нефункциональные требования, согласовывают результат.</w:t>
+        <w:t>Анализ требований — выясняют, что должна делать система.</w:t>
       </w:r>
     </w:p>
     <w:p>
       <w:pPr>
-        <w:spacing w:after="160" w:line="276" w:lineRule="auto"/>
-        <w:ind w:firstLine="709"/>
-        <w:jc w:val="both"/>
+        <w:pStyle w:val="ListBullet"/>
+        <w:spacing w:after="40"/>
       </w:pPr>
-      <w:r>
-        <w:rPr>
-          <w:rFonts w:ascii="Times New Roman" w:hAnsi="Times New Roman" w:eastAsia="Times New Roman"/>
-          <w:b/>
-          <w:i w:val="0"/>
-          <w:sz w:val="28"/>
-        </w:rPr>
-        <w:t xml:space="preserve">Проектирование — </w:t>
-      </w:r>
       <w:r>
         <w:rPr>
           <w:rFonts w:ascii="Times New Roman" w:hAnsi="Times New Roman" w:eastAsia="Times New Roman"/>
@@ -230,24 +210,14 @@
           <w:i w:val="0"/>
           <w:sz w:val="28"/>
         </w:rPr>
-        <w:t>разработка архитектуры, структур данных, интерфейсов и моделей (в том числе UML) на основе требований. Итог — «чертёж» будущей системы.</w:t>
+        <w:t>Проектирование — создают архитектуру и модели системы.</w:t>
       </w:r>
     </w:p>
     <w:p>
       <w:pPr>
-        <w:spacing w:after="160" w:line="276" w:lineRule="auto"/>
-        <w:ind w:firstLine="709"/>
-        <w:jc w:val="both"/>
+        <w:pStyle w:val="ListBullet"/>
+        <w:spacing w:after="40"/>
       </w:pPr>
-      <w:r>
-        <w:rPr>
-          <w:rFonts w:ascii="Times New Roman" w:hAnsi="Times New Roman" w:eastAsia="Times New Roman"/>
-          <w:b/>
-          <w:i w:val="0"/>
-          <w:sz w:val="28"/>
-        </w:rPr>
-        <w:t xml:space="preserve">Реализация — </w:t>
-      </w:r>
       <w:r>
         <w:rPr>
           <w:rFonts w:ascii="Times New Roman" w:hAnsi="Times New Roman" w:eastAsia="Times New Roman"/>
@@ -255,24 +225,14 @@
           <w:i w:val="0"/>
           <w:sz w:val="28"/>
         </w:rPr>
-        <w:t>написание исходного кода и сборка модулей согласно проекту.</w:t>
+        <w:t>Реализация — пишут код программы.</w:t>
       </w:r>
     </w:p>
     <w:p>
       <w:pPr>
-        <w:spacing w:after="160" w:line="276" w:lineRule="auto"/>
-        <w:ind w:firstLine="709"/>
-        <w:jc w:val="both"/>
+        <w:pStyle w:val="ListBullet"/>
+        <w:spacing w:after="40"/>
       </w:pPr>
-      <w:r>
-        <w:rPr>
-          <w:rFonts w:ascii="Times New Roman" w:hAnsi="Times New Roman" w:eastAsia="Times New Roman"/>
-          <w:b/>
-          <w:i w:val="0"/>
-          <w:sz w:val="28"/>
-        </w:rPr>
-        <w:t xml:space="preserve">Тестирование — </w:t>
-      </w:r>
       <w:r>
         <w:rPr>
           <w:rFonts w:ascii="Times New Roman" w:hAnsi="Times New Roman" w:eastAsia="Times New Roman"/>
@@ -280,24 +240,14 @@
           <w:i w:val="0"/>
           <w:sz w:val="28"/>
         </w:rPr>
-        <w:t>проверка соответствия ПО требованиям и поиск дефектов (модульное, интеграционное, системное, приёмочное).</w:t>
+        <w:t>Тестирование — проверяют программу на ошибки.</w:t>
       </w:r>
     </w:p>
     <w:p>
       <w:pPr>
-        <w:spacing w:after="160" w:line="276" w:lineRule="auto"/>
-        <w:ind w:firstLine="709"/>
-        <w:jc w:val="both"/>
+        <w:pStyle w:val="ListBullet"/>
+        <w:spacing w:after="40"/>
       </w:pPr>
-      <w:r>
-        <w:rPr>
-          <w:rFonts w:ascii="Times New Roman" w:hAnsi="Times New Roman" w:eastAsia="Times New Roman"/>
-          <w:b/>
-          <w:i w:val="0"/>
-          <w:sz w:val="28"/>
-        </w:rPr>
-        <w:t xml:space="preserve">Внедрение — </w:t>
-      </w:r>
       <w:r>
         <w:rPr>
           <w:rFonts w:ascii="Times New Roman" w:hAnsi="Times New Roman" w:eastAsia="Times New Roman"/>
@@ -305,24 +255,14 @@
           <w:i w:val="0"/>
           <w:sz w:val="28"/>
         </w:rPr>
-        <w:t>установка системы у заказчика, настройка, обучение пользователей и ввод в эксплуатацию.</w:t>
+        <w:t>Внедрение — устанавливают программу у заказчика.</w:t>
       </w:r>
     </w:p>
     <w:p>
       <w:pPr>
-        <w:spacing w:after="160" w:line="276" w:lineRule="auto"/>
-        <w:ind w:firstLine="709"/>
-        <w:jc w:val="both"/>
+        <w:pStyle w:val="ListBullet"/>
+        <w:spacing w:after="40"/>
       </w:pPr>
-      <w:r>
-        <w:rPr>
-          <w:rFonts w:ascii="Times New Roman" w:hAnsi="Times New Roman" w:eastAsia="Times New Roman"/>
-          <w:b/>
-          <w:i w:val="0"/>
-          <w:sz w:val="28"/>
-        </w:rPr>
-        <w:t xml:space="preserve">Сопровождение — </w:t>
-      </w:r>
       <w:r>
         <w:rPr>
           <w:rFonts w:ascii="Times New Roman" w:hAnsi="Times New Roman" w:eastAsia="Times New Roman"/>
@@ -330,24 +270,14 @@
           <w:i w:val="0"/>
           <w:sz w:val="28"/>
         </w:rPr>
-        <w:t>исправление ошибок, адаптация к новым условиям и развитие функций после внедрения.</w:t>
+        <w:t>Сопровождение — исправляют ошибки и дорабатывают систему.</w:t>
       </w:r>
     </w:p>
     <w:p>
       <w:pPr>
-        <w:spacing w:after="160" w:line="276" w:lineRule="auto"/>
-        <w:ind w:firstLine="709"/>
-        <w:jc w:val="both"/>
+        <w:pStyle w:val="ListBullet"/>
+        <w:spacing w:after="40"/>
       </w:pPr>
-      <w:r>
-        <w:rPr>
-          <w:rFonts w:ascii="Times New Roman" w:hAnsi="Times New Roman" w:eastAsia="Times New Roman"/>
-          <w:b/>
-          <w:i w:val="0"/>
-          <w:sz w:val="28"/>
-        </w:rPr>
-        <w:t xml:space="preserve">Вывод из эксплуатации — </w:t>
-      </w:r>
       <w:r>
         <w:rPr>
           <w:rFonts w:ascii="Times New Roman" w:hAnsi="Times New Roman" w:eastAsia="Times New Roman"/>
@@ -355,7 +285,7 @@
           <w:i w:val="0"/>
           <w:sz w:val="28"/>
         </w:rPr>
-        <w:t>прекращение поддержки системы, при необходимости — сохранение или перенос данных.</w:t>
+        <w:t>Вывод из эксплуатации — прекращают использование программы.</w:t>
       </w:r>
     </w:p>
     <w:p>
@@ -371,7 +301,7 @@
           <w:i w:val="0"/>
           <w:sz w:val="28"/>
         </w:rPr>
-        <w:t>Последовательность: Анализ требований → Проектирование → Реализация → Тестирование → Внедрение → Сопровождение → Вывод из эксплуатации.</w:t>
+        <w:t>Последовательность: Анализ → Проектирование → Реализация → Тестирование → Внедрение → Сопровождение → Вывод из эксплуатации.</w:t>
       </w:r>
     </w:p>
     <w:p>
@@ -391,7 +321,7 @@
     </w:p>
     <w:p>
       <w:pPr>
-        <w:spacing w:after="160" w:line="276" w:lineRule="auto"/>
+        <w:spacing w:after="120" w:line="276" w:lineRule="auto"/>
         <w:ind w:firstLine="709"/>
         <w:jc w:val="both"/>
       </w:pPr>
@@ -402,7 +332,7 @@
           <w:i w:val="0"/>
           <w:sz w:val="28"/>
         </w:rPr>
-        <w:t xml:space="preserve">Назначение диаграммы use case — </w:t>
+        <w:t xml:space="preserve">Назначение — </w:t>
       </w:r>
       <w:r>
         <w:rPr>
@@ -411,12 +341,12 @@
           <w:i w:val="0"/>
           <w:sz w:val="28"/>
         </w:rPr>
-        <w:t>показать, кто взаимодействует с системой и какие функции она предоставляет. Диаграмма задаёт границы системы с точки зрения пользователей, не раскрывая внутреннюю реализацию.</w:t>
+        <w:t>показать, кто работает с системой и какие функции она даёт пользователям.</w:t>
       </w:r>
     </w:p>
     <w:p>
       <w:pPr>
-        <w:spacing w:after="160" w:line="276" w:lineRule="auto"/>
+        <w:spacing w:after="120" w:line="276" w:lineRule="auto"/>
         <w:ind w:firstLine="709"/>
         <w:jc w:val="both"/>
       </w:pPr>
@@ -436,12 +366,12 @@
           <w:i w:val="0"/>
           <w:sz w:val="28"/>
         </w:rPr>
-        <w:t>внешняя роль (человек или другая система), которая взаимодействует с системой для достижения цели. Находится вне границ системы и инициирует прецеденты или участвует в них.</w:t>
+        <w:t>человек или другая система вне нашей программы, которая с ней взаимодействует.</w:t>
       </w:r>
     </w:p>
     <w:p>
       <w:pPr>
-        <w:spacing w:after="160" w:line="276" w:lineRule="auto"/>
+        <w:spacing w:after="120" w:line="276" w:lineRule="auto"/>
         <w:ind w:firstLine="709"/>
         <w:jc w:val="both"/>
       </w:pPr>
@@ -461,12 +391,12 @@
           <w:i w:val="0"/>
           <w:sz w:val="28"/>
         </w:rPr>
-        <w:t>законченный фрагмент поведения системы, видимый актёру и дающий ему значимый результат. Описывает «что» делает система, а не «как» устроен код. На диаграмме — овал.</w:t>
+        <w:t>действие системы, полезное для актёра (например, «Оформить заказ»).</w:t>
       </w:r>
     </w:p>
     <w:p>
       <w:pPr>
-        <w:spacing w:after="160" w:line="276" w:lineRule="auto"/>
+        <w:spacing w:after="120" w:line="276" w:lineRule="auto"/>
         <w:ind w:firstLine="709"/>
         <w:jc w:val="both"/>
       </w:pPr>
@@ -486,12 +416,12 @@
           <w:i w:val="0"/>
           <w:sz w:val="28"/>
         </w:rPr>
-        <w:t>обязательное включение одного прецедента в другой: базовый всегда выполняет включаемый. Используется для общего повторяющегося фрагмента. Стрелка: базовый → включаемый, &lt;&lt;include&gt;&gt;.</w:t>
+        <w:t>один прецедент всегда включает другой. Стрелка: базовый → включаемый, &lt;&lt;include&gt;&gt;.</w:t>
       </w:r>
     </w:p>
     <w:p>
       <w:pPr>
-        <w:spacing w:after="160" w:line="276" w:lineRule="auto"/>
+        <w:spacing w:after="120" w:line="276" w:lineRule="auto"/>
         <w:ind w:firstLine="709"/>
         <w:jc w:val="both"/>
       </w:pPr>
@@ -511,7 +441,7 @@
           <w:i w:val="0"/>
           <w:sz w:val="28"/>
         </w:rPr>
-        <w:t>условное расширение базового прецедента: дополнительное поведение выполняется не всегда, а при условии. Стрелка: расширение → базовый, &lt;&lt;extend&gt;&gt;.</w:t>
+        <w:t>один прецедент иногда дополняет другой (по условию). Стрелка: расширение → базовый, &lt;&lt;extend&gt;&gt;.</w:t>
       </w:r>
     </w:p>
     <w:p>
@@ -531,7 +461,7 @@
     </w:p>
     <w:p>
       <w:pPr>
-        <w:spacing w:after="160" w:line="276" w:lineRule="auto"/>
+        <w:spacing w:after="120" w:line="276" w:lineRule="auto"/>
         <w:ind w:firstLine="709"/>
         <w:jc w:val="both"/>
       </w:pPr>
@@ -551,12 +481,12 @@
           <w:i w:val="0"/>
           <w:sz w:val="28"/>
         </w:rPr>
-        <w:t>проверка правильности выполнения функций системы по требованиям. Сравнивают фактический результат с ожидаемым. Оценивается поведение («что делает» система), а не устройство кода.</w:t>
+        <w:t>проверка, правильно ли программа выполняет свои функции по требованиям.</w:t>
       </w:r>
     </w:p>
     <w:p>
       <w:pPr>
-        <w:spacing w:after="160" w:line="276" w:lineRule="auto"/>
+        <w:spacing w:after="120" w:line="276" w:lineRule="auto"/>
         <w:ind w:firstLine="709"/>
         <w:jc w:val="both"/>
       </w:pPr>
@@ -576,7 +506,7 @@
           <w:i w:val="0"/>
           <w:sz w:val="28"/>
         </w:rPr>
-        <w:t>проверка удобства интерфейса: насколько легко и быстро пользователь достигает цели, понятны ли элементы управления. Важно не только «работает ли», но и «удобно ли пользоваться».</w:t>
+        <w:t>проверка, удобно ли пользоваться интерфейсом программы.</w:t>
       </w:r>
     </w:p>
     <w:p>
@@ -607,7 +537,7 @@
           <w:i w:val="0"/>
           <w:sz w:val="28"/>
         </w:rPr>
-        <w:t>Пример: оформление заказа (Покупатель, Интерфейс, Корзина, Склад, Оплата).</w:t>
+        <w:t>Пример: оформление заказа.</w:t>
       </w:r>
     </w:p>
     <w:p>
@@ -702,7 +632,7 @@
     </w:p>
     <w:p>
       <w:pPr>
-        <w:spacing w:after="160" w:line="276" w:lineRule="auto"/>
+        <w:spacing w:after="120" w:line="276" w:lineRule="auto"/>
         <w:ind w:firstLine="709"/>
         <w:jc w:val="both"/>
       </w:pPr>
@@ -722,12 +652,12 @@
           <w:i w:val="0"/>
           <w:sz w:val="28"/>
         </w:rPr>
-        <w:t>описать систему как набор функций: что делается, какие входы и выходы, чем процесс управляется и какими ресурсами выполняется. Помогает анализировать процессы и формулировать требования к ПО.</w:t>
+        <w:t>описать, что делает система: какие работы выполняет, что на входе и выходе.</w:t>
       </w:r>
     </w:p>
     <w:p>
       <w:pPr>
-        <w:spacing w:after="160" w:line="276" w:lineRule="auto"/>
+        <w:spacing w:after="120" w:line="276" w:lineRule="auto"/>
         <w:ind w:firstLine="709"/>
         <w:jc w:val="both"/>
       </w:pPr>
@@ -747,12 +677,12 @@
           <w:i w:val="0"/>
           <w:sz w:val="28"/>
         </w:rPr>
-        <w:t>функциональные блоки (работы) и стрелки четырёх типов: вход (слева), выход (справа), управление (сверху), механизм (снизу). Модель иерархична: блоки декомпозируются на дочерние диаграммы. Указывают также цель, точку зрения и глоссарий.</w:t>
+        <w:t>блоки-функции и стрелки: вход (слева), выход (справа), управление (сверху), механизм (снизу). Модель строится по уровням (декомпозиция).</w:t>
       </w:r>
     </w:p>
     <w:p>
       <w:pPr>
-        <w:spacing w:after="160" w:line="276" w:lineRule="auto"/>
+        <w:spacing w:after="120" w:line="276" w:lineRule="auto"/>
         <w:ind w:firstLine="709"/>
         <w:jc w:val="both"/>
       </w:pPr>
@@ -772,7 +702,7 @@
           <w:i w:val="0"/>
           <w:sz w:val="28"/>
         </w:rPr>
-        <w:t>верхний уровень IDEF0: один блок всей системы и внешние стрелки. Определяет границы моделируемого объекта. Остальные диаграммы — его декомпозиция.</w:t>
+        <w:t>верхний уровень: один блок всей системы и внешние стрелки. Показывает границы системы.</w:t>
       </w:r>
     </w:p>
     <w:p>
@@ -847,7 +777,7 @@
     </w:p>
     <w:p>
       <w:pPr>
-        <w:spacing w:after="160" w:line="276" w:lineRule="auto"/>
+        <w:spacing w:after="120" w:line="276" w:lineRule="auto"/>
         <w:ind w:firstLine="709"/>
         <w:jc w:val="both"/>
       </w:pPr>
@@ -867,12 +797,12 @@
           <w:i w:val="0"/>
           <w:sz w:val="28"/>
         </w:rPr>
-        <w:t>объединение данных и методов в одном объекте и сокрытие внутренней реализации. Снаружи доступен только публичный интерфейс. Это повышает надёжность и позволяет менять реализацию без поломки внешнего кода.</w:t>
+        <w:t>данные и методы объединены в объекте, а внутреннее устройство скрыто. Снаружи видны только нужные операции.</w:t>
       </w:r>
     </w:p>
     <w:p>
       <w:pPr>
-        <w:spacing w:after="160" w:line="276" w:lineRule="auto"/>
+        <w:spacing w:after="120" w:line="276" w:lineRule="auto"/>
         <w:ind w:firstLine="709"/>
         <w:jc w:val="both"/>
       </w:pPr>
@@ -892,12 +822,12 @@
           <w:i w:val="0"/>
           <w:sz w:val="28"/>
         </w:rPr>
-        <w:t>создание класса-потомка на основе класса-предка. Потомок получает свойства и поведение предка и может их расширять или переопределять. Обеспечивает повторное использование кода и иерархии «общее → частное».</w:t>
+        <w:t>новый класс берёт свойства и методы старого класса и может добавить свои.</w:t>
       </w:r>
     </w:p>
     <w:p>
       <w:pPr>
-        <w:spacing w:after="160" w:line="276" w:lineRule="auto"/>
+        <w:spacing w:after="120" w:line="276" w:lineRule="auto"/>
         <w:ind w:firstLine="709"/>
         <w:jc w:val="both"/>
       </w:pPr>
@@ -917,7 +847,7 @@
           <w:i w:val="0"/>
           <w:sz w:val="28"/>
         </w:rPr>
-        <w:t>способность объектов разных классов одинаково вызываться через общий интерфейс, но выполнять свою реализацию метода. Один интерфейс — много реализаций; систему легче расширять.</w:t>
+        <w:t>разные объекты по-разному выполняют один и тот же метод (один интерфейс — разные реализации).</w:t>
       </w:r>
     </w:p>
     <w:p>
@@ -937,7 +867,7 @@
     </w:p>
     <w:p>
       <w:pPr>
-        <w:spacing w:after="160" w:line="276" w:lineRule="auto"/>
+        <w:spacing w:after="120" w:line="276" w:lineRule="auto"/>
         <w:ind w:firstLine="709"/>
         <w:jc w:val="both"/>
       </w:pPr>
@@ -948,7 +878,7 @@
           <w:i w:val="0"/>
           <w:sz w:val="28"/>
         </w:rPr>
-        <w:t xml:space="preserve">Назначение диаграммы классов — </w:t>
+        <w:t xml:space="preserve">Назначение — </w:t>
       </w:r>
       <w:r>
         <w:rPr>
@@ -957,12 +887,12 @@
           <w:i w:val="0"/>
           <w:sz w:val="28"/>
         </w:rPr>
-        <w:t>показать статическую структуру системы: классы, атрибуты, операции и связи между ними. Используется при проектировании ОО-систем.</w:t>
+        <w:t>показать классы системы, их поля, методы и связи между ними.</w:t>
       </w:r>
     </w:p>
     <w:p>
       <w:pPr>
-        <w:spacing w:after="160" w:line="276" w:lineRule="auto"/>
+        <w:spacing w:after="120" w:line="276" w:lineRule="auto"/>
         <w:ind w:firstLine="709"/>
         <w:jc w:val="both"/>
       </w:pPr>
@@ -982,12 +912,12 @@
           <w:i w:val="0"/>
           <w:sz w:val="28"/>
         </w:rPr>
-        <w:t>описание множества объектов с общей структурой и поведением. На диаграмме — прямоугольник из трёх секций: имя, атрибуты, методы.</w:t>
+        <w:t>описание объектов с одинаковыми данными и поведением. На схеме — три части: имя, атрибуты, методы.</w:t>
       </w:r>
     </w:p>
     <w:p>
       <w:pPr>
-        <w:spacing w:after="160" w:line="276" w:lineRule="auto"/>
+        <w:spacing w:after="120" w:line="276" w:lineRule="auto"/>
         <w:ind w:firstLine="709"/>
         <w:jc w:val="both"/>
       </w:pPr>
@@ -1007,12 +937,12 @@
           <w:i w:val="0"/>
           <w:sz w:val="28"/>
         </w:rPr>
-        <w:t>набор операций без реализации (контракт). Класс, реализующий интерфейс, обязан предоставить эти операции. Обозначается &lt;&lt;interface&gt;&gt; или «леденцом».</w:t>
+        <w:t>список методов без реализации. Класс должен эти методы реализовать.</w:t>
       </w:r>
     </w:p>
     <w:p>
       <w:pPr>
-        <w:spacing w:after="160" w:line="276" w:lineRule="auto"/>
+        <w:spacing w:after="120" w:line="276" w:lineRule="auto"/>
         <w:ind w:firstLine="709"/>
         <w:jc w:val="both"/>
       </w:pPr>
@@ -1023,7 +953,7 @@
           <w:i w:val="0"/>
           <w:sz w:val="28"/>
         </w:rPr>
-        <w:t xml:space="preserve">Виды видимости — </w:t>
+        <w:t xml:space="preserve">Видимость — </w:t>
       </w:r>
       <w:r>
         <w:rPr>
@@ -1032,12 +962,12 @@
           <w:i w:val="0"/>
           <w:sz w:val="28"/>
         </w:rPr>
-        <w:t>+ public (всем), − private (только класс), # protected (класс и потомки), ~ package (в пределах пакета).</w:t>
+        <w:t>+ public (всем), − private (только внутри класса), # protected (класс и потомки), ~ package (в пакете).</w:t>
       </w:r>
     </w:p>
     <w:p>
       <w:pPr>
-        <w:spacing w:after="160" w:line="276" w:lineRule="auto"/>
+        <w:spacing w:after="120" w:line="276" w:lineRule="auto"/>
         <w:ind w:firstLine="709"/>
         <w:jc w:val="both"/>
       </w:pPr>
@@ -1057,7 +987,7 @@
           <w:i w:val="0"/>
           <w:sz w:val="28"/>
         </w:rPr>
-        <w:t>сколько объектов одного класса связано с объектом другого: 1; 0..1; * (0..*); 1..*. Пример: Заказ 1 — 1..* ПозицияЗаказа.</w:t>
+        <w:t>сколько объектов связано друг с другом: 1, 0..1, *, 1..*. Пример: у заказа 1..* позиций.</w:t>
       </w:r>
     </w:p>
     <w:p>
@@ -1088,7 +1018,7 @@
           <w:i w:val="0"/>
           <w:sz w:val="28"/>
         </w:rPr>
-        <w:t>Пример: система «Библиотека» (Читатель, Библиотекарь, Система уведомлений; &lt;&lt;include&gt;&gt;, &lt;&lt;extend&gt;&gt;).</w:t>
+        <w:t>Пример: система «Библиотека».</w:t>
       </w:r>
     </w:p>
     <w:p>
@@ -1183,7 +1113,7 @@
     </w:p>
     <w:p>
       <w:pPr>
-        <w:spacing w:after="160" w:line="276" w:lineRule="auto"/>
+        <w:spacing w:after="120" w:line="276" w:lineRule="auto"/>
         <w:ind w:firstLine="709"/>
         <w:jc w:val="both"/>
       </w:pPr>
@@ -1203,12 +1133,12 @@
           <w:i w:val="0"/>
           <w:sz w:val="28"/>
         </w:rPr>
-        <w:t>показать взаимодействие объектов во времени: какие сообщения и в каком порядке при выполнении сценария. Удобна для уточнения динамики прецедента.</w:t>
+        <w:t>показать, в каком порядке объекты обмениваются сообщениями во времени.</w:t>
       </w:r>
     </w:p>
     <w:p>
       <w:pPr>
-        <w:spacing w:after="160" w:line="276" w:lineRule="auto"/>
+        <w:spacing w:after="120" w:line="276" w:lineRule="auto"/>
         <w:ind w:firstLine="709"/>
         <w:jc w:val="both"/>
       </w:pPr>
@@ -1228,12 +1158,12 @@
           <w:i w:val="0"/>
           <w:sz w:val="28"/>
         </w:rPr>
-        <w:t>участники взаимодействия; вверху диаграммы — прямоугольники с именем (:Класс или имя:Класс).</w:t>
+        <w:t>участники взаимодействия (прямоугольники вверху диаграммы).</w:t>
       </w:r>
     </w:p>
     <w:p>
       <w:pPr>
-        <w:spacing w:after="160" w:line="276" w:lineRule="auto"/>
+        <w:spacing w:after="120" w:line="276" w:lineRule="auto"/>
         <w:ind w:firstLine="709"/>
         <w:jc w:val="both"/>
       </w:pPr>
@@ -1253,12 +1183,12 @@
           <w:i w:val="0"/>
           <w:sz w:val="28"/>
         </w:rPr>
-        <w:t>вертикальные пунктирные линии от объектов; показывают время участия объекта.</w:t>
+        <w:t>вертикальные пунктирные линии от объектов.</w:t>
       </w:r>
     </w:p>
     <w:p>
       <w:pPr>
-        <w:spacing w:after="160" w:line="276" w:lineRule="auto"/>
+        <w:spacing w:after="120" w:line="276" w:lineRule="auto"/>
         <w:ind w:firstLine="709"/>
         <w:jc w:val="both"/>
       </w:pPr>
@@ -1278,12 +1208,12 @@
           <w:i w:val="0"/>
           <w:sz w:val="28"/>
         </w:rPr>
-        <w:t>горизонтальные стрелки между линиями жизни с именем операции; порядок — сверху вниз. На время обработки рисуют активацию.</w:t>
+        <w:t>стрелки между объектами с названием действия. Порядок читается сверху вниз.</w:t>
       </w:r>
     </w:p>
     <w:p>
       <w:pPr>
-        <w:spacing w:after="160" w:line="276" w:lineRule="auto"/>
+        <w:spacing w:after="120" w:line="276" w:lineRule="auto"/>
         <w:ind w:firstLine="709"/>
         <w:jc w:val="both"/>
       </w:pPr>
@@ -1303,12 +1233,12 @@
           <w:i w:val="0"/>
           <w:sz w:val="28"/>
         </w:rPr>
-        <w:t>отправитель ждёт ответа. Сплошная стрелка с закрашенным наконечником; обычный вызов метода.</w:t>
+        <w:t>отправитель ждёт ответа (закрашенная стрелка).</w:t>
       </w:r>
     </w:p>
     <w:p>
       <w:pPr>
-        <w:spacing w:after="160" w:line="276" w:lineRule="auto"/>
+        <w:spacing w:after="120" w:line="276" w:lineRule="auto"/>
         <w:ind w:firstLine="709"/>
         <w:jc w:val="both"/>
       </w:pPr>
@@ -1328,7 +1258,7 @@
           <w:i w:val="0"/>
           <w:sz w:val="28"/>
         </w:rPr>
-        <w:t>отправитель не ждёт ответа и продолжает работу. Стрелка с открытым наконечником; события, сигналы, уведомления.</w:t>
+        <w:t>отправитель не ждёт ответа (открытая стрелка).</w:t>
       </w:r>
     </w:p>
     <w:p>
@@ -1348,7 +1278,7 @@
     </w:p>
     <w:p>
       <w:pPr>
-        <w:spacing w:after="160" w:line="276" w:lineRule="auto"/>
+        <w:spacing w:after="120" w:line="276" w:lineRule="auto"/>
         <w:ind w:firstLine="709"/>
         <w:jc w:val="both"/>
       </w:pPr>
@@ -1359,7 +1289,7 @@
           <w:i w:val="0"/>
           <w:sz w:val="28"/>
         </w:rPr>
-        <w:t xml:space="preserve">Управление конфигурацией ПО (SCM) — </w:t>
+        <w:t xml:space="preserve">Управление конфигурацией ПО — </w:t>
       </w:r>
       <w:r>
         <w:rPr>
@@ -1368,12 +1298,12 @@
           <w:i w:val="0"/>
           <w:sz w:val="28"/>
         </w:rPr>
-        <w:t>процессы идентификации элементов продукта, контроля изменений, учёта состояния и аудита на протяжении ЖЦ. Цель — знать состав версии, историю изменений и уметь воспроизвести сборку/релиз.</w:t>
+        <w:t>учёт состава программы и контроль её изменений. Нужно знать, какая версия что содержит и кто что менял.</w:t>
       </w:r>
     </w:p>
     <w:p>
       <w:pPr>
-        <w:spacing w:after="160" w:line="276" w:lineRule="auto"/>
+        <w:spacing w:after="120" w:line="276" w:lineRule="auto"/>
         <w:ind w:firstLine="709"/>
         <w:jc w:val="both"/>
       </w:pPr>
@@ -1393,7 +1323,7 @@
           <w:i w:val="0"/>
           <w:sz w:val="28"/>
         </w:rPr>
-        <w:t>присвоение элементам уникальных обозначений и фиксация версий. Включает выбор элементов конфигурации, схему нумерации версий, базовые линии (baselines) и описание состава релиза.</w:t>
+        <w:t>присвоение уникальных имён и номеров версий файлам, модулям и релизам.</w:t>
       </w:r>
     </w:p>
     <w:p>
@@ -1413,7 +1343,7 @@
     </w:p>
     <w:p>
       <w:pPr>
-        <w:spacing w:after="160" w:line="276" w:lineRule="auto"/>
+        <w:spacing w:after="120" w:line="276" w:lineRule="auto"/>
         <w:ind w:firstLine="709"/>
         <w:jc w:val="both"/>
       </w:pPr>
@@ -1433,7 +1363,7 @@
           <w:i w:val="0"/>
           <w:sz w:val="28"/>
         </w:rPr>
-        <w:t>гибкий подход к разработке: короткие итерации, регулярная поставка рабочего ПО, сотрудничество с заказчиком и готовность к изменению требований. Ценности зафиксированы в Agile Manifesto (2001).</w:t>
+        <w:t>гибкий способ разработки: короткие циклы, частая поставка рабочей программы и готовность менять требования.</w:t>
       </w:r>
     </w:p>
     <w:p>
@@ -1455,7 +1385,7 @@
     <w:p>
       <w:pPr>
         <w:pStyle w:val="ListBullet"/>
-        <w:spacing w:after="60"/>
+        <w:spacing w:after="40"/>
       </w:pPr>
       <w:r>
         <w:rPr>
@@ -1464,13 +1394,13 @@
           <w:i w:val="0"/>
           <w:sz w:val="28"/>
         </w:rPr>
-        <w:t>Ранняя и регулярная поставка ценного ПО заказчику.</w:t>
+        <w:t>Часто давать заказчику ценное рабочее ПО.</w:t>
       </w:r>
     </w:p>
     <w:p>
       <w:pPr>
         <w:pStyle w:val="ListBullet"/>
-        <w:spacing w:after="60"/>
+        <w:spacing w:after="40"/>
       </w:pPr>
       <w:r>
         <w:rPr>
@@ -1479,13 +1409,13 @@
           <w:i w:val="0"/>
           <w:sz w:val="28"/>
         </w:rPr>
-        <w:t>Изменение требований приветствуется даже на поздних стадиях.</w:t>
+        <w:t>Принимать изменение требований.</w:t>
       </w:r>
     </w:p>
     <w:p>
       <w:pPr>
         <w:pStyle w:val="ListBullet"/>
-        <w:spacing w:after="60"/>
+        <w:spacing w:after="40"/>
       </w:pPr>
       <w:r>
         <w:rPr>
@@ -1494,13 +1424,13 @@
           <w:i w:val="0"/>
           <w:sz w:val="28"/>
         </w:rPr>
-        <w:t>Частая поставка рабочего ПО (недели, а не месяцы).</w:t>
+        <w:t>Поставлять ПО часто (недели).</w:t>
       </w:r>
     </w:p>
     <w:p>
       <w:pPr>
         <w:pStyle w:val="ListBullet"/>
-        <w:spacing w:after="60"/>
+        <w:spacing w:after="40"/>
       </w:pPr>
       <w:r>
         <w:rPr>
@@ -1509,13 +1439,13 @@
           <w:i w:val="0"/>
           <w:sz w:val="28"/>
         </w:rPr>
-        <w:t>Ежедневное сотрудничество бизнеса и разработчиков.</w:t>
+        <w:t>Бизнес и разработчики работают вместе.</w:t>
       </w:r>
     </w:p>
     <w:p>
       <w:pPr>
         <w:pStyle w:val="ListBullet"/>
-        <w:spacing w:after="60"/>
+        <w:spacing w:after="40"/>
       </w:pPr>
       <w:r>
         <w:rPr>
@@ -1524,13 +1454,13 @@
           <w:i w:val="0"/>
           <w:sz w:val="28"/>
         </w:rPr>
-        <w:t>Проект вокруг мотивированных людей; им доверяют.</w:t>
+        <w:t>Доверять мотивированной команде.</w:t>
       </w:r>
     </w:p>
     <w:p>
       <w:pPr>
         <w:pStyle w:val="ListBullet"/>
-        <w:spacing w:after="60"/>
+        <w:spacing w:after="40"/>
       </w:pPr>
       <w:r>
         <w:rPr>
@@ -1539,13 +1469,13 @@
           <w:i w:val="0"/>
           <w:sz w:val="28"/>
         </w:rPr>
-        <w:t>Лучший способ обмена информацией — личный разговор.</w:t>
+        <w:t>Лучше общаться лично.</w:t>
       </w:r>
     </w:p>
     <w:p>
       <w:pPr>
         <w:pStyle w:val="ListBullet"/>
-        <w:spacing w:after="60"/>
+        <w:spacing w:after="40"/>
       </w:pPr>
       <w:r>
         <w:rPr>
@@ -1554,13 +1484,13 @@
           <w:i w:val="0"/>
           <w:sz w:val="28"/>
         </w:rPr>
-        <w:t>Рабочее ПО — главный показатель прогресса.</w:t>
+        <w:t>Главный показатель — рабочее ПО.</w:t>
       </w:r>
     </w:p>
     <w:p>
       <w:pPr>
         <w:pStyle w:val="ListBullet"/>
-        <w:spacing w:after="60"/>
+        <w:spacing w:after="40"/>
       </w:pPr>
       <w:r>
         <w:rPr>
@@ -1569,13 +1499,13 @@
           <w:i w:val="0"/>
           <w:sz w:val="28"/>
         </w:rPr>
-        <w:t>Устойчивый темп разработки.</w:t>
+        <w:t>Держать устойчивый темп работы.</w:t>
       </w:r>
     </w:p>
     <w:p>
       <w:pPr>
         <w:pStyle w:val="ListBullet"/>
-        <w:spacing w:after="60"/>
+        <w:spacing w:after="40"/>
       </w:pPr>
       <w:r>
         <w:rPr>
@@ -1584,13 +1514,13 @@
           <w:i w:val="0"/>
           <w:sz w:val="28"/>
         </w:rPr>
-        <w:t>Внимание к техническому совершенству и дизайну.</w:t>
+        <w:t>Следить за качеством кода и дизайна.</w:t>
       </w:r>
     </w:p>
     <w:p>
       <w:pPr>
         <w:pStyle w:val="ListBullet"/>
-        <w:spacing w:after="60"/>
+        <w:spacing w:after="40"/>
       </w:pPr>
       <w:r>
         <w:rPr>
@@ -1599,13 +1529,13 @@
           <w:i w:val="0"/>
           <w:sz w:val="28"/>
         </w:rPr>
-        <w:t>Простота — не делать лишней работы.</w:t>
+        <w:t>Делать проще, без лишней работы.</w:t>
       </w:r>
     </w:p>
     <w:p>
       <w:pPr>
         <w:pStyle w:val="ListBullet"/>
-        <w:spacing w:after="60"/>
+        <w:spacing w:after="40"/>
       </w:pPr>
       <w:r>
         <w:rPr>
@@ -1614,13 +1544,13 @@
           <w:i w:val="0"/>
           <w:sz w:val="28"/>
         </w:rPr>
-        <w:t>Лучшие решения у самоорганизующихся команд.</w:t>
+        <w:t>Команда сама организует работу.</w:t>
       </w:r>
     </w:p>
     <w:p>
       <w:pPr>
         <w:pStyle w:val="ListBullet"/>
-        <w:spacing w:after="60"/>
+        <w:spacing w:after="40"/>
       </w:pPr>
       <w:r>
         <w:rPr>
@@ -1629,7 +1559,7 @@
           <w:i w:val="0"/>
           <w:sz w:val="28"/>
         </w:rPr>
-        <w:t>Регулярная рефлексия и улучшение работы.</w:t>
+        <w:t>Регулярно улучшать процесс.</w:t>
       </w:r>
     </w:p>
     <w:p>
@@ -1660,7 +1590,7 @@
           <w:i w:val="0"/>
           <w:sz w:val="28"/>
         </w:rPr>
-        <w:t>Пример: учёт заказов (Покупатель, Заказ, ПозицияЗаказа, Товар, интерфейс Оплата).</w:t>
+        <w:t>Пример: учёт заказов.</w:t>
       </w:r>
     </w:p>
     <w:p>
@@ -1740,7 +1670,7 @@
     </w:p>
     <w:p>
       <w:pPr>
-        <w:spacing w:after="160" w:before="0"/>
+        <w:spacing w:after="120" w:before="0"/>
         <w:jc w:val="both"/>
       </w:pPr>
       <w:r>
@@ -1750,7 +1680,7 @@
           <w:i/>
           <w:sz w:val="24"/>
         </w:rPr>
-        <w:t>Примечание: в бланке задания 1 и 2 сформулированы одинаково (диаграмма коммуникации).</w:t>
+        <w:t>Примечание: в бланке задания 1 и 2 одинаковые.</w:t>
       </w:r>
     </w:p>
     <w:p>
@@ -1770,7 +1700,7 @@
     </w:p>
     <w:p>
       <w:pPr>
-        <w:spacing w:after="160" w:line="276" w:lineRule="auto"/>
+        <w:spacing w:after="120" w:line="276" w:lineRule="auto"/>
         <w:ind w:firstLine="709"/>
         <w:jc w:val="both"/>
       </w:pPr>
@@ -1790,12 +1720,12 @@
           <w:i w:val="0"/>
           <w:sz w:val="28"/>
         </w:rPr>
-        <w:t>показать структуру связей объектов и обмен сообщениями при выполнении сценария. Акцент на том, кто с кем связан; порядок сообщений задаётся нумерацией.</w:t>
+        <w:t>показать, какие объекты связаны и какими сообщениями обмениваются. Порядок сообщений задаётся номерами.</w:t>
       </w:r>
     </w:p>
     <w:p>
       <w:pPr>
-        <w:spacing w:after="160" w:line="276" w:lineRule="auto"/>
+        <w:spacing w:after="120" w:line="276" w:lineRule="auto"/>
         <w:ind w:firstLine="709"/>
         <w:jc w:val="both"/>
       </w:pPr>
@@ -1806,7 +1736,7 @@
           <w:i w:val="0"/>
           <w:sz w:val="28"/>
         </w:rPr>
-        <w:t xml:space="preserve">Основные элементы — </w:t>
+        <w:t xml:space="preserve">Элементы — </w:t>
       </w:r>
       <w:r>
         <w:rPr>
@@ -1815,12 +1745,12 @@
           <w:i w:val="0"/>
           <w:sz w:val="28"/>
         </w:rPr>
-        <w:t>объекты (роли), связи между ними, сообщения вдоль связей с номерами (1, 1.1, 2…), при необходимости актёры.</w:t>
+        <w:t>объекты, линии связей между ними и нумерованные сообщения.</w:t>
       </w:r>
     </w:p>
     <w:p>
       <w:pPr>
-        <w:spacing w:after="160" w:line="276" w:lineRule="auto"/>
+        <w:spacing w:after="120" w:line="276" w:lineRule="auto"/>
         <w:ind w:firstLine="709"/>
         <w:jc w:val="both"/>
       </w:pPr>
@@ -1831,7 +1761,7 @@
           <w:i w:val="0"/>
           <w:sz w:val="28"/>
         </w:rPr>
-        <w:t xml:space="preserve">Отличие от диаграммы последовательности — </w:t>
+        <w:t xml:space="preserve">Отличие от последовательности — </w:t>
       </w:r>
       <w:r>
         <w:rPr>
@@ -1840,7 +1770,7 @@
           <w:i w:val="0"/>
           <w:sz w:val="28"/>
         </w:rPr>
-        <w:t>sequence подчёркивает время (сверху вниз, линии жизни); communication — топологию связей (порядок через номера). Семантика сообщений одна, различается способ представления.</w:t>
+        <w:t>на последовательности важен порядок во времени, на коммуникации — кто с кем связан.</w:t>
       </w:r>
     </w:p>
     <w:p>
@@ -1855,24 +1785,15 @@
           <w:i w:val="0"/>
           <w:sz w:val="28"/>
         </w:rPr>
-        <w:t>Задание 2. Диаграмма коммуникации — дополнение (5–6 баллов)</w:t>
+        <w:t>Задание 2. Диаграмма коммуникации (5–6 баллов)</w:t>
       </w:r>
     </w:p>
     <w:p>
       <w:pPr>
-        <w:spacing w:after="160" w:line="276" w:lineRule="auto"/>
+        <w:spacing w:after="120" w:line="276" w:lineRule="auto"/>
         <w:ind w:firstLine="709"/>
         <w:jc w:val="both"/>
       </w:pPr>
-      <w:r>
-        <w:rPr>
-          <w:rFonts w:ascii="Times New Roman" w:hAnsi="Times New Roman" w:eastAsia="Times New Roman"/>
-          <w:b/>
-          <w:i w:val="0"/>
-          <w:sz w:val="28"/>
-        </w:rPr>
-        <w:t xml:space="preserve">Углубление сравнения. </w:t>
-      </w:r>
       <w:r>
         <w:rPr>
           <w:rFonts w:ascii="Times New Roman" w:hAnsi="Times New Roman" w:eastAsia="Times New Roman"/>
@@ -1880,7 +1801,7 @@
           <w:i w:val="0"/>
           <w:sz w:val="28"/>
         </w:rPr>
-        <w:t>Обе диаграммы — диаграммы взаимодействия UML. Sequence удобнее для длинных сценариев и ветвлений во времени; communication — для компактного обзора «кто с кем общается». Нумерация отражает последовательность и вложенность вызовов.</w:t>
+        <w:t>Обе диаграммы показывают одно взаимодействие по-разному. Последовательность удобнее читать как сценарий по шагам, коммуникацию — как схему связей.</w:t>
       </w:r>
     </w:p>
     <w:p>
@@ -1955,7 +1876,7 @@
     </w:p>
     <w:p>
       <w:pPr>
-        <w:spacing w:after="160" w:line="276" w:lineRule="auto"/>
+        <w:spacing w:after="120" w:line="276" w:lineRule="auto"/>
         <w:ind w:firstLine="709"/>
         <w:jc w:val="both"/>
       </w:pPr>
@@ -1975,12 +1896,12 @@
           <w:i w:val="0"/>
           <w:sz w:val="28"/>
         </w:rPr>
-        <w:t>отвечает за ценность продукта и Product Backlog: формулирует требования, задаёт приоритеты, принимает результат.</w:t>
+        <w:t>отвечает за Product Backlog и приоритеты задач.</w:t>
       </w:r>
     </w:p>
     <w:p>
       <w:pPr>
-        <w:spacing w:after="160" w:line="276" w:lineRule="auto"/>
+        <w:spacing w:after="120" w:line="276" w:lineRule="auto"/>
         <w:ind w:firstLine="709"/>
         <w:jc w:val="both"/>
       </w:pPr>
@@ -2000,12 +1921,12 @@
           <w:i w:val="0"/>
           <w:sz w:val="28"/>
         </w:rPr>
-        <w:t>помогает следовать Scrum, устраняет препятствия, фасилитирует события, защищает команду от помех.</w:t>
+        <w:t>помогает команде работать по Scrum и убирает препятствия.</w:t>
       </w:r>
     </w:p>
     <w:p>
       <w:pPr>
-        <w:spacing w:after="160" w:line="276" w:lineRule="auto"/>
+        <w:spacing w:after="120" w:line="276" w:lineRule="auto"/>
         <w:ind w:firstLine="709"/>
         <w:jc w:val="both"/>
       </w:pPr>
@@ -2025,12 +1946,12 @@
           <w:i w:val="0"/>
           <w:sz w:val="28"/>
         </w:rPr>
-        <w:t>кросс-функциональная команда, создающая Инкремент; сама оценивает работу и решает, как её выполнить.</w:t>
+        <w:t>команда, которая делает продукт.</w:t>
       </w:r>
     </w:p>
     <w:p>
       <w:pPr>
-        <w:spacing w:after="160" w:line="276" w:lineRule="auto"/>
+        <w:spacing w:after="120" w:line="276" w:lineRule="auto"/>
         <w:ind w:firstLine="709"/>
         <w:jc w:val="both"/>
       </w:pPr>
@@ -2050,12 +1971,12 @@
           <w:i w:val="0"/>
           <w:sz w:val="28"/>
         </w:rPr>
-        <w:t>упорядоченный список всего нужного в продукте (функции, улучшения, дефекты); ведёт Product Owner.</w:t>
+        <w:t>общий список всего, что нужно сделать в продукте.</w:t>
       </w:r>
     </w:p>
     <w:p>
       <w:pPr>
-        <w:spacing w:after="160" w:line="276" w:lineRule="auto"/>
+        <w:spacing w:after="120" w:line="276" w:lineRule="auto"/>
         <w:ind w:firstLine="709"/>
         <w:jc w:val="both"/>
       </w:pPr>
@@ -2075,12 +1996,12 @@
           <w:i w:val="0"/>
           <w:sz w:val="28"/>
         </w:rPr>
-        <w:t>элементы бэклога, выбранные на спринт, плюс план их реализации; принадлежит команде разработки.</w:t>
+        <w:t>задачи, выбранные на текущий спринт.</w:t>
       </w:r>
     </w:p>
     <w:p>
       <w:pPr>
-        <w:spacing w:after="160" w:line="276" w:lineRule="auto"/>
+        <w:spacing w:after="120" w:line="276" w:lineRule="auto"/>
         <w:ind w:firstLine="709"/>
         <w:jc w:val="both"/>
       </w:pPr>
@@ -2100,7 +2021,7 @@
           <w:i w:val="0"/>
           <w:sz w:val="28"/>
         </w:rPr>
-        <w:t>готовый к использованию прирост продукта за спринт, соответствующий Definition of Done.</w:t>
+        <w:t>готовая рабочая часть продукта после спринта.</w:t>
       </w:r>
     </w:p>
     <w:p>
@@ -2131,7 +2052,7 @@
           <w:i w:val="0"/>
           <w:sz w:val="28"/>
         </w:rPr>
-        <w:t>Пример: жизненный цикл заказа (Новый → Подтверждён → Оплачен → Доставка → Доставлен → Закрыт; ветка Отменён).</w:t>
+        <w:t>Пример: состояния заказа.</w:t>
       </w:r>
     </w:p>
     <w:p>

</xml_diff>